<commit_message>
Deploying to gh-pages from @ Morrison-Lab/mds@4e62432e3d9b13b3c8cc0b69dc0be1ae66bc4d6b 🚀
</commit_message>
<xml_diff>
--- a/algebra.docx
+++ b/algebra.docx
@@ -15,7 +15,7 @@
         <w:pStyle w:val="Date"/>
       </w:pPr>
       <w:r>
-        <w:t xml:space="preserve">Last modified: 2026-09-28 03:24:06 (PDT)</w:t>
+        <w:t xml:space="preserve">Last modified: 2026-09-28 03:31:56 (PDT)</w:t>
       </w:r>
     </w:p>
     <w:p>
@@ -1104,7 +1104,7 @@
         <w:t xml:space="preserve"> </w:t>
       </w:r>
       <w:r>
-        <w:t xml:space="preserve">(Rudin 1976, chap. 1)</w:t>
+        <w:t xml:space="preserve">(Rudin 1976, Definition 1.8, p. 4, and Theorem 1.19, p. 8)</w:t>
       </w:r>
       <w:r>
         <w:t xml:space="preserve">.</w:t>
@@ -2178,7 +2178,7 @@
         <w:t xml:space="preserve"> </w:t>
       </w:r>
       <w:r>
-        <w:t xml:space="preserve">(Rudin 1976, chap. 1)</w:t>
+        <w:t xml:space="preserve">(Rudin 1976, Definition 1.8, p. 4, and Theorem 1.19, p. 8)</w:t>
       </w:r>
       <w:r>
         <w:t xml:space="preserve">.</w:t>

</xml_diff>

<commit_message>
Deploying to gh-pages from @ Morrison-Lab/mds@d2a7be190e206876ea076f4f5c0cf51bb56fc37d 🚀
</commit_message>
<xml_diff>
--- a/algebra.docx
+++ b/algebra.docx
@@ -15,7 +15,16 @@
         <w:pStyle w:val="Date"/>
       </w:pPr>
       <w:r>
-        <w:t xml:space="preserve">Last modified: 2026-09-30 14:04:39 (PDT)</w:t>
+        <w:t xml:space="preserve">Last modified: 2026-09-30 14:36:42 (PDT)</w:t>
+      </w:r>
+    </w:p>
+    <w:bookmarkStart w:id="12" w:name="equalities"/>
+    <w:p>
+      <w:pPr>
+        <w:pStyle w:val="Heading2"/>
+      </w:pPr>
+      <w:r>
+        <w:t xml:space="preserve">1 Equalities</w:t>
       </w:r>
     </w:p>
     <w:p>
@@ -82,19 +91,10 @@
         <w:t xml:space="preserve">Therefore, I include this section as a quick reference.</w:t>
       </w:r>
     </w:p>
-    <w:bookmarkStart w:id="12" w:name="equalities"/>
-    <w:p>
-      <w:pPr>
-        <w:pStyle w:val="Heading2"/>
-      </w:pPr>
-      <w:r>
-        <w:t xml:space="preserve">1 Equalities</w:t>
-      </w:r>
-    </w:p>
     <w:bookmarkStart w:id="10" w:name="thm-equal-trans"/>
     <w:p>
       <w:pPr>
-        <w:pStyle w:val="FirstParagraph"/>
+        <w:pStyle w:val="BodyText"/>
       </w:pPr>
       <w:r>
         <w:rPr>

</xml_diff>

<commit_message>
Deploying to gh-pages from @ Morrison-Lab/mds@194316b1efc301ad6326256ce8606519ac920731 🚀
</commit_message>
<xml_diff>
--- a/algebra.docx
+++ b/algebra.docx
@@ -15,7 +15,7 @@
         <w:pStyle w:val="Date"/>
       </w:pPr>
       <w:r>
-        <w:t xml:space="preserve">Last modified: 2026-10-01 18:10:18 (PDT)</w:t>
+        <w:t xml:space="preserve">Last modified: 2026-10-01 23:40:11 (PDT)</w:t>
       </w:r>
     </w:p>
     <w:bookmarkStart w:id="12" w:name="equalities"/>
@@ -3053,7 +3053,7 @@
     </w:p>
     <w:bookmarkEnd w:id="31"/>
     <w:bookmarkEnd w:id="32"/>
-    <w:bookmarkStart w:id="34" w:name="sums-and-products-together"/>
+    <w:bookmarkStart w:id="37" w:name="sums-and-products-together"/>
     <w:p>
       <w:pPr>
         <w:pStyle w:val="Heading2"/>
@@ -3139,17 +3139,1361 @@
       </m:oMathPara>
     </w:p>
     <w:bookmarkEnd w:id="33"/>
+    <w:bookmarkStart w:id="34" w:name="exr-square-of-a-sum"/>
+    <w:p>
+      <w:pPr>
+        <w:pStyle w:val="FirstParagraph"/>
+      </w:pPr>
+      <w:r>
+        <w:rPr>
+          <w:b/>
+          <w:bCs/>
+        </w:rPr>
+        <w:t xml:space="preserve">Exercise 1 (Expand a squared sum)</w:t>
+      </w:r>
+      <w:r>
+        <w:t xml:space="preserve"> </w:t>
+      </w:r>
+      <w:r>
+        <w:t xml:space="preserve">Is</w:t>
+      </w:r>
+      <w:r>
+        <w:t xml:space="preserve"> </w:t>
+      </w:r>
+      <m:oMath>
+        <m:r>
+          <m:rPr>
+            <m:sty m:val="p"/>
+          </m:rPr>
+          <m:t>(</m:t>
+        </m:r>
+        <m:r>
+          <m:t>3</m:t>
+        </m:r>
+        <m:r>
+          <m:rPr>
+            <m:sty m:val="p"/>
+          </m:rPr>
+          <m:t>+</m:t>
+        </m:r>
+        <m:r>
+          <m:t>4</m:t>
+        </m:r>
+        <m:sSup>
+          <m:e>
+            <m:r>
+              <m:rPr>
+                <m:sty m:val="p"/>
+              </m:rPr>
+              <m:t>)</m:t>
+            </m:r>
+          </m:e>
+          <m:sup>
+            <m:r>
+              <m:t>2</m:t>
+            </m:r>
+          </m:sup>
+        </m:sSup>
+      </m:oMath>
+      <w:r>
+        <w:t xml:space="preserve"> </w:t>
+      </w:r>
+      <w:r>
+        <w:t xml:space="preserve">equal to</w:t>
+      </w:r>
+      <w:r>
+        <w:t xml:space="preserve"> </w:t>
+      </w:r>
+      <m:oMath>
+        <m:sSup>
+          <m:e>
+            <m:r>
+              <m:t>3</m:t>
+            </m:r>
+          </m:e>
+          <m:sup>
+            <m:r>
+              <m:t>2</m:t>
+            </m:r>
+          </m:sup>
+        </m:sSup>
+        <m:r>
+          <m:rPr>
+            <m:sty m:val="p"/>
+          </m:rPr>
+          <m:t>+</m:t>
+        </m:r>
+        <m:sSup>
+          <m:e>
+            <m:r>
+              <m:t>4</m:t>
+            </m:r>
+          </m:e>
+          <m:sup>
+            <m:r>
+              <m:t>2</m:t>
+            </m:r>
+          </m:sup>
+        </m:sSup>
+      </m:oMath>
+      <w:r>
+        <w:t xml:space="preserve">?</w:t>
+      </w:r>
+      <w:r>
+        <w:t xml:space="preserve"> </w:t>
+      </w:r>
+      <w:r>
+        <w:t xml:space="preserve">Then expand</w:t>
+      </w:r>
+      <w:r>
+        <w:t xml:space="preserve"> </w:t>
+      </w:r>
+      <m:oMath>
+        <m:r>
+          <m:rPr>
+            <m:sty m:val="p"/>
+          </m:rPr>
+          <m:t>(</m:t>
+        </m:r>
+        <m:r>
+          <m:t>a</m:t>
+        </m:r>
+        <m:r>
+          <m:rPr>
+            <m:sty m:val="p"/>
+          </m:rPr>
+          <m:t>+</m:t>
+        </m:r>
+        <m:r>
+          <m:t>b</m:t>
+        </m:r>
+        <m:sSup>
+          <m:e>
+            <m:r>
+              <m:rPr>
+                <m:sty m:val="p"/>
+              </m:rPr>
+              <m:t>)</m:t>
+            </m:r>
+          </m:e>
+          <m:sup>
+            <m:r>
+              <m:t>2</m:t>
+            </m:r>
+          </m:sup>
+        </m:sSup>
+      </m:oMath>
+      <w:r>
+        <w:t xml:space="preserve"> </w:t>
+      </w:r>
+      <w:r>
+        <w:t xml:space="preserve">for any numbers</w:t>
+      </w:r>
+      <w:r>
+        <w:t xml:space="preserve"> </w:t>
+      </w:r>
+      <m:oMath>
+        <m:r>
+          <m:t>a</m:t>
+        </m:r>
+      </m:oMath>
+      <w:r>
+        <w:t xml:space="preserve"> </w:t>
+      </w:r>
+      <w:r>
+        <w:t xml:space="preserve">and</w:t>
+      </w:r>
+      <w:r>
+        <w:t xml:space="preserve"> </w:t>
+      </w:r>
+      <m:oMath>
+        <m:r>
+          <m:t>b</m:t>
+        </m:r>
+      </m:oMath>
+      <w:r>
+        <w:t xml:space="preserve">,</w:t>
+      </w:r>
+      <w:r>
+        <w:t xml:space="preserve"> </w:t>
+      </w:r>
+      <w:r>
+        <w:t xml:space="preserve">using only the distributive law and the rules above.</w:t>
+      </w:r>
+    </w:p>
     <w:bookmarkEnd w:id="34"/>
-    <w:bookmarkStart w:id="46" w:name="quotients"/>
+    <w:bookmarkStart w:id="35" w:name="sol-square-of-a-sum"/>
     <w:p>
       <w:pPr>
+        <w:pStyle w:val="BodyText"/>
+      </w:pPr>
+      <w:r>
+        <w:rPr>
+          <w:i/>
+          <w:iCs/>
+        </w:rPr>
+        <w:t xml:space="preserve">Solution 1</w:t>
+      </w:r>
+      <w:r>
+        <w:t xml:space="preserve">. </w:t>
+      </w:r>
+      <w:r>
+        <w:t xml:space="preserve">No:</w:t>
+      </w:r>
+      <w:r>
+        <w:t xml:space="preserve"> </w:t>
+      </w:r>
+      <m:oMath>
+        <m:r>
+          <m:rPr>
+            <m:sty m:val="p"/>
+          </m:rPr>
+          <m:t>(</m:t>
+        </m:r>
+        <m:r>
+          <m:t>3</m:t>
+        </m:r>
+        <m:r>
+          <m:rPr>
+            <m:sty m:val="p"/>
+          </m:rPr>
+          <m:t>+</m:t>
+        </m:r>
+        <m:r>
+          <m:t>4</m:t>
+        </m:r>
+        <m:sSup>
+          <m:e>
+            <m:r>
+              <m:rPr>
+                <m:sty m:val="p"/>
+              </m:rPr>
+              <m:t>)</m:t>
+            </m:r>
+          </m:e>
+          <m:sup>
+            <m:r>
+              <m:t>2</m:t>
+            </m:r>
+          </m:sup>
+        </m:sSup>
+        <m:r>
+          <m:rPr>
+            <m:sty m:val="p"/>
+          </m:rPr>
+          <m:t>=</m:t>
+        </m:r>
+        <m:sSup>
+          <m:e>
+            <m:r>
+              <m:t>7</m:t>
+            </m:r>
+          </m:e>
+          <m:sup>
+            <m:r>
+              <m:t>2</m:t>
+            </m:r>
+          </m:sup>
+        </m:sSup>
+        <m:r>
+          <m:rPr>
+            <m:sty m:val="p"/>
+          </m:rPr>
+          <m:t>=</m:t>
+        </m:r>
+        <m:r>
+          <m:t>49</m:t>
+        </m:r>
+      </m:oMath>
+      <w:r>
+        <w:t xml:space="preserve">, while</w:t>
+      </w:r>
+      <w:r>
+        <w:t xml:space="preserve"> </w:t>
+      </w:r>
+      <m:oMath>
+        <m:sSup>
+          <m:e>
+            <m:r>
+              <m:t>3</m:t>
+            </m:r>
+          </m:e>
+          <m:sup>
+            <m:r>
+              <m:t>2</m:t>
+            </m:r>
+          </m:sup>
+        </m:sSup>
+        <m:r>
+          <m:rPr>
+            <m:sty m:val="p"/>
+          </m:rPr>
+          <m:t>+</m:t>
+        </m:r>
+        <m:sSup>
+          <m:e>
+            <m:r>
+              <m:t>4</m:t>
+            </m:r>
+          </m:e>
+          <m:sup>
+            <m:r>
+              <m:t>2</m:t>
+            </m:r>
+          </m:sup>
+        </m:sSup>
+        <m:r>
+          <m:rPr>
+            <m:sty m:val="p"/>
+          </m:rPr>
+          <m:t>=</m:t>
+        </m:r>
+        <m:r>
+          <m:t>9</m:t>
+        </m:r>
+        <m:r>
+          <m:rPr>
+            <m:sty m:val="p"/>
+          </m:rPr>
+          <m:t>+</m:t>
+        </m:r>
+        <m:r>
+          <m:t>16</m:t>
+        </m:r>
+        <m:r>
+          <m:rPr>
+            <m:sty m:val="p"/>
+          </m:rPr>
+          <m:t>=</m:t>
+        </m:r>
+        <m:r>
+          <m:t>25</m:t>
+        </m:r>
+      </m:oMath>
+      <w:r>
+        <w:t xml:space="preserve">.</w:t>
+      </w:r>
+      <w:r>
+        <w:t xml:space="preserve"> </w:t>
+      </w:r>
+      <w:r>
+        <w:t xml:space="preserve">The difference,</w:t>
+      </w:r>
+      <w:r>
+        <w:t xml:space="preserve"> </w:t>
+      </w:r>
+      <m:oMath>
+        <m:r>
+          <m:t>49</m:t>
+        </m:r>
+        <m:r>
+          <m:rPr>
+            <m:sty m:val="p"/>
+          </m:rPr>
+          <m:t>−</m:t>
+        </m:r>
+        <m:r>
+          <m:t>25</m:t>
+        </m:r>
+        <m:r>
+          <m:rPr>
+            <m:sty m:val="p"/>
+          </m:rPr>
+          <m:t>=</m:t>
+        </m:r>
+        <m:r>
+          <m:t>24</m:t>
+        </m:r>
+      </m:oMath>
+      <w:r>
+        <w:t xml:space="preserve">, is</w:t>
+      </w:r>
+      <w:r>
+        <w:t xml:space="preserve"> </w:t>
+      </w:r>
+      <m:oMath>
+        <m:r>
+          <m:t>2</m:t>
+        </m:r>
+        <m:r>
+          <m:rPr>
+            <m:sty m:val="p"/>
+          </m:rPr>
+          <m:t>⋅</m:t>
+        </m:r>
+        <m:r>
+          <m:t>3</m:t>
+        </m:r>
+        <m:r>
+          <m:rPr>
+            <m:sty m:val="p"/>
+          </m:rPr>
+          <m:t>⋅</m:t>
+        </m:r>
+        <m:r>
+          <m:t>4</m:t>
+        </m:r>
+      </m:oMath>
+      <w:r>
+        <w:t xml:space="preserve">.</w:t>
+      </w:r>
+    </w:p>
+    <w:p>
+      <w:pPr>
+        <w:pStyle w:val="BodyText"/>
+      </w:pPr>
+      <w:r>
+        <w:t xml:space="preserve">To see where that extra term comes from,</w:t>
+      </w:r>
+      <w:r>
+        <w:t xml:space="preserve"> </w:t>
+      </w:r>
+      <w:r>
+        <w:t xml:space="preserve">write the square as a product</w:t>
+      </w:r>
+      <w:r>
+        <w:t xml:space="preserve"> </w:t>
+      </w:r>
+      <w:r>
+        <w:t xml:space="preserve">and apply the distributive law (</w:t>
+      </w:r>
+      <w:hyperlink w:anchor="thm-mult-distr">
+        <w:r>
+          <w:rPr>
+            <w:rStyle w:val="Hyperlink"/>
+          </w:rPr>
+          <w:t xml:space="preserve">Theorem 14</w:t>
+        </w:r>
+      </w:hyperlink>
+      <w:r>
+        <w:t xml:space="preserve">) twice:</w:t>
+      </w:r>
+    </w:p>
+    <w:p>
+      <w:pPr>
+        <w:pStyle w:val="BodyText"/>
+      </w:pPr>
+      <m:oMathPara>
+        <m:oMathParaPr>
+          <m:jc m:val="center"/>
+        </m:oMathParaPr>
+        <m:oMath>
+          <m:eqArr>
+            <m:e>
+              <m:r>
+                <m:rPr>
+                  <m:sty m:val="p"/>
+                </m:rPr>
+                <m:t>(</m:t>
+              </m:r>
+              <m:r>
+                <m:t>a</m:t>
+              </m:r>
+              <m:r>
+                <m:rPr>
+                  <m:sty m:val="p"/>
+                </m:rPr>
+                <m:t>+</m:t>
+              </m:r>
+              <m:r>
+                <m:t>b</m:t>
+              </m:r>
+              <m:sSup>
+                <m:e>
+                  <m:r>
+                    <m:rPr>
+                      <m:sty m:val="p"/>
+                    </m:rPr>
+                    <m:t>)</m:t>
+                  </m:r>
+                </m:e>
+                <m:sup>
+                  <m:r>
+                    <m:t>2</m:t>
+                  </m:r>
+                </m:sup>
+              </m:sSup>
+              <m:r>
+                <m:t>&amp;</m:t>
+              </m:r>
+              <m:r>
+                <m:rPr>
+                  <m:sty m:val="p"/>
+                </m:rPr>
+                <m:t>=</m:t>
+              </m:r>
+              <m:r>
+                <m:rPr>
+                  <m:sty m:val="p"/>
+                </m:rPr>
+                <m:t>(</m:t>
+              </m:r>
+              <m:r>
+                <m:t>a</m:t>
+              </m:r>
+              <m:r>
+                <m:rPr>
+                  <m:sty m:val="p"/>
+                </m:rPr>
+                <m:t>+</m:t>
+              </m:r>
+              <m:r>
+                <m:t>b</m:t>
+              </m:r>
+              <m:r>
+                <m:rPr>
+                  <m:sty m:val="p"/>
+                </m:rPr>
+                <m:t>)</m:t>
+              </m:r>
+              <m:r>
+                <m:rPr>
+                  <m:sty m:val="p"/>
+                </m:rPr>
+                <m:t>(</m:t>
+              </m:r>
+              <m:r>
+                <m:t>a</m:t>
+              </m:r>
+              <m:r>
+                <m:rPr>
+                  <m:sty m:val="p"/>
+                </m:rPr>
+                <m:t>+</m:t>
+              </m:r>
+              <m:r>
+                <m:t>b</m:t>
+              </m:r>
+              <m:r>
+                <m:rPr>
+                  <m:sty m:val="p"/>
+                </m:rPr>
+                <m:t>)</m:t>
+              </m:r>
+              <m:r>
+                <m:t>&amp;</m:t>
+              </m:r>
+              <m:r>
+                <m:t>&amp;</m:t>
+              </m:r>
+              <m:r>
+                <m:rPr>
+                  <m:nor/>
+                  <m:sty m:val="p"/>
+                </m:rPr>
+                <m:t>(definition of a square)</m:t>
+              </m:r>
+            </m:e>
+            <m:e>
+              <m:r>
+                <m:t>&amp;</m:t>
+              </m:r>
+              <m:r>
+                <m:rPr>
+                  <m:sty m:val="p"/>
+                </m:rPr>
+                <m:t>=</m:t>
+              </m:r>
+              <m:r>
+                <m:rPr>
+                  <m:sty m:val="p"/>
+                </m:rPr>
+                <m:t>(</m:t>
+              </m:r>
+              <m:r>
+                <m:t>a</m:t>
+              </m:r>
+              <m:r>
+                <m:rPr>
+                  <m:sty m:val="p"/>
+                </m:rPr>
+                <m:t>+</m:t>
+              </m:r>
+              <m:r>
+                <m:t>b</m:t>
+              </m:r>
+              <m:r>
+                <m:rPr>
+                  <m:sty m:val="p"/>
+                </m:rPr>
+                <m:t>)</m:t>
+              </m:r>
+              <m:r>
+                <m:t> </m:t>
+              </m:r>
+              <m:r>
+                <m:t>a</m:t>
+              </m:r>
+              <m:r>
+                <m:rPr>
+                  <m:sty m:val="p"/>
+                </m:rPr>
+                <m:t>+</m:t>
+              </m:r>
+              <m:r>
+                <m:rPr>
+                  <m:sty m:val="p"/>
+                </m:rPr>
+                <m:t>(</m:t>
+              </m:r>
+              <m:r>
+                <m:t>a</m:t>
+              </m:r>
+              <m:r>
+                <m:rPr>
+                  <m:sty m:val="p"/>
+                </m:rPr>
+                <m:t>+</m:t>
+              </m:r>
+              <m:r>
+                <m:t>b</m:t>
+              </m:r>
+              <m:r>
+                <m:rPr>
+                  <m:sty m:val="p"/>
+                </m:rPr>
+                <m:t>)</m:t>
+              </m:r>
+              <m:r>
+                <m:t> </m:t>
+              </m:r>
+              <m:r>
+                <m:t>b</m:t>
+              </m:r>
+              <m:r>
+                <m:t>&amp;</m:t>
+              </m:r>
+              <m:r>
+                <m:t>&amp;</m:t>
+              </m:r>
+              <m:r>
+                <m:rPr>
+                  <m:nor/>
+                  <m:sty m:val="p"/>
+                </m:rPr>
+                <m:t>(distributive law)</m:t>
+              </m:r>
+            </m:e>
+            <m:e>
+              <m:r>
+                <m:t>&amp;</m:t>
+              </m:r>
+              <m:r>
+                <m:rPr>
+                  <m:sty m:val="p"/>
+                </m:rPr>
+                <m:t>=</m:t>
+              </m:r>
+              <m:r>
+                <m:rPr>
+                  <m:sty m:val="p"/>
+                </m:rPr>
+                <m:t>(</m:t>
+              </m:r>
+              <m:sSup>
+                <m:e>
+                  <m:r>
+                    <m:t>a</m:t>
+                  </m:r>
+                </m:e>
+                <m:sup>
+                  <m:r>
+                    <m:t>2</m:t>
+                  </m:r>
+                </m:sup>
+              </m:sSup>
+              <m:r>
+                <m:rPr>
+                  <m:sty m:val="p"/>
+                </m:rPr>
+                <m:t>+</m:t>
+              </m:r>
+              <m:r>
+                <m:t>b</m:t>
+              </m:r>
+              <m:r>
+                <m:t>a</m:t>
+              </m:r>
+              <m:r>
+                <m:rPr>
+                  <m:sty m:val="p"/>
+                </m:rPr>
+                <m:t>)</m:t>
+              </m:r>
+              <m:r>
+                <m:rPr>
+                  <m:sty m:val="p"/>
+                </m:rPr>
+                <m:t>+</m:t>
+              </m:r>
+              <m:r>
+                <m:rPr>
+                  <m:sty m:val="p"/>
+                </m:rPr>
+                <m:t>(</m:t>
+              </m:r>
+              <m:r>
+                <m:t>a</m:t>
+              </m:r>
+              <m:r>
+                <m:t>b</m:t>
+              </m:r>
+              <m:r>
+                <m:rPr>
+                  <m:sty m:val="p"/>
+                </m:rPr>
+                <m:t>+</m:t>
+              </m:r>
+              <m:sSup>
+                <m:e>
+                  <m:r>
+                    <m:t>b</m:t>
+                  </m:r>
+                </m:e>
+                <m:sup>
+                  <m:r>
+                    <m:t>2</m:t>
+                  </m:r>
+                </m:sup>
+              </m:sSup>
+              <m:r>
+                <m:rPr>
+                  <m:sty m:val="p"/>
+                </m:rPr>
+                <m:t>)</m:t>
+              </m:r>
+              <m:r>
+                <m:t>&amp;</m:t>
+              </m:r>
+              <m:r>
+                <m:t>&amp;</m:t>
+              </m:r>
+              <m:r>
+                <m:rPr>
+                  <m:nor/>
+                  <m:sty m:val="p"/>
+                </m:rPr>
+                <m:t>(distributive law, twice)</m:t>
+              </m:r>
+            </m:e>
+            <m:e>
+              <m:r>
+                <m:t>&amp;</m:t>
+              </m:r>
+              <m:r>
+                <m:rPr>
+                  <m:sty m:val="p"/>
+                </m:rPr>
+                <m:t>=</m:t>
+              </m:r>
+              <m:sSup>
+                <m:e>
+                  <m:r>
+                    <m:t>a</m:t>
+                  </m:r>
+                </m:e>
+                <m:sup>
+                  <m:r>
+                    <m:t>2</m:t>
+                  </m:r>
+                </m:sup>
+              </m:sSup>
+              <m:r>
+                <m:rPr>
+                  <m:sty m:val="p"/>
+                </m:rPr>
+                <m:t>+</m:t>
+              </m:r>
+              <m:r>
+                <m:t>a</m:t>
+              </m:r>
+              <m:r>
+                <m:t>b</m:t>
+              </m:r>
+              <m:r>
+                <m:rPr>
+                  <m:sty m:val="p"/>
+                </m:rPr>
+                <m:t>+</m:t>
+              </m:r>
+              <m:r>
+                <m:t>a</m:t>
+              </m:r>
+              <m:r>
+                <m:t>b</m:t>
+              </m:r>
+              <m:r>
+                <m:rPr>
+                  <m:sty m:val="p"/>
+                </m:rPr>
+                <m:t>+</m:t>
+              </m:r>
+              <m:sSup>
+                <m:e>
+                  <m:r>
+                    <m:t>b</m:t>
+                  </m:r>
+                </m:e>
+                <m:sup>
+                  <m:r>
+                    <m:t>2</m:t>
+                  </m:r>
+                </m:sup>
+              </m:sSup>
+              <m:r>
+                <m:t>&amp;</m:t>
+              </m:r>
+              <m:r>
+                <m:t>&amp;</m:t>
+              </m:r>
+              <m:r>
+                <m:rPr>
+                  <m:nor/>
+                  <m:sty m:val="p"/>
+                </m:rPr>
+                <m:t>(commutative and associative laws)</m:t>
+              </m:r>
+            </m:e>
+            <m:e>
+              <m:r>
+                <m:t>&amp;</m:t>
+              </m:r>
+              <m:r>
+                <m:rPr>
+                  <m:sty m:val="p"/>
+                </m:rPr>
+                <m:t>=</m:t>
+              </m:r>
+              <m:sSup>
+                <m:e>
+                  <m:r>
+                    <m:t>a</m:t>
+                  </m:r>
+                </m:e>
+                <m:sup>
+                  <m:r>
+                    <m:t>2</m:t>
+                  </m:r>
+                </m:sup>
+              </m:sSup>
+              <m:r>
+                <m:rPr>
+                  <m:sty m:val="p"/>
+                </m:rPr>
+                <m:t>+</m:t>
+              </m:r>
+              <m:r>
+                <m:t>2</m:t>
+              </m:r>
+              <m:r>
+                <m:t>a</m:t>
+              </m:r>
+              <m:r>
+                <m:t>b</m:t>
+              </m:r>
+              <m:r>
+                <m:rPr>
+                  <m:sty m:val="p"/>
+                </m:rPr>
+                <m:t>+</m:t>
+              </m:r>
+              <m:sSup>
+                <m:e>
+                  <m:r>
+                    <m:t>b</m:t>
+                  </m:r>
+                </m:e>
+                <m:sup>
+                  <m:r>
+                    <m:t>2</m:t>
+                  </m:r>
+                </m:sup>
+              </m:sSup>
+              <m:r>
+                <m:t>&amp;</m:t>
+              </m:r>
+              <m:r>
+                <m:t>&amp;</m:t>
+              </m:r>
+              <m:r>
+                <m:rPr>
+                  <m:nor/>
+                  <m:sty m:val="p"/>
+                </m:rPr>
+                <m:t>(collect like terms)</m:t>
+              </m:r>
+            </m:e>
+          </m:eqArr>
+        </m:oMath>
+      </m:oMathPara>
+    </w:p>
+    <w:p>
+      <w:pPr>
+        <w:pStyle w:val="FirstParagraph"/>
+      </w:pPr>
+      <w:r>
+        <w:t xml:space="preserve">The step</w:t>
+      </w:r>
+      <w:r>
+        <w:t xml:space="preserve"> </w:t>
+      </w:r>
+      <w:r>
+        <w:t xml:space="preserve">“commutative and associative laws”</w:t>
+      </w:r>
+      <w:r>
+        <w:t xml:space="preserve"> </w:t>
+      </w:r>
+      <w:r>
+        <w:t xml:space="preserve">uses</w:t>
+      </w:r>
+      <w:r>
+        <w:t xml:space="preserve"> </w:t>
+      </w:r>
+      <w:hyperlink w:anchor="thm-prod-symmetric">
+        <w:r>
+          <w:rPr>
+            <w:rStyle w:val="Hyperlink"/>
+          </w:rPr>
+          <w:t xml:space="preserve">Theorem 11</w:t>
+        </w:r>
+      </w:hyperlink>
+      <w:r>
+        <w:t xml:space="preserve"> </w:t>
+      </w:r>
+      <w:r>
+        <w:t xml:space="preserve">to write</w:t>
+      </w:r>
+      <w:r>
+        <w:t xml:space="preserve"> </w:t>
+      </w:r>
+      <m:oMath>
+        <m:r>
+          <m:t>b</m:t>
+        </m:r>
+        <m:r>
+          <m:t>a</m:t>
+        </m:r>
+      </m:oMath>
+      <w:r>
+        <w:t xml:space="preserve"> </w:t>
+      </w:r>
+      <w:r>
+        <w:t xml:space="preserve">as</w:t>
+      </w:r>
+      <w:r>
+        <w:t xml:space="preserve"> </w:t>
+      </w:r>
+      <m:oMath>
+        <m:r>
+          <m:t>a</m:t>
+        </m:r>
+        <m:r>
+          <m:t>b</m:t>
+        </m:r>
+      </m:oMath>
+      <w:r>
+        <w:t xml:space="preserve">,</w:t>
+      </w:r>
+      <w:r>
+        <w:t xml:space="preserve"> </w:t>
+      </w:r>
+      <w:r>
+        <w:t xml:space="preserve">and</w:t>
+      </w:r>
+      <w:r>
+        <w:t xml:space="preserve"> </w:t>
+      </w:r>
+      <w:hyperlink w:anchor="thm-sum-assoc">
+        <w:r>
+          <w:rPr>
+            <w:rStyle w:val="Hyperlink"/>
+          </w:rPr>
+          <w:t xml:space="preserve">Theorem 9</w:t>
+        </w:r>
+      </w:hyperlink>
+      <w:r>
+        <w:t xml:space="preserve"> </w:t>
+      </w:r>
+      <w:r>
+        <w:t xml:space="preserve">to drop the parentheses.</w:t>
+      </w:r>
+    </w:p>
+    <w:bookmarkEnd w:id="35"/>
+    <w:bookmarkStart w:id="36" w:name="thm-square-of-a-sum"/>
+    <w:p>
+      <w:pPr>
+        <w:pStyle w:val="BodyText"/>
+      </w:pPr>
+      <w:r>
+        <w:rPr>
+          <w:b/>
+          <w:bCs/>
+        </w:rPr>
+        <w:t xml:space="preserve">Theorem 15 (Square of a sum)</w:t>
+      </w:r>
+      <w:r>
+        <w:t xml:space="preserve"> </w:t>
+      </w:r>
+      <w:r>
+        <w:t xml:space="preserve">For any numbers</w:t>
+      </w:r>
+      <w:r>
+        <w:t xml:space="preserve"> </w:t>
+      </w:r>
+      <m:oMath>
+        <m:r>
+          <m:t>a</m:t>
+        </m:r>
+      </m:oMath>
+      <w:r>
+        <w:t xml:space="preserve"> </w:t>
+      </w:r>
+      <w:r>
+        <w:t xml:space="preserve">and</w:t>
+      </w:r>
+      <w:r>
+        <w:t xml:space="preserve"> </w:t>
+      </w:r>
+      <m:oMath>
+        <m:r>
+          <m:t>b</m:t>
+        </m:r>
+      </m:oMath>
+      <w:r>
+        <w:t xml:space="preserve">,</w:t>
+      </w:r>
+    </w:p>
+    <w:p>
+      <w:pPr>
+        <w:pStyle w:val="BodyText"/>
+      </w:pPr>
+      <m:oMathPara>
+        <m:oMathParaPr>
+          <m:jc m:val="center"/>
+        </m:oMathParaPr>
+        <m:oMath>
+          <m:r>
+            <m:rPr>
+              <m:sty m:val="p"/>
+            </m:rPr>
+            <m:t>(</m:t>
+          </m:r>
+          <m:r>
+            <m:t>a</m:t>
+          </m:r>
+          <m:r>
+            <m:rPr>
+              <m:sty m:val="p"/>
+            </m:rPr>
+            <m:t>+</m:t>
+          </m:r>
+          <m:r>
+            <m:t>b</m:t>
+          </m:r>
+          <m:sSup>
+            <m:e>
+              <m:r>
+                <m:rPr>
+                  <m:sty m:val="p"/>
+                </m:rPr>
+                <m:t>)</m:t>
+              </m:r>
+            </m:e>
+            <m:sup>
+              <m:r>
+                <m:t>2</m:t>
+              </m:r>
+            </m:sup>
+          </m:sSup>
+          <m:r>
+            <m:rPr>
+              <m:sty m:val="p"/>
+            </m:rPr>
+            <m:t>=</m:t>
+          </m:r>
+          <m:sSup>
+            <m:e>
+              <m:r>
+                <m:t>a</m:t>
+              </m:r>
+            </m:e>
+            <m:sup>
+              <m:r>
+                <m:t>2</m:t>
+              </m:r>
+            </m:sup>
+          </m:sSup>
+          <m:r>
+            <m:rPr>
+              <m:sty m:val="p"/>
+            </m:rPr>
+            <m:t>+</m:t>
+          </m:r>
+          <m:r>
+            <m:t>2</m:t>
+          </m:r>
+          <m:r>
+            <m:t>a</m:t>
+          </m:r>
+          <m:r>
+            <m:t>b</m:t>
+          </m:r>
+          <m:r>
+            <m:rPr>
+              <m:sty m:val="p"/>
+            </m:rPr>
+            <m:t>+</m:t>
+          </m:r>
+          <m:sSup>
+            <m:e>
+              <m:r>
+                <m:t>b</m:t>
+              </m:r>
+            </m:e>
+            <m:sup>
+              <m:r>
+                <m:t>2</m:t>
+              </m:r>
+            </m:sup>
+          </m:sSup>
+        </m:oMath>
+      </m:oMathPara>
+    </w:p>
+    <w:bookmarkEnd w:id="36"/>
+    <w:p>
+      <w:pPr>
+        <w:pStyle w:val="FirstParagraph"/>
+      </w:pPr>
+      <w:r>
+        <w:rPr>
+          <w:i/>
+          <w:iCs/>
+        </w:rPr>
+        <w:t xml:space="preserve">Proof</w:t>
+      </w:r>
+      <w:r>
+        <w:t xml:space="preserve">. </w:t>
+      </w:r>
+      <w:r>
+        <w:t xml:space="preserve">By</w:t>
+      </w:r>
+      <w:r>
+        <w:t xml:space="preserve"> </w:t>
+      </w:r>
+      <w:hyperlink w:anchor="sol-square-of-a-sum">
+        <w:r>
+          <w:rPr>
+            <w:rStyle w:val="Hyperlink"/>
+          </w:rPr>
+          <w:t xml:space="preserve">Solution 1</w:t>
+        </w:r>
+      </w:hyperlink>
+      <w:r>
+        <w:t xml:space="preserve">.</w:t>
+      </w:r>
+    </w:p>
+    <w:p>
+      <w:pPr>
+        <w:pStyle w:val="BodyText"/>
+      </w:pPr>
+      <w:r>
+        <w:t xml:space="preserve">Replacing</w:t>
+      </w:r>
+      <w:r>
+        <w:t xml:space="preserve"> </w:t>
+      </w:r>
+      <m:oMath>
+        <m:r>
+          <m:t>b</m:t>
+        </m:r>
+      </m:oMath>
+      <w:r>
+        <w:t xml:space="preserve"> </w:t>
+      </w:r>
+      <w:r>
+        <w:t xml:space="preserve">by</w:t>
+      </w:r>
+      <w:r>
+        <w:t xml:space="preserve"> </w:t>
+      </w:r>
+      <m:oMath>
+        <m:r>
+          <m:rPr>
+            <m:sty m:val="p"/>
+          </m:rPr>
+          <m:t>−</m:t>
+        </m:r>
+        <m:r>
+          <m:t>b</m:t>
+        </m:r>
+      </m:oMath>
+      <w:r>
+        <w:t xml:space="preserve"> </w:t>
+      </w:r>
+      <w:r>
+        <w:t xml:space="preserve">gives</w:t>
+      </w:r>
+      <w:r>
+        <w:t xml:space="preserve"> </w:t>
+      </w:r>
+      <m:oMath>
+        <m:r>
+          <m:rPr>
+            <m:sty m:val="p"/>
+          </m:rPr>
+          <m:t>(</m:t>
+        </m:r>
+        <m:r>
+          <m:t>a</m:t>
+        </m:r>
+        <m:r>
+          <m:rPr>
+            <m:sty m:val="p"/>
+          </m:rPr>
+          <m:t>−</m:t>
+        </m:r>
+        <m:r>
+          <m:t>b</m:t>
+        </m:r>
+        <m:sSup>
+          <m:e>
+            <m:r>
+              <m:rPr>
+                <m:sty m:val="p"/>
+              </m:rPr>
+              <m:t>)</m:t>
+            </m:r>
+          </m:e>
+          <m:sup>
+            <m:r>
+              <m:t>2</m:t>
+            </m:r>
+          </m:sup>
+        </m:sSup>
+        <m:r>
+          <m:rPr>
+            <m:sty m:val="p"/>
+          </m:rPr>
+          <m:t>=</m:t>
+        </m:r>
+        <m:sSup>
+          <m:e>
+            <m:r>
+              <m:t>a</m:t>
+            </m:r>
+          </m:e>
+          <m:sup>
+            <m:r>
+              <m:t>2</m:t>
+            </m:r>
+          </m:sup>
+        </m:sSup>
+        <m:r>
+          <m:rPr>
+            <m:sty m:val="p"/>
+          </m:rPr>
+          <m:t>−</m:t>
+        </m:r>
+        <m:r>
+          <m:t>2</m:t>
+        </m:r>
+        <m:r>
+          <m:t>a</m:t>
+        </m:r>
+        <m:r>
+          <m:t>b</m:t>
+        </m:r>
+        <m:r>
+          <m:rPr>
+            <m:sty m:val="p"/>
+          </m:rPr>
+          <m:t>+</m:t>
+        </m:r>
+        <m:sSup>
+          <m:e>
+            <m:r>
+              <m:t>b</m:t>
+            </m:r>
+          </m:e>
+          <m:sup>
+            <m:r>
+              <m:t>2</m:t>
+            </m:r>
+          </m:sup>
+        </m:sSup>
+      </m:oMath>
+      <w:r>
+        <w:t xml:space="preserve">.</w:t>
+      </w:r>
+      <w:r>
+        <w:t xml:space="preserve"> </w:t>
+      </w:r>
+      <w:r>
+        <w:t xml:space="preserve">Squared errors such as</w:t>
+      </w:r>
+      <w:r>
+        <w:t xml:space="preserve"> </w:t>
+      </w:r>
+      <m:oMath>
+        <m:r>
+          <m:rPr>
+            <m:sty m:val="p"/>
+          </m:rPr>
+          <m:t>(</m:t>
+        </m:r>
+        <m:r>
+          <m:t>y</m:t>
+        </m:r>
+        <m:r>
+          <m:rPr>
+            <m:sty m:val="p"/>
+          </m:rPr>
+          <m:t>−</m:t>
+        </m:r>
+        <m:acc>
+          <m:accPr>
+            <m:chr m:val="̂"/>
+          </m:accPr>
+          <m:e>
+            <m:r>
+              <m:t>y</m:t>
+            </m:r>
+          </m:e>
+        </m:acc>
+        <m:sSup>
+          <m:e>
+            <m:r>
+              <m:rPr>
+                <m:sty m:val="p"/>
+              </m:rPr>
+              <m:t>)</m:t>
+            </m:r>
+          </m:e>
+          <m:sup>
+            <m:r>
+              <m:t>2</m:t>
+            </m:r>
+          </m:sup>
+        </m:sSup>
+      </m:oMath>
+      <w:r>
+        <w:t xml:space="preserve"> </w:t>
+      </w:r>
+      <w:r>
+        <w:t xml:space="preserve">are expanded this way.</w:t>
+      </w:r>
+    </w:p>
+    <w:bookmarkEnd w:id="37"/>
+    <w:bookmarkStart w:id="49" w:name="quotients"/>
+    <w:p>
+      <w:pPr>
         <w:pStyle w:val="Heading2"/>
       </w:pPr>
       <w:r>
         <w:t xml:space="preserve">8 Quotients</w:t>
       </w:r>
     </w:p>
-    <w:bookmarkStart w:id="35" w:name="def-quotient"/>
+    <w:bookmarkStart w:id="38" w:name="def-quotient"/>
     <w:p>
       <w:pPr>
         <w:pStyle w:val="FirstParagraph"/>
@@ -3318,7 +4662,7 @@
         </m:oMath>
       </m:oMathPara>
     </w:p>
-    <w:bookmarkEnd w:id="35"/>
+    <w:bookmarkEnd w:id="38"/>
     <w:p>
       <w:pPr>
         <w:pStyle w:val="FirstParagraph"/>
@@ -3435,7 +4779,7 @@
       <w:r>
         <w:t xml:space="preserve">cf. </w:t>
       </w:r>
-      <w:hyperlink r:id="rId36">
+      <w:hyperlink r:id="rId39">
         <w:r>
           <w:rPr>
             <w:rStyle w:val="Hyperlink"/>
@@ -3444,7 +4788,7 @@
         </w:r>
       </w:hyperlink>
     </w:p>
-    <w:bookmarkStart w:id="37" w:name="exm-quotient"/>
+    <w:bookmarkStart w:id="40" w:name="exm-quotient"/>
     <w:p>
       <w:pPr>
         <w:pStyle w:val="BodyText"/>
@@ -3580,8 +4924,8 @@
         <w:t xml:space="preserve">requires a nonzero denominator.</w:t>
       </w:r>
     </w:p>
-    <w:bookmarkEnd w:id="37"/>
-    <w:bookmarkStart w:id="39" w:name="def-ratio"/>
+    <w:bookmarkEnd w:id="40"/>
+    <w:bookmarkStart w:id="42" w:name="def-ratio"/>
     <w:p>
       <w:pPr>
         <w:pStyle w:val="BodyText"/>
@@ -3623,7 +4967,7 @@
       <w:r>
         <w:t xml:space="preserve">cf. </w:t>
       </w:r>
-      <w:hyperlink r:id="rId38">
+      <w:hyperlink r:id="rId41">
         <w:r>
           <w:rPr>
             <w:rStyle w:val="Hyperlink"/>
@@ -3632,8 +4976,8 @@
         </w:r>
       </w:hyperlink>
     </w:p>
-    <w:bookmarkEnd w:id="39"/>
-    <w:bookmarkStart w:id="42" w:name="def-proportion"/>
+    <w:bookmarkEnd w:id="42"/>
+    <w:bookmarkStart w:id="45" w:name="def-proportion"/>
     <w:p>
       <w:pPr>
         <w:pStyle w:val="BodyText"/>
@@ -3684,7 +5028,7 @@
       <w:r>
         <w:t xml:space="preserve"> </w:t>
       </w:r>
-      <w:hyperlink r:id="rId40">
+      <w:hyperlink r:id="rId43">
         <w:r>
           <w:rPr>
             <w:rStyle w:val="Hyperlink"/>
@@ -3706,7 +5050,7 @@
       <w:r>
         <w:t xml:space="preserve"> </w:t>
       </w:r>
-      <w:hyperlink r:id="rId41">
+      <w:hyperlink r:id="rId44">
         <w:r>
           <w:rPr>
             <w:rStyle w:val="Hyperlink"/>
@@ -3721,8 +5065,8 @@
         <w:t xml:space="preserve">for other meanings.</w:t>
       </w:r>
     </w:p>
-    <w:bookmarkEnd w:id="42"/>
-    <w:bookmarkStart w:id="44" w:name="def-proportional"/>
+    <w:bookmarkEnd w:id="45"/>
+    <w:bookmarkStart w:id="47" w:name="def-proportional"/>
     <w:p>
       <w:pPr>
         <w:pStyle w:val="BodyText"/>
@@ -3893,7 +5237,7 @@
       <w:r>
         <w:t xml:space="preserve">(cf. </w:t>
       </w:r>
-      <w:hyperlink r:id="rId43">
+      <w:hyperlink r:id="rId46">
         <w:r>
           <w:rPr>
             <w:rStyle w:val="Hyperlink"/>
@@ -3905,7 +5249,7 @@
         <w:t xml:space="preserve">)</w:t>
       </w:r>
     </w:p>
-    <w:bookmarkEnd w:id="44"/>
+    <w:bookmarkEnd w:id="47"/>
     <w:p>
       <w:pPr>
         <w:pStyle w:val="BodyText"/>
@@ -3916,7 +5260,7 @@
       <w:r>
         <w:t xml:space="preserve"> </w:t>
       </w:r>
-      <w:hyperlink r:id="rId45">
+      <w:hyperlink r:id="rId48">
         <w:r>
           <w:rPr>
             <w:rStyle w:val="Hyperlink"/>
@@ -3925,8 +5269,8 @@
         </w:r>
       </w:hyperlink>
     </w:p>
-    <w:bookmarkEnd w:id="46"/>
-    <w:bookmarkStart w:id="65" w:name="exponentials-and-logarithms"/>
+    <w:bookmarkEnd w:id="49"/>
+    <w:bookmarkStart w:id="68" w:name="exponentials-and-logarithms"/>
     <w:p>
       <w:pPr>
         <w:pStyle w:val="Heading2"/>
@@ -4137,7 +5481,7 @@
         <w:t xml:space="preserve">for base 10.</w:t>
       </w:r>
     </w:p>
-    <w:bookmarkStart w:id="47" w:name="thm-exp-log-inverse"/>
+    <w:bookmarkStart w:id="50" w:name="thm-exp-log-inverse"/>
     <w:p>
       <w:pPr>
         <w:pStyle w:val="BodyText"/>
@@ -4147,7 +5491,7 @@
           <w:b/>
           <w:bCs/>
         </w:rPr>
-        <w:t xml:space="preserve">Theorem 15 (</w:t>
+        <w:t xml:space="preserve">Theorem 16 (</w:t>
       </w:r>
       <m:oMath>
         <m:r>
@@ -4433,8 +5777,8 @@
         <w:t xml:space="preserve">.</w:t>
       </w:r>
     </w:p>
-    <w:bookmarkEnd w:id="47"/>
-    <w:bookmarkStart w:id="48" w:name="thm-log-prod"/>
+    <w:bookmarkEnd w:id="50"/>
+    <w:bookmarkStart w:id="51" w:name="thm-log-prod"/>
     <w:p>
       <w:pPr>
         <w:pStyle w:val="FirstParagraph"/>
@@ -4444,7 +5788,7 @@
           <w:b/>
           <w:bCs/>
         </w:rPr>
-        <w:t xml:space="preserve">Theorem 16 (Logarithm of a product)</w:t>
+        <w:t xml:space="preserve">Theorem 17 (Logarithm of a product)</w:t>
       </w:r>
       <w:r>
         <w:t xml:space="preserve"> </w:t>
@@ -4604,8 +5948,8 @@
         </m:oMath>
       </m:oMathPara>
     </w:p>
-    <w:bookmarkEnd w:id="48"/>
-    <w:bookmarkStart w:id="49" w:name="cor-log-quot"/>
+    <w:bookmarkEnd w:id="51"/>
+    <w:bookmarkStart w:id="52" w:name="cor-log-quot"/>
     <w:p>
       <w:pPr>
         <w:pStyle w:val="FirstParagraph"/>
@@ -4778,7 +6122,7 @@
         </m:oMath>
       </m:oMathPara>
     </w:p>
-    <w:bookmarkEnd w:id="49"/>
+    <w:bookmarkEnd w:id="52"/>
     <w:p>
       <w:pPr>
         <w:pStyle w:val="FirstParagraph"/>
@@ -4879,7 +6223,7 @@
           <w:rPr>
             <w:rStyle w:val="Hyperlink"/>
           </w:rPr>
-          <w:t xml:space="preserve">Theorem 16</w:t>
+          <w:t xml:space="preserve">Theorem 17</w:t>
         </w:r>
       </w:hyperlink>
       <w:r>
@@ -5177,7 +6521,7 @@
           <w:rPr>
             <w:rStyle w:val="Hyperlink"/>
           </w:rPr>
-          <w:t xml:space="preserve">Theorem 16</w:t>
+          <w:t xml:space="preserve">Theorem 17</w:t>
         </w:r>
       </w:hyperlink>
       <w:r>
@@ -5333,7 +6677,7 @@
         <w:t xml:space="preserve">.</w:t>
       </w:r>
     </w:p>
-    <w:bookmarkStart w:id="50" w:name="thm-log-exp"/>
+    <w:bookmarkStart w:id="53" w:name="thm-log-exp"/>
     <w:p>
       <w:pPr>
         <w:pStyle w:val="BodyText"/>
@@ -5343,7 +6687,7 @@
           <w:b/>
           <w:bCs/>
         </w:rPr>
-        <w:t xml:space="preserve">Theorem 17 (Logarithm of a power)</w:t>
+        <w:t xml:space="preserve">Theorem 18 (Logarithm of a power)</w:t>
       </w:r>
       <w:r>
         <w:t xml:space="preserve"> </w:t>
@@ -5485,8 +6829,8 @@
         </m:oMath>
       </m:oMathPara>
     </w:p>
-    <w:bookmarkEnd w:id="50"/>
-    <w:bookmarkStart w:id="51" w:name="thm-exp-sum"/>
+    <w:bookmarkEnd w:id="53"/>
+    <w:bookmarkStart w:id="54" w:name="thm-exp-sum"/>
     <w:p>
       <w:pPr>
         <w:pStyle w:val="FirstParagraph"/>
@@ -5496,7 +6840,7 @@
           <w:b/>
           <w:bCs/>
         </w:rPr>
-        <w:t xml:space="preserve">Theorem 18 (exponential of a sum)</w:t>
+        <w:t xml:space="preserve">Theorem 19 (exponential of a sum)</w:t>
       </w:r>
       <w:r>
         <w:t xml:space="preserve"> </w:t>
@@ -5621,8 +6965,8 @@
         </m:oMath>
       </m:oMathPara>
     </w:p>
-    <w:bookmarkEnd w:id="51"/>
-    <w:bookmarkStart w:id="52" w:name="cor-exp-sum"/>
+    <w:bookmarkEnd w:id="54"/>
+    <w:bookmarkStart w:id="55" w:name="cor-exp-sum"/>
     <w:p>
       <w:pPr>
         <w:pStyle w:val="FirstParagraph"/>
@@ -5772,8 +7116,8 @@
         </m:oMath>
       </m:oMathPara>
     </w:p>
-    <w:bookmarkEnd w:id="52"/>
-    <w:bookmarkStart w:id="53" w:name="thm-double-exp"/>
+    <w:bookmarkEnd w:id="55"/>
+    <w:bookmarkStart w:id="56" w:name="thm-double-exp"/>
     <w:p>
       <w:pPr>
         <w:pStyle w:val="FirstParagraph"/>
@@ -5783,7 +7127,7 @@
           <w:b/>
           <w:bCs/>
         </w:rPr>
-        <w:t xml:space="preserve">Theorem 19 (Power of a power)</w:t>
+        <w:t xml:space="preserve">Theorem 20 (Power of a power)</w:t>
       </w:r>
       <w:r>
         <w:t xml:space="preserve"> </w:t>
@@ -5961,8 +7305,8 @@
         </m:oMath>
       </m:oMathPara>
     </w:p>
-    <w:bookmarkEnd w:id="53"/>
-    <w:bookmarkStart w:id="54" w:name="exm-double-exp-negative-base"/>
+    <w:bookmarkEnd w:id="56"/>
+    <w:bookmarkStart w:id="57" w:name="exm-double-exp-negative-base"/>
     <w:p>
       <w:pPr>
         <w:pStyle w:val="FirstParagraph"/>
@@ -6487,7 +7831,7 @@
           <w:rPr>
             <w:rStyle w:val="Hyperlink"/>
           </w:rPr>
-          <w:t xml:space="preserve">Theorem 19</w:t>
+          <w:t xml:space="preserve">Theorem 20</w:t>
         </w:r>
       </w:hyperlink>
       <w:r>
@@ -6647,8 +7991,8 @@
         <w:t xml:space="preserve">is not even a real number.</w:t>
       </w:r>
     </w:p>
-    <w:bookmarkEnd w:id="54"/>
-    <w:bookmarkStart w:id="55" w:name="cor-exp-ab"/>
+    <w:bookmarkEnd w:id="57"/>
+    <w:bookmarkStart w:id="58" w:name="cor-exp-ab"/>
     <w:p>
       <w:pPr>
         <w:pStyle w:val="BodyText"/>
@@ -6805,8 +8149,8 @@
         </m:oMath>
       </m:oMathPara>
     </w:p>
-    <w:bookmarkEnd w:id="55"/>
-    <w:bookmarkStart w:id="56" w:name="exr-exp-vs-mult"/>
+    <w:bookmarkEnd w:id="58"/>
+    <w:bookmarkStart w:id="59" w:name="exr-exp-vs-mult"/>
     <w:p>
       <w:pPr>
         <w:pStyle w:val="FirstParagraph"/>
@@ -6816,7 +8160,7 @@
           <w:b/>
           <w:bCs/>
         </w:rPr>
-        <w:t xml:space="preserve">Exercise 1</w:t>
+        <w:t xml:space="preserve">Exercise 2</w:t>
       </w:r>
       <w:r>
         <w:t xml:space="preserve"> </w:t>
@@ -6890,8 +8234,8 @@
         <w:t xml:space="preserve">?</w:t>
       </w:r>
     </w:p>
-    <w:bookmarkEnd w:id="56"/>
-    <w:bookmarkStart w:id="59" w:name="sol-exp-vs-mult"/>
+    <w:bookmarkEnd w:id="59"/>
+    <w:bookmarkStart w:id="62" w:name="sol-exp-vs-mult"/>
     <w:p>
       <w:pPr>
         <w:pStyle w:val="BodyText"/>
@@ -6901,7 +8245,7 @@
           <w:i/>
           <w:iCs/>
         </w:rPr>
-        <w:t xml:space="preserve">Solution 1</w:t>
+        <w:t xml:space="preserve">Solution 2</w:t>
       </w:r>
       <w:r>
         <w:t xml:space="preserve">. </w:t>
@@ -8675,7 +10019,7 @@
       <w:tr>
         <w:tc>
           <w:tcPr/>
-          <w:bookmarkStart w:id="57" w:name="fig-double-exponential"/>
+          <w:bookmarkStart w:id="60" w:name="fig-double-exponential"/>
           <w:p>
             <w:pPr>
               <w:pStyle w:val="Compact"/>
@@ -8742,7 +10086,7 @@
               </m:sSup>
             </m:oMath>
           </w:p>
-          <w:bookmarkEnd w:id="57"/>
+          <w:bookmarkEnd w:id="60"/>
         </w:tc>
       </w:tr>
     </w:tbl>
@@ -8767,7 +10111,7 @@
       <w:tr>
         <w:tc>
           <w:tcPr/>
-          <w:bookmarkStart w:id="58" w:name="fig-double-exponential2"/>
+          <w:bookmarkStart w:id="61" w:name="fig-double-exponential2"/>
           <w:p>
             <w:pPr>
               <w:pStyle w:val="Compact"/>
@@ -8884,12 +10228,12 @@
               <w:t xml:space="preserve">.</w:t>
             </w:r>
           </w:p>
-          <w:bookmarkEnd w:id="58"/>
+          <w:bookmarkEnd w:id="61"/>
         </w:tc>
       </w:tr>
     </w:tbl>
-    <w:bookmarkEnd w:id="59"/>
-    <w:bookmarkStart w:id="60" w:name="exr-double-exponential"/>
+    <w:bookmarkEnd w:id="62"/>
+    <w:bookmarkStart w:id="63" w:name="exr-double-exponential"/>
     <w:p>
       <w:pPr>
         <w:pStyle w:val="BodyText"/>
@@ -8899,7 +10243,7 @@
           <w:b/>
           <w:bCs/>
         </w:rPr>
-        <w:t xml:space="preserve">Exercise 2</w:t>
+        <w:t xml:space="preserve">Exercise 3</w:t>
       </w:r>
       <w:r>
         <w:t xml:space="preserve"> </w:t>
@@ -9048,8 +10392,8 @@
         <w:t xml:space="preserve">?</w:t>
       </w:r>
     </w:p>
-    <w:bookmarkEnd w:id="60"/>
-    <w:bookmarkStart w:id="62" w:name="sol-double-exponential"/>
+    <w:bookmarkEnd w:id="63"/>
+    <w:bookmarkStart w:id="65" w:name="sol-double-exponential"/>
     <w:p>
       <w:pPr>
         <w:pStyle w:val="BodyText"/>
@@ -9059,7 +10403,7 @@
           <w:i/>
           <w:iCs/>
         </w:rPr>
-        <w:t xml:space="preserve">Solution 2</w:t>
+        <w:t xml:space="preserve">Solution 3</w:t>
       </w:r>
       <w:r>
         <w:t xml:space="preserve">. </w:t>
@@ -9229,7 +10573,7 @@
           <w:rPr>
             <w:rStyle w:val="Hyperlink"/>
           </w:rPr>
-          <w:t xml:space="preserve">Theorem 19</w:t>
+          <w:t xml:space="preserve">Theorem 20</w:t>
         </w:r>
       </w:hyperlink>
       <w:r>
@@ -9463,7 +10807,7 @@
           <w:rPr>
             <w:rStyle w:val="Hyperlink"/>
           </w:rPr>
-          <w:t xml:space="preserve">Theorem 17</w:t>
+          <w:t xml:space="preserve">Theorem 18</w:t>
         </w:r>
       </w:hyperlink>
       <w:r>
@@ -9474,7 +10818,7 @@
       <w:pPr>
         <w:pStyle w:val="BodyText"/>
       </w:pPr>
-      <w:bookmarkStart w:id="61" w:name="eq-double-exp-log-scale"/>
+      <w:bookmarkStart w:id="64" w:name="eq-double-exp-log-scale"/>
       <m:oMathPara>
         <m:oMathParaPr>
           <m:jc m:val="center"/>
@@ -9781,7 +11125,7 @@
           </m:r>
         </m:oMath>
       </m:oMathPara>
-      <w:bookmarkEnd w:id="61"/>
+      <w:bookmarkEnd w:id="64"/>
     </w:p>
     <w:p>
       <w:pPr>
@@ -9927,7 +11271,7 @@
           <w:rPr>
             <w:rStyle w:val="Hyperlink"/>
           </w:rPr>
-          <w:t xml:space="preserve">Exercise 1</w:t>
+          <w:t xml:space="preserve">Exercise 2</w:t>
         </w:r>
       </w:hyperlink>
       <w:r>
@@ -11103,9 +12447,9 @@
         </m:oMath>
       </m:oMathPara>
     </w:p>
-    <w:bookmarkEnd w:id="62"/>
-    <w:bookmarkStart w:id="64" w:name="refs"/>
-    <w:bookmarkStart w:id="63" w:name="ref-rudin1976principles"/>
+    <w:bookmarkEnd w:id="65"/>
+    <w:bookmarkStart w:id="67" w:name="refs"/>
+    <w:bookmarkStart w:id="66" w:name="ref-rudin1976principles"/>
     <w:p>
       <w:pPr>
         <w:pStyle w:val="Bibliography"/>
@@ -11127,9 +12471,9 @@
         <w:t xml:space="preserve">. 3rd ed. International Series in Pure and Applied Mathematics. McGraw-Hill.</w:t>
       </w:r>
     </w:p>
-    <w:bookmarkEnd w:id="63"/>
-    <w:bookmarkEnd w:id="64"/>
-    <w:bookmarkEnd w:id="65"/>
+    <w:bookmarkEnd w:id="66"/>
+    <w:bookmarkEnd w:id="67"/>
+    <w:bookmarkEnd w:id="68"/>
     <w:sectPr>
       <w:footnotePr>
         <w:numRestart w:val="eachSect"/>

</xml_diff>

<commit_message>
Deploying to gh-pages from @ Morrison-Lab/mds@f629098b094803f403cef5bdcf6207a464d24617 🚀
</commit_message>
<xml_diff>
--- a/algebra.docx
+++ b/algebra.docx
@@ -15,7 +15,7 @@
         <w:pStyle w:val="Date"/>
       </w:pPr>
       <w:r>
-        <w:t xml:space="preserve">Last modified: 2026-10-01 23:40:46 (PDT)</w:t>
+        <w:t xml:space="preserve">Last modified: 2026-10-01 23:47:01 (PDT)</w:t>
       </w:r>
     </w:p>
     <w:bookmarkStart w:id="12" w:name="equalities"/>
@@ -3556,16 +3556,16 @@
     </w:p>
     <w:bookmarkEnd w:id="25"/>
     <w:bookmarkEnd w:id="26"/>
-    <w:bookmarkStart w:id="31" w:name="infimum-and-supremum"/>
+    <w:bookmarkStart w:id="32" w:name="sec-minimizers"/>
     <w:p>
       <w:pPr>
         <w:pStyle w:val="Heading2"/>
       </w:pPr>
       <w:r>
-        <w:t xml:space="preserve">4 Infimum and supremum</w:t>
+        <w:t xml:space="preserve">4 Global and local minimizers</w:t>
       </w:r>
     </w:p>
-    <w:bookmarkStart w:id="27" w:name="def-infimum"/>
+    <w:bookmarkStart w:id="27" w:name="exr-local-vs-global-min"/>
     <w:p>
       <w:pPr>
         <w:pStyle w:val="FirstParagraph"/>
@@ -3575,7 +3575,2803 @@
           <w:b/>
           <w:bCs/>
         </w:rPr>
-        <w:t xml:space="preserve">Definition 5 (Infimum (greatest lower bound))</w:t>
+        <w:t xml:space="preserve">Exercise 2 (A dip that is not the bottom)</w:t>
+      </w:r>
+      <w:r>
+        <w:t xml:space="preserve"> </w:t>
+      </w:r>
+      <w:r>
+        <w:t xml:space="preserve">Let</w:t>
+      </w:r>
+      <w:r>
+        <w:t xml:space="preserve"> </w:t>
+      </w:r>
+      <m:oMath>
+        <m:r>
+          <m:t>f</m:t>
+        </m:r>
+        <m:r>
+          <m:rPr>
+            <m:sty m:val="p"/>
+          </m:rPr>
+          <m:t>(</m:t>
+        </m:r>
+        <m:r>
+          <m:t>x</m:t>
+        </m:r>
+        <m:r>
+          <m:rPr>
+            <m:sty m:val="p"/>
+          </m:rPr>
+          <m:t>)</m:t>
+        </m:r>
+        <m:r>
+          <m:rPr>
+            <m:sty m:val="p"/>
+          </m:rPr>
+          <m:t>=</m:t>
+        </m:r>
+        <m:sSup>
+          <m:e>
+            <m:r>
+              <m:t>x</m:t>
+            </m:r>
+          </m:e>
+          <m:sup>
+            <m:r>
+              <m:t>3</m:t>
+            </m:r>
+          </m:sup>
+        </m:sSup>
+        <m:r>
+          <m:rPr>
+            <m:sty m:val="p"/>
+          </m:rPr>
+          <m:t>−</m:t>
+        </m:r>
+        <m:r>
+          <m:t>3</m:t>
+        </m:r>
+        <m:r>
+          <m:t>x</m:t>
+        </m:r>
+      </m:oMath>
+      <w:r>
+        <w:t xml:space="preserve"> </w:t>
+      </w:r>
+      <w:r>
+        <w:t xml:space="preserve">for</w:t>
+      </w:r>
+      <w:r>
+        <w:t xml:space="preserve"> </w:t>
+      </w:r>
+      <m:oMath>
+        <m:r>
+          <m:t>x</m:t>
+        </m:r>
+        <m:r>
+          <m:rPr>
+            <m:sty m:val="p"/>
+          </m:rPr>
+          <m:t>∈</m:t>
+        </m:r>
+        <m:r>
+          <m:rPr>
+            <m:scr m:val="double-struck"/>
+            <m:sty m:val="p"/>
+          </m:rPr>
+          <m:t>R</m:t>
+        </m:r>
+      </m:oMath>
+      <w:r>
+        <w:t xml:space="preserve">.</w:t>
+      </w:r>
+    </w:p>
+    <w:p>
+      <w:pPr>
+        <w:pStyle w:val="Compact"/>
+        <w:numPr>
+          <w:ilvl w:val="0"/>
+          <w:numId w:val="1003"/>
+        </w:numPr>
+      </w:pPr>
+      <w:r>
+        <w:t xml:space="preserve">Show that</w:t>
+      </w:r>
+      <w:r>
+        <w:t xml:space="preserve"> </w:t>
+      </w:r>
+      <m:oMath>
+        <m:r>
+          <m:t>f</m:t>
+        </m:r>
+        <m:r>
+          <m:rPr>
+            <m:sty m:val="p"/>
+          </m:rPr>
+          <m:t>(</m:t>
+        </m:r>
+        <m:r>
+          <m:t>x</m:t>
+        </m:r>
+        <m:r>
+          <m:rPr>
+            <m:sty m:val="p"/>
+          </m:rPr>
+          <m:t>)</m:t>
+        </m:r>
+        <m:r>
+          <m:rPr>
+            <m:sty m:val="p"/>
+          </m:rPr>
+          <m:t>−</m:t>
+        </m:r>
+        <m:r>
+          <m:t>f</m:t>
+        </m:r>
+        <m:r>
+          <m:rPr>
+            <m:sty m:val="p"/>
+          </m:rPr>
+          <m:t>(</m:t>
+        </m:r>
+        <m:r>
+          <m:t>1</m:t>
+        </m:r>
+        <m:r>
+          <m:rPr>
+            <m:sty m:val="p"/>
+          </m:rPr>
+          <m:t>)</m:t>
+        </m:r>
+        <m:r>
+          <m:rPr>
+            <m:sty m:val="p"/>
+          </m:rPr>
+          <m:t>=</m:t>
+        </m:r>
+        <m:r>
+          <m:rPr>
+            <m:sty m:val="p"/>
+          </m:rPr>
+          <m:t>(</m:t>
+        </m:r>
+        <m:r>
+          <m:t>x</m:t>
+        </m:r>
+        <m:r>
+          <m:rPr>
+            <m:sty m:val="p"/>
+          </m:rPr>
+          <m:t>−</m:t>
+        </m:r>
+        <m:r>
+          <m:t>1</m:t>
+        </m:r>
+        <m:sSup>
+          <m:e>
+            <m:r>
+              <m:rPr>
+                <m:sty m:val="p"/>
+              </m:rPr>
+              <m:t>)</m:t>
+            </m:r>
+          </m:e>
+          <m:sup>
+            <m:r>
+              <m:t>2</m:t>
+            </m:r>
+          </m:sup>
+        </m:sSup>
+        <m:r>
+          <m:rPr>
+            <m:sty m:val="p"/>
+          </m:rPr>
+          <m:t>(</m:t>
+        </m:r>
+        <m:r>
+          <m:t>x</m:t>
+        </m:r>
+        <m:r>
+          <m:rPr>
+            <m:sty m:val="p"/>
+          </m:rPr>
+          <m:t>+</m:t>
+        </m:r>
+        <m:r>
+          <m:t>2</m:t>
+        </m:r>
+        <m:r>
+          <m:rPr>
+            <m:sty m:val="p"/>
+          </m:rPr>
+          <m:t>)</m:t>
+        </m:r>
+      </m:oMath>
+      <w:r>
+        <w:t xml:space="preserve">.</w:t>
+      </w:r>
+    </w:p>
+    <w:p>
+      <w:pPr>
+        <w:pStyle w:val="Compact"/>
+        <w:numPr>
+          <w:ilvl w:val="0"/>
+          <w:numId w:val="1003"/>
+        </w:numPr>
+      </w:pPr>
+      <w:r>
+        <w:t xml:space="preserve">Use part 1 to show that</w:t>
+      </w:r>
+      <w:r>
+        <w:t xml:space="preserve"> </w:t>
+      </w:r>
+      <m:oMath>
+        <m:r>
+          <m:t>f</m:t>
+        </m:r>
+        <m:r>
+          <m:rPr>
+            <m:sty m:val="p"/>
+          </m:rPr>
+          <m:t>(</m:t>
+        </m:r>
+        <m:r>
+          <m:t>x</m:t>
+        </m:r>
+        <m:r>
+          <m:rPr>
+            <m:sty m:val="p"/>
+          </m:rPr>
+          <m:t>)</m:t>
+        </m:r>
+        <m:r>
+          <m:rPr>
+            <m:sty m:val="p"/>
+          </m:rPr>
+          <m:t>≥</m:t>
+        </m:r>
+        <m:r>
+          <m:t>f</m:t>
+        </m:r>
+        <m:r>
+          <m:rPr>
+            <m:sty m:val="p"/>
+          </m:rPr>
+          <m:t>(</m:t>
+        </m:r>
+        <m:r>
+          <m:t>1</m:t>
+        </m:r>
+        <m:r>
+          <m:rPr>
+            <m:sty m:val="p"/>
+          </m:rPr>
+          <m:t>)</m:t>
+        </m:r>
+      </m:oMath>
+      <w:r>
+        <w:t xml:space="preserve"> </w:t>
+      </w:r>
+      <w:r>
+        <w:t xml:space="preserve">for every</w:t>
+      </w:r>
+      <w:r>
+        <w:t xml:space="preserve"> </w:t>
+      </w:r>
+      <m:oMath>
+        <m:r>
+          <m:t>x</m:t>
+        </m:r>
+      </m:oMath>
+      <w:r>
+        <w:t xml:space="preserve"> </w:t>
+      </w:r>
+      <w:r>
+        <w:t xml:space="preserve">in the interval</w:t>
+      </w:r>
+      <w:r>
+        <w:t xml:space="preserve"> </w:t>
+      </w:r>
+      <m:oMath>
+        <m:r>
+          <m:rPr>
+            <m:sty m:val="p"/>
+          </m:rPr>
+          <m:t>(</m:t>
+        </m:r>
+        <m:r>
+          <m:t>0</m:t>
+        </m:r>
+        <m:r>
+          <m:rPr>
+            <m:sty m:val="p"/>
+          </m:rPr>
+          <m:t>,</m:t>
+        </m:r>
+        <m:r>
+          <m:t>2</m:t>
+        </m:r>
+        <m:r>
+          <m:rPr>
+            <m:sty m:val="p"/>
+          </m:rPr>
+          <m:t>)</m:t>
+        </m:r>
+      </m:oMath>
+      <w:r>
+        <w:t xml:space="preserve">.</w:t>
+      </w:r>
+    </w:p>
+    <w:p>
+      <w:pPr>
+        <w:pStyle w:val="Compact"/>
+        <w:numPr>
+          <w:ilvl w:val="0"/>
+          <w:numId w:val="1003"/>
+        </w:numPr>
+      </w:pPr>
+      <w:r>
+        <w:t xml:space="preserve">Compute</w:t>
+      </w:r>
+      <w:r>
+        <w:t xml:space="preserve"> </w:t>
+      </w:r>
+      <m:oMath>
+        <m:r>
+          <m:t>f</m:t>
+        </m:r>
+        <m:r>
+          <m:rPr>
+            <m:sty m:val="p"/>
+          </m:rPr>
+          <m:t>(</m:t>
+        </m:r>
+        <m:r>
+          <m:rPr>
+            <m:sty m:val="p"/>
+          </m:rPr>
+          <m:t>−</m:t>
+        </m:r>
+        <m:r>
+          <m:t>3</m:t>
+        </m:r>
+        <m:r>
+          <m:rPr>
+            <m:sty m:val="p"/>
+          </m:rPr>
+          <m:t>)</m:t>
+        </m:r>
+      </m:oMath>
+      <w:r>
+        <w:t xml:space="preserve">.</w:t>
+      </w:r>
+      <w:r>
+        <w:t xml:space="preserve"> </w:t>
+      </w:r>
+      <w:r>
+        <w:t xml:space="preserve">Is</w:t>
+      </w:r>
+      <w:r>
+        <w:t xml:space="preserve"> </w:t>
+      </w:r>
+      <m:oMath>
+        <m:r>
+          <m:t>f</m:t>
+        </m:r>
+        <m:r>
+          <m:rPr>
+            <m:sty m:val="p"/>
+          </m:rPr>
+          <m:t>(</m:t>
+        </m:r>
+        <m:r>
+          <m:t>1</m:t>
+        </m:r>
+        <m:r>
+          <m:rPr>
+            <m:sty m:val="p"/>
+          </m:rPr>
+          <m:t>)</m:t>
+        </m:r>
+      </m:oMath>
+      <w:r>
+        <w:t xml:space="preserve"> </w:t>
+      </w:r>
+      <w:r>
+        <w:t xml:space="preserve">the smallest value</w:t>
+      </w:r>
+      <w:r>
+        <w:t xml:space="preserve"> </w:t>
+      </w:r>
+      <m:oMath>
+        <m:r>
+          <m:t>f</m:t>
+        </m:r>
+      </m:oMath>
+      <w:r>
+        <w:t xml:space="preserve"> </w:t>
+      </w:r>
+      <w:r>
+        <w:t xml:space="preserve">takes on all of</w:t>
+      </w:r>
+      <w:r>
+        <w:t xml:space="preserve"> </w:t>
+      </w:r>
+      <m:oMath>
+        <m:r>
+          <m:rPr>
+            <m:scr m:val="double-struck"/>
+            <m:sty m:val="p"/>
+          </m:rPr>
+          <m:t>R</m:t>
+        </m:r>
+      </m:oMath>
+      <w:r>
+        <w:t xml:space="preserve">?</w:t>
+      </w:r>
+    </w:p>
+    <w:p>
+      <w:pPr>
+        <w:pStyle w:val="Compact"/>
+        <w:numPr>
+          <w:ilvl w:val="0"/>
+          <w:numId w:val="1003"/>
+        </w:numPr>
+      </w:pPr>
+      <w:r>
+        <w:t xml:space="preserve">Does</w:t>
+      </w:r>
+      <w:r>
+        <w:t xml:space="preserve"> </w:t>
+      </w:r>
+      <m:oMath>
+        <m:r>
+          <m:t>f</m:t>
+        </m:r>
+      </m:oMath>
+      <w:r>
+        <w:t xml:space="preserve"> </w:t>
+      </w:r>
+      <w:r>
+        <w:t xml:space="preserve">take a smallest value anywhere on</w:t>
+      </w:r>
+      <w:r>
+        <w:t xml:space="preserve"> </w:t>
+      </w:r>
+      <m:oMath>
+        <m:r>
+          <m:rPr>
+            <m:scr m:val="double-struck"/>
+            <m:sty m:val="p"/>
+          </m:rPr>
+          <m:t>R</m:t>
+        </m:r>
+      </m:oMath>
+      <w:r>
+        <w:t xml:space="preserve">?</w:t>
+      </w:r>
+    </w:p>
+    <w:bookmarkEnd w:id="27"/>
+    <w:bookmarkStart w:id="28" w:name="sol-local-vs-global-min"/>
+    <w:p>
+      <w:pPr>
+        <w:pStyle w:val="FirstParagraph"/>
+      </w:pPr>
+      <w:r>
+        <w:rPr>
+          <w:i/>
+          <w:iCs/>
+        </w:rPr>
+        <w:t xml:space="preserve">Solution 2</w:t>
+      </w:r>
+      <w:r>
+        <w:t xml:space="preserve">. </w:t>
+      </w:r>
+    </w:p>
+    <w:p>
+      <w:pPr>
+        <w:numPr>
+          <w:ilvl w:val="0"/>
+          <w:numId w:val="1004"/>
+        </w:numPr>
+      </w:pPr>
+      <w:r>
+        <w:t xml:space="preserve">Since</w:t>
+      </w:r>
+      <w:r>
+        <w:t xml:space="preserve"> </w:t>
+      </w:r>
+      <m:oMath>
+        <m:r>
+          <m:t>f</m:t>
+        </m:r>
+        <m:r>
+          <m:rPr>
+            <m:sty m:val="p"/>
+          </m:rPr>
+          <m:t>(</m:t>
+        </m:r>
+        <m:r>
+          <m:t>1</m:t>
+        </m:r>
+        <m:r>
+          <m:rPr>
+            <m:sty m:val="p"/>
+          </m:rPr>
+          <m:t>)</m:t>
+        </m:r>
+        <m:r>
+          <m:rPr>
+            <m:sty m:val="p"/>
+          </m:rPr>
+          <m:t>=</m:t>
+        </m:r>
+        <m:r>
+          <m:t>1</m:t>
+        </m:r>
+        <m:r>
+          <m:rPr>
+            <m:sty m:val="p"/>
+          </m:rPr>
+          <m:t>−</m:t>
+        </m:r>
+        <m:r>
+          <m:t>3</m:t>
+        </m:r>
+        <m:r>
+          <m:rPr>
+            <m:sty m:val="p"/>
+          </m:rPr>
+          <m:t>=</m:t>
+        </m:r>
+        <m:r>
+          <m:rPr>
+            <m:sty m:val="p"/>
+          </m:rPr>
+          <m:t>−</m:t>
+        </m:r>
+        <m:r>
+          <m:t>2</m:t>
+        </m:r>
+      </m:oMath>
+      <w:r>
+        <w:t xml:space="preserve">,</w:t>
+      </w:r>
+    </w:p>
+    <w:p>
+      <w:pPr>
+        <w:pStyle w:val="BodyText"/>
+      </w:pPr>
+      <m:oMathPara>
+        <m:oMathParaPr>
+          <m:jc m:val="center"/>
+        </m:oMathParaPr>
+        <m:oMath>
+          <m:eqArr>
+            <m:e>
+              <m:r>
+                <m:t>f</m:t>
+              </m:r>
+              <m:r>
+                <m:rPr>
+                  <m:sty m:val="p"/>
+                </m:rPr>
+                <m:t>(</m:t>
+              </m:r>
+              <m:r>
+                <m:t>x</m:t>
+              </m:r>
+              <m:r>
+                <m:rPr>
+                  <m:sty m:val="p"/>
+                </m:rPr>
+                <m:t>)</m:t>
+              </m:r>
+              <m:r>
+                <m:rPr>
+                  <m:sty m:val="p"/>
+                </m:rPr>
+                <m:t>−</m:t>
+              </m:r>
+              <m:r>
+                <m:t>f</m:t>
+              </m:r>
+              <m:r>
+                <m:rPr>
+                  <m:sty m:val="p"/>
+                </m:rPr>
+                <m:t>(</m:t>
+              </m:r>
+              <m:r>
+                <m:t>1</m:t>
+              </m:r>
+              <m:r>
+                <m:rPr>
+                  <m:sty m:val="p"/>
+                </m:rPr>
+                <m:t>)</m:t>
+              </m:r>
+              <m:r>
+                <m:t>&amp;</m:t>
+              </m:r>
+              <m:r>
+                <m:rPr>
+                  <m:sty m:val="p"/>
+                </m:rPr>
+                <m:t>=</m:t>
+              </m:r>
+              <m:sSup>
+                <m:e>
+                  <m:r>
+                    <m:t>x</m:t>
+                  </m:r>
+                </m:e>
+                <m:sup>
+                  <m:r>
+                    <m:t>3</m:t>
+                  </m:r>
+                </m:sup>
+              </m:sSup>
+              <m:r>
+                <m:rPr>
+                  <m:sty m:val="p"/>
+                </m:rPr>
+                <m:t>−</m:t>
+              </m:r>
+              <m:r>
+                <m:t>3</m:t>
+              </m:r>
+              <m:r>
+                <m:t>x</m:t>
+              </m:r>
+              <m:r>
+                <m:rPr>
+                  <m:sty m:val="p"/>
+                </m:rPr>
+                <m:t>+</m:t>
+              </m:r>
+              <m:r>
+                <m:t>2</m:t>
+              </m:r>
+            </m:e>
+            <m:e>
+              <m:r>
+                <m:t>&amp;</m:t>
+              </m:r>
+              <m:r>
+                <m:rPr>
+                  <m:sty m:val="p"/>
+                </m:rPr>
+                <m:t>=</m:t>
+              </m:r>
+              <m:r>
+                <m:rPr>
+                  <m:sty m:val="p"/>
+                </m:rPr>
+                <m:t>(</m:t>
+              </m:r>
+              <m:r>
+                <m:t>x</m:t>
+              </m:r>
+              <m:r>
+                <m:rPr>
+                  <m:sty m:val="p"/>
+                </m:rPr>
+                <m:t>−</m:t>
+              </m:r>
+              <m:r>
+                <m:t>1</m:t>
+              </m:r>
+              <m:r>
+                <m:rPr>
+                  <m:sty m:val="p"/>
+                </m:rPr>
+                <m:t>)</m:t>
+              </m:r>
+              <m:r>
+                <m:rPr>
+                  <m:sty m:val="p"/>
+                </m:rPr>
+                <m:t>(</m:t>
+              </m:r>
+              <m:sSup>
+                <m:e>
+                  <m:r>
+                    <m:t>x</m:t>
+                  </m:r>
+                </m:e>
+                <m:sup>
+                  <m:r>
+                    <m:t>2</m:t>
+                  </m:r>
+                </m:sup>
+              </m:sSup>
+              <m:r>
+                <m:rPr>
+                  <m:sty m:val="p"/>
+                </m:rPr>
+                <m:t>+</m:t>
+              </m:r>
+              <m:r>
+                <m:t>x</m:t>
+              </m:r>
+              <m:r>
+                <m:rPr>
+                  <m:sty m:val="p"/>
+                </m:rPr>
+                <m:t>−</m:t>
+              </m:r>
+              <m:r>
+                <m:t>2</m:t>
+              </m:r>
+              <m:r>
+                <m:rPr>
+                  <m:sty m:val="p"/>
+                </m:rPr>
+                <m:t>)</m:t>
+              </m:r>
+            </m:e>
+            <m:e>
+              <m:r>
+                <m:t>&amp;</m:t>
+              </m:r>
+              <m:r>
+                <m:rPr>
+                  <m:sty m:val="p"/>
+                </m:rPr>
+                <m:t>=</m:t>
+              </m:r>
+              <m:r>
+                <m:rPr>
+                  <m:sty m:val="p"/>
+                </m:rPr>
+                <m:t>(</m:t>
+              </m:r>
+              <m:r>
+                <m:t>x</m:t>
+              </m:r>
+              <m:r>
+                <m:rPr>
+                  <m:sty m:val="p"/>
+                </m:rPr>
+                <m:t>−</m:t>
+              </m:r>
+              <m:r>
+                <m:t>1</m:t>
+              </m:r>
+              <m:r>
+                <m:rPr>
+                  <m:sty m:val="p"/>
+                </m:rPr>
+                <m:t>)</m:t>
+              </m:r>
+              <m:r>
+                <m:rPr>
+                  <m:sty m:val="p"/>
+                </m:rPr>
+                <m:t>(</m:t>
+              </m:r>
+              <m:r>
+                <m:t>x</m:t>
+              </m:r>
+              <m:r>
+                <m:rPr>
+                  <m:sty m:val="p"/>
+                </m:rPr>
+                <m:t>−</m:t>
+              </m:r>
+              <m:r>
+                <m:t>1</m:t>
+              </m:r>
+              <m:r>
+                <m:rPr>
+                  <m:sty m:val="p"/>
+                </m:rPr>
+                <m:t>)</m:t>
+              </m:r>
+              <m:r>
+                <m:rPr>
+                  <m:sty m:val="p"/>
+                </m:rPr>
+                <m:t>(</m:t>
+              </m:r>
+              <m:r>
+                <m:t>x</m:t>
+              </m:r>
+              <m:r>
+                <m:rPr>
+                  <m:sty m:val="p"/>
+                </m:rPr>
+                <m:t>+</m:t>
+              </m:r>
+              <m:r>
+                <m:t>2</m:t>
+              </m:r>
+              <m:r>
+                <m:rPr>
+                  <m:sty m:val="p"/>
+                </m:rPr>
+                <m:t>)</m:t>
+              </m:r>
+            </m:e>
+            <m:e>
+              <m:r>
+                <m:t>&amp;</m:t>
+              </m:r>
+              <m:r>
+                <m:rPr>
+                  <m:sty m:val="p"/>
+                </m:rPr>
+                <m:t>=</m:t>
+              </m:r>
+              <m:r>
+                <m:rPr>
+                  <m:sty m:val="p"/>
+                </m:rPr>
+                <m:t>(</m:t>
+              </m:r>
+              <m:r>
+                <m:t>x</m:t>
+              </m:r>
+              <m:r>
+                <m:rPr>
+                  <m:sty m:val="p"/>
+                </m:rPr>
+                <m:t>−</m:t>
+              </m:r>
+              <m:r>
+                <m:t>1</m:t>
+              </m:r>
+              <m:sSup>
+                <m:e>
+                  <m:r>
+                    <m:rPr>
+                      <m:sty m:val="p"/>
+                    </m:rPr>
+                    <m:t>)</m:t>
+                  </m:r>
+                </m:e>
+                <m:sup>
+                  <m:r>
+                    <m:t>2</m:t>
+                  </m:r>
+                </m:sup>
+              </m:sSup>
+              <m:r>
+                <m:rPr>
+                  <m:sty m:val="p"/>
+                </m:rPr>
+                <m:t>(</m:t>
+              </m:r>
+              <m:r>
+                <m:t>x</m:t>
+              </m:r>
+              <m:r>
+                <m:rPr>
+                  <m:sty m:val="p"/>
+                </m:rPr>
+                <m:t>+</m:t>
+              </m:r>
+              <m:r>
+                <m:t>2</m:t>
+              </m:r>
+              <m:r>
+                <m:rPr>
+                  <m:sty m:val="p"/>
+                </m:rPr>
+                <m:t>)</m:t>
+              </m:r>
+              <m:r>
+                <m:rPr>
+                  <m:sty m:val="p"/>
+                </m:rPr>
+                <m:t>.</m:t>
+              </m:r>
+            </m:e>
+          </m:eqArr>
+        </m:oMath>
+      </m:oMathPara>
+    </w:p>
+    <w:p>
+      <w:pPr>
+        <w:numPr>
+          <w:ilvl w:val="0"/>
+          <w:numId w:val="1004"/>
+        </w:numPr>
+      </w:pPr>
+      <w:r>
+        <w:t xml:space="preserve">For</w:t>
+      </w:r>
+      <w:r>
+        <w:t xml:space="preserve"> </w:t>
+      </w:r>
+      <m:oMath>
+        <m:r>
+          <m:t>x</m:t>
+        </m:r>
+        <m:r>
+          <m:rPr>
+            <m:sty m:val="p"/>
+          </m:rPr>
+          <m:t>∈</m:t>
+        </m:r>
+        <m:r>
+          <m:rPr>
+            <m:sty m:val="p"/>
+          </m:rPr>
+          <m:t>(</m:t>
+        </m:r>
+        <m:r>
+          <m:t>0</m:t>
+        </m:r>
+        <m:r>
+          <m:rPr>
+            <m:sty m:val="p"/>
+          </m:rPr>
+          <m:t>,</m:t>
+        </m:r>
+        <m:r>
+          <m:t>2</m:t>
+        </m:r>
+        <m:r>
+          <m:rPr>
+            <m:sty m:val="p"/>
+          </m:rPr>
+          <m:t>)</m:t>
+        </m:r>
+      </m:oMath>
+      <w:r>
+        <w:t xml:space="preserve">,</w:t>
+      </w:r>
+      <w:r>
+        <w:t xml:space="preserve"> </w:t>
+      </w:r>
+      <m:oMath>
+        <m:r>
+          <m:rPr>
+            <m:sty m:val="p"/>
+          </m:rPr>
+          <m:t>(</m:t>
+        </m:r>
+        <m:r>
+          <m:t>x</m:t>
+        </m:r>
+        <m:r>
+          <m:rPr>
+            <m:sty m:val="p"/>
+          </m:rPr>
+          <m:t>−</m:t>
+        </m:r>
+        <m:r>
+          <m:t>1</m:t>
+        </m:r>
+        <m:sSup>
+          <m:e>
+            <m:r>
+              <m:rPr>
+                <m:sty m:val="p"/>
+              </m:rPr>
+              <m:t>)</m:t>
+            </m:r>
+          </m:e>
+          <m:sup>
+            <m:r>
+              <m:t>2</m:t>
+            </m:r>
+          </m:sup>
+        </m:sSup>
+        <m:r>
+          <m:rPr>
+            <m:sty m:val="p"/>
+          </m:rPr>
+          <m:t>≥</m:t>
+        </m:r>
+        <m:r>
+          <m:t>0</m:t>
+        </m:r>
+      </m:oMath>
+      <w:r>
+        <w:t xml:space="preserve"> </w:t>
+      </w:r>
+      <w:r>
+        <w:t xml:space="preserve">and</w:t>
+      </w:r>
+      <w:r>
+        <w:t xml:space="preserve"> </w:t>
+      </w:r>
+      <m:oMath>
+        <m:r>
+          <m:t>x</m:t>
+        </m:r>
+        <m:r>
+          <m:rPr>
+            <m:sty m:val="p"/>
+          </m:rPr>
+          <m:t>+</m:t>
+        </m:r>
+        <m:r>
+          <m:t>2</m:t>
+        </m:r>
+        <m:r>
+          <m:rPr>
+            <m:sty m:val="p"/>
+          </m:rPr>
+          <m:t>&gt;</m:t>
+        </m:r>
+        <m:r>
+          <m:t>0</m:t>
+        </m:r>
+      </m:oMath>
+      <w:r>
+        <w:t xml:space="preserve">,</w:t>
+      </w:r>
+      <w:r>
+        <w:t xml:space="preserve"> </w:t>
+      </w:r>
+      <w:r>
+        <w:t xml:space="preserve">so their product is at least</w:t>
+      </w:r>
+      <w:r>
+        <w:t xml:space="preserve"> </w:t>
+      </w:r>
+      <m:oMath>
+        <m:r>
+          <m:t>0</m:t>
+        </m:r>
+      </m:oMath>
+      <w:r>
+        <w:t xml:space="preserve">.</w:t>
+      </w:r>
+      <w:r>
+        <w:t xml:space="preserve"> </w:t>
+      </w:r>
+      <w:r>
+        <w:t xml:space="preserve">By part 1,</w:t>
+      </w:r>
+      <w:r>
+        <w:t xml:space="preserve"> </w:t>
+      </w:r>
+      <m:oMath>
+        <m:r>
+          <m:t>f</m:t>
+        </m:r>
+        <m:r>
+          <m:rPr>
+            <m:sty m:val="p"/>
+          </m:rPr>
+          <m:t>(</m:t>
+        </m:r>
+        <m:r>
+          <m:t>x</m:t>
+        </m:r>
+        <m:r>
+          <m:rPr>
+            <m:sty m:val="p"/>
+          </m:rPr>
+          <m:t>)</m:t>
+        </m:r>
+        <m:r>
+          <m:rPr>
+            <m:sty m:val="p"/>
+          </m:rPr>
+          <m:t>−</m:t>
+        </m:r>
+        <m:r>
+          <m:t>f</m:t>
+        </m:r>
+        <m:r>
+          <m:rPr>
+            <m:sty m:val="p"/>
+          </m:rPr>
+          <m:t>(</m:t>
+        </m:r>
+        <m:r>
+          <m:t>1</m:t>
+        </m:r>
+        <m:r>
+          <m:rPr>
+            <m:sty m:val="p"/>
+          </m:rPr>
+          <m:t>)</m:t>
+        </m:r>
+        <m:r>
+          <m:rPr>
+            <m:sty m:val="p"/>
+          </m:rPr>
+          <m:t>≥</m:t>
+        </m:r>
+        <m:r>
+          <m:t>0</m:t>
+        </m:r>
+      </m:oMath>
+      <w:r>
+        <w:t xml:space="preserve">,</w:t>
+      </w:r>
+      <w:r>
+        <w:t xml:space="preserve"> </w:t>
+      </w:r>
+      <w:r>
+        <w:t xml:space="preserve">that is,</w:t>
+      </w:r>
+      <w:r>
+        <w:t xml:space="preserve"> </w:t>
+      </w:r>
+      <m:oMath>
+        <m:r>
+          <m:t>f</m:t>
+        </m:r>
+        <m:r>
+          <m:rPr>
+            <m:sty m:val="p"/>
+          </m:rPr>
+          <m:t>(</m:t>
+        </m:r>
+        <m:r>
+          <m:t>x</m:t>
+        </m:r>
+        <m:r>
+          <m:rPr>
+            <m:sty m:val="p"/>
+          </m:rPr>
+          <m:t>)</m:t>
+        </m:r>
+        <m:r>
+          <m:rPr>
+            <m:sty m:val="p"/>
+          </m:rPr>
+          <m:t>≥</m:t>
+        </m:r>
+        <m:r>
+          <m:t>f</m:t>
+        </m:r>
+        <m:r>
+          <m:rPr>
+            <m:sty m:val="p"/>
+          </m:rPr>
+          <m:t>(</m:t>
+        </m:r>
+        <m:r>
+          <m:t>1</m:t>
+        </m:r>
+        <m:r>
+          <m:rPr>
+            <m:sty m:val="p"/>
+          </m:rPr>
+          <m:t>)</m:t>
+        </m:r>
+      </m:oMath>
+      <w:r>
+        <w:t xml:space="preserve">.</w:t>
+      </w:r>
+    </w:p>
+    <w:p>
+      <w:pPr>
+        <w:numPr>
+          <w:ilvl w:val="0"/>
+          <w:numId w:val="1004"/>
+        </w:numPr>
+      </w:pPr>
+      <m:oMath>
+        <m:r>
+          <m:t>f</m:t>
+        </m:r>
+        <m:r>
+          <m:rPr>
+            <m:sty m:val="p"/>
+          </m:rPr>
+          <m:t>(</m:t>
+        </m:r>
+        <m:r>
+          <m:rPr>
+            <m:sty m:val="p"/>
+          </m:rPr>
+          <m:t>−</m:t>
+        </m:r>
+        <m:r>
+          <m:t>3</m:t>
+        </m:r>
+        <m:r>
+          <m:rPr>
+            <m:sty m:val="p"/>
+          </m:rPr>
+          <m:t>)</m:t>
+        </m:r>
+        <m:r>
+          <m:rPr>
+            <m:sty m:val="p"/>
+          </m:rPr>
+          <m:t>=</m:t>
+        </m:r>
+        <m:r>
+          <m:rPr>
+            <m:sty m:val="p"/>
+          </m:rPr>
+          <m:t>−</m:t>
+        </m:r>
+        <m:r>
+          <m:t>27</m:t>
+        </m:r>
+        <m:r>
+          <m:rPr>
+            <m:sty m:val="p"/>
+          </m:rPr>
+          <m:t>+</m:t>
+        </m:r>
+        <m:r>
+          <m:t>9</m:t>
+        </m:r>
+        <m:r>
+          <m:rPr>
+            <m:sty m:val="p"/>
+          </m:rPr>
+          <m:t>=</m:t>
+        </m:r>
+        <m:r>
+          <m:rPr>
+            <m:sty m:val="p"/>
+          </m:rPr>
+          <m:t>−</m:t>
+        </m:r>
+        <m:r>
+          <m:t>18</m:t>
+        </m:r>
+      </m:oMath>
+      <w:r>
+        <w:t xml:space="preserve">.</w:t>
+      </w:r>
+      <w:r>
+        <w:t xml:space="preserve"> </w:t>
+      </w:r>
+      <w:r>
+        <w:t xml:space="preserve">Since</w:t>
+      </w:r>
+      <w:r>
+        <w:t xml:space="preserve"> </w:t>
+      </w:r>
+      <m:oMath>
+        <m:r>
+          <m:rPr>
+            <m:sty m:val="p"/>
+          </m:rPr>
+          <m:t>−</m:t>
+        </m:r>
+        <m:r>
+          <m:t>18</m:t>
+        </m:r>
+        <m:r>
+          <m:rPr>
+            <m:sty m:val="p"/>
+          </m:rPr>
+          <m:t>&lt;</m:t>
+        </m:r>
+        <m:r>
+          <m:rPr>
+            <m:sty m:val="p"/>
+          </m:rPr>
+          <m:t>−</m:t>
+        </m:r>
+        <m:r>
+          <m:t>2</m:t>
+        </m:r>
+        <m:r>
+          <m:rPr>
+            <m:sty m:val="p"/>
+          </m:rPr>
+          <m:t>=</m:t>
+        </m:r>
+        <m:r>
+          <m:t>f</m:t>
+        </m:r>
+        <m:r>
+          <m:rPr>
+            <m:sty m:val="p"/>
+          </m:rPr>
+          <m:t>(</m:t>
+        </m:r>
+        <m:r>
+          <m:t>1</m:t>
+        </m:r>
+        <m:r>
+          <m:rPr>
+            <m:sty m:val="p"/>
+          </m:rPr>
+          <m:t>)</m:t>
+        </m:r>
+      </m:oMath>
+      <w:r>
+        <w:t xml:space="preserve">,</w:t>
+      </w:r>
+      <w:r>
+        <w:t xml:space="preserve"> </w:t>
+      </w:r>
+      <m:oMath>
+        <m:r>
+          <m:t>f</m:t>
+        </m:r>
+        <m:r>
+          <m:rPr>
+            <m:sty m:val="p"/>
+          </m:rPr>
+          <m:t>(</m:t>
+        </m:r>
+        <m:r>
+          <m:t>1</m:t>
+        </m:r>
+        <m:r>
+          <m:rPr>
+            <m:sty m:val="p"/>
+          </m:rPr>
+          <m:t>)</m:t>
+        </m:r>
+      </m:oMath>
+      <w:r>
+        <w:t xml:space="preserve"> </w:t>
+      </w:r>
+      <w:r>
+        <w:t xml:space="preserve">is not the smallest value of</w:t>
+      </w:r>
+      <w:r>
+        <w:t xml:space="preserve"> </w:t>
+      </w:r>
+      <m:oMath>
+        <m:r>
+          <m:t>f</m:t>
+        </m:r>
+      </m:oMath>
+      <w:r>
+        <w:t xml:space="preserve"> </w:t>
+      </w:r>
+      <w:r>
+        <w:t xml:space="preserve">on</w:t>
+      </w:r>
+      <w:r>
+        <w:t xml:space="preserve"> </w:t>
+      </w:r>
+      <m:oMath>
+        <m:r>
+          <m:rPr>
+            <m:scr m:val="double-struck"/>
+            <m:sty m:val="p"/>
+          </m:rPr>
+          <m:t>R</m:t>
+        </m:r>
+      </m:oMath>
+      <w:r>
+        <w:t xml:space="preserve">.</w:t>
+      </w:r>
+    </w:p>
+    <w:p>
+      <w:pPr>
+        <w:numPr>
+          <w:ilvl w:val="0"/>
+          <w:numId w:val="1004"/>
+        </w:numPr>
+      </w:pPr>
+      <w:r>
+        <w:t xml:space="preserve">No.</w:t>
+      </w:r>
+      <w:r>
+        <w:t xml:space="preserve"> </w:t>
+      </w:r>
+      <w:r>
+        <w:t xml:space="preserve">For each</w:t>
+      </w:r>
+      <w:r>
+        <w:t xml:space="preserve"> </w:t>
+      </w:r>
+      <m:oMath>
+        <m:r>
+          <m:t>n</m:t>
+        </m:r>
+        <m:r>
+          <m:rPr>
+            <m:sty m:val="p"/>
+          </m:rPr>
+          <m:t>≥</m:t>
+        </m:r>
+        <m:r>
+          <m:t>2</m:t>
+        </m:r>
+      </m:oMath>
+      <w:r>
+        <w:t xml:space="preserve">,</w:t>
+      </w:r>
+      <w:r>
+        <w:t xml:space="preserve"> </w:t>
+      </w:r>
+      <m:oMath>
+        <m:r>
+          <m:t>f</m:t>
+        </m:r>
+        <m:r>
+          <m:rPr>
+            <m:sty m:val="p"/>
+          </m:rPr>
+          <m:t>(</m:t>
+        </m:r>
+        <m:r>
+          <m:rPr>
+            <m:sty m:val="p"/>
+          </m:rPr>
+          <m:t>−</m:t>
+        </m:r>
+        <m:r>
+          <m:t>n</m:t>
+        </m:r>
+        <m:r>
+          <m:rPr>
+            <m:sty m:val="p"/>
+          </m:rPr>
+          <m:t>)</m:t>
+        </m:r>
+        <m:r>
+          <m:rPr>
+            <m:sty m:val="p"/>
+          </m:rPr>
+          <m:t>=</m:t>
+        </m:r>
+        <m:r>
+          <m:rPr>
+            <m:sty m:val="p"/>
+          </m:rPr>
+          <m:t>−</m:t>
+        </m:r>
+        <m:sSup>
+          <m:e>
+            <m:r>
+              <m:t>n</m:t>
+            </m:r>
+          </m:e>
+          <m:sup>
+            <m:r>
+              <m:t>3</m:t>
+            </m:r>
+          </m:sup>
+        </m:sSup>
+        <m:r>
+          <m:rPr>
+            <m:sty m:val="p"/>
+          </m:rPr>
+          <m:t>+</m:t>
+        </m:r>
+        <m:r>
+          <m:t>3</m:t>
+        </m:r>
+        <m:r>
+          <m:t>n</m:t>
+        </m:r>
+        <m:r>
+          <m:rPr>
+            <m:sty m:val="p"/>
+          </m:rPr>
+          <m:t>=</m:t>
+        </m:r>
+        <m:r>
+          <m:rPr>
+            <m:sty m:val="p"/>
+          </m:rPr>
+          <m:t>−</m:t>
+        </m:r>
+        <m:r>
+          <m:t>n</m:t>
+        </m:r>
+        <m:r>
+          <m:rPr>
+            <m:sty m:val="p"/>
+          </m:rPr>
+          <m:t>(</m:t>
+        </m:r>
+        <m:sSup>
+          <m:e>
+            <m:r>
+              <m:t>n</m:t>
+            </m:r>
+          </m:e>
+          <m:sup>
+            <m:r>
+              <m:t>2</m:t>
+            </m:r>
+          </m:sup>
+        </m:sSup>
+        <m:r>
+          <m:rPr>
+            <m:sty m:val="p"/>
+          </m:rPr>
+          <m:t>−</m:t>
+        </m:r>
+        <m:r>
+          <m:t>3</m:t>
+        </m:r>
+        <m:r>
+          <m:rPr>
+            <m:sty m:val="p"/>
+          </m:rPr>
+          <m:t>)</m:t>
+        </m:r>
+        <m:r>
+          <m:rPr>
+            <m:sty m:val="p"/>
+          </m:rPr>
+          <m:t>≤</m:t>
+        </m:r>
+        <m:r>
+          <m:rPr>
+            <m:sty m:val="p"/>
+          </m:rPr>
+          <m:t>−</m:t>
+        </m:r>
+        <m:r>
+          <m:t>n</m:t>
+        </m:r>
+      </m:oMath>
+      <w:r>
+        <w:t xml:space="preserve">,</w:t>
+      </w:r>
+      <w:r>
+        <w:t xml:space="preserve"> </w:t>
+      </w:r>
+      <w:r>
+        <w:t xml:space="preserve">so no value of</w:t>
+      </w:r>
+      <w:r>
+        <w:t xml:space="preserve"> </w:t>
+      </w:r>
+      <m:oMath>
+        <m:r>
+          <m:t>f</m:t>
+        </m:r>
+      </m:oMath>
+      <w:r>
+        <w:t xml:space="preserve"> </w:t>
+      </w:r>
+      <w:r>
+        <w:t xml:space="preserve">is smaller than all the others:</w:t>
+      </w:r>
+      <w:r>
+        <w:t xml:space="preserve"> </w:t>
+      </w:r>
+      <w:r>
+        <w:t xml:space="preserve">for any</w:t>
+      </w:r>
+      <w:r>
+        <w:t xml:space="preserve"> </w:t>
+      </w:r>
+      <m:oMath>
+        <m:r>
+          <m:t>x</m:t>
+        </m:r>
+      </m:oMath>
+      <w:r>
+        <w:t xml:space="preserve">, picking</w:t>
+      </w:r>
+      <w:r>
+        <w:t xml:space="preserve"> </w:t>
+      </w:r>
+      <m:oMath>
+        <m:r>
+          <m:t>n</m:t>
+        </m:r>
+        <m:r>
+          <m:rPr>
+            <m:sty m:val="p"/>
+          </m:rPr>
+          <m:t>≥</m:t>
+        </m:r>
+        <m:r>
+          <m:t>2</m:t>
+        </m:r>
+      </m:oMath>
+      <w:r>
+        <w:t xml:space="preserve"> </w:t>
+      </w:r>
+      <w:r>
+        <w:t xml:space="preserve">with</w:t>
+      </w:r>
+      <w:r>
+        <w:t xml:space="preserve"> </w:t>
+      </w:r>
+      <m:oMath>
+        <m:r>
+          <m:rPr>
+            <m:sty m:val="p"/>
+          </m:rPr>
+          <m:t>−</m:t>
+        </m:r>
+        <m:r>
+          <m:t>n</m:t>
+        </m:r>
+        <m:r>
+          <m:rPr>
+            <m:sty m:val="p"/>
+          </m:rPr>
+          <m:t>&lt;</m:t>
+        </m:r>
+        <m:r>
+          <m:t>f</m:t>
+        </m:r>
+        <m:r>
+          <m:rPr>
+            <m:sty m:val="p"/>
+          </m:rPr>
+          <m:t>(</m:t>
+        </m:r>
+        <m:r>
+          <m:t>x</m:t>
+        </m:r>
+        <m:r>
+          <m:rPr>
+            <m:sty m:val="p"/>
+          </m:rPr>
+          <m:t>)</m:t>
+        </m:r>
+      </m:oMath>
+      <w:r>
+        <w:t xml:space="preserve"> </w:t>
+      </w:r>
+      <w:r>
+        <w:t xml:space="preserve">gives</w:t>
+      </w:r>
+      <w:r>
+        <w:t xml:space="preserve"> </w:t>
+      </w:r>
+      <m:oMath>
+        <m:r>
+          <m:t>f</m:t>
+        </m:r>
+        <m:r>
+          <m:rPr>
+            <m:sty m:val="p"/>
+          </m:rPr>
+          <m:t>(</m:t>
+        </m:r>
+        <m:r>
+          <m:rPr>
+            <m:sty m:val="p"/>
+          </m:rPr>
+          <m:t>−</m:t>
+        </m:r>
+        <m:r>
+          <m:t>n</m:t>
+        </m:r>
+        <m:r>
+          <m:rPr>
+            <m:sty m:val="p"/>
+          </m:rPr>
+          <m:t>)</m:t>
+        </m:r>
+        <m:r>
+          <m:rPr>
+            <m:sty m:val="p"/>
+          </m:rPr>
+          <m:t>&lt;</m:t>
+        </m:r>
+        <m:r>
+          <m:t>f</m:t>
+        </m:r>
+        <m:r>
+          <m:rPr>
+            <m:sty m:val="p"/>
+          </m:rPr>
+          <m:t>(</m:t>
+        </m:r>
+        <m:r>
+          <m:t>x</m:t>
+        </m:r>
+        <m:r>
+          <m:rPr>
+            <m:sty m:val="p"/>
+          </m:rPr>
+          <m:t>)</m:t>
+        </m:r>
+      </m:oMath>
+      <w:r>
+        <w:t xml:space="preserve">.</w:t>
+      </w:r>
+    </w:p>
+    <w:bookmarkEnd w:id="28"/>
+    <w:bookmarkStart w:id="29" w:name="def-global-minimizer"/>
+    <w:p>
+      <w:pPr>
+        <w:pStyle w:val="FirstParagraph"/>
+      </w:pPr>
+      <w:r>
+        <w:rPr>
+          <w:b/>
+          <w:bCs/>
+        </w:rPr>
+        <w:t xml:space="preserve">Definition 5 (Global minimizer)</w:t>
+      </w:r>
+      <w:r>
+        <w:t xml:space="preserve"> </w:t>
+      </w:r>
+      <w:r>
+        <w:t xml:space="preserve">Let</w:t>
+      </w:r>
+      <w:r>
+        <w:t xml:space="preserve"> </w:t>
+      </w:r>
+      <m:oMath>
+        <m:r>
+          <m:t>A</m:t>
+        </m:r>
+        <m:r>
+          <m:rPr>
+            <m:sty m:val="p"/>
+          </m:rPr>
+          <m:t>⊆</m:t>
+        </m:r>
+        <m:sSup>
+          <m:e>
+            <m:r>
+              <m:rPr>
+                <m:scr m:val="double-struck"/>
+                <m:sty m:val="p"/>
+              </m:rPr>
+              <m:t>R</m:t>
+            </m:r>
+          </m:e>
+          <m:sup>
+            <m:r>
+              <m:t>p</m:t>
+            </m:r>
+          </m:sup>
+        </m:sSup>
+      </m:oMath>
+      <w:r>
+        <w:t xml:space="preserve"> </w:t>
+      </w:r>
+      <w:r>
+        <w:t xml:space="preserve">and let</w:t>
+      </w:r>
+      <w:r>
+        <w:t xml:space="preserve"> </w:t>
+      </w:r>
+      <m:oMath>
+        <m:r>
+          <m:t>f</m:t>
+        </m:r>
+        <m:r>
+          <m:rPr>
+            <m:sty m:val="p"/>
+          </m:rPr>
+          <m:t>:</m:t>
+        </m:r>
+        <m:r>
+          <m:t>A</m:t>
+        </m:r>
+        <m:r>
+          <m:rPr>
+            <m:sty m:val="p"/>
+          </m:rPr>
+          <m:t>→</m:t>
+        </m:r>
+        <m:r>
+          <m:rPr>
+            <m:scr m:val="double-struck"/>
+            <m:sty m:val="p"/>
+          </m:rPr>
+          <m:t>R</m:t>
+        </m:r>
+      </m:oMath>
+      <w:r>
+        <w:t xml:space="preserve"> </w:t>
+      </w:r>
+      <w:r>
+        <w:t xml:space="preserve">be a</w:t>
+      </w:r>
+      <w:r>
+        <w:t xml:space="preserve"> </w:t>
+      </w:r>
+      <w:hyperlink r:id="rId22">
+        <w:r>
+          <w:rPr>
+            <w:rStyle w:val="Hyperlink"/>
+          </w:rPr>
+          <w:t xml:space="preserve">function</w:t>
+        </w:r>
+      </w:hyperlink>
+      <w:r>
+        <w:t xml:space="preserve">.</w:t>
+      </w:r>
+      <w:r>
+        <w:t xml:space="preserve"> </w:t>
+      </w:r>
+      <w:r>
+        <w:t xml:space="preserve">A point</w:t>
+      </w:r>
+      <w:r>
+        <w:t xml:space="preserve"> </w:t>
+      </w:r>
+      <m:oMath>
+        <m:sSup>
+          <m:e>
+            <m:r>
+              <m:t>x</m:t>
+            </m:r>
+          </m:e>
+          <m:sup>
+            <m:r>
+              <m:rPr>
+                <m:sty m:val="p"/>
+              </m:rPr>
+              <m:t>*</m:t>
+            </m:r>
+          </m:sup>
+        </m:sSup>
+        <m:r>
+          <m:rPr>
+            <m:sty m:val="p"/>
+          </m:rPr>
+          <m:t>∈</m:t>
+        </m:r>
+        <m:r>
+          <m:t>A</m:t>
+        </m:r>
+      </m:oMath>
+      <w:r>
+        <w:t xml:space="preserve"> </w:t>
+      </w:r>
+      <w:r>
+        <w:t xml:space="preserve">is a</w:t>
+      </w:r>
+      <w:r>
+        <w:t xml:space="preserve"> </w:t>
+      </w:r>
+      <w:r>
+        <w:rPr>
+          <w:b/>
+          <w:bCs/>
+        </w:rPr>
+        <w:t xml:space="preserve">global minimizer</w:t>
+      </w:r>
+      <w:r>
+        <w:t xml:space="preserve"> </w:t>
+      </w:r>
+      <w:r>
+        <w:t xml:space="preserve">of</w:t>
+      </w:r>
+      <w:r>
+        <w:t xml:space="preserve"> </w:t>
+      </w:r>
+      <m:oMath>
+        <m:r>
+          <m:t>f</m:t>
+        </m:r>
+      </m:oMath>
+      <w:r>
+        <w:t xml:space="preserve"> </w:t>
+      </w:r>
+      <w:r>
+        <w:t xml:space="preserve">over</w:t>
+      </w:r>
+      <w:r>
+        <w:t xml:space="preserve"> </w:t>
+      </w:r>
+      <m:oMath>
+        <m:r>
+          <m:t>A</m:t>
+        </m:r>
+      </m:oMath>
+      <w:r>
+        <w:t xml:space="preserve"> </w:t>
+      </w:r>
+      <w:r>
+        <w:t xml:space="preserve">if</w:t>
+      </w:r>
+      <w:r>
+        <w:t xml:space="preserve"> </w:t>
+      </w:r>
+      <m:oMath>
+        <m:r>
+          <m:t>f</m:t>
+        </m:r>
+        <m:r>
+          <m:rPr>
+            <m:sty m:val="p"/>
+          </m:rPr>
+          <m:t>(</m:t>
+        </m:r>
+        <m:sSup>
+          <m:e>
+            <m:r>
+              <m:t>x</m:t>
+            </m:r>
+          </m:e>
+          <m:sup>
+            <m:r>
+              <m:rPr>
+                <m:sty m:val="p"/>
+              </m:rPr>
+              <m:t>*</m:t>
+            </m:r>
+          </m:sup>
+        </m:sSup>
+        <m:r>
+          <m:rPr>
+            <m:sty m:val="p"/>
+          </m:rPr>
+          <m:t>)</m:t>
+        </m:r>
+        <m:r>
+          <m:rPr>
+            <m:sty m:val="p"/>
+          </m:rPr>
+          <m:t>≤</m:t>
+        </m:r>
+        <m:r>
+          <m:t>f</m:t>
+        </m:r>
+        <m:r>
+          <m:rPr>
+            <m:sty m:val="p"/>
+          </m:rPr>
+          <m:t>(</m:t>
+        </m:r>
+        <m:r>
+          <m:t>x</m:t>
+        </m:r>
+        <m:r>
+          <m:rPr>
+            <m:sty m:val="p"/>
+          </m:rPr>
+          <m:t>)</m:t>
+        </m:r>
+      </m:oMath>
+      <w:r>
+        <w:t xml:space="preserve"> </w:t>
+      </w:r>
+      <w:r>
+        <w:t xml:space="preserve">for all</w:t>
+      </w:r>
+      <w:r>
+        <w:t xml:space="preserve"> </w:t>
+      </w:r>
+      <m:oMath>
+        <m:r>
+          <m:t>x</m:t>
+        </m:r>
+        <m:r>
+          <m:rPr>
+            <m:sty m:val="p"/>
+          </m:rPr>
+          <m:t>∈</m:t>
+        </m:r>
+        <m:r>
+          <m:t>A</m:t>
+        </m:r>
+      </m:oMath>
+      <w:r>
+        <w:t xml:space="preserve">.</w:t>
+      </w:r>
+    </w:p>
+    <w:bookmarkEnd w:id="29"/>
+    <w:p>
+      <w:pPr>
+        <w:pStyle w:val="BodyText"/>
+      </w:pPr>
+      <w:r>
+        <w:t xml:space="preserve">The global minimizers of</w:t>
+      </w:r>
+      <w:r>
+        <w:t xml:space="preserve"> </w:t>
+      </w:r>
+      <m:oMath>
+        <m:r>
+          <m:t>f</m:t>
+        </m:r>
+      </m:oMath>
+      <w:r>
+        <w:t xml:space="preserve"> </w:t>
+      </w:r>
+      <w:r>
+        <w:t xml:space="preserve">are exactly the elements of</w:t>
+      </w:r>
+      <w:r>
+        <w:t xml:space="preserve"> </w:t>
+      </w:r>
+      <m:oMath>
+        <m:r>
+          <m:rPr>
+            <m:sty m:val="p"/>
+          </m:rPr>
+          <m:t>arg</m:t>
+        </m:r>
+        <m:sSub>
+          <m:e>
+            <m:r>
+              <m:rPr>
+                <m:sty m:val="p"/>
+              </m:rPr>
+              <m:t>min</m:t>
+            </m:r>
+          </m:e>
+          <m:sub>
+            <m:r>
+              <m:t>x</m:t>
+            </m:r>
+            <m:r>
+              <m:rPr>
+                <m:sty m:val="p"/>
+              </m:rPr>
+              <m:t>∈</m:t>
+            </m:r>
+            <m:r>
+              <m:t>A</m:t>
+            </m:r>
+          </m:sub>
+        </m:sSub>
+        <m:r>
+          <m:t>f</m:t>
+        </m:r>
+        <m:r>
+          <m:rPr>
+            <m:sty m:val="p"/>
+          </m:rPr>
+          <m:t>(</m:t>
+        </m:r>
+        <m:r>
+          <m:t>x</m:t>
+        </m:r>
+        <m:r>
+          <m:rPr>
+            <m:sty m:val="p"/>
+          </m:rPr>
+          <m:t>)</m:t>
+        </m:r>
+      </m:oMath>
+      <w:r>
+        <w:t xml:space="preserve"> </w:t>
+      </w:r>
+      <w:r>
+        <w:t xml:space="preserve">(</w:t>
+      </w:r>
+      <w:hyperlink w:anchor="def-argmin">
+        <w:r>
+          <w:rPr>
+            <w:rStyle w:val="Hyperlink"/>
+          </w:rPr>
+          <w:t xml:space="preserve">Definition 3</w:t>
+        </w:r>
+      </w:hyperlink>
+      <w:r>
+        <w:t xml:space="preserve">).</w:t>
+      </w:r>
+      <w:r>
+        <w:t xml:space="preserve"> </w:t>
+      </w:r>
+      <w:r>
+        <w:t xml:space="preserve">In</w:t>
+      </w:r>
+      <w:r>
+        <w:t xml:space="preserve"> </w:t>
+      </w:r>
+      <w:hyperlink w:anchor="exr-local-vs-global-min">
+        <w:r>
+          <w:rPr>
+            <w:rStyle w:val="Hyperlink"/>
+          </w:rPr>
+          <w:t xml:space="preserve">Exercise 2</w:t>
+        </w:r>
+      </w:hyperlink>
+      <w:r>
+        <w:t xml:space="preserve">,</w:t>
+      </w:r>
+      <w:r>
+        <w:t xml:space="preserve"> </w:t>
+      </w:r>
+      <m:oMath>
+        <m:r>
+          <m:t>f</m:t>
+        </m:r>
+      </m:oMath>
+      <w:r>
+        <w:t xml:space="preserve"> </w:t>
+      </w:r>
+      <w:r>
+        <w:t xml:space="preserve">has no global minimizer over</w:t>
+      </w:r>
+      <w:r>
+        <w:t xml:space="preserve"> </w:t>
+      </w:r>
+      <m:oMath>
+        <m:r>
+          <m:rPr>
+            <m:scr m:val="double-struck"/>
+            <m:sty m:val="p"/>
+          </m:rPr>
+          <m:t>R</m:t>
+        </m:r>
+      </m:oMath>
+      <w:r>
+        <w:t xml:space="preserve">.</w:t>
+      </w:r>
+    </w:p>
+    <w:bookmarkStart w:id="31" w:name="def-local-minimizer"/>
+    <w:p>
+      <w:pPr>
+        <w:pStyle w:val="BodyText"/>
+      </w:pPr>
+      <w:r>
+        <w:rPr>
+          <w:b/>
+          <w:bCs/>
+        </w:rPr>
+        <w:t xml:space="preserve">Definition 6 (Local minimizer)</w:t>
+      </w:r>
+      <w:r>
+        <w:t xml:space="preserve"> </w:t>
+      </w:r>
+      <w:r>
+        <w:t xml:space="preserve">Let</w:t>
+      </w:r>
+      <w:r>
+        <w:t xml:space="preserve"> </w:t>
+      </w:r>
+      <m:oMath>
+        <m:r>
+          <m:t>A</m:t>
+        </m:r>
+        <m:r>
+          <m:rPr>
+            <m:sty m:val="p"/>
+          </m:rPr>
+          <m:t>⊆</m:t>
+        </m:r>
+        <m:sSup>
+          <m:e>
+            <m:r>
+              <m:rPr>
+                <m:scr m:val="double-struck"/>
+                <m:sty m:val="p"/>
+              </m:rPr>
+              <m:t>R</m:t>
+            </m:r>
+          </m:e>
+          <m:sup>
+            <m:r>
+              <m:t>p</m:t>
+            </m:r>
+          </m:sup>
+        </m:sSup>
+      </m:oMath>
+      <w:r>
+        <w:t xml:space="preserve"> </w:t>
+      </w:r>
+      <w:r>
+        <w:t xml:space="preserve">and let</w:t>
+      </w:r>
+      <w:r>
+        <w:t xml:space="preserve"> </w:t>
+      </w:r>
+      <m:oMath>
+        <m:r>
+          <m:t>f</m:t>
+        </m:r>
+        <m:r>
+          <m:rPr>
+            <m:sty m:val="p"/>
+          </m:rPr>
+          <m:t>:</m:t>
+        </m:r>
+        <m:r>
+          <m:t>A</m:t>
+        </m:r>
+        <m:r>
+          <m:rPr>
+            <m:sty m:val="p"/>
+          </m:rPr>
+          <m:t>→</m:t>
+        </m:r>
+        <m:r>
+          <m:rPr>
+            <m:scr m:val="double-struck"/>
+            <m:sty m:val="p"/>
+          </m:rPr>
+          <m:t>R</m:t>
+        </m:r>
+      </m:oMath>
+      <w:r>
+        <w:t xml:space="preserve"> </w:t>
+      </w:r>
+      <w:r>
+        <w:t xml:space="preserve">be a</w:t>
+      </w:r>
+      <w:r>
+        <w:t xml:space="preserve"> </w:t>
+      </w:r>
+      <w:hyperlink r:id="rId22">
+        <w:r>
+          <w:rPr>
+            <w:rStyle w:val="Hyperlink"/>
+          </w:rPr>
+          <w:t xml:space="preserve">function</w:t>
+        </w:r>
+      </w:hyperlink>
+      <w:r>
+        <w:t xml:space="preserve">.</w:t>
+      </w:r>
+      <w:r>
+        <w:t xml:space="preserve"> </w:t>
+      </w:r>
+      <w:r>
+        <w:t xml:space="preserve">A point</w:t>
+      </w:r>
+      <w:r>
+        <w:t xml:space="preserve"> </w:t>
+      </w:r>
+      <m:oMath>
+        <m:sSup>
+          <m:e>
+            <m:r>
+              <m:t>x</m:t>
+            </m:r>
+          </m:e>
+          <m:sup>
+            <m:r>
+              <m:rPr>
+                <m:sty m:val="p"/>
+              </m:rPr>
+              <m:t>*</m:t>
+            </m:r>
+          </m:sup>
+        </m:sSup>
+        <m:r>
+          <m:rPr>
+            <m:sty m:val="p"/>
+          </m:rPr>
+          <m:t>∈</m:t>
+        </m:r>
+        <m:r>
+          <m:t>A</m:t>
+        </m:r>
+      </m:oMath>
+      <w:r>
+        <w:t xml:space="preserve"> </w:t>
+      </w:r>
+      <w:r>
+        <w:t xml:space="preserve">is a</w:t>
+      </w:r>
+      <w:r>
+        <w:t xml:space="preserve"> </w:t>
+      </w:r>
+      <w:r>
+        <w:rPr>
+          <w:b/>
+          <w:bCs/>
+        </w:rPr>
+        <w:t xml:space="preserve">local minimizer</w:t>
+      </w:r>
+      <w:r>
+        <w:t xml:space="preserve"> </w:t>
+      </w:r>
+      <w:r>
+        <w:t xml:space="preserve">of</w:t>
+      </w:r>
+      <w:r>
+        <w:t xml:space="preserve"> </w:t>
+      </w:r>
+      <m:oMath>
+        <m:r>
+          <m:t>f</m:t>
+        </m:r>
+      </m:oMath>
+      <w:r>
+        <w:t xml:space="preserve"> </w:t>
+      </w:r>
+      <w:r>
+        <w:t xml:space="preserve">if there is a number</w:t>
+      </w:r>
+      <w:r>
+        <w:t xml:space="preserve"> </w:t>
+      </w:r>
+      <m:oMath>
+        <m:r>
+          <m:t>δ</m:t>
+        </m:r>
+        <m:r>
+          <m:rPr>
+            <m:sty m:val="p"/>
+          </m:rPr>
+          <m:t>&gt;</m:t>
+        </m:r>
+        <m:r>
+          <m:t>0</m:t>
+        </m:r>
+      </m:oMath>
+      <w:r>
+        <w:t xml:space="preserve"> </w:t>
+      </w:r>
+      <w:r>
+        <w:t xml:space="preserve">such that</w:t>
+      </w:r>
+      <w:r>
+        <w:t xml:space="preserve"> </w:t>
+      </w:r>
+      <m:oMath>
+        <m:r>
+          <m:t>f</m:t>
+        </m:r>
+        <m:r>
+          <m:rPr>
+            <m:sty m:val="p"/>
+          </m:rPr>
+          <m:t>(</m:t>
+        </m:r>
+        <m:sSup>
+          <m:e>
+            <m:r>
+              <m:t>x</m:t>
+            </m:r>
+          </m:e>
+          <m:sup>
+            <m:r>
+              <m:rPr>
+                <m:sty m:val="p"/>
+              </m:rPr>
+              <m:t>*</m:t>
+            </m:r>
+          </m:sup>
+        </m:sSup>
+        <m:r>
+          <m:rPr>
+            <m:sty m:val="p"/>
+          </m:rPr>
+          <m:t>)</m:t>
+        </m:r>
+        <m:r>
+          <m:rPr>
+            <m:sty m:val="p"/>
+          </m:rPr>
+          <m:t>≤</m:t>
+        </m:r>
+        <m:r>
+          <m:t>f</m:t>
+        </m:r>
+        <m:r>
+          <m:rPr>
+            <m:sty m:val="p"/>
+          </m:rPr>
+          <m:t>(</m:t>
+        </m:r>
+        <m:r>
+          <m:t>x</m:t>
+        </m:r>
+        <m:r>
+          <m:rPr>
+            <m:sty m:val="p"/>
+          </m:rPr>
+          <m:t>)</m:t>
+        </m:r>
+      </m:oMath>
+      <w:r>
+        <w:t xml:space="preserve"> </w:t>
+      </w:r>
+      <w:r>
+        <w:t xml:space="preserve">for all</w:t>
+      </w:r>
+      <w:r>
+        <w:t xml:space="preserve"> </w:t>
+      </w:r>
+      <m:oMath>
+        <m:r>
+          <m:t>x</m:t>
+        </m:r>
+        <m:r>
+          <m:rPr>
+            <m:sty m:val="p"/>
+          </m:rPr>
+          <m:t>∈</m:t>
+        </m:r>
+        <m:r>
+          <m:t>A</m:t>
+        </m:r>
+      </m:oMath>
+      <w:r>
+        <w:t xml:space="preserve"> </w:t>
+      </w:r>
+      <w:r>
+        <w:t xml:space="preserve">with</w:t>
+      </w:r>
+      <w:r>
+        <w:t xml:space="preserve"> </w:t>
+      </w:r>
+      <m:oMath>
+        <m:r>
+          <m:t>​</m:t>
+        </m:r>
+        <m:d>
+          <m:dPr>
+            <m:begChr m:val="∥"/>
+            <m:sepChr m:val=""/>
+            <m:endChr m:val="∥"/>
+            <m:grow/>
+          </m:dPr>
+          <m:e>
+            <m:r>
+              <m:t>x</m:t>
+            </m:r>
+            <m:r>
+              <m:rPr>
+                <m:sty m:val="p"/>
+              </m:rPr>
+              <m:t>−</m:t>
+            </m:r>
+            <m:sSup>
+              <m:e>
+                <m:r>
+                  <m:t>x</m:t>
+                </m:r>
+              </m:e>
+              <m:sup>
+                <m:r>
+                  <m:rPr>
+                    <m:sty m:val="p"/>
+                  </m:rPr>
+                  <m:t>*</m:t>
+                </m:r>
+              </m:sup>
+            </m:sSup>
+          </m:e>
+        </m:d>
+        <m:r>
+          <m:t>​</m:t>
+        </m:r>
+        <m:r>
+          <m:rPr>
+            <m:sty m:val="p"/>
+          </m:rPr>
+          <m:t>&lt;</m:t>
+        </m:r>
+        <m:r>
+          <m:t>δ</m:t>
+        </m:r>
+      </m:oMath>
+      <w:r>
+        <w:t xml:space="preserve">,</w:t>
+      </w:r>
+      <w:r>
+        <w:t xml:space="preserve"> </w:t>
+      </w:r>
+      <w:r>
+        <w:t xml:space="preserve">where</w:t>
+      </w:r>
+      <w:r>
+        <w:t xml:space="preserve"> </w:t>
+      </w:r>
+      <m:oMath>
+        <m:r>
+          <m:t>​</m:t>
+        </m:r>
+        <m:d>
+          <m:dPr>
+            <m:begChr m:val="∥"/>
+            <m:sepChr m:val=""/>
+            <m:endChr m:val="∥"/>
+            <m:grow/>
+          </m:dPr>
+          <m:e>
+            <m:r>
+              <m:rPr>
+                <m:sty m:val="p"/>
+              </m:rPr>
+              <m:t>⋅</m:t>
+            </m:r>
+          </m:e>
+        </m:d>
+        <m:r>
+          <m:t>​</m:t>
+        </m:r>
+      </m:oMath>
+      <w:r>
+        <w:t xml:space="preserve"> </w:t>
+      </w:r>
+      <w:r>
+        <w:t xml:space="preserve">is the</w:t>
+      </w:r>
+      <w:r>
+        <w:t xml:space="preserve"> </w:t>
+      </w:r>
+      <w:hyperlink r:id="rId30">
+        <w:r>
+          <w:rPr>
+            <w:rStyle w:val="Hyperlink"/>
+          </w:rPr>
+          <w:t xml:space="preserve">Euclidean norm</w:t>
+        </w:r>
+      </w:hyperlink>
+      <w:r>
+        <w:t xml:space="preserve">.</w:t>
+      </w:r>
+    </w:p>
+    <w:bookmarkEnd w:id="31"/>
+    <w:p>
+      <w:pPr>
+        <w:pStyle w:val="BodyText"/>
+      </w:pPr>
+      <w:r>
+        <w:t xml:space="preserve">For</w:t>
+      </w:r>
+      <w:r>
+        <w:t xml:space="preserve"> </w:t>
+      </w:r>
+      <m:oMath>
+        <m:r>
+          <m:t>p</m:t>
+        </m:r>
+        <m:r>
+          <m:rPr>
+            <m:sty m:val="p"/>
+          </m:rPr>
+          <m:t>=</m:t>
+        </m:r>
+        <m:r>
+          <m:t>1</m:t>
+        </m:r>
+      </m:oMath>
+      <w:r>
+        <w:t xml:space="preserve">,</w:t>
+      </w:r>
+      <w:r>
+        <w:t xml:space="preserve"> </w:t>
+      </w:r>
+      <m:oMath>
+        <m:r>
+          <m:t>​</m:t>
+        </m:r>
+        <m:d>
+          <m:dPr>
+            <m:begChr m:val="∥"/>
+            <m:sepChr m:val=""/>
+            <m:endChr m:val="∥"/>
+            <m:grow/>
+          </m:dPr>
+          <m:e>
+            <m:r>
+              <m:t>x</m:t>
+            </m:r>
+            <m:r>
+              <m:rPr>
+                <m:sty m:val="p"/>
+              </m:rPr>
+              <m:t>−</m:t>
+            </m:r>
+            <m:sSup>
+              <m:e>
+                <m:r>
+                  <m:t>x</m:t>
+                </m:r>
+              </m:e>
+              <m:sup>
+                <m:r>
+                  <m:rPr>
+                    <m:sty m:val="p"/>
+                  </m:rPr>
+                  <m:t>*</m:t>
+                </m:r>
+              </m:sup>
+            </m:sSup>
+          </m:e>
+        </m:d>
+        <m:r>
+          <m:t>​</m:t>
+        </m:r>
+        <m:r>
+          <m:rPr>
+            <m:sty m:val="p"/>
+          </m:rPr>
+          <m:t>=</m:t>
+        </m:r>
+        <m:r>
+          <m:t>​</m:t>
+        </m:r>
+        <m:d>
+          <m:dPr>
+            <m:begChr m:val="|"/>
+            <m:sepChr m:val=""/>
+            <m:endChr m:val="|"/>
+            <m:grow/>
+          </m:dPr>
+          <m:e>
+            <m:r>
+              <m:t>x</m:t>
+            </m:r>
+            <m:r>
+              <m:rPr>
+                <m:sty m:val="p"/>
+              </m:rPr>
+              <m:t>−</m:t>
+            </m:r>
+            <m:sSup>
+              <m:e>
+                <m:r>
+                  <m:t>x</m:t>
+                </m:r>
+              </m:e>
+              <m:sup>
+                <m:r>
+                  <m:rPr>
+                    <m:sty m:val="p"/>
+                  </m:rPr>
+                  <m:t>*</m:t>
+                </m:r>
+              </m:sup>
+            </m:sSup>
+          </m:e>
+        </m:d>
+        <m:r>
+          <m:t>​</m:t>
+        </m:r>
+      </m:oMath>
+      <w:r>
+        <w:t xml:space="preserve">.</w:t>
+      </w:r>
+      <w:r>
+        <w:t xml:space="preserve"> </w:t>
+      </w:r>
+      <w:r>
+        <w:t xml:space="preserve">Every global minimizer (</w:t>
+      </w:r>
+      <w:hyperlink w:anchor="def-global-minimizer">
+        <w:r>
+          <w:rPr>
+            <w:rStyle w:val="Hyperlink"/>
+          </w:rPr>
+          <w:t xml:space="preserve">Definition 5</w:t>
+        </w:r>
+      </w:hyperlink>
+      <w:r>
+        <w:t xml:space="preserve">) is a local minimizer:</w:t>
+      </w:r>
+      <w:r>
+        <w:t xml:space="preserve"> </w:t>
+      </w:r>
+      <w:r>
+        <w:t xml:space="preserve">take any</w:t>
+      </w:r>
+      <w:r>
+        <w:t xml:space="preserve"> </w:t>
+      </w:r>
+      <m:oMath>
+        <m:r>
+          <m:t>δ</m:t>
+        </m:r>
+        <m:r>
+          <m:rPr>
+            <m:sty m:val="p"/>
+          </m:rPr>
+          <m:t>&gt;</m:t>
+        </m:r>
+        <m:r>
+          <m:t>0</m:t>
+        </m:r>
+      </m:oMath>
+      <w:r>
+        <w:t xml:space="preserve">.</w:t>
+      </w:r>
+      <w:r>
+        <w:t xml:space="preserve"> </w:t>
+      </w:r>
+      <w:r>
+        <w:t xml:space="preserve">The converse fails.</w:t>
+      </w:r>
+      <w:r>
+        <w:t xml:space="preserve"> </w:t>
+      </w:r>
+      <w:r>
+        <w:t xml:space="preserve">In</w:t>
+      </w:r>
+      <w:r>
+        <w:t xml:space="preserve"> </w:t>
+      </w:r>
+      <w:hyperlink w:anchor="exr-local-vs-global-min">
+        <w:r>
+          <w:rPr>
+            <w:rStyle w:val="Hyperlink"/>
+          </w:rPr>
+          <w:t xml:space="preserve">Exercise 2</w:t>
+        </w:r>
+      </w:hyperlink>
+      <w:r>
+        <w:t xml:space="preserve">,</w:t>
+      </w:r>
+      <w:r>
+        <w:t xml:space="preserve"> </w:t>
+      </w:r>
+      <m:oMath>
+        <m:sSup>
+          <m:e>
+            <m:r>
+              <m:t>x</m:t>
+            </m:r>
+          </m:e>
+          <m:sup>
+            <m:r>
+              <m:rPr>
+                <m:sty m:val="p"/>
+              </m:rPr>
+              <m:t>*</m:t>
+            </m:r>
+          </m:sup>
+        </m:sSup>
+        <m:r>
+          <m:rPr>
+            <m:sty m:val="p"/>
+          </m:rPr>
+          <m:t>=</m:t>
+        </m:r>
+        <m:r>
+          <m:t>1</m:t>
+        </m:r>
+      </m:oMath>
+      <w:r>
+        <w:t xml:space="preserve"> </w:t>
+      </w:r>
+      <w:r>
+        <w:t xml:space="preserve">is a local minimizer of</w:t>
+      </w:r>
+      <w:r>
+        <w:t xml:space="preserve"> </w:t>
+      </w:r>
+      <m:oMath>
+        <m:r>
+          <m:t>f</m:t>
+        </m:r>
+      </m:oMath>
+      <w:r>
+        <w:t xml:space="preserve"> </w:t>
+      </w:r>
+      <w:r>
+        <w:t xml:space="preserve">(take</w:t>
+      </w:r>
+      <w:r>
+        <w:t xml:space="preserve"> </w:t>
+      </w:r>
+      <m:oMath>
+        <m:r>
+          <m:t>δ</m:t>
+        </m:r>
+        <m:r>
+          <m:rPr>
+            <m:sty m:val="p"/>
+          </m:rPr>
+          <m:t>=</m:t>
+        </m:r>
+        <m:r>
+          <m:t>1</m:t>
+        </m:r>
+      </m:oMath>
+      <w:r>
+        <w:t xml:space="preserve">),</w:t>
+      </w:r>
+      <w:r>
+        <w:t xml:space="preserve"> </w:t>
+      </w:r>
+      <w:r>
+        <w:t xml:space="preserve">but not a global one.</w:t>
+      </w:r>
+    </w:p>
+    <w:bookmarkEnd w:id="32"/>
+    <w:bookmarkStart w:id="37" w:name="infimum-and-supremum"/>
+    <w:p>
+      <w:pPr>
+        <w:pStyle w:val="Heading2"/>
+      </w:pPr>
+      <w:r>
+        <w:t xml:space="preserve">5 Infimum and supremum</w:t>
+      </w:r>
+    </w:p>
+    <w:bookmarkStart w:id="33" w:name="def-infimum"/>
+    <w:p>
+      <w:pPr>
+        <w:pStyle w:val="FirstParagraph"/>
+      </w:pPr>
+      <w:r>
+        <w:rPr>
+          <w:b/>
+          <w:bCs/>
+        </w:rPr>
+        <w:t xml:space="preserve">Definition 7 (Infimum (greatest lower bound))</w:t>
       </w:r>
       <w:r>
         <w:t xml:space="preserve"> </w:t>
@@ -4001,7 +6797,7 @@
         <w:t xml:space="preserve">by convention.</w:t>
       </w:r>
     </w:p>
-    <w:bookmarkEnd w:id="27"/>
+    <w:bookmarkEnd w:id="33"/>
     <w:p>
       <w:pPr>
         <w:pStyle w:val="BodyText"/>
@@ -4017,7 +6813,7 @@
           <w:rPr>
             <w:rStyle w:val="Hyperlink"/>
           </w:rPr>
-          <w:t xml:space="preserve">Definition 5</w:t>
+          <w:t xml:space="preserve">Definition 7</w:t>
         </w:r>
       </w:hyperlink>
       <w:r>
@@ -4091,7 +6887,7 @@
         <w:t xml:space="preserve">.</w:t>
       </w:r>
     </w:p>
-    <w:bookmarkStart w:id="28" w:name="exm-infimum"/>
+    <w:bookmarkStart w:id="34" w:name="exm-infimum"/>
     <w:p>
       <w:pPr>
         <w:pStyle w:val="BodyText"/>
@@ -4115,7 +6911,7 @@
         <w:pStyle w:val="Compact"/>
         <w:numPr>
           <w:ilvl w:val="0"/>
-          <w:numId w:val="1003"/>
+          <w:numId w:val="1005"/>
         </w:numPr>
       </w:pPr>
       <m:oMath>
@@ -4191,7 +6987,7 @@
         <w:pStyle w:val="Compact"/>
         <w:numPr>
           <w:ilvl w:val="0"/>
-          <w:numId w:val="1003"/>
+          <w:numId w:val="1005"/>
         </w:numPr>
       </w:pPr>
       <m:oMath>
@@ -4445,7 +7241,7 @@
         <w:pStyle w:val="Compact"/>
         <w:numPr>
           <w:ilvl w:val="0"/>
-          <w:numId w:val="1003"/>
+          <w:numId w:val="1005"/>
         </w:numPr>
       </w:pPr>
       <m:oMath>
@@ -4536,7 +7332,7 @@
         <w:pStyle w:val="Compact"/>
         <w:numPr>
           <w:ilvl w:val="0"/>
-          <w:numId w:val="1003"/>
+          <w:numId w:val="1005"/>
         </w:numPr>
       </w:pPr>
       <m:oMath>
@@ -4638,8 +7434,8 @@
         <w:t xml:space="preserve">because no real number is less than or equal to every element of that set.</w:t>
       </w:r>
     </w:p>
-    <w:bookmarkEnd w:id="28"/>
-    <w:bookmarkStart w:id="29" w:name="def-supremum"/>
+    <w:bookmarkEnd w:id="34"/>
+    <w:bookmarkStart w:id="35" w:name="def-supremum"/>
     <w:p>
       <w:pPr>
         <w:pStyle w:val="FirstParagraph"/>
@@ -4649,7 +7445,7 @@
           <w:b/>
           <w:bCs/>
         </w:rPr>
-        <w:t xml:space="preserve">Definition 6 (Supremum (least upper bound))</w:t>
+        <w:t xml:space="preserve">Definition 8 (Supremum (least upper bound))</w:t>
       </w:r>
       <w:r>
         <w:t xml:space="preserve"> </w:t>
@@ -5075,7 +7871,7 @@
         <w:t xml:space="preserve">by convention.</w:t>
       </w:r>
     </w:p>
-    <w:bookmarkEnd w:id="29"/>
+    <w:bookmarkEnd w:id="35"/>
     <w:p>
       <w:pPr>
         <w:pStyle w:val="BodyText"/>
@@ -5091,7 +7887,7 @@
           <w:rPr>
             <w:rStyle w:val="Hyperlink"/>
           </w:rPr>
-          <w:t xml:space="preserve">Definition 6</w:t>
+          <w:t xml:space="preserve">Definition 8</w:t>
         </w:r>
       </w:hyperlink>
       <w:r>
@@ -5165,7 +7961,7 @@
         <w:t xml:space="preserve">.</w:t>
       </w:r>
     </w:p>
-    <w:bookmarkStart w:id="30" w:name="exm-supremum"/>
+    <w:bookmarkStart w:id="36" w:name="exm-supremum"/>
     <w:p>
       <w:pPr>
         <w:pStyle w:val="BodyText"/>
@@ -5189,7 +7985,7 @@
         <w:pStyle w:val="Compact"/>
         <w:numPr>
           <w:ilvl w:val="0"/>
-          <w:numId w:val="1004"/>
+          <w:numId w:val="1006"/>
         </w:numPr>
       </w:pPr>
       <m:oMath>
@@ -5265,7 +8061,7 @@
         <w:pStyle w:val="Compact"/>
         <w:numPr>
           <w:ilvl w:val="0"/>
-          <w:numId w:val="1004"/>
+          <w:numId w:val="1006"/>
         </w:numPr>
       </w:pPr>
       <m:oMath>
@@ -5356,7 +8152,7 @@
         <w:pStyle w:val="Compact"/>
         <w:numPr>
           <w:ilvl w:val="0"/>
-          <w:numId w:val="1004"/>
+          <w:numId w:val="1006"/>
         </w:numPr>
       </w:pPr>
       <m:oMath>
@@ -5440,18 +8236,18 @@
         <w:t xml:space="preserve">because no real number is greater than or equal to every element of that set.</w:t>
       </w:r>
     </w:p>
-    <w:bookmarkEnd w:id="30"/>
-    <w:bookmarkEnd w:id="31"/>
-    <w:bookmarkStart w:id="35" w:name="sums"/>
+    <w:bookmarkEnd w:id="36"/>
+    <w:bookmarkEnd w:id="37"/>
+    <w:bookmarkStart w:id="41" w:name="sums"/>
     <w:p>
       <w:pPr>
         <w:pStyle w:val="Heading2"/>
       </w:pPr>
       <w:r>
-        <w:t xml:space="preserve">5 Sums</w:t>
+        <w:t xml:space="preserve">6 Sums</w:t>
       </w:r>
     </w:p>
-    <w:bookmarkStart w:id="32" w:name="thm-add-ident"/>
+    <w:bookmarkStart w:id="38" w:name="thm-add-ident"/>
     <w:p>
       <w:pPr>
         <w:pStyle w:val="FirstParagraph"/>
@@ -5497,8 +8293,8 @@
         </m:oMath>
       </m:oMathPara>
     </w:p>
-    <w:bookmarkEnd w:id="32"/>
-    <w:bookmarkStart w:id="33" w:name="thm-sum-symmetric"/>
+    <w:bookmarkEnd w:id="38"/>
+    <w:bookmarkStart w:id="39" w:name="thm-sum-symmetric"/>
     <w:p>
       <w:pPr>
         <w:pStyle w:val="FirstParagraph"/>
@@ -5553,8 +8349,8 @@
         </m:oMath>
       </m:oMathPara>
     </w:p>
-    <w:bookmarkEnd w:id="33"/>
-    <w:bookmarkStart w:id="34" w:name="thm-sum-assoc"/>
+    <w:bookmarkEnd w:id="39"/>
+    <w:bookmarkStart w:id="40" w:name="thm-sum-assoc"/>
     <w:p>
       <w:pPr>
         <w:pStyle w:val="FirstParagraph"/>
@@ -5665,18 +8461,18 @@
         </m:oMath>
       </m:oMathPara>
     </w:p>
-    <w:bookmarkEnd w:id="34"/>
-    <w:bookmarkEnd w:id="35"/>
-    <w:bookmarkStart w:id="39" w:name="products"/>
+    <w:bookmarkEnd w:id="40"/>
+    <w:bookmarkEnd w:id="41"/>
+    <w:bookmarkStart w:id="45" w:name="products"/>
     <w:p>
       <w:pPr>
         <w:pStyle w:val="Heading2"/>
       </w:pPr>
       <w:r>
-        <w:t xml:space="preserve">6 Products</w:t>
+        <w:t xml:space="preserve">7 Products</w:t>
       </w:r>
     </w:p>
-    <w:bookmarkStart w:id="36" w:name="thm-mult-one"/>
+    <w:bookmarkStart w:id="42" w:name="thm-mult-one"/>
     <w:p>
       <w:pPr>
         <w:pStyle w:val="FirstParagraph"/>
@@ -5722,8 +8518,8 @@
         </m:oMath>
       </m:oMathPara>
     </w:p>
-    <w:bookmarkEnd w:id="36"/>
-    <w:bookmarkStart w:id="37" w:name="thm-prod-symmetric"/>
+    <w:bookmarkEnd w:id="42"/>
+    <w:bookmarkStart w:id="43" w:name="thm-prod-symmetric"/>
     <w:p>
       <w:pPr>
         <w:pStyle w:val="FirstParagraph"/>
@@ -5778,8 +8574,8 @@
         </m:oMath>
       </m:oMathPara>
     </w:p>
-    <w:bookmarkEnd w:id="37"/>
-    <w:bookmarkStart w:id="38" w:name="thm-prod-assoc"/>
+    <w:bookmarkEnd w:id="43"/>
+    <w:bookmarkStart w:id="44" w:name="thm-prod-assoc"/>
     <w:p>
       <w:pPr>
         <w:pStyle w:val="FirstParagraph"/>
@@ -5876,18 +8672,18 @@
         </m:oMath>
       </m:oMathPara>
     </w:p>
-    <w:bookmarkEnd w:id="38"/>
-    <w:bookmarkEnd w:id="39"/>
-    <w:bookmarkStart w:id="41" w:name="division"/>
+    <w:bookmarkEnd w:id="44"/>
+    <w:bookmarkEnd w:id="45"/>
+    <w:bookmarkStart w:id="47" w:name="division"/>
     <w:p>
       <w:pPr>
         <w:pStyle w:val="Heading2"/>
       </w:pPr>
       <w:r>
-        <w:t xml:space="preserve">7 Division</w:t>
+        <w:t xml:space="preserve">8 Division</w:t>
       </w:r>
     </w:p>
-    <w:bookmarkStart w:id="40" w:name="thm-prod-div"/>
+    <w:bookmarkStart w:id="46" w:name="thm-prod-div"/>
     <w:p>
       <w:pPr>
         <w:pStyle w:val="FirstParagraph"/>
@@ -5983,18 +8779,18 @@
         </m:oMath>
       </m:oMathPara>
     </w:p>
-    <w:bookmarkEnd w:id="40"/>
-    <w:bookmarkEnd w:id="41"/>
-    <w:bookmarkStart w:id="46" w:name="sums-and-products-together"/>
+    <w:bookmarkEnd w:id="46"/>
+    <w:bookmarkEnd w:id="47"/>
+    <w:bookmarkStart w:id="52" w:name="sums-and-products-together"/>
     <w:p>
       <w:pPr>
         <w:pStyle w:val="Heading2"/>
       </w:pPr>
       <w:r>
-        <w:t xml:space="preserve">8 Sums and products together</w:t>
+        <w:t xml:space="preserve">9 Sums and products together</w:t>
       </w:r>
     </w:p>
-    <w:bookmarkStart w:id="42" w:name="thm-mult-distr"/>
+    <w:bookmarkStart w:id="48" w:name="thm-mult-distr"/>
     <w:p>
       <w:pPr>
         <w:pStyle w:val="FirstParagraph"/>
@@ -6070,8 +8866,8 @@
         </m:oMath>
       </m:oMathPara>
     </w:p>
-    <w:bookmarkEnd w:id="42"/>
-    <w:bookmarkStart w:id="43" w:name="exr-square-of-a-sum"/>
+    <w:bookmarkEnd w:id="48"/>
+    <w:bookmarkStart w:id="49" w:name="exr-square-of-a-sum"/>
     <w:p>
       <w:pPr>
         <w:pStyle w:val="FirstParagraph"/>
@@ -6081,7 +8877,7 @@
           <w:b/>
           <w:bCs/>
         </w:rPr>
-        <w:t xml:space="preserve">Exercise 2 (Expand a squared sum)</w:t>
+        <w:t xml:space="preserve">Exercise 3 (Expand a squared sum)</w:t>
       </w:r>
       <w:r>
         <w:t xml:space="preserve"> </w:t>
@@ -6253,8 +9049,8 @@
         <w:t xml:space="preserve">using only the distributive law and the rules above.</w:t>
       </w:r>
     </w:p>
-    <w:bookmarkEnd w:id="43"/>
-    <w:bookmarkStart w:id="44" w:name="sol-square-of-a-sum"/>
+    <w:bookmarkEnd w:id="49"/>
+    <w:bookmarkStart w:id="50" w:name="sol-square-of-a-sum"/>
     <w:p>
       <w:pPr>
         <w:pStyle w:val="BodyText"/>
@@ -6264,7 +9060,7 @@
           <w:i/>
           <w:iCs/>
         </w:rPr>
-        <w:t xml:space="preserve">Solution 2</w:t>
+        <w:t xml:space="preserve">Solution 3</w:t>
       </w:r>
       <w:r>
         <w:t xml:space="preserve">. </w:t>
@@ -7050,8 +9846,8 @@
         <w:t xml:space="preserve">to drop the parentheses.</w:t>
       </w:r>
     </w:p>
-    <w:bookmarkEnd w:id="44"/>
-    <w:bookmarkStart w:id="45" w:name="thm-square-of-a-sum"/>
+    <w:bookmarkEnd w:id="50"/>
+    <w:bookmarkStart w:id="51" w:name="thm-square-of-a-sum"/>
     <w:p>
       <w:pPr>
         <w:pStyle w:val="BodyText"/>
@@ -7191,7 +9987,7 @@
         </m:oMath>
       </m:oMathPara>
     </w:p>
-    <w:bookmarkEnd w:id="45"/>
+    <w:bookmarkEnd w:id="51"/>
     <w:p>
       <w:pPr>
         <w:pStyle w:val="FirstParagraph"/>
@@ -7217,7 +10013,7 @@
           <w:rPr>
             <w:rStyle w:val="Hyperlink"/>
           </w:rPr>
-          <w:t xml:space="preserve">Solution 2</w:t>
+          <w:t xml:space="preserve">Solution 3</w:t>
         </w:r>
       </w:hyperlink>
       <w:r>
@@ -7415,17 +10211,17 @@
         <w:t xml:space="preserve">are expanded this way.</w:t>
       </w:r>
     </w:p>
-    <w:bookmarkEnd w:id="46"/>
-    <w:bookmarkStart w:id="58" w:name="quotients"/>
+    <w:bookmarkEnd w:id="52"/>
+    <w:bookmarkStart w:id="64" w:name="quotients"/>
     <w:p>
       <w:pPr>
         <w:pStyle w:val="Heading2"/>
       </w:pPr>
       <w:r>
-        <w:t xml:space="preserve">9 Quotients</w:t>
+        <w:t xml:space="preserve">10 Quotients</w:t>
       </w:r>
     </w:p>
-    <w:bookmarkStart w:id="47" w:name="def-quotient"/>
+    <w:bookmarkStart w:id="53" w:name="def-quotient"/>
     <w:p>
       <w:pPr>
         <w:pStyle w:val="FirstParagraph"/>
@@ -7435,7 +10231,7 @@
           <w:b/>
           <w:bCs/>
         </w:rPr>
-        <w:t xml:space="preserve">Definition 7 (Quotient)</w:t>
+        <w:t xml:space="preserve">Definition 9 (Quotient)</w:t>
       </w:r>
       <w:r>
         <w:t xml:space="preserve"> </w:t>
@@ -7594,7 +10390,7 @@
         </m:oMath>
       </m:oMathPara>
     </w:p>
-    <w:bookmarkEnd w:id="47"/>
+    <w:bookmarkEnd w:id="53"/>
     <w:p>
       <w:pPr>
         <w:pStyle w:val="FirstParagraph"/>
@@ -7711,7 +10507,7 @@
       <w:r>
         <w:t xml:space="preserve">cf. </w:t>
       </w:r>
-      <w:hyperlink r:id="rId48">
+      <w:hyperlink r:id="rId54">
         <w:r>
           <w:rPr>
             <w:rStyle w:val="Hyperlink"/>
@@ -7720,7 +10516,7 @@
         </w:r>
       </w:hyperlink>
     </w:p>
-    <w:bookmarkStart w:id="49" w:name="exm-quotient"/>
+    <w:bookmarkStart w:id="55" w:name="exm-quotient"/>
     <w:p>
       <w:pPr>
         <w:pStyle w:val="BodyText"/>
@@ -7846,7 +10642,7 @@
           <w:rPr>
             <w:rStyle w:val="Hyperlink"/>
           </w:rPr>
-          <w:t xml:space="preserve">Definition 7</w:t>
+          <w:t xml:space="preserve">Definition 9</w:t>
         </w:r>
       </w:hyperlink>
       <w:r>
@@ -7856,8 +10652,8 @@
         <w:t xml:space="preserve">requires a nonzero denominator.</w:t>
       </w:r>
     </w:p>
-    <w:bookmarkEnd w:id="49"/>
-    <w:bookmarkStart w:id="51" w:name="def-ratio"/>
+    <w:bookmarkEnd w:id="55"/>
+    <w:bookmarkStart w:id="57" w:name="def-ratio"/>
     <w:p>
       <w:pPr>
         <w:pStyle w:val="BodyText"/>
@@ -7867,7 +10663,7 @@
           <w:b/>
           <w:bCs/>
         </w:rPr>
-        <w:t xml:space="preserve">Definition 8 (Ratios)</w:t>
+        <w:t xml:space="preserve">Definition 10 (Ratios)</w:t>
       </w:r>
       <w:r>
         <w:t xml:space="preserve"> </w:t>
@@ -7899,7 +10695,7 @@
       <w:r>
         <w:t xml:space="preserve">cf. </w:t>
       </w:r>
-      <w:hyperlink r:id="rId50">
+      <w:hyperlink r:id="rId56">
         <w:r>
           <w:rPr>
             <w:rStyle w:val="Hyperlink"/>
@@ -7908,8 +10704,8 @@
         </w:r>
       </w:hyperlink>
     </w:p>
-    <w:bookmarkEnd w:id="51"/>
-    <w:bookmarkStart w:id="54" w:name="def-proportion"/>
+    <w:bookmarkEnd w:id="57"/>
+    <w:bookmarkStart w:id="60" w:name="def-proportion"/>
     <w:p>
       <w:pPr>
         <w:pStyle w:val="BodyText"/>
@@ -7919,7 +10715,7 @@
           <w:b/>
           <w:bCs/>
         </w:rPr>
-        <w:t xml:space="preserve">Definition 9 (Proportion)</w:t>
+        <w:t xml:space="preserve">Definition 11 (Proportion)</w:t>
       </w:r>
       <w:r>
         <w:t xml:space="preserve"> </w:t>
@@ -7960,7 +10756,7 @@
       <w:r>
         <w:t xml:space="preserve"> </w:t>
       </w:r>
-      <w:hyperlink r:id="rId52">
+      <w:hyperlink r:id="rId58">
         <w:r>
           <w:rPr>
             <w:rStyle w:val="Hyperlink"/>
@@ -7982,7 +10778,7 @@
       <w:r>
         <w:t xml:space="preserve"> </w:t>
       </w:r>
-      <w:hyperlink r:id="rId53">
+      <w:hyperlink r:id="rId59">
         <w:r>
           <w:rPr>
             <w:rStyle w:val="Hyperlink"/>
@@ -7997,8 +10793,8 @@
         <w:t xml:space="preserve">for other meanings.</w:t>
       </w:r>
     </w:p>
-    <w:bookmarkEnd w:id="54"/>
-    <w:bookmarkStart w:id="56" w:name="def-proportional"/>
+    <w:bookmarkEnd w:id="60"/>
+    <w:bookmarkStart w:id="62" w:name="def-proportional"/>
     <w:p>
       <w:pPr>
         <w:pStyle w:val="BodyText"/>
@@ -8008,7 +10804,7 @@
           <w:b/>
           <w:bCs/>
         </w:rPr>
-        <w:t xml:space="preserve">Definition 10 (Proportional)</w:t>
+        <w:t xml:space="preserve">Definition 12 (Proportional)</w:t>
       </w:r>
       <w:r>
         <w:t xml:space="preserve"> </w:t>
@@ -8169,7 +10965,7 @@
       <w:r>
         <w:t xml:space="preserve">(cf. </w:t>
       </w:r>
-      <w:hyperlink r:id="rId55">
+      <w:hyperlink r:id="rId61">
         <w:r>
           <w:rPr>
             <w:rStyle w:val="Hyperlink"/>
@@ -8181,7 +10977,7 @@
         <w:t xml:space="preserve">)</w:t>
       </w:r>
     </w:p>
-    <w:bookmarkEnd w:id="56"/>
+    <w:bookmarkEnd w:id="62"/>
     <w:p>
       <w:pPr>
         <w:pStyle w:val="BodyText"/>
@@ -8192,7 +10988,7 @@
       <w:r>
         <w:t xml:space="preserve"> </w:t>
       </w:r>
-      <w:hyperlink r:id="rId57">
+      <w:hyperlink r:id="rId63">
         <w:r>
           <w:rPr>
             <w:rStyle w:val="Hyperlink"/>
@@ -8201,14 +10997,14 @@
         </w:r>
       </w:hyperlink>
     </w:p>
-    <w:bookmarkEnd w:id="58"/>
-    <w:bookmarkStart w:id="77" w:name="exponentials-and-logarithms"/>
+    <w:bookmarkEnd w:id="64"/>
+    <w:bookmarkStart w:id="83" w:name="exponentials-and-logarithms"/>
     <w:p>
       <w:pPr>
         <w:pStyle w:val="Heading2"/>
       </w:pPr>
       <w:r>
-        <w:t xml:space="preserve">10 Exponentials and Logarithms</w:t>
+        <w:t xml:space="preserve">11 Exponentials and Logarithms</w:t>
       </w:r>
     </w:p>
     <w:p>
@@ -8413,7 +11209,7 @@
         <w:t xml:space="preserve">for base 10.</w:t>
       </w:r>
     </w:p>
-    <w:bookmarkStart w:id="59" w:name="thm-exp-log-inverse"/>
+    <w:bookmarkStart w:id="65" w:name="thm-exp-log-inverse"/>
     <w:p>
       <w:pPr>
         <w:pStyle w:val="BodyText"/>
@@ -8518,7 +11314,7 @@
         <w:pStyle w:val="Compact"/>
         <w:numPr>
           <w:ilvl w:val="0"/>
-          <w:numId w:val="1005"/>
+          <w:numId w:val="1007"/>
         </w:numPr>
       </w:pPr>
       <w:r>
@@ -8614,7 +11410,7 @@
         <w:pStyle w:val="Compact"/>
         <w:numPr>
           <w:ilvl w:val="0"/>
-          <w:numId w:val="1005"/>
+          <w:numId w:val="1007"/>
         </w:numPr>
       </w:pPr>
       <w:r>
@@ -8709,8 +11505,8 @@
         <w:t xml:space="preserve">.</w:t>
       </w:r>
     </w:p>
-    <w:bookmarkEnd w:id="59"/>
-    <w:bookmarkStart w:id="60" w:name="thm-log-prod"/>
+    <w:bookmarkEnd w:id="65"/>
+    <w:bookmarkStart w:id="66" w:name="thm-log-prod"/>
     <w:p>
       <w:pPr>
         <w:pStyle w:val="FirstParagraph"/>
@@ -8880,8 +11676,8 @@
         </m:oMath>
       </m:oMathPara>
     </w:p>
-    <w:bookmarkEnd w:id="60"/>
-    <w:bookmarkStart w:id="61" w:name="cor-log-quot"/>
+    <w:bookmarkEnd w:id="66"/>
+    <w:bookmarkStart w:id="67" w:name="cor-log-quot"/>
     <w:p>
       <w:pPr>
         <w:pStyle w:val="FirstParagraph"/>
@@ -9054,7 +11850,7 @@
         </m:oMath>
       </m:oMathPara>
     </w:p>
-    <w:bookmarkEnd w:id="61"/>
+    <w:bookmarkEnd w:id="67"/>
     <w:p>
       <w:pPr>
         <w:pStyle w:val="FirstParagraph"/>
@@ -9609,7 +12405,7 @@
         <w:t xml:space="preserve">.</w:t>
       </w:r>
     </w:p>
-    <w:bookmarkStart w:id="62" w:name="thm-log-exp"/>
+    <w:bookmarkStart w:id="68" w:name="thm-log-exp"/>
     <w:p>
       <w:pPr>
         <w:pStyle w:val="BodyText"/>
@@ -9761,8 +12557,8 @@
         </m:oMath>
       </m:oMathPara>
     </w:p>
-    <w:bookmarkEnd w:id="62"/>
-    <w:bookmarkStart w:id="63" w:name="thm-exp-sum"/>
+    <w:bookmarkEnd w:id="68"/>
+    <w:bookmarkStart w:id="69" w:name="thm-exp-sum"/>
     <w:p>
       <w:pPr>
         <w:pStyle w:val="FirstParagraph"/>
@@ -9897,8 +12693,8 @@
         </m:oMath>
       </m:oMathPara>
     </w:p>
-    <w:bookmarkEnd w:id="63"/>
-    <w:bookmarkStart w:id="64" w:name="cor-exp-sum"/>
+    <w:bookmarkEnd w:id="69"/>
+    <w:bookmarkStart w:id="70" w:name="cor-exp-sum"/>
     <w:p>
       <w:pPr>
         <w:pStyle w:val="FirstParagraph"/>
@@ -10048,8 +12844,8 @@
         </m:oMath>
       </m:oMathPara>
     </w:p>
-    <w:bookmarkEnd w:id="64"/>
-    <w:bookmarkStart w:id="65" w:name="thm-double-exp"/>
+    <w:bookmarkEnd w:id="70"/>
+    <w:bookmarkStart w:id="71" w:name="thm-double-exp"/>
     <w:p>
       <w:pPr>
         <w:pStyle w:val="FirstParagraph"/>
@@ -10237,8 +13033,8 @@
         </m:oMath>
       </m:oMathPara>
     </w:p>
-    <w:bookmarkEnd w:id="65"/>
-    <w:bookmarkStart w:id="66" w:name="exm-double-exp-negative-base"/>
+    <w:bookmarkEnd w:id="71"/>
+    <w:bookmarkStart w:id="72" w:name="exm-double-exp-negative-base"/>
     <w:p>
       <w:pPr>
         <w:pStyle w:val="FirstParagraph"/>
@@ -10923,8 +13719,8 @@
         <w:t xml:space="preserve">is not even a real number.</w:t>
       </w:r>
     </w:p>
-    <w:bookmarkEnd w:id="66"/>
-    <w:bookmarkStart w:id="67" w:name="cor-exp-ab"/>
+    <w:bookmarkEnd w:id="72"/>
+    <w:bookmarkStart w:id="73" w:name="cor-exp-ab"/>
     <w:p>
       <w:pPr>
         <w:pStyle w:val="BodyText"/>
@@ -11081,8 +13877,8 @@
         </m:oMath>
       </m:oMathPara>
     </w:p>
-    <w:bookmarkEnd w:id="67"/>
-    <w:bookmarkStart w:id="68" w:name="exr-exp-vs-mult"/>
+    <w:bookmarkEnd w:id="73"/>
+    <w:bookmarkStart w:id="74" w:name="exr-exp-vs-mult"/>
     <w:p>
       <w:pPr>
         <w:pStyle w:val="FirstParagraph"/>
@@ -11092,7 +13888,7 @@
           <w:b/>
           <w:bCs/>
         </w:rPr>
-        <w:t xml:space="preserve">Exercise 3</w:t>
+        <w:t xml:space="preserve">Exercise 4</w:t>
       </w:r>
       <w:r>
         <w:t xml:space="preserve"> </w:t>
@@ -11166,8 +13962,8 @@
         <w:t xml:space="preserve">?</w:t>
       </w:r>
     </w:p>
-    <w:bookmarkEnd w:id="68"/>
-    <w:bookmarkStart w:id="71" w:name="sol-exp-vs-mult"/>
+    <w:bookmarkEnd w:id="74"/>
+    <w:bookmarkStart w:id="77" w:name="sol-exp-vs-mult"/>
     <w:p>
       <w:pPr>
         <w:pStyle w:val="BodyText"/>
@@ -11177,7 +13973,7 @@
           <w:i/>
           <w:iCs/>
         </w:rPr>
-        <w:t xml:space="preserve">Solution 3</w:t>
+        <w:t xml:space="preserve">Solution 4</w:t>
       </w:r>
       <w:r>
         <w:t xml:space="preserve">. </w:t>
@@ -11360,7 +14156,7 @@
         <w:pStyle w:val="Compact"/>
         <w:numPr>
           <w:ilvl w:val="0"/>
-          <w:numId w:val="1006"/>
+          <w:numId w:val="1008"/>
         </w:numPr>
       </w:pPr>
       <m:oMath>
@@ -11397,7 +14193,7 @@
         <w:pStyle w:val="Compact"/>
         <w:numPr>
           <w:ilvl w:val="0"/>
-          <w:numId w:val="1006"/>
+          <w:numId w:val="1008"/>
         </w:numPr>
       </w:pPr>
       <m:oMath>
@@ -11580,7 +14376,7 @@
         <w:pStyle w:val="Compact"/>
         <w:numPr>
           <w:ilvl w:val="0"/>
-          <w:numId w:val="1006"/>
+          <w:numId w:val="1008"/>
         </w:numPr>
       </w:pPr>
       <m:oMath>
@@ -12101,7 +14897,7 @@
         <w:pStyle w:val="Compact"/>
         <w:numPr>
           <w:ilvl w:val="0"/>
-          <w:numId w:val="1006"/>
+          <w:numId w:val="1008"/>
         </w:numPr>
       </w:pPr>
       <m:oMath>
@@ -12359,7 +15155,7 @@
         <w:pStyle w:val="Compact"/>
         <w:numPr>
           <w:ilvl w:val="0"/>
-          <w:numId w:val="1006"/>
+          <w:numId w:val="1008"/>
         </w:numPr>
       </w:pPr>
       <m:oMath>
@@ -12951,7 +15747,7 @@
       <w:tr>
         <w:tc>
           <w:tcPr/>
-          <w:bookmarkStart w:id="69" w:name="fig-double-exponential"/>
+          <w:bookmarkStart w:id="75" w:name="fig-double-exponential"/>
           <w:p>
             <w:pPr>
               <w:pStyle w:val="Compact"/>
@@ -13018,7 +15814,7 @@
               </m:sSup>
             </m:oMath>
           </w:p>
-          <w:bookmarkEnd w:id="69"/>
+          <w:bookmarkEnd w:id="75"/>
         </w:tc>
       </w:tr>
     </w:tbl>
@@ -13043,7 +15839,7 @@
       <w:tr>
         <w:tc>
           <w:tcPr/>
-          <w:bookmarkStart w:id="70" w:name="fig-double-exponential2"/>
+          <w:bookmarkStart w:id="76" w:name="fig-double-exponential2"/>
           <w:p>
             <w:pPr>
               <w:pStyle w:val="Compact"/>
@@ -13160,12 +15956,12 @@
               <w:t xml:space="preserve">.</w:t>
             </w:r>
           </w:p>
-          <w:bookmarkEnd w:id="70"/>
+          <w:bookmarkEnd w:id="76"/>
         </w:tc>
       </w:tr>
     </w:tbl>
-    <w:bookmarkEnd w:id="71"/>
-    <w:bookmarkStart w:id="72" w:name="exr-double-exponential"/>
+    <w:bookmarkEnd w:id="77"/>
+    <w:bookmarkStart w:id="78" w:name="exr-double-exponential"/>
     <w:p>
       <w:pPr>
         <w:pStyle w:val="BodyText"/>
@@ -13175,7 +15971,7 @@
           <w:b/>
           <w:bCs/>
         </w:rPr>
-        <w:t xml:space="preserve">Exercise 4</w:t>
+        <w:t xml:space="preserve">Exercise 5</w:t>
       </w:r>
       <w:r>
         <w:t xml:space="preserve"> </w:t>
@@ -13324,8 +16120,8 @@
         <w:t xml:space="preserve">?</w:t>
       </w:r>
     </w:p>
-    <w:bookmarkEnd w:id="72"/>
-    <w:bookmarkStart w:id="74" w:name="sol-double-exponential"/>
+    <w:bookmarkEnd w:id="78"/>
+    <w:bookmarkStart w:id="80" w:name="sol-double-exponential"/>
     <w:p>
       <w:pPr>
         <w:pStyle w:val="BodyText"/>
@@ -13335,7 +16131,7 @@
           <w:i/>
           <w:iCs/>
         </w:rPr>
-        <w:t xml:space="preserve">Solution 4</w:t>
+        <w:t xml:space="preserve">Solution 5</w:t>
       </w:r>
       <w:r>
         <w:t xml:space="preserve">. </w:t>
@@ -13750,7 +16546,7 @@
       <w:pPr>
         <w:pStyle w:val="BodyText"/>
       </w:pPr>
-      <w:bookmarkStart w:id="73" w:name="eq-double-exp-log-scale"/>
+      <w:bookmarkStart w:id="79" w:name="eq-double-exp-log-scale"/>
       <m:oMathPara>
         <m:oMathParaPr>
           <m:jc m:val="center"/>
@@ -14057,7 +16853,7 @@
           </m:r>
         </m:oMath>
       </m:oMathPara>
-      <w:bookmarkEnd w:id="73"/>
+      <w:bookmarkEnd w:id="79"/>
     </w:p>
     <w:p>
       <w:pPr>
@@ -14089,7 +16885,7 @@
         <w:pStyle w:val="Compact"/>
         <w:numPr>
           <w:ilvl w:val="0"/>
-          <w:numId w:val="1007"/>
+          <w:numId w:val="1009"/>
         </w:numPr>
       </w:pPr>
       <m:oMath>
@@ -14160,7 +16956,7 @@
         <w:pStyle w:val="Compact"/>
         <w:numPr>
           <w:ilvl w:val="0"/>
-          <w:numId w:val="1007"/>
+          <w:numId w:val="1009"/>
         </w:numPr>
       </w:pPr>
       <m:oMath>
@@ -14203,7 +16999,7 @@
           <w:rPr>
             <w:rStyle w:val="Hyperlink"/>
           </w:rPr>
-          <w:t xml:space="preserve">Exercise 3</w:t>
+          <w:t xml:space="preserve">Exercise 4</w:t>
         </w:r>
       </w:hyperlink>
       <w:r>
@@ -14402,7 +17198,7 @@
         <w:pStyle w:val="Compact"/>
         <w:numPr>
           <w:ilvl w:val="0"/>
-          <w:numId w:val="1008"/>
+          <w:numId w:val="1010"/>
         </w:numPr>
       </w:pPr>
       <w:r>
@@ -14501,7 +17297,7 @@
         <w:pStyle w:val="Compact"/>
         <w:numPr>
           <w:ilvl w:val="0"/>
-          <w:numId w:val="1008"/>
+          <w:numId w:val="1010"/>
         </w:numPr>
       </w:pPr>
       <w:r>
@@ -14700,7 +17496,7 @@
         <w:pStyle w:val="Compact"/>
         <w:numPr>
           <w:ilvl w:val="0"/>
-          <w:numId w:val="1008"/>
+          <w:numId w:val="1010"/>
         </w:numPr>
       </w:pPr>
       <w:r>
@@ -15379,9 +18175,9 @@
         </m:oMath>
       </m:oMathPara>
     </w:p>
-    <w:bookmarkEnd w:id="74"/>
-    <w:bookmarkStart w:id="76" w:name="refs"/>
-    <w:bookmarkStart w:id="75" w:name="ref-rudin1976principles"/>
+    <w:bookmarkEnd w:id="80"/>
+    <w:bookmarkStart w:id="82" w:name="refs"/>
+    <w:bookmarkStart w:id="81" w:name="ref-rudin1976principles"/>
     <w:p>
       <w:pPr>
         <w:pStyle w:val="Bibliography"/>
@@ -15403,9 +18199,9 @@
         <w:t xml:space="preserve">. 3rd ed. International Series in Pure and Applied Mathematics. McGraw-Hill.</w:t>
       </w:r>
     </w:p>
-    <w:bookmarkEnd w:id="75"/>
-    <w:bookmarkEnd w:id="76"/>
-    <w:bookmarkEnd w:id="77"/>
+    <w:bookmarkEnd w:id="81"/>
+    <w:bookmarkEnd w:id="82"/>
+    <w:bookmarkEnd w:id="83"/>
     <w:sectPr>
       <w:footnotePr>
         <w:numRestart w:val="eachSect"/>
@@ -15768,12 +18564,6 @@
     </w:lvlOverride>
   </w:num>
   <w:num w:numId="1003">
-    <w:abstractNumId w:val="991"/>
-  </w:num>
-  <w:num w:numId="1004">
-    <w:abstractNumId w:val="991"/>
-  </w:num>
-  <w:num w:numId="1005">
     <w:abstractNumId w:val="99411"/>
     <w:lvlOverride w:ilvl="0">
       <w:startOverride w:val="1"/>
@@ -15803,7 +18593,7 @@
       <w:startOverride w:val="1"/>
     </w:lvlOverride>
   </w:num>
-  <w:num w:numId="1006">
+  <w:num w:numId="1004">
     <w:abstractNumId w:val="99411"/>
     <w:lvlOverride w:ilvl="0">
       <w:startOverride w:val="1"/>
@@ -15832,6 +18622,12 @@
     <w:lvlOverride w:ilvl="8">
       <w:startOverride w:val="1"/>
     </w:lvlOverride>
+  </w:num>
+  <w:num w:numId="1005">
+    <w:abstractNumId w:val="991"/>
+  </w:num>
+  <w:num w:numId="1006">
+    <w:abstractNumId w:val="991"/>
   </w:num>
   <w:num w:numId="1007">
     <w:abstractNumId w:val="99411"/>
@@ -15864,6 +18660,66 @@
     </w:lvlOverride>
   </w:num>
   <w:num w:numId="1008">
+    <w:abstractNumId w:val="99411"/>
+    <w:lvlOverride w:ilvl="0">
+      <w:startOverride w:val="1"/>
+    </w:lvlOverride>
+    <w:lvlOverride w:ilvl="1">
+      <w:startOverride w:val="1"/>
+    </w:lvlOverride>
+    <w:lvlOverride w:ilvl="2">
+      <w:startOverride w:val="1"/>
+    </w:lvlOverride>
+    <w:lvlOverride w:ilvl="3">
+      <w:startOverride w:val="1"/>
+    </w:lvlOverride>
+    <w:lvlOverride w:ilvl="4">
+      <w:startOverride w:val="1"/>
+    </w:lvlOverride>
+    <w:lvlOverride w:ilvl="5">
+      <w:startOverride w:val="1"/>
+    </w:lvlOverride>
+    <w:lvlOverride w:ilvl="6">
+      <w:startOverride w:val="1"/>
+    </w:lvlOverride>
+    <w:lvlOverride w:ilvl="7">
+      <w:startOverride w:val="1"/>
+    </w:lvlOverride>
+    <w:lvlOverride w:ilvl="8">
+      <w:startOverride w:val="1"/>
+    </w:lvlOverride>
+  </w:num>
+  <w:num w:numId="1009">
+    <w:abstractNumId w:val="99411"/>
+    <w:lvlOverride w:ilvl="0">
+      <w:startOverride w:val="1"/>
+    </w:lvlOverride>
+    <w:lvlOverride w:ilvl="1">
+      <w:startOverride w:val="1"/>
+    </w:lvlOverride>
+    <w:lvlOverride w:ilvl="2">
+      <w:startOverride w:val="1"/>
+    </w:lvlOverride>
+    <w:lvlOverride w:ilvl="3">
+      <w:startOverride w:val="1"/>
+    </w:lvlOverride>
+    <w:lvlOverride w:ilvl="4">
+      <w:startOverride w:val="1"/>
+    </w:lvlOverride>
+    <w:lvlOverride w:ilvl="5">
+      <w:startOverride w:val="1"/>
+    </w:lvlOverride>
+    <w:lvlOverride w:ilvl="6">
+      <w:startOverride w:val="1"/>
+    </w:lvlOverride>
+    <w:lvlOverride w:ilvl="7">
+      <w:startOverride w:val="1"/>
+    </w:lvlOverride>
+    <w:lvlOverride w:ilvl="8">
+      <w:startOverride w:val="1"/>
+    </w:lvlOverride>
+  </w:num>
+  <w:num w:numId="1010">
     <w:abstractNumId w:val="991"/>
   </w:num>
 </w:numbering>

</xml_diff>

<commit_message>
Deploying to gh-pages from @ Morrison-Lab/mds@aa9144975c8620e00945ba804a28932f7fd2b9a7 🚀
</commit_message>
<xml_diff>
--- a/algebra.docx
+++ b/algebra.docx
@@ -15,7 +15,7 @@
         <w:pStyle w:val="Date"/>
       </w:pPr>
       <w:r>
-        <w:t xml:space="preserve">Last modified: 2026-10-01 23:48:29 (PDT)</w:t>
+        <w:t xml:space="preserve">Last modified: 2026-10-01 23:55:30 (PDT)</w:t>
       </w:r>
     </w:p>
     <w:bookmarkStart w:id="12" w:name="equalities"/>
@@ -10212,16 +10212,16 @@
       </w:r>
     </w:p>
     <w:bookmarkEnd w:id="52"/>
-    <w:bookmarkStart w:id="64" w:name="quotients"/>
+    <w:bookmarkStart w:id="60" w:name="sec-summation"/>
     <w:p>
       <w:pPr>
         <w:pStyle w:val="Heading2"/>
       </w:pPr>
       <w:r>
-        <w:t xml:space="preserve">10 Quotients</w:t>
+        <w:t xml:space="preserve">10 Summation notation</w:t>
       </w:r>
     </w:p>
-    <w:bookmarkStart w:id="53" w:name="def-quotient"/>
+    <w:bookmarkStart w:id="53" w:name="exr-expand-a-sum"/>
     <w:p>
       <w:pPr>
         <w:pStyle w:val="FirstParagraph"/>
@@ -10231,133 +10231,599 @@
           <w:b/>
           <w:bCs/>
         </w:rPr>
-        <w:t xml:space="preserve">Definition 9 (Quotient)</w:t>
-      </w:r>
-      <w:r>
-        <w:t xml:space="preserve"> </w:t>
-      </w:r>
-      <w:r>
-        <w:t xml:space="preserve">For real numbers</w:t>
-      </w:r>
-      <w:r>
-        <w:t xml:space="preserve"> </w:t>
-      </w:r>
-      <m:oMath>
-        <m:r>
-          <m:t>a</m:t>
-        </m:r>
-      </m:oMath>
-      <w:r>
-        <w:t xml:space="preserve"> </w:t>
-      </w:r>
-      <w:r>
-        <w:t xml:space="preserve">and</w:t>
-      </w:r>
-      <w:r>
-        <w:t xml:space="preserve"> </w:t>
-      </w:r>
-      <m:oMath>
-        <m:r>
-          <m:t>b</m:t>
-        </m:r>
-      </m:oMath>
-      <w:r>
-        <w:t xml:space="preserve"> </w:t>
-      </w:r>
-      <w:r>
-        <w:t xml:space="preserve">with</w:t>
-      </w:r>
-      <w:r>
-        <w:t xml:space="preserve"> </w:t>
-      </w:r>
-      <m:oMath>
-        <m:r>
-          <m:t>b</m:t>
-        </m:r>
-        <m:r>
-          <m:rPr>
-            <m:sty m:val="p"/>
-          </m:rPr>
-          <m:t>≠</m:t>
-        </m:r>
-        <m:r>
-          <m:t>0</m:t>
-        </m:r>
-      </m:oMath>
-      <w:r>
-        <w:t xml:space="preserve">,</w:t>
-      </w:r>
-      <w:r>
-        <w:t xml:space="preserve"> </w:t>
-      </w:r>
-      <w:r>
-        <w:t xml:space="preserve">the</w:t>
-      </w:r>
-      <w:r>
-        <w:t xml:space="preserve"> </w:t>
-      </w:r>
+        <w:t xml:space="preserve">Exercise 4 (Expand a sum)</w:t>
+      </w:r>
+      <w:r>
+        <w:t xml:space="preserve"> </w:t>
+      </w:r>
+      <w:r>
+        <w:t xml:space="preserve">The expression</w:t>
+      </w:r>
+      <w:r>
+        <w:t xml:space="preserve"> </w:t>
+      </w:r>
+      <m:oMath>
+        <m:nary>
+          <m:naryPr>
+            <m:chr m:val="∑"/>
+            <m:limLoc m:val="undOvr"/>
+            <m:subHide m:val="off"/>
+            <m:supHide m:val="off"/>
+          </m:naryPr>
+          <m:sub>
+            <m:r>
+              <m:t>i</m:t>
+            </m:r>
+            <m:r>
+              <m:rPr>
+                <m:sty m:val="p"/>
+              </m:rPr>
+              <m:t>=</m:t>
+            </m:r>
+            <m:r>
+              <m:t>1</m:t>
+            </m:r>
+          </m:sub>
+          <m:sup>
+            <m:r>
+              <m:t>4</m:t>
+            </m:r>
+          </m:sup>
+          <m:e>
+            <m:sSup>
+              <m:e>
+                <m:r>
+                  <m:t>i</m:t>
+                </m:r>
+              </m:e>
+              <m:sup>
+                <m:r>
+                  <m:t>2</m:t>
+                </m:r>
+              </m:sup>
+            </m:sSup>
+          </m:e>
+        </m:nary>
+      </m:oMath>
+      <w:r>
+        <w:t xml:space="preserve"> </w:t>
+      </w:r>
+      <w:r>
+        <w:t xml:space="preserve">is shorthand for a sum of four terms.</w:t>
+      </w:r>
+    </w:p>
+    <w:p>
+      <w:pPr>
+        <w:pStyle w:val="Compact"/>
+        <w:numPr>
+          <w:ilvl w:val="0"/>
+          <w:numId w:val="1007"/>
+        </w:numPr>
+      </w:pPr>
+      <w:r>
+        <w:t xml:space="preserve">Guess which four terms, and add them up.</w:t>
+      </w:r>
+    </w:p>
+    <w:p>
+      <w:pPr>
+        <w:pStyle w:val="Compact"/>
+        <w:numPr>
+          <w:ilvl w:val="0"/>
+          <w:numId w:val="1007"/>
+        </w:numPr>
+      </w:pPr>
+      <w:r>
+        <w:t xml:space="preserve">Write</w:t>
+      </w:r>
+      <w:r>
+        <w:t xml:space="preserve"> </w:t>
+      </w:r>
+      <m:oMath>
+        <m:f>
+          <m:fPr>
+            <m:type m:val="bar"/>
+          </m:fPr>
+          <m:num>
+            <m:r>
+              <m:t>1</m:t>
+            </m:r>
+          </m:num>
+          <m:den>
+            <m:r>
+              <m:t>N</m:t>
+            </m:r>
+          </m:den>
+        </m:f>
+        <m:nary>
+          <m:naryPr>
+            <m:chr m:val="∑"/>
+            <m:limLoc m:val="undOvr"/>
+            <m:subHide m:val="off"/>
+            <m:supHide m:val="off"/>
+          </m:naryPr>
+          <m:sub>
+            <m:r>
+              <m:t>i</m:t>
+            </m:r>
+            <m:r>
+              <m:rPr>
+                <m:sty m:val="p"/>
+              </m:rPr>
+              <m:t>=</m:t>
+            </m:r>
+            <m:r>
+              <m:t>1</m:t>
+            </m:r>
+          </m:sub>
+          <m:sup>
+            <m:r>
+              <m:t>N</m:t>
+            </m:r>
+          </m:sup>
+          <m:e>
+            <m:sSup>
+              <m:e>
+                <m:d>
+                  <m:dPr>
+                    <m:begChr m:val="("/>
+                    <m:sepChr m:val=""/>
+                    <m:endChr m:val=")"/>
+                    <m:grow/>
+                  </m:dPr>
+                  <m:e>
+                    <m:sSub>
+                      <m:e>
+                        <m:r>
+                          <m:t>y</m:t>
+                        </m:r>
+                      </m:e>
+                      <m:sub>
+                        <m:r>
+                          <m:t>i</m:t>
+                        </m:r>
+                      </m:sub>
+                    </m:sSub>
+                    <m:r>
+                      <m:rPr>
+                        <m:sty m:val="p"/>
+                      </m:rPr>
+                      <m:t>−</m:t>
+                    </m:r>
+                    <m:sSub>
+                      <m:e>
+                        <m:acc>
+                          <m:accPr>
+                            <m:chr m:val="̂"/>
+                          </m:accPr>
+                          <m:e>
+                            <m:r>
+                              <m:t>y</m:t>
+                            </m:r>
+                          </m:e>
+                        </m:acc>
+                      </m:e>
+                      <m:sub>
+                        <m:r>
+                          <m:t>i</m:t>
+                        </m:r>
+                      </m:sub>
+                    </m:sSub>
+                  </m:e>
+                </m:d>
+              </m:e>
+              <m:sup>
+                <m:r>
+                  <m:t>2</m:t>
+                </m:r>
+              </m:sup>
+            </m:sSup>
+          </m:e>
+        </m:nary>
+      </m:oMath>
+      <w:r>
+        <w:t xml:space="preserve"> </w:t>
+      </w:r>
+      <w:r>
+        <w:t xml:space="preserve">for</w:t>
+      </w:r>
+      <w:r>
+        <w:t xml:space="preserve"> </w:t>
+      </w:r>
+      <m:oMath>
+        <m:r>
+          <m:t>N</m:t>
+        </m:r>
+        <m:r>
+          <m:rPr>
+            <m:sty m:val="p"/>
+          </m:rPr>
+          <m:t>=</m:t>
+        </m:r>
+        <m:r>
+          <m:t>3</m:t>
+        </m:r>
+      </m:oMath>
+      <w:r>
+        <w:t xml:space="preserve"> </w:t>
+      </w:r>
+      <w:r>
+        <w:t xml:space="preserve">without the</w:t>
+      </w:r>
+      <w:r>
+        <w:t xml:space="preserve"> </w:t>
+      </w:r>
+      <m:oMath>
+        <m:r>
+          <m:rPr>
+            <m:sty m:val="p"/>
+          </m:rPr>
+          <m:t>∑</m:t>
+        </m:r>
+      </m:oMath>
+      <w:r>
+        <w:t xml:space="preserve"> </w:t>
+      </w:r>
+      <w:r>
+        <w:t xml:space="preserve">symbol.</w:t>
+      </w:r>
+    </w:p>
+    <w:bookmarkEnd w:id="53"/>
+    <w:bookmarkStart w:id="54" w:name="sol-expand-a-sum"/>
+    <w:p>
+      <w:pPr>
+        <w:pStyle w:val="FirstParagraph"/>
+      </w:pPr>
       <w:r>
         <w:rPr>
-          <w:b/>
-          <w:bCs/>
+          <w:i/>
+          <w:iCs/>
         </w:rPr>
-        <w:t xml:space="preserve">quotient</w:t>
-      </w:r>
-      <w:r>
-        <w:t xml:space="preserve"> </w:t>
-      </w:r>
-      <w:r>
-        <w:t xml:space="preserve">of</w:t>
-      </w:r>
-      <w:r>
-        <w:t xml:space="preserve"> </w:t>
-      </w:r>
-      <m:oMath>
-        <m:r>
-          <m:t>a</m:t>
-        </m:r>
-      </m:oMath>
-      <w:r>
-        <w:t xml:space="preserve"> </w:t>
-      </w:r>
-      <w:r>
-        <w:t xml:space="preserve">by</w:t>
-      </w:r>
-      <w:r>
-        <w:t xml:space="preserve"> </w:t>
-      </w:r>
-      <m:oMath>
-        <m:r>
-          <m:t>b</m:t>
-        </m:r>
-      </m:oMath>
-      <w:r>
-        <w:t xml:space="preserve"> </w:t>
-      </w:r>
-      <w:r>
-        <w:t xml:space="preserve">is the result of dividing</w:t>
-      </w:r>
-      <w:r>
-        <w:t xml:space="preserve"> </w:t>
-      </w:r>
-      <m:oMath>
-        <m:r>
-          <m:t>a</m:t>
-        </m:r>
-      </m:oMath>
-      <w:r>
-        <w:t xml:space="preserve"> </w:t>
-      </w:r>
-      <w:r>
-        <w:t xml:space="preserve">by</w:t>
-      </w:r>
-      <w:r>
-        <w:t xml:space="preserve"> </w:t>
-      </w:r>
-      <m:oMath>
-        <m:r>
-          <m:t>b</m:t>
-        </m:r>
+        <w:t xml:space="preserve">Solution 4</w:t>
+      </w:r>
+      <w:r>
+        <w:t xml:space="preserve">. </w:t>
+      </w:r>
+    </w:p>
+    <w:p>
+      <w:pPr>
+        <w:numPr>
+          <w:ilvl w:val="0"/>
+          <w:numId w:val="1008"/>
+        </w:numPr>
+      </w:pPr>
+      <w:r>
+        <w:t xml:space="preserve">Replace</w:t>
+      </w:r>
+      <w:r>
+        <w:t xml:space="preserve"> </w:t>
+      </w:r>
+      <m:oMath>
+        <m:r>
+          <m:t>i</m:t>
+        </m:r>
+      </m:oMath>
+      <w:r>
+        <w:t xml:space="preserve"> </w:t>
+      </w:r>
+      <w:r>
+        <w:t xml:space="preserve">by each of</w:t>
+      </w:r>
+      <w:r>
+        <w:t xml:space="preserve"> </w:t>
+      </w:r>
+      <m:oMath>
+        <m:r>
+          <m:t>1</m:t>
+        </m:r>
+        <m:r>
+          <m:rPr>
+            <m:sty m:val="p"/>
+          </m:rPr>
+          <m:t>,</m:t>
+        </m:r>
+        <m:r>
+          <m:t>2</m:t>
+        </m:r>
+        <m:r>
+          <m:rPr>
+            <m:sty m:val="p"/>
+          </m:rPr>
+          <m:t>,</m:t>
+        </m:r>
+        <m:r>
+          <m:t>3</m:t>
+        </m:r>
+        <m:r>
+          <m:rPr>
+            <m:sty m:val="p"/>
+          </m:rPr>
+          <m:t>,</m:t>
+        </m:r>
+        <m:r>
+          <m:t>4</m:t>
+        </m:r>
+      </m:oMath>
+      <w:r>
+        <w:t xml:space="preserve"> </w:t>
+      </w:r>
+      <w:r>
+        <w:t xml:space="preserve">in turn, and add the results:</w:t>
+      </w:r>
+    </w:p>
+    <w:p>
+      <w:pPr>
+        <w:pStyle w:val="BodyText"/>
+      </w:pPr>
+      <m:oMathPara>
+        <m:oMathParaPr>
+          <m:jc m:val="center"/>
+        </m:oMathParaPr>
+        <m:oMath>
+          <m:eqArr>
+            <m:e>
+              <m:nary>
+                <m:naryPr>
+                  <m:chr m:val="∑"/>
+                  <m:limLoc m:val="undOvr"/>
+                  <m:subHide m:val="off"/>
+                  <m:supHide m:val="off"/>
+                </m:naryPr>
+                <m:sub>
+                  <m:r>
+                    <m:t>i</m:t>
+                  </m:r>
+                  <m:r>
+                    <m:rPr>
+                      <m:sty m:val="p"/>
+                    </m:rPr>
+                    <m:t>=</m:t>
+                  </m:r>
+                  <m:r>
+                    <m:t>1</m:t>
+                  </m:r>
+                </m:sub>
+                <m:sup>
+                  <m:r>
+                    <m:t>4</m:t>
+                  </m:r>
+                </m:sup>
+                <m:e>
+                  <m:sSup>
+                    <m:e>
+                      <m:r>
+                        <m:t>i</m:t>
+                      </m:r>
+                    </m:e>
+                    <m:sup>
+                      <m:r>
+                        <m:t>2</m:t>
+                      </m:r>
+                    </m:sup>
+                  </m:sSup>
+                </m:e>
+              </m:nary>
+              <m:r>
+                <m:t>&amp;</m:t>
+              </m:r>
+              <m:r>
+                <m:rPr>
+                  <m:sty m:val="p"/>
+                </m:rPr>
+                <m:t>=</m:t>
+              </m:r>
+              <m:sSup>
+                <m:e>
+                  <m:r>
+                    <m:t>1</m:t>
+                  </m:r>
+                </m:e>
+                <m:sup>
+                  <m:r>
+                    <m:t>2</m:t>
+                  </m:r>
+                </m:sup>
+              </m:sSup>
+              <m:r>
+                <m:rPr>
+                  <m:sty m:val="p"/>
+                </m:rPr>
+                <m:t>+</m:t>
+              </m:r>
+              <m:sSup>
+                <m:e>
+                  <m:r>
+                    <m:t>2</m:t>
+                  </m:r>
+                </m:e>
+                <m:sup>
+                  <m:r>
+                    <m:t>2</m:t>
+                  </m:r>
+                </m:sup>
+              </m:sSup>
+              <m:r>
+                <m:rPr>
+                  <m:sty m:val="p"/>
+                </m:rPr>
+                <m:t>+</m:t>
+              </m:r>
+              <m:sSup>
+                <m:e>
+                  <m:r>
+                    <m:t>3</m:t>
+                  </m:r>
+                </m:e>
+                <m:sup>
+                  <m:r>
+                    <m:t>2</m:t>
+                  </m:r>
+                </m:sup>
+              </m:sSup>
+              <m:r>
+                <m:rPr>
+                  <m:sty m:val="p"/>
+                </m:rPr>
+                <m:t>+</m:t>
+              </m:r>
+              <m:sSup>
+                <m:e>
+                  <m:r>
+                    <m:t>4</m:t>
+                  </m:r>
+                </m:e>
+                <m:sup>
+                  <m:r>
+                    <m:t>2</m:t>
+                  </m:r>
+                </m:sup>
+              </m:sSup>
+            </m:e>
+            <m:e>
+              <m:r>
+                <m:t>&amp;</m:t>
+              </m:r>
+              <m:r>
+                <m:rPr>
+                  <m:sty m:val="p"/>
+                </m:rPr>
+                <m:t>=</m:t>
+              </m:r>
+              <m:r>
+                <m:t>1</m:t>
+              </m:r>
+              <m:r>
+                <m:rPr>
+                  <m:sty m:val="p"/>
+                </m:rPr>
+                <m:t>+</m:t>
+              </m:r>
+              <m:r>
+                <m:t>4</m:t>
+              </m:r>
+              <m:r>
+                <m:rPr>
+                  <m:sty m:val="p"/>
+                </m:rPr>
+                <m:t>+</m:t>
+              </m:r>
+              <m:r>
+                <m:t>9</m:t>
+              </m:r>
+              <m:r>
+                <m:rPr>
+                  <m:sty m:val="p"/>
+                </m:rPr>
+                <m:t>+</m:t>
+              </m:r>
+              <m:r>
+                <m:t>16</m:t>
+              </m:r>
+            </m:e>
+            <m:e>
+              <m:r>
+                <m:t>&amp;</m:t>
+              </m:r>
+              <m:r>
+                <m:rPr>
+                  <m:sty m:val="p"/>
+                </m:rPr>
+                <m:t>=</m:t>
+              </m:r>
+              <m:r>
+                <m:t>30</m:t>
+              </m:r>
+            </m:e>
+          </m:eqArr>
+        </m:oMath>
+      </m:oMathPara>
+    </w:p>
+    <w:p>
+      <w:pPr>
+        <w:numPr>
+          <w:ilvl w:val="0"/>
+          <w:numId w:val="1008"/>
+        </w:numPr>
+      </w:pPr>
+      <w:r>
+        <w:t xml:space="preserve">Replace</w:t>
+      </w:r>
+      <w:r>
+        <w:t xml:space="preserve"> </w:t>
+      </w:r>
+      <m:oMath>
+        <m:r>
+          <m:t>i</m:t>
+        </m:r>
+      </m:oMath>
+      <w:r>
+        <w:t xml:space="preserve"> </w:t>
+      </w:r>
+      <w:r>
+        <w:t xml:space="preserve">by each of</w:t>
+      </w:r>
+      <w:r>
+        <w:t xml:space="preserve"> </w:t>
+      </w:r>
+      <m:oMath>
+        <m:r>
+          <m:t>1</m:t>
+        </m:r>
+        <m:r>
+          <m:rPr>
+            <m:sty m:val="p"/>
+          </m:rPr>
+          <m:t>,</m:t>
+        </m:r>
+        <m:r>
+          <m:t>2</m:t>
+        </m:r>
+        <m:r>
+          <m:rPr>
+            <m:sty m:val="p"/>
+          </m:rPr>
+          <m:t>,</m:t>
+        </m:r>
+        <m:r>
+          <m:t>3</m:t>
+        </m:r>
+      </m:oMath>
+      <w:r>
+        <w:t xml:space="preserve"> </w:t>
+      </w:r>
+      <w:r>
+        <w:t xml:space="preserve">in turn inside the parentheses,</w:t>
+      </w:r>
+      <w:r>
+        <w:t xml:space="preserve"> </w:t>
+      </w:r>
+      <w:r>
+        <w:t xml:space="preserve">add the three squares,</w:t>
+      </w:r>
+      <w:r>
+        <w:t xml:space="preserve"> </w:t>
+      </w:r>
+      <w:r>
+        <w:t xml:space="preserve">and multiply the total by</w:t>
+      </w:r>
+      <w:r>
+        <w:t xml:space="preserve"> </w:t>
+      </w:r>
+      <m:oMath>
+        <m:f>
+          <m:fPr>
+            <m:type m:val="bar"/>
+          </m:fPr>
+          <m:num>
+            <m:r>
+              <m:t>1</m:t>
+            </m:r>
+          </m:num>
+          <m:den>
+            <m:r>
+              <m:t>3</m:t>
+            </m:r>
+          </m:den>
+        </m:f>
       </m:oMath>
       <w:r>
         <w:t xml:space="preserve">:</w:t>
@@ -10378,6 +10844,3046 @@
             </m:fPr>
             <m:num>
               <m:r>
+                <m:t>1</m:t>
+              </m:r>
+            </m:num>
+            <m:den>
+              <m:r>
+                <m:t>3</m:t>
+              </m:r>
+            </m:den>
+          </m:f>
+          <m:nary>
+            <m:naryPr>
+              <m:chr m:val="∑"/>
+              <m:limLoc m:val="undOvr"/>
+              <m:subHide m:val="off"/>
+              <m:supHide m:val="off"/>
+            </m:naryPr>
+            <m:sub>
+              <m:r>
+                <m:t>i</m:t>
+              </m:r>
+              <m:r>
+                <m:rPr>
+                  <m:sty m:val="p"/>
+                </m:rPr>
+                <m:t>=</m:t>
+              </m:r>
+              <m:r>
+                <m:t>1</m:t>
+              </m:r>
+            </m:sub>
+            <m:sup>
+              <m:r>
+                <m:t>3</m:t>
+              </m:r>
+            </m:sup>
+            <m:e>
+              <m:sSup>
+                <m:e>
+                  <m:d>
+                    <m:dPr>
+                      <m:begChr m:val="("/>
+                      <m:sepChr m:val=""/>
+                      <m:endChr m:val=")"/>
+                      <m:grow/>
+                    </m:dPr>
+                    <m:e>
+                      <m:sSub>
+                        <m:e>
+                          <m:r>
+                            <m:t>y</m:t>
+                          </m:r>
+                        </m:e>
+                        <m:sub>
+                          <m:r>
+                            <m:t>i</m:t>
+                          </m:r>
+                        </m:sub>
+                      </m:sSub>
+                      <m:r>
+                        <m:rPr>
+                          <m:sty m:val="p"/>
+                        </m:rPr>
+                        <m:t>−</m:t>
+                      </m:r>
+                      <m:sSub>
+                        <m:e>
+                          <m:acc>
+                            <m:accPr>
+                              <m:chr m:val="̂"/>
+                            </m:accPr>
+                            <m:e>
+                              <m:r>
+                                <m:t>y</m:t>
+                              </m:r>
+                            </m:e>
+                          </m:acc>
+                        </m:e>
+                        <m:sub>
+                          <m:r>
+                            <m:t>i</m:t>
+                          </m:r>
+                        </m:sub>
+                      </m:sSub>
+                    </m:e>
+                  </m:d>
+                </m:e>
+                <m:sup>
+                  <m:r>
+                    <m:t>2</m:t>
+                  </m:r>
+                </m:sup>
+              </m:sSup>
+            </m:e>
+          </m:nary>
+          <m:r>
+            <m:rPr>
+              <m:sty m:val="p"/>
+            </m:rPr>
+            <m:t>=</m:t>
+          </m:r>
+          <m:f>
+            <m:fPr>
+              <m:type m:val="bar"/>
+            </m:fPr>
+            <m:num>
+              <m:r>
+                <m:t>1</m:t>
+              </m:r>
+            </m:num>
+            <m:den>
+              <m:r>
+                <m:t>3</m:t>
+              </m:r>
+            </m:den>
+          </m:f>
+          <m:d>
+            <m:dPr>
+              <m:begChr m:val="["/>
+              <m:sepChr m:val=""/>
+              <m:endChr m:val="]"/>
+              <m:grow/>
+            </m:dPr>
+            <m:e>
+              <m:sSup>
+                <m:e>
+                  <m:d>
+                    <m:dPr>
+                      <m:begChr m:val="("/>
+                      <m:sepChr m:val=""/>
+                      <m:endChr m:val=")"/>
+                      <m:grow/>
+                    </m:dPr>
+                    <m:e>
+                      <m:sSub>
+                        <m:e>
+                          <m:r>
+                            <m:t>y</m:t>
+                          </m:r>
+                        </m:e>
+                        <m:sub>
+                          <m:r>
+                            <m:t>1</m:t>
+                          </m:r>
+                        </m:sub>
+                      </m:sSub>
+                      <m:r>
+                        <m:rPr>
+                          <m:sty m:val="p"/>
+                        </m:rPr>
+                        <m:t>−</m:t>
+                      </m:r>
+                      <m:sSub>
+                        <m:e>
+                          <m:acc>
+                            <m:accPr>
+                              <m:chr m:val="̂"/>
+                            </m:accPr>
+                            <m:e>
+                              <m:r>
+                                <m:t>y</m:t>
+                              </m:r>
+                            </m:e>
+                          </m:acc>
+                        </m:e>
+                        <m:sub>
+                          <m:r>
+                            <m:t>1</m:t>
+                          </m:r>
+                        </m:sub>
+                      </m:sSub>
+                    </m:e>
+                  </m:d>
+                </m:e>
+                <m:sup>
+                  <m:r>
+                    <m:t>2</m:t>
+                  </m:r>
+                </m:sup>
+              </m:sSup>
+              <m:r>
+                <m:rPr>
+                  <m:sty m:val="p"/>
+                </m:rPr>
+                <m:t>+</m:t>
+              </m:r>
+              <m:sSup>
+                <m:e>
+                  <m:d>
+                    <m:dPr>
+                      <m:begChr m:val="("/>
+                      <m:sepChr m:val=""/>
+                      <m:endChr m:val=")"/>
+                      <m:grow/>
+                    </m:dPr>
+                    <m:e>
+                      <m:sSub>
+                        <m:e>
+                          <m:r>
+                            <m:t>y</m:t>
+                          </m:r>
+                        </m:e>
+                        <m:sub>
+                          <m:r>
+                            <m:t>2</m:t>
+                          </m:r>
+                        </m:sub>
+                      </m:sSub>
+                      <m:r>
+                        <m:rPr>
+                          <m:sty m:val="p"/>
+                        </m:rPr>
+                        <m:t>−</m:t>
+                      </m:r>
+                      <m:sSub>
+                        <m:e>
+                          <m:acc>
+                            <m:accPr>
+                              <m:chr m:val="̂"/>
+                            </m:accPr>
+                            <m:e>
+                              <m:r>
+                                <m:t>y</m:t>
+                              </m:r>
+                            </m:e>
+                          </m:acc>
+                        </m:e>
+                        <m:sub>
+                          <m:r>
+                            <m:t>2</m:t>
+                          </m:r>
+                        </m:sub>
+                      </m:sSub>
+                    </m:e>
+                  </m:d>
+                </m:e>
+                <m:sup>
+                  <m:r>
+                    <m:t>2</m:t>
+                  </m:r>
+                </m:sup>
+              </m:sSup>
+              <m:r>
+                <m:rPr>
+                  <m:sty m:val="p"/>
+                </m:rPr>
+                <m:t>+</m:t>
+              </m:r>
+              <m:sSup>
+                <m:e>
+                  <m:d>
+                    <m:dPr>
+                      <m:begChr m:val="("/>
+                      <m:sepChr m:val=""/>
+                      <m:endChr m:val=")"/>
+                      <m:grow/>
+                    </m:dPr>
+                    <m:e>
+                      <m:sSub>
+                        <m:e>
+                          <m:r>
+                            <m:t>y</m:t>
+                          </m:r>
+                        </m:e>
+                        <m:sub>
+                          <m:r>
+                            <m:t>3</m:t>
+                          </m:r>
+                        </m:sub>
+                      </m:sSub>
+                      <m:r>
+                        <m:rPr>
+                          <m:sty m:val="p"/>
+                        </m:rPr>
+                        <m:t>−</m:t>
+                      </m:r>
+                      <m:sSub>
+                        <m:e>
+                          <m:acc>
+                            <m:accPr>
+                              <m:chr m:val="̂"/>
+                            </m:accPr>
+                            <m:e>
+                              <m:r>
+                                <m:t>y</m:t>
+                              </m:r>
+                            </m:e>
+                          </m:acc>
+                        </m:e>
+                        <m:sub>
+                          <m:r>
+                            <m:t>3</m:t>
+                          </m:r>
+                        </m:sub>
+                      </m:sSub>
+                    </m:e>
+                  </m:d>
+                </m:e>
+                <m:sup>
+                  <m:r>
+                    <m:t>2</m:t>
+                  </m:r>
+                </m:sup>
+              </m:sSup>
+            </m:e>
+          </m:d>
+        </m:oMath>
+      </m:oMathPara>
+    </w:p>
+    <w:bookmarkEnd w:id="54"/>
+    <w:bookmarkStart w:id="55" w:name="def-summation"/>
+    <w:p>
+      <w:pPr>
+        <w:pStyle w:val="FirstParagraph"/>
+      </w:pPr>
+      <w:r>
+        <w:rPr>
+          <w:b/>
+          <w:bCs/>
+        </w:rPr>
+        <w:t xml:space="preserve">Definition 9 (Summation notation)</w:t>
+      </w:r>
+      <w:r>
+        <w:t xml:space="preserve"> </w:t>
+      </w:r>
+      <w:r>
+        <w:t xml:space="preserve">Let</w:t>
+      </w:r>
+      <w:r>
+        <w:t xml:space="preserve"> </w:t>
+      </w:r>
+      <m:oMath>
+        <m:r>
+          <m:t>m</m:t>
+        </m:r>
+      </m:oMath>
+      <w:r>
+        <w:t xml:space="preserve"> </w:t>
+      </w:r>
+      <w:r>
+        <w:t xml:space="preserve">and</w:t>
+      </w:r>
+      <w:r>
+        <w:t xml:space="preserve"> </w:t>
+      </w:r>
+      <m:oMath>
+        <m:r>
+          <m:t>n</m:t>
+        </m:r>
+      </m:oMath>
+      <w:r>
+        <w:t xml:space="preserve"> </w:t>
+      </w:r>
+      <w:r>
+        <w:t xml:space="preserve">be integers with</w:t>
+      </w:r>
+      <w:r>
+        <w:t xml:space="preserve"> </w:t>
+      </w:r>
+      <m:oMath>
+        <m:r>
+          <m:t>m</m:t>
+        </m:r>
+        <m:r>
+          <m:rPr>
+            <m:sty m:val="p"/>
+          </m:rPr>
+          <m:t>≤</m:t>
+        </m:r>
+        <m:r>
+          <m:t>n</m:t>
+        </m:r>
+      </m:oMath>
+      <w:r>
+        <w:t xml:space="preserve">,</w:t>
+      </w:r>
+      <w:r>
+        <w:t xml:space="preserve"> </w:t>
+      </w:r>
+      <w:r>
+        <w:t xml:space="preserve">and let</w:t>
+      </w:r>
+      <w:r>
+        <w:t xml:space="preserve"> </w:t>
+      </w:r>
+      <m:oMath>
+        <m:sSub>
+          <m:e>
+            <m:r>
+              <m:t>a</m:t>
+            </m:r>
+          </m:e>
+          <m:sub>
+            <m:r>
+              <m:t>m</m:t>
+            </m:r>
+          </m:sub>
+        </m:sSub>
+        <m:r>
+          <m:rPr>
+            <m:sty m:val="p"/>
+          </m:rPr>
+          <m:t>,</m:t>
+        </m:r>
+        <m:sSub>
+          <m:e>
+            <m:r>
+              <m:t>a</m:t>
+            </m:r>
+          </m:e>
+          <m:sub>
+            <m:r>
+              <m:t>m</m:t>
+            </m:r>
+            <m:r>
+              <m:rPr>
+                <m:sty m:val="p"/>
+              </m:rPr>
+              <m:t>+</m:t>
+            </m:r>
+            <m:r>
+              <m:t>1</m:t>
+            </m:r>
+          </m:sub>
+        </m:sSub>
+        <m:r>
+          <m:rPr>
+            <m:sty m:val="p"/>
+          </m:rPr>
+          <m:t>,</m:t>
+        </m:r>
+        <m:r>
+          <m:rPr>
+            <m:sty m:val="p"/>
+          </m:rPr>
+          <m:t>…</m:t>
+        </m:r>
+        <m:r>
+          <m:rPr>
+            <m:sty m:val="p"/>
+          </m:rPr>
+          <m:t>,</m:t>
+        </m:r>
+        <m:sSub>
+          <m:e>
+            <m:r>
+              <m:t>a</m:t>
+            </m:r>
+          </m:e>
+          <m:sub>
+            <m:r>
+              <m:t>n</m:t>
+            </m:r>
+          </m:sub>
+        </m:sSub>
+      </m:oMath>
+      <w:r>
+        <w:t xml:space="preserve"> </w:t>
+      </w:r>
+      <w:r>
+        <w:t xml:space="preserve">be numbers.</w:t>
+      </w:r>
+      <w:r>
+        <w:t xml:space="preserve"> </w:t>
+      </w:r>
+      <w:r>
+        <w:t xml:space="preserve">The</w:t>
+      </w:r>
+      <w:r>
+        <w:t xml:space="preserve"> </w:t>
+      </w:r>
+      <w:r>
+        <w:rPr>
+          <w:b/>
+          <w:bCs/>
+        </w:rPr>
+        <w:t xml:space="preserve">sum</w:t>
+      </w:r>
+      <w:r>
+        <w:t xml:space="preserve"> </w:t>
+      </w:r>
+      <w:r>
+        <w:t xml:space="preserve">of</w:t>
+      </w:r>
+      <w:r>
+        <w:t xml:space="preserve"> </w:t>
+      </w:r>
+      <m:oMath>
+        <m:sSub>
+          <m:e>
+            <m:r>
+              <m:t>a</m:t>
+            </m:r>
+          </m:e>
+          <m:sub>
+            <m:r>
+              <m:t>m</m:t>
+            </m:r>
+          </m:sub>
+        </m:sSub>
+      </m:oMath>
+      <w:r>
+        <w:t xml:space="preserve"> </w:t>
+      </w:r>
+      <w:r>
+        <w:t xml:space="preserve">through</w:t>
+      </w:r>
+      <w:r>
+        <w:t xml:space="preserve"> </w:t>
+      </w:r>
+      <m:oMath>
+        <m:sSub>
+          <m:e>
+            <m:r>
+              <m:t>a</m:t>
+            </m:r>
+          </m:e>
+          <m:sub>
+            <m:r>
+              <m:t>n</m:t>
+            </m:r>
+          </m:sub>
+        </m:sSub>
+      </m:oMath>
+      <w:r>
+        <w:t xml:space="preserve"> </w:t>
+      </w:r>
+      <w:r>
+        <w:t xml:space="preserve">is</w:t>
+      </w:r>
+    </w:p>
+    <w:p>
+      <w:pPr>
+        <w:pStyle w:val="BodyText"/>
+      </w:pPr>
+      <m:oMathPara>
+        <m:oMathParaPr>
+          <m:jc m:val="center"/>
+        </m:oMathParaPr>
+        <m:oMath>
+          <m:nary>
+            <m:naryPr>
+              <m:chr m:val="∑"/>
+              <m:limLoc m:val="undOvr"/>
+              <m:subHide m:val="off"/>
+              <m:supHide m:val="off"/>
+            </m:naryPr>
+            <m:sub>
+              <m:r>
+                <m:t>i</m:t>
+              </m:r>
+              <m:r>
+                <m:rPr>
+                  <m:sty m:val="p"/>
+                </m:rPr>
+                <m:t>=</m:t>
+              </m:r>
+              <m:r>
+                <m:t>m</m:t>
+              </m:r>
+            </m:sub>
+            <m:sup>
+              <m:r>
+                <m:t>n</m:t>
+              </m:r>
+            </m:sup>
+            <m:e>
+              <m:sSub>
+                <m:e>
+                  <m:r>
+                    <m:t>a</m:t>
+                  </m:r>
+                </m:e>
+                <m:sub>
+                  <m:r>
+                    <m:t>i</m:t>
+                  </m:r>
+                </m:sub>
+              </m:sSub>
+            </m:e>
+          </m:nary>
+          <m:limUpp>
+            <m:e>
+              <m:r>
+                <m:rPr>
+                  <m:sty m:val="p"/>
+                </m:rPr>
+                <m:t>=</m:t>
+              </m:r>
+            </m:e>
+            <m:lim>
+              <m:r>
+                <m:rPr>
+                  <m:nor/>
+                  <m:sty m:val="p"/>
+                </m:rPr>
+                <m:t>def</m:t>
+              </m:r>
+            </m:lim>
+          </m:limUpp>
+          <m:sSub>
+            <m:e>
+              <m:r>
+                <m:t>a</m:t>
+              </m:r>
+            </m:e>
+            <m:sub>
+              <m:r>
+                <m:t>m</m:t>
+              </m:r>
+            </m:sub>
+          </m:sSub>
+          <m:r>
+            <m:rPr>
+              <m:sty m:val="p"/>
+            </m:rPr>
+            <m:t>+</m:t>
+          </m:r>
+          <m:sSub>
+            <m:e>
+              <m:r>
+                <m:t>a</m:t>
+              </m:r>
+            </m:e>
+            <m:sub>
+              <m:r>
+                <m:t>m</m:t>
+              </m:r>
+              <m:r>
+                <m:rPr>
+                  <m:sty m:val="p"/>
+                </m:rPr>
+                <m:t>+</m:t>
+              </m:r>
+              <m:r>
+                <m:t>1</m:t>
+              </m:r>
+            </m:sub>
+          </m:sSub>
+          <m:r>
+            <m:rPr>
+              <m:sty m:val="p"/>
+            </m:rPr>
+            <m:t>+</m:t>
+          </m:r>
+          <m:r>
+            <m:rPr>
+              <m:sty m:val="p"/>
+            </m:rPr>
+            <m:t>⋯</m:t>
+          </m:r>
+          <m:r>
+            <m:rPr>
+              <m:sty m:val="p"/>
+            </m:rPr>
+            <m:t>+</m:t>
+          </m:r>
+          <m:sSub>
+            <m:e>
+              <m:r>
+                <m:t>a</m:t>
+              </m:r>
+            </m:e>
+            <m:sub>
+              <m:r>
+                <m:t>n</m:t>
+              </m:r>
+            </m:sub>
+          </m:sSub>
+        </m:oMath>
+      </m:oMathPara>
+    </w:p>
+    <w:p>
+      <w:pPr>
+        <w:pStyle w:val="FirstParagraph"/>
+      </w:pPr>
+      <w:r>
+        <w:t xml:space="preserve">The variable</w:t>
+      </w:r>
+      <w:r>
+        <w:t xml:space="preserve"> </w:t>
+      </w:r>
+      <m:oMath>
+        <m:r>
+          <m:t>i</m:t>
+        </m:r>
+      </m:oMath>
+      <w:r>
+        <w:t xml:space="preserve"> </w:t>
+      </w:r>
+      <w:r>
+        <w:t xml:space="preserve">is the</w:t>
+      </w:r>
+      <w:r>
+        <w:t xml:space="preserve"> </w:t>
+      </w:r>
+      <w:r>
+        <w:rPr>
+          <w:b/>
+          <w:bCs/>
+        </w:rPr>
+        <w:t xml:space="preserve">index</w:t>
+      </w:r>
+      <w:r>
+        <w:t xml:space="preserve"> </w:t>
+      </w:r>
+      <w:r>
+        <w:t xml:space="preserve">of the sum;</w:t>
+      </w:r>
+      <w:r>
+        <w:t xml:space="preserve"> </w:t>
+      </w:r>
+      <m:oMath>
+        <m:r>
+          <m:t>m</m:t>
+        </m:r>
+      </m:oMath>
+      <w:r>
+        <w:t xml:space="preserve"> </w:t>
+      </w:r>
+      <w:r>
+        <w:t xml:space="preserve">and</w:t>
+      </w:r>
+      <w:r>
+        <w:t xml:space="preserve"> </w:t>
+      </w:r>
+      <m:oMath>
+        <m:r>
+          <m:t>n</m:t>
+        </m:r>
+      </m:oMath>
+      <w:r>
+        <w:t xml:space="preserve"> </w:t>
+      </w:r>
+      <w:r>
+        <w:t xml:space="preserve">are its</w:t>
+      </w:r>
+      <w:r>
+        <w:t xml:space="preserve"> </w:t>
+      </w:r>
+      <w:r>
+        <w:rPr>
+          <w:b/>
+          <w:bCs/>
+        </w:rPr>
+        <w:t xml:space="preserve">lower</w:t>
+      </w:r>
+      <w:r>
+        <w:t xml:space="preserve"> </w:t>
+      </w:r>
+      <w:r>
+        <w:t xml:space="preserve">and</w:t>
+      </w:r>
+      <w:r>
+        <w:t xml:space="preserve"> </w:t>
+      </w:r>
+      <w:r>
+        <w:rPr>
+          <w:b/>
+          <w:bCs/>
+        </w:rPr>
+        <w:t xml:space="preserve">upper limits</w:t>
+      </w:r>
+      <w:r>
+        <w:t xml:space="preserve">.</w:t>
+      </w:r>
+    </w:p>
+    <w:bookmarkEnd w:id="55"/>
+    <w:p>
+      <w:pPr>
+        <w:pStyle w:val="BodyText"/>
+      </w:pPr>
+      <w:r>
+        <w:t xml:space="preserve">The index is a placeholder:</w:t>
+      </w:r>
+      <w:r>
+        <w:t xml:space="preserve"> </w:t>
+      </w:r>
+      <m:oMath>
+        <m:nary>
+          <m:naryPr>
+            <m:chr m:val="∑"/>
+            <m:limLoc m:val="undOvr"/>
+            <m:subHide m:val="off"/>
+            <m:supHide m:val="off"/>
+          </m:naryPr>
+          <m:sub>
+            <m:r>
+              <m:t>i</m:t>
+            </m:r>
+            <m:r>
+              <m:rPr>
+                <m:sty m:val="p"/>
+              </m:rPr>
+              <m:t>=</m:t>
+            </m:r>
+            <m:r>
+              <m:t>1</m:t>
+            </m:r>
+          </m:sub>
+          <m:sup>
+            <m:r>
+              <m:t>n</m:t>
+            </m:r>
+          </m:sup>
+          <m:e>
+            <m:sSub>
+              <m:e>
+                <m:r>
+                  <m:t>a</m:t>
+                </m:r>
+              </m:e>
+              <m:sub>
+                <m:r>
+                  <m:t>i</m:t>
+                </m:r>
+              </m:sub>
+            </m:sSub>
+          </m:e>
+        </m:nary>
+      </m:oMath>
+      <w:r>
+        <w:t xml:space="preserve"> </w:t>
+      </w:r>
+      <w:r>
+        <w:t xml:space="preserve">and</w:t>
+      </w:r>
+      <w:r>
+        <w:t xml:space="preserve"> </w:t>
+      </w:r>
+      <m:oMath>
+        <m:nary>
+          <m:naryPr>
+            <m:chr m:val="∑"/>
+            <m:limLoc m:val="undOvr"/>
+            <m:subHide m:val="off"/>
+            <m:supHide m:val="off"/>
+          </m:naryPr>
+          <m:sub>
+            <m:r>
+              <m:t>j</m:t>
+            </m:r>
+            <m:r>
+              <m:rPr>
+                <m:sty m:val="p"/>
+              </m:rPr>
+              <m:t>=</m:t>
+            </m:r>
+            <m:r>
+              <m:t>1</m:t>
+            </m:r>
+          </m:sub>
+          <m:sup>
+            <m:r>
+              <m:t>n</m:t>
+            </m:r>
+          </m:sup>
+          <m:e>
+            <m:sSub>
+              <m:e>
+                <m:r>
+                  <m:t>a</m:t>
+                </m:r>
+              </m:e>
+              <m:sub>
+                <m:r>
+                  <m:t>j</m:t>
+                </m:r>
+              </m:sub>
+            </m:sSub>
+          </m:e>
+        </m:nary>
+      </m:oMath>
+      <w:r>
+        <w:t xml:space="preserve"> </w:t>
+      </w:r>
+      <w:r>
+        <w:t xml:space="preserve">are the same number.</w:t>
+      </w:r>
+      <w:r>
+        <w:t xml:space="preserve"> </w:t>
+      </w:r>
+      <w:r>
+        <w:t xml:space="preserve">When the upper limit is less than the lower limit,</w:t>
+      </w:r>
+      <w:r>
+        <w:t xml:space="preserve"> </w:t>
+      </w:r>
+      <w:r>
+        <w:t xml:space="preserve">the sum has no terms,</w:t>
+      </w:r>
+      <w:r>
+        <w:t xml:space="preserve"> </w:t>
+      </w:r>
+      <w:r>
+        <w:t xml:space="preserve">and by convention it equals</w:t>
+      </w:r>
+      <w:r>
+        <w:t xml:space="preserve"> </w:t>
+      </w:r>
+      <m:oMath>
+        <m:r>
+          <m:t>0</m:t>
+        </m:r>
+      </m:oMath>
+      <w:r>
+        <w:t xml:space="preserve">.</w:t>
+      </w:r>
+    </w:p>
+    <w:bookmarkStart w:id="56" w:name="exr-sum-rules"/>
+    <w:p>
+      <w:pPr>
+        <w:pStyle w:val="BodyText"/>
+      </w:pPr>
+      <w:r>
+        <w:rPr>
+          <w:b/>
+          <w:bCs/>
+        </w:rPr>
+        <w:t xml:space="preserve">Exercise 5 (Rearrange a sum)</w:t>
+      </w:r>
+      <w:r>
+        <w:t xml:space="preserve"> </w:t>
+      </w:r>
+      <w:r>
+        <w:t xml:space="preserve">Let</w:t>
+      </w:r>
+      <w:r>
+        <w:t xml:space="preserve"> </w:t>
+      </w:r>
+      <m:oMath>
+        <m:r>
+          <m:t>c</m:t>
+        </m:r>
+      </m:oMath>
+      <w:r>
+        <w:t xml:space="preserve"> </w:t>
+      </w:r>
+      <w:r>
+        <w:t xml:space="preserve">be a number, and let</w:t>
+      </w:r>
+      <w:r>
+        <w:t xml:space="preserve"> </w:t>
+      </w:r>
+      <m:oMath>
+        <m:sSub>
+          <m:e>
+            <m:r>
+              <m:t>a</m:t>
+            </m:r>
+          </m:e>
+          <m:sub>
+            <m:r>
+              <m:t>1</m:t>
+            </m:r>
+          </m:sub>
+        </m:sSub>
+        <m:r>
+          <m:rPr>
+            <m:sty m:val="p"/>
+          </m:rPr>
+          <m:t>,</m:t>
+        </m:r>
+        <m:sSub>
+          <m:e>
+            <m:r>
+              <m:t>a</m:t>
+            </m:r>
+          </m:e>
+          <m:sub>
+            <m:r>
+              <m:t>2</m:t>
+            </m:r>
+          </m:sub>
+        </m:sSub>
+        <m:r>
+          <m:rPr>
+            <m:sty m:val="p"/>
+          </m:rPr>
+          <m:t>,</m:t>
+        </m:r>
+        <m:sSub>
+          <m:e>
+            <m:r>
+              <m:t>a</m:t>
+            </m:r>
+          </m:e>
+          <m:sub>
+            <m:r>
+              <m:t>3</m:t>
+            </m:r>
+          </m:sub>
+        </m:sSub>
+      </m:oMath>
+      <w:r>
+        <w:t xml:space="preserve"> </w:t>
+      </w:r>
+      <w:r>
+        <w:t xml:space="preserve">and</w:t>
+      </w:r>
+      <w:r>
+        <w:t xml:space="preserve"> </w:t>
+      </w:r>
+      <m:oMath>
+        <m:sSub>
+          <m:e>
+            <m:r>
+              <m:t>b</m:t>
+            </m:r>
+          </m:e>
+          <m:sub>
+            <m:r>
+              <m:t>1</m:t>
+            </m:r>
+          </m:sub>
+        </m:sSub>
+        <m:r>
+          <m:rPr>
+            <m:sty m:val="p"/>
+          </m:rPr>
+          <m:t>,</m:t>
+        </m:r>
+        <m:sSub>
+          <m:e>
+            <m:r>
+              <m:t>b</m:t>
+            </m:r>
+          </m:e>
+          <m:sub>
+            <m:r>
+              <m:t>2</m:t>
+            </m:r>
+          </m:sub>
+        </m:sSub>
+        <m:r>
+          <m:rPr>
+            <m:sty m:val="p"/>
+          </m:rPr>
+          <m:t>,</m:t>
+        </m:r>
+        <m:sSub>
+          <m:e>
+            <m:r>
+              <m:t>b</m:t>
+            </m:r>
+          </m:e>
+          <m:sub>
+            <m:r>
+              <m:t>3</m:t>
+            </m:r>
+          </m:sub>
+        </m:sSub>
+      </m:oMath>
+      <w:r>
+        <w:t xml:space="preserve"> </w:t>
+      </w:r>
+      <w:r>
+        <w:t xml:space="preserve">be numbers.</w:t>
+      </w:r>
+      <w:r>
+        <w:t xml:space="preserve"> </w:t>
+      </w:r>
+      <w:r>
+        <w:t xml:space="preserve">Using</w:t>
+      </w:r>
+      <w:r>
+        <w:t xml:space="preserve"> </w:t>
+      </w:r>
+      <w:hyperlink w:anchor="def-summation">
+        <w:r>
+          <w:rPr>
+            <w:rStyle w:val="Hyperlink"/>
+          </w:rPr>
+          <w:t xml:space="preserve">Definition 9</w:t>
+        </w:r>
+      </w:hyperlink>
+      <w:r>
+        <w:t xml:space="preserve"> </w:t>
+      </w:r>
+      <w:r>
+        <w:t xml:space="preserve">and the rules of algebra above, show that:</w:t>
+      </w:r>
+    </w:p>
+    <w:p>
+      <w:pPr>
+        <w:pStyle w:val="Compact"/>
+        <w:numPr>
+          <w:ilvl w:val="0"/>
+          <w:numId w:val="1009"/>
+        </w:numPr>
+      </w:pPr>
+      <m:oMath>
+        <m:nary>
+          <m:naryPr>
+            <m:chr m:val="∑"/>
+            <m:limLoc m:val="undOvr"/>
+            <m:subHide m:val="off"/>
+            <m:supHide m:val="off"/>
+          </m:naryPr>
+          <m:sub>
+            <m:r>
+              <m:t>i</m:t>
+            </m:r>
+            <m:r>
+              <m:rPr>
+                <m:sty m:val="p"/>
+              </m:rPr>
+              <m:t>=</m:t>
+            </m:r>
+            <m:r>
+              <m:t>1</m:t>
+            </m:r>
+          </m:sub>
+          <m:sup>
+            <m:r>
+              <m:t>3</m:t>
+            </m:r>
+          </m:sup>
+          <m:e>
+            <m:r>
+              <m:t>c</m:t>
+            </m:r>
+          </m:e>
+        </m:nary>
+        <m:r>
+          <m:t> </m:t>
+        </m:r>
+        <m:sSub>
+          <m:e>
+            <m:r>
+              <m:t>a</m:t>
+            </m:r>
+          </m:e>
+          <m:sub>
+            <m:r>
+              <m:t>i</m:t>
+            </m:r>
+          </m:sub>
+        </m:sSub>
+        <m:r>
+          <m:rPr>
+            <m:sty m:val="p"/>
+          </m:rPr>
+          <m:t>=</m:t>
+        </m:r>
+        <m:r>
+          <m:t>c</m:t>
+        </m:r>
+        <m:nary>
+          <m:naryPr>
+            <m:chr m:val="∑"/>
+            <m:limLoc m:val="undOvr"/>
+            <m:subHide m:val="off"/>
+            <m:supHide m:val="off"/>
+          </m:naryPr>
+          <m:sub>
+            <m:r>
+              <m:t>i</m:t>
+            </m:r>
+            <m:r>
+              <m:rPr>
+                <m:sty m:val="p"/>
+              </m:rPr>
+              <m:t>=</m:t>
+            </m:r>
+            <m:r>
+              <m:t>1</m:t>
+            </m:r>
+          </m:sub>
+          <m:sup>
+            <m:r>
+              <m:t>3</m:t>
+            </m:r>
+          </m:sup>
+          <m:e>
+            <m:sSub>
+              <m:e>
+                <m:r>
+                  <m:t>a</m:t>
+                </m:r>
+              </m:e>
+              <m:sub>
+                <m:r>
+                  <m:t>i</m:t>
+                </m:r>
+              </m:sub>
+            </m:sSub>
+          </m:e>
+        </m:nary>
+      </m:oMath>
+      <w:r>
+        <w:t xml:space="preserve">;</w:t>
+      </w:r>
+    </w:p>
+    <w:p>
+      <w:pPr>
+        <w:pStyle w:val="Compact"/>
+        <w:numPr>
+          <w:ilvl w:val="0"/>
+          <w:numId w:val="1009"/>
+        </w:numPr>
+      </w:pPr>
+      <m:oMath>
+        <m:nary>
+          <m:naryPr>
+            <m:chr m:val="∑"/>
+            <m:limLoc m:val="undOvr"/>
+            <m:subHide m:val="off"/>
+            <m:supHide m:val="off"/>
+          </m:naryPr>
+          <m:sub>
+            <m:r>
+              <m:t>i</m:t>
+            </m:r>
+            <m:r>
+              <m:rPr>
+                <m:sty m:val="p"/>
+              </m:rPr>
+              <m:t>=</m:t>
+            </m:r>
+            <m:r>
+              <m:t>1</m:t>
+            </m:r>
+          </m:sub>
+          <m:sup>
+            <m:r>
+              <m:t>3</m:t>
+            </m:r>
+          </m:sup>
+          <m:e>
+            <m:d>
+              <m:dPr>
+                <m:begChr m:val="("/>
+                <m:sepChr m:val=""/>
+                <m:endChr m:val=")"/>
+                <m:grow/>
+              </m:dPr>
+              <m:e>
+                <m:sSub>
+                  <m:e>
+                    <m:r>
+                      <m:t>a</m:t>
+                    </m:r>
+                  </m:e>
+                  <m:sub>
+                    <m:r>
+                      <m:t>i</m:t>
+                    </m:r>
+                  </m:sub>
+                </m:sSub>
+                <m:r>
+                  <m:rPr>
+                    <m:sty m:val="p"/>
+                  </m:rPr>
+                  <m:t>+</m:t>
+                </m:r>
+                <m:sSub>
+                  <m:e>
+                    <m:r>
+                      <m:t>b</m:t>
+                    </m:r>
+                  </m:e>
+                  <m:sub>
+                    <m:r>
+                      <m:t>i</m:t>
+                    </m:r>
+                  </m:sub>
+                </m:sSub>
+              </m:e>
+            </m:d>
+          </m:e>
+        </m:nary>
+        <m:r>
+          <m:rPr>
+            <m:sty m:val="p"/>
+          </m:rPr>
+          <m:t>=</m:t>
+        </m:r>
+        <m:nary>
+          <m:naryPr>
+            <m:chr m:val="∑"/>
+            <m:limLoc m:val="undOvr"/>
+            <m:subHide m:val="off"/>
+            <m:supHide m:val="off"/>
+          </m:naryPr>
+          <m:sub>
+            <m:r>
+              <m:t>i</m:t>
+            </m:r>
+            <m:r>
+              <m:rPr>
+                <m:sty m:val="p"/>
+              </m:rPr>
+              <m:t>=</m:t>
+            </m:r>
+            <m:r>
+              <m:t>1</m:t>
+            </m:r>
+          </m:sub>
+          <m:sup>
+            <m:r>
+              <m:t>3</m:t>
+            </m:r>
+          </m:sup>
+          <m:e>
+            <m:sSub>
+              <m:e>
+                <m:r>
+                  <m:t>a</m:t>
+                </m:r>
+              </m:e>
+              <m:sub>
+                <m:r>
+                  <m:t>i</m:t>
+                </m:r>
+              </m:sub>
+            </m:sSub>
+          </m:e>
+        </m:nary>
+        <m:r>
+          <m:rPr>
+            <m:sty m:val="p"/>
+          </m:rPr>
+          <m:t>+</m:t>
+        </m:r>
+        <m:nary>
+          <m:naryPr>
+            <m:chr m:val="∑"/>
+            <m:limLoc m:val="undOvr"/>
+            <m:subHide m:val="off"/>
+            <m:supHide m:val="off"/>
+          </m:naryPr>
+          <m:sub>
+            <m:r>
+              <m:t>i</m:t>
+            </m:r>
+            <m:r>
+              <m:rPr>
+                <m:sty m:val="p"/>
+              </m:rPr>
+              <m:t>=</m:t>
+            </m:r>
+            <m:r>
+              <m:t>1</m:t>
+            </m:r>
+          </m:sub>
+          <m:sup>
+            <m:r>
+              <m:t>3</m:t>
+            </m:r>
+          </m:sup>
+          <m:e>
+            <m:sSub>
+              <m:e>
+                <m:r>
+                  <m:t>b</m:t>
+                </m:r>
+              </m:e>
+              <m:sub>
+                <m:r>
+                  <m:t>i</m:t>
+                </m:r>
+              </m:sub>
+            </m:sSub>
+          </m:e>
+        </m:nary>
+      </m:oMath>
+      <w:r>
+        <w:t xml:space="preserve">.</w:t>
+      </w:r>
+    </w:p>
+    <w:p>
+      <w:pPr>
+        <w:pStyle w:val="FirstParagraph"/>
+      </w:pPr>
+      <w:r>
+        <w:t xml:space="preserve">Does either argument depend on there being exactly three terms?</w:t>
+      </w:r>
+    </w:p>
+    <w:bookmarkEnd w:id="56"/>
+    <w:bookmarkStart w:id="57" w:name="sol-sum-rules"/>
+    <w:p>
+      <w:pPr>
+        <w:pStyle w:val="BodyText"/>
+      </w:pPr>
+      <w:r>
+        <w:rPr>
+          <w:i/>
+          <w:iCs/>
+        </w:rPr>
+        <w:t xml:space="preserve">Solution 5</w:t>
+      </w:r>
+      <w:r>
+        <w:t xml:space="preserve">. </w:t>
+      </w:r>
+      <w:r>
+        <w:t xml:space="preserve">Each step below applies</w:t>
+      </w:r>
+      <w:r>
+        <w:t xml:space="preserve"> </w:t>
+      </w:r>
+      <w:hyperlink w:anchor="def-summation">
+        <w:r>
+          <w:rPr>
+            <w:rStyle w:val="Hyperlink"/>
+          </w:rPr>
+          <w:t xml:space="preserve">Definition 9</w:t>
+        </w:r>
+      </w:hyperlink>
+      <w:r>
+        <w:t xml:space="preserve">,</w:t>
+      </w:r>
+      <w:r>
+        <w:t xml:space="preserve"> </w:t>
+      </w:r>
+      <w:r>
+        <w:t xml:space="preserve">the distributive law (</w:t>
+      </w:r>
+      <w:hyperlink w:anchor="thm-mult-distr">
+        <w:r>
+          <w:rPr>
+            <w:rStyle w:val="Hyperlink"/>
+          </w:rPr>
+          <w:t xml:space="preserve">Theorem 14</w:t>
+        </w:r>
+      </w:hyperlink>
+      <w:r>
+        <w:t xml:space="preserve">),</w:t>
+      </w:r>
+      <w:r>
+        <w:t xml:space="preserve"> </w:t>
+      </w:r>
+      <w:r>
+        <w:t xml:space="preserve">or the commutative and associative laws of addition</w:t>
+      </w:r>
+      <w:r>
+        <w:t xml:space="preserve"> </w:t>
+      </w:r>
+      <w:r>
+        <w:t xml:space="preserve">(</w:t>
+      </w:r>
+      <w:hyperlink w:anchor="thm-sum-symmetric">
+        <w:r>
+          <w:rPr>
+            <w:rStyle w:val="Hyperlink"/>
+          </w:rPr>
+          <w:t xml:space="preserve">Theorem 8</w:t>
+        </w:r>
+      </w:hyperlink>
+      <w:r>
+        <w:t xml:space="preserve"> </w:t>
+      </w:r>
+      <w:r>
+        <w:t xml:space="preserve">and</w:t>
+      </w:r>
+      <w:r>
+        <w:t xml:space="preserve"> </w:t>
+      </w:r>
+      <w:hyperlink w:anchor="thm-sum-assoc">
+        <w:r>
+          <w:rPr>
+            <w:rStyle w:val="Hyperlink"/>
+          </w:rPr>
+          <w:t xml:space="preserve">Theorem 9</w:t>
+        </w:r>
+      </w:hyperlink>
+      <w:r>
+        <w:t xml:space="preserve">).</w:t>
+      </w:r>
+    </w:p>
+    <w:p>
+      <w:pPr>
+        <w:numPr>
+          <w:ilvl w:val="0"/>
+          <w:numId w:val="1010"/>
+        </w:numPr>
+      </w:pPr>
+      <w:r>
+        <w:t xml:space="preserve">Expand the sum, then factor out</w:t>
+      </w:r>
+      <w:r>
+        <w:t xml:space="preserve"> </w:t>
+      </w:r>
+      <m:oMath>
+        <m:r>
+          <m:t>c</m:t>
+        </m:r>
+      </m:oMath>
+      <w:r>
+        <w:t xml:space="preserve">:</w:t>
+      </w:r>
+    </w:p>
+    <w:p>
+      <w:pPr>
+        <w:pStyle w:val="BodyText"/>
+      </w:pPr>
+      <m:oMathPara>
+        <m:oMathParaPr>
+          <m:jc m:val="center"/>
+        </m:oMathParaPr>
+        <m:oMath>
+          <m:eqArr>
+            <m:e>
+              <m:nary>
+                <m:naryPr>
+                  <m:chr m:val="∑"/>
+                  <m:limLoc m:val="undOvr"/>
+                  <m:subHide m:val="off"/>
+                  <m:supHide m:val="off"/>
+                </m:naryPr>
+                <m:sub>
+                  <m:r>
+                    <m:t>i</m:t>
+                  </m:r>
+                  <m:r>
+                    <m:rPr>
+                      <m:sty m:val="p"/>
+                    </m:rPr>
+                    <m:t>=</m:t>
+                  </m:r>
+                  <m:r>
+                    <m:t>1</m:t>
+                  </m:r>
+                </m:sub>
+                <m:sup>
+                  <m:r>
+                    <m:t>3</m:t>
+                  </m:r>
+                </m:sup>
+                <m:e>
+                  <m:r>
+                    <m:t>c</m:t>
+                  </m:r>
+                </m:e>
+              </m:nary>
+              <m:r>
+                <m:t> </m:t>
+              </m:r>
+              <m:sSub>
+                <m:e>
+                  <m:r>
+                    <m:t>a</m:t>
+                  </m:r>
+                </m:e>
+                <m:sub>
+                  <m:r>
+                    <m:t>i</m:t>
+                  </m:r>
+                </m:sub>
+              </m:sSub>
+              <m:r>
+                <m:t>&amp;</m:t>
+              </m:r>
+              <m:r>
+                <m:rPr>
+                  <m:sty m:val="p"/>
+                </m:rPr>
+                <m:t>=</m:t>
+              </m:r>
+              <m:r>
+                <m:t>c</m:t>
+              </m:r>
+              <m:r>
+                <m:t> </m:t>
+              </m:r>
+              <m:sSub>
+                <m:e>
+                  <m:r>
+                    <m:t>a</m:t>
+                  </m:r>
+                </m:e>
+                <m:sub>
+                  <m:r>
+                    <m:t>1</m:t>
+                  </m:r>
+                </m:sub>
+              </m:sSub>
+              <m:r>
+                <m:rPr>
+                  <m:sty m:val="p"/>
+                </m:rPr>
+                <m:t>+</m:t>
+              </m:r>
+              <m:r>
+                <m:t>c</m:t>
+              </m:r>
+              <m:r>
+                <m:t> </m:t>
+              </m:r>
+              <m:sSub>
+                <m:e>
+                  <m:r>
+                    <m:t>a</m:t>
+                  </m:r>
+                </m:e>
+                <m:sub>
+                  <m:r>
+                    <m:t>2</m:t>
+                  </m:r>
+                </m:sub>
+              </m:sSub>
+              <m:r>
+                <m:rPr>
+                  <m:sty m:val="p"/>
+                </m:rPr>
+                <m:t>+</m:t>
+              </m:r>
+              <m:r>
+                <m:t>c</m:t>
+              </m:r>
+              <m:r>
+                <m:t> </m:t>
+              </m:r>
+              <m:sSub>
+                <m:e>
+                  <m:r>
+                    <m:t>a</m:t>
+                  </m:r>
+                </m:e>
+                <m:sub>
+                  <m:r>
+                    <m:t>3</m:t>
+                  </m:r>
+                </m:sub>
+              </m:sSub>
+              <m:r>
+                <m:t>&amp;</m:t>
+              </m:r>
+              <m:r>
+                <m:t>&amp;</m:t>
+              </m:r>
+              <m:r>
+                <m:rPr>
+                  <m:nor/>
+                  <m:sty m:val="p"/>
+                </m:rPr>
+                <m:t>(expand the sum)</m:t>
+              </m:r>
+            </m:e>
+            <m:e>
+              <m:r>
+                <m:t>&amp;</m:t>
+              </m:r>
+              <m:r>
+                <m:rPr>
+                  <m:sty m:val="p"/>
+                </m:rPr>
+                <m:t>=</m:t>
+              </m:r>
+              <m:r>
+                <m:t>c</m:t>
+              </m:r>
+              <m:d>
+                <m:dPr>
+                  <m:begChr m:val="("/>
+                  <m:sepChr m:val=""/>
+                  <m:endChr m:val=")"/>
+                  <m:grow/>
+                </m:dPr>
+                <m:e>
+                  <m:sSub>
+                    <m:e>
+                      <m:r>
+                        <m:t>a</m:t>
+                      </m:r>
+                    </m:e>
+                    <m:sub>
+                      <m:r>
+                        <m:t>1</m:t>
+                      </m:r>
+                    </m:sub>
+                  </m:sSub>
+                  <m:r>
+                    <m:rPr>
+                      <m:sty m:val="p"/>
+                    </m:rPr>
+                    <m:t>+</m:t>
+                  </m:r>
+                  <m:sSub>
+                    <m:e>
+                      <m:r>
+                        <m:t>a</m:t>
+                      </m:r>
+                    </m:e>
+                    <m:sub>
+                      <m:r>
+                        <m:t>2</m:t>
+                      </m:r>
+                    </m:sub>
+                  </m:sSub>
+                  <m:r>
+                    <m:rPr>
+                      <m:sty m:val="p"/>
+                    </m:rPr>
+                    <m:t>+</m:t>
+                  </m:r>
+                  <m:sSub>
+                    <m:e>
+                      <m:r>
+                        <m:t>a</m:t>
+                      </m:r>
+                    </m:e>
+                    <m:sub>
+                      <m:r>
+                        <m:t>3</m:t>
+                      </m:r>
+                    </m:sub>
+                  </m:sSub>
+                </m:e>
+              </m:d>
+              <m:r>
+                <m:t>&amp;</m:t>
+              </m:r>
+              <m:r>
+                <m:t>&amp;</m:t>
+              </m:r>
+              <m:r>
+                <m:rPr>
+                  <m:nor/>
+                  <m:sty m:val="p"/>
+                </m:rPr>
+                <m:t>(distributive law)</m:t>
+              </m:r>
+            </m:e>
+            <m:e>
+              <m:r>
+                <m:t>&amp;</m:t>
+              </m:r>
+              <m:r>
+                <m:rPr>
+                  <m:sty m:val="p"/>
+                </m:rPr>
+                <m:t>=</m:t>
+              </m:r>
+              <m:r>
+                <m:t>c</m:t>
+              </m:r>
+              <m:nary>
+                <m:naryPr>
+                  <m:chr m:val="∑"/>
+                  <m:limLoc m:val="undOvr"/>
+                  <m:subHide m:val="off"/>
+                  <m:supHide m:val="off"/>
+                </m:naryPr>
+                <m:sub>
+                  <m:r>
+                    <m:t>i</m:t>
+                  </m:r>
+                  <m:r>
+                    <m:rPr>
+                      <m:sty m:val="p"/>
+                    </m:rPr>
+                    <m:t>=</m:t>
+                  </m:r>
+                  <m:r>
+                    <m:t>1</m:t>
+                  </m:r>
+                </m:sub>
+                <m:sup>
+                  <m:r>
+                    <m:t>3</m:t>
+                  </m:r>
+                </m:sup>
+                <m:e>
+                  <m:sSub>
+                    <m:e>
+                      <m:r>
+                        <m:t>a</m:t>
+                      </m:r>
+                    </m:e>
+                    <m:sub>
+                      <m:r>
+                        <m:t>i</m:t>
+                      </m:r>
+                    </m:sub>
+                  </m:sSub>
+                </m:e>
+              </m:nary>
+              <m:r>
+                <m:t>&amp;</m:t>
+              </m:r>
+              <m:r>
+                <m:t>&amp;</m:t>
+              </m:r>
+              <m:r>
+                <m:rPr>
+                  <m:nor/>
+                  <m:sty m:val="p"/>
+                </m:rPr>
+                <m:t>(collect the sum)</m:t>
+              </m:r>
+            </m:e>
+          </m:eqArr>
+        </m:oMath>
+      </m:oMathPara>
+    </w:p>
+    <w:p>
+      <w:pPr>
+        <w:numPr>
+          <w:ilvl w:val="0"/>
+          <w:numId w:val="1010"/>
+        </w:numPr>
+      </w:pPr>
+      <w:r>
+        <w:t xml:space="preserve">Expand the sum, then regroup the terms:</w:t>
+      </w:r>
+    </w:p>
+    <w:p>
+      <w:pPr>
+        <w:pStyle w:val="BodyText"/>
+      </w:pPr>
+      <m:oMathPara>
+        <m:oMathParaPr>
+          <m:jc m:val="center"/>
+        </m:oMathParaPr>
+        <m:oMath>
+          <m:eqArr>
+            <m:e>
+              <m:nary>
+                <m:naryPr>
+                  <m:chr m:val="∑"/>
+                  <m:limLoc m:val="undOvr"/>
+                  <m:subHide m:val="off"/>
+                  <m:supHide m:val="off"/>
+                </m:naryPr>
+                <m:sub>
+                  <m:r>
+                    <m:t>i</m:t>
+                  </m:r>
+                  <m:r>
+                    <m:rPr>
+                      <m:sty m:val="p"/>
+                    </m:rPr>
+                    <m:t>=</m:t>
+                  </m:r>
+                  <m:r>
+                    <m:t>1</m:t>
+                  </m:r>
+                </m:sub>
+                <m:sup>
+                  <m:r>
+                    <m:t>3</m:t>
+                  </m:r>
+                </m:sup>
+                <m:e>
+                  <m:d>
+                    <m:dPr>
+                      <m:begChr m:val="("/>
+                      <m:sepChr m:val=""/>
+                      <m:endChr m:val=")"/>
+                      <m:grow/>
+                    </m:dPr>
+                    <m:e>
+                      <m:sSub>
+                        <m:e>
+                          <m:r>
+                            <m:t>a</m:t>
+                          </m:r>
+                        </m:e>
+                        <m:sub>
+                          <m:r>
+                            <m:t>i</m:t>
+                          </m:r>
+                        </m:sub>
+                      </m:sSub>
+                      <m:r>
+                        <m:rPr>
+                          <m:sty m:val="p"/>
+                        </m:rPr>
+                        <m:t>+</m:t>
+                      </m:r>
+                      <m:sSub>
+                        <m:e>
+                          <m:r>
+                            <m:t>b</m:t>
+                          </m:r>
+                        </m:e>
+                        <m:sub>
+                          <m:r>
+                            <m:t>i</m:t>
+                          </m:r>
+                        </m:sub>
+                      </m:sSub>
+                    </m:e>
+                  </m:d>
+                </m:e>
+              </m:nary>
+              <m:r>
+                <m:t>&amp;</m:t>
+              </m:r>
+              <m:r>
+                <m:rPr>
+                  <m:sty m:val="p"/>
+                </m:rPr>
+                <m:t>=</m:t>
+              </m:r>
+              <m:d>
+                <m:dPr>
+                  <m:begChr m:val="("/>
+                  <m:sepChr m:val=""/>
+                  <m:endChr m:val=")"/>
+                  <m:grow/>
+                </m:dPr>
+                <m:e>
+                  <m:sSub>
+                    <m:e>
+                      <m:r>
+                        <m:t>a</m:t>
+                      </m:r>
+                    </m:e>
+                    <m:sub>
+                      <m:r>
+                        <m:t>1</m:t>
+                      </m:r>
+                    </m:sub>
+                  </m:sSub>
+                  <m:r>
+                    <m:rPr>
+                      <m:sty m:val="p"/>
+                    </m:rPr>
+                    <m:t>+</m:t>
+                  </m:r>
+                  <m:sSub>
+                    <m:e>
+                      <m:r>
+                        <m:t>b</m:t>
+                      </m:r>
+                    </m:e>
+                    <m:sub>
+                      <m:r>
+                        <m:t>1</m:t>
+                      </m:r>
+                    </m:sub>
+                  </m:sSub>
+                </m:e>
+              </m:d>
+              <m:r>
+                <m:rPr>
+                  <m:sty m:val="p"/>
+                </m:rPr>
+                <m:t>+</m:t>
+              </m:r>
+              <m:d>
+                <m:dPr>
+                  <m:begChr m:val="("/>
+                  <m:sepChr m:val=""/>
+                  <m:endChr m:val=")"/>
+                  <m:grow/>
+                </m:dPr>
+                <m:e>
+                  <m:sSub>
+                    <m:e>
+                      <m:r>
+                        <m:t>a</m:t>
+                      </m:r>
+                    </m:e>
+                    <m:sub>
+                      <m:r>
+                        <m:t>2</m:t>
+                      </m:r>
+                    </m:sub>
+                  </m:sSub>
+                  <m:r>
+                    <m:rPr>
+                      <m:sty m:val="p"/>
+                    </m:rPr>
+                    <m:t>+</m:t>
+                  </m:r>
+                  <m:sSub>
+                    <m:e>
+                      <m:r>
+                        <m:t>b</m:t>
+                      </m:r>
+                    </m:e>
+                    <m:sub>
+                      <m:r>
+                        <m:t>2</m:t>
+                      </m:r>
+                    </m:sub>
+                  </m:sSub>
+                </m:e>
+              </m:d>
+              <m:r>
+                <m:rPr>
+                  <m:sty m:val="p"/>
+                </m:rPr>
+                <m:t>+</m:t>
+              </m:r>
+              <m:d>
+                <m:dPr>
+                  <m:begChr m:val="("/>
+                  <m:sepChr m:val=""/>
+                  <m:endChr m:val=")"/>
+                  <m:grow/>
+                </m:dPr>
+                <m:e>
+                  <m:sSub>
+                    <m:e>
+                      <m:r>
+                        <m:t>a</m:t>
+                      </m:r>
+                    </m:e>
+                    <m:sub>
+                      <m:r>
+                        <m:t>3</m:t>
+                      </m:r>
+                    </m:sub>
+                  </m:sSub>
+                  <m:r>
+                    <m:rPr>
+                      <m:sty m:val="p"/>
+                    </m:rPr>
+                    <m:t>+</m:t>
+                  </m:r>
+                  <m:sSub>
+                    <m:e>
+                      <m:r>
+                        <m:t>b</m:t>
+                      </m:r>
+                    </m:e>
+                    <m:sub>
+                      <m:r>
+                        <m:t>3</m:t>
+                      </m:r>
+                    </m:sub>
+                  </m:sSub>
+                </m:e>
+              </m:d>
+              <m:r>
+                <m:t>&amp;</m:t>
+              </m:r>
+              <m:r>
+                <m:t>&amp;</m:t>
+              </m:r>
+              <m:r>
+                <m:rPr>
+                  <m:nor/>
+                  <m:sty m:val="p"/>
+                </m:rPr>
+                <m:t>(expand the sum)</m:t>
+              </m:r>
+            </m:e>
+            <m:e>
+              <m:r>
+                <m:t>&amp;</m:t>
+              </m:r>
+              <m:r>
+                <m:rPr>
+                  <m:sty m:val="p"/>
+                </m:rPr>
+                <m:t>=</m:t>
+              </m:r>
+              <m:d>
+                <m:dPr>
+                  <m:begChr m:val="("/>
+                  <m:sepChr m:val=""/>
+                  <m:endChr m:val=")"/>
+                  <m:grow/>
+                </m:dPr>
+                <m:e>
+                  <m:sSub>
+                    <m:e>
+                      <m:r>
+                        <m:t>a</m:t>
+                      </m:r>
+                    </m:e>
+                    <m:sub>
+                      <m:r>
+                        <m:t>1</m:t>
+                      </m:r>
+                    </m:sub>
+                  </m:sSub>
+                  <m:r>
+                    <m:rPr>
+                      <m:sty m:val="p"/>
+                    </m:rPr>
+                    <m:t>+</m:t>
+                  </m:r>
+                  <m:sSub>
+                    <m:e>
+                      <m:r>
+                        <m:t>a</m:t>
+                      </m:r>
+                    </m:e>
+                    <m:sub>
+                      <m:r>
+                        <m:t>2</m:t>
+                      </m:r>
+                    </m:sub>
+                  </m:sSub>
+                  <m:r>
+                    <m:rPr>
+                      <m:sty m:val="p"/>
+                    </m:rPr>
+                    <m:t>+</m:t>
+                  </m:r>
+                  <m:sSub>
+                    <m:e>
+                      <m:r>
+                        <m:t>a</m:t>
+                      </m:r>
+                    </m:e>
+                    <m:sub>
+                      <m:r>
+                        <m:t>3</m:t>
+                      </m:r>
+                    </m:sub>
+                  </m:sSub>
+                </m:e>
+              </m:d>
+              <m:r>
+                <m:rPr>
+                  <m:sty m:val="p"/>
+                </m:rPr>
+                <m:t>+</m:t>
+              </m:r>
+              <m:d>
+                <m:dPr>
+                  <m:begChr m:val="("/>
+                  <m:sepChr m:val=""/>
+                  <m:endChr m:val=")"/>
+                  <m:grow/>
+                </m:dPr>
+                <m:e>
+                  <m:sSub>
+                    <m:e>
+                      <m:r>
+                        <m:t>b</m:t>
+                      </m:r>
+                    </m:e>
+                    <m:sub>
+                      <m:r>
+                        <m:t>1</m:t>
+                      </m:r>
+                    </m:sub>
+                  </m:sSub>
+                  <m:r>
+                    <m:rPr>
+                      <m:sty m:val="p"/>
+                    </m:rPr>
+                    <m:t>+</m:t>
+                  </m:r>
+                  <m:sSub>
+                    <m:e>
+                      <m:r>
+                        <m:t>b</m:t>
+                      </m:r>
+                    </m:e>
+                    <m:sub>
+                      <m:r>
+                        <m:t>2</m:t>
+                      </m:r>
+                    </m:sub>
+                  </m:sSub>
+                  <m:r>
+                    <m:rPr>
+                      <m:sty m:val="p"/>
+                    </m:rPr>
+                    <m:t>+</m:t>
+                  </m:r>
+                  <m:sSub>
+                    <m:e>
+                      <m:r>
+                        <m:t>b</m:t>
+                      </m:r>
+                    </m:e>
+                    <m:sub>
+                      <m:r>
+                        <m:t>3</m:t>
+                      </m:r>
+                    </m:sub>
+                  </m:sSub>
+                </m:e>
+              </m:d>
+              <m:r>
+                <m:t>&amp;</m:t>
+              </m:r>
+              <m:r>
+                <m:t>&amp;</m:t>
+              </m:r>
+              <m:r>
+                <m:rPr>
+                  <m:nor/>
+                  <m:sty m:val="p"/>
+                </m:rPr>
+                <m:t>(commutative and associative laws)</m:t>
+              </m:r>
+            </m:e>
+            <m:e>
+              <m:r>
+                <m:t>&amp;</m:t>
+              </m:r>
+              <m:r>
+                <m:rPr>
+                  <m:sty m:val="p"/>
+                </m:rPr>
+                <m:t>=</m:t>
+              </m:r>
+              <m:nary>
+                <m:naryPr>
+                  <m:chr m:val="∑"/>
+                  <m:limLoc m:val="undOvr"/>
+                  <m:subHide m:val="off"/>
+                  <m:supHide m:val="off"/>
+                </m:naryPr>
+                <m:sub>
+                  <m:r>
+                    <m:t>i</m:t>
+                  </m:r>
+                  <m:r>
+                    <m:rPr>
+                      <m:sty m:val="p"/>
+                    </m:rPr>
+                    <m:t>=</m:t>
+                  </m:r>
+                  <m:r>
+                    <m:t>1</m:t>
+                  </m:r>
+                </m:sub>
+                <m:sup>
+                  <m:r>
+                    <m:t>3</m:t>
+                  </m:r>
+                </m:sup>
+                <m:e>
+                  <m:sSub>
+                    <m:e>
+                      <m:r>
+                        <m:t>a</m:t>
+                      </m:r>
+                    </m:e>
+                    <m:sub>
+                      <m:r>
+                        <m:t>i</m:t>
+                      </m:r>
+                    </m:sub>
+                  </m:sSub>
+                </m:e>
+              </m:nary>
+              <m:r>
+                <m:rPr>
+                  <m:sty m:val="p"/>
+                </m:rPr>
+                <m:t>+</m:t>
+              </m:r>
+              <m:nary>
+                <m:naryPr>
+                  <m:chr m:val="∑"/>
+                  <m:limLoc m:val="undOvr"/>
+                  <m:subHide m:val="off"/>
+                  <m:supHide m:val="off"/>
+                </m:naryPr>
+                <m:sub>
+                  <m:r>
+                    <m:t>i</m:t>
+                  </m:r>
+                  <m:r>
+                    <m:rPr>
+                      <m:sty m:val="p"/>
+                    </m:rPr>
+                    <m:t>=</m:t>
+                  </m:r>
+                  <m:r>
+                    <m:t>1</m:t>
+                  </m:r>
+                </m:sub>
+                <m:sup>
+                  <m:r>
+                    <m:t>3</m:t>
+                  </m:r>
+                </m:sup>
+                <m:e>
+                  <m:sSub>
+                    <m:e>
+                      <m:r>
+                        <m:t>b</m:t>
+                      </m:r>
+                    </m:e>
+                    <m:sub>
+                      <m:r>
+                        <m:t>i</m:t>
+                      </m:r>
+                    </m:sub>
+                  </m:sSub>
+                </m:e>
+              </m:nary>
+              <m:r>
+                <m:t>&amp;</m:t>
+              </m:r>
+              <m:r>
+                <m:t>&amp;</m:t>
+              </m:r>
+              <m:r>
+                <m:rPr>
+                  <m:nor/>
+                  <m:sty m:val="p"/>
+                </m:rPr>
+                <m:t>(collect the sum)</m:t>
+              </m:r>
+            </m:e>
+          </m:eqArr>
+        </m:oMath>
+      </m:oMathPara>
+    </w:p>
+    <w:p>
+      <w:pPr>
+        <w:pStyle w:val="FirstParagraph"/>
+      </w:pPr>
+      <w:r>
+        <w:t xml:space="preserve">Neither argument uses the number of terms:</w:t>
+      </w:r>
+      <w:r>
+        <w:t xml:space="preserve"> </w:t>
+      </w:r>
+      <w:r>
+        <w:t xml:space="preserve">the same steps work for any lower and upper limits.</w:t>
+      </w:r>
+    </w:p>
+    <w:bookmarkEnd w:id="57"/>
+    <w:bookmarkStart w:id="58" w:name="thm-sum-constant-factor"/>
+    <w:p>
+      <w:pPr>
+        <w:pStyle w:val="BodyText"/>
+      </w:pPr>
+      <w:r>
+        <w:rPr>
+          <w:b/>
+          <w:bCs/>
+        </w:rPr>
+        <w:t xml:space="preserve">Theorem 16 (A constant factor comes out of a sum)</w:t>
+      </w:r>
+      <w:r>
+        <w:t xml:space="preserve"> </w:t>
+      </w:r>
+      <w:r>
+        <w:t xml:space="preserve">For any number</w:t>
+      </w:r>
+      <w:r>
+        <w:t xml:space="preserve"> </w:t>
+      </w:r>
+      <m:oMath>
+        <m:r>
+          <m:t>c</m:t>
+        </m:r>
+      </m:oMath>
+      <w:r>
+        <w:t xml:space="preserve"> </w:t>
+      </w:r>
+      <w:r>
+        <w:t xml:space="preserve">and numbers</w:t>
+      </w:r>
+      <w:r>
+        <w:t xml:space="preserve"> </w:t>
+      </w:r>
+      <m:oMath>
+        <m:sSub>
+          <m:e>
+            <m:r>
+              <m:t>a</m:t>
+            </m:r>
+          </m:e>
+          <m:sub>
+            <m:r>
+              <m:t>m</m:t>
+            </m:r>
+          </m:sub>
+        </m:sSub>
+        <m:r>
+          <m:rPr>
+            <m:sty m:val="p"/>
+          </m:rPr>
+          <m:t>,</m:t>
+        </m:r>
+        <m:r>
+          <m:rPr>
+            <m:sty m:val="p"/>
+          </m:rPr>
+          <m:t>…</m:t>
+        </m:r>
+        <m:r>
+          <m:rPr>
+            <m:sty m:val="p"/>
+          </m:rPr>
+          <m:t>,</m:t>
+        </m:r>
+        <m:sSub>
+          <m:e>
+            <m:r>
+              <m:t>a</m:t>
+            </m:r>
+          </m:e>
+          <m:sub>
+            <m:r>
+              <m:t>n</m:t>
+            </m:r>
+          </m:sub>
+        </m:sSub>
+      </m:oMath>
+      <w:r>
+        <w:t xml:space="preserve">,</w:t>
+      </w:r>
+    </w:p>
+    <w:p>
+      <w:pPr>
+        <w:pStyle w:val="BodyText"/>
+      </w:pPr>
+      <m:oMathPara>
+        <m:oMathParaPr>
+          <m:jc m:val="center"/>
+        </m:oMathParaPr>
+        <m:oMath>
+          <m:nary>
+            <m:naryPr>
+              <m:chr m:val="∑"/>
+              <m:limLoc m:val="undOvr"/>
+              <m:subHide m:val="off"/>
+              <m:supHide m:val="off"/>
+            </m:naryPr>
+            <m:sub>
+              <m:r>
+                <m:t>i</m:t>
+              </m:r>
+              <m:r>
+                <m:rPr>
+                  <m:sty m:val="p"/>
+                </m:rPr>
+                <m:t>=</m:t>
+              </m:r>
+              <m:r>
+                <m:t>m</m:t>
+              </m:r>
+            </m:sub>
+            <m:sup>
+              <m:r>
+                <m:t>n</m:t>
+              </m:r>
+            </m:sup>
+            <m:e>
+              <m:r>
+                <m:t>c</m:t>
+              </m:r>
+            </m:e>
+          </m:nary>
+          <m:r>
+            <m:t> </m:t>
+          </m:r>
+          <m:sSub>
+            <m:e>
+              <m:r>
+                <m:t>a</m:t>
+              </m:r>
+            </m:e>
+            <m:sub>
+              <m:r>
+                <m:t>i</m:t>
+              </m:r>
+            </m:sub>
+          </m:sSub>
+          <m:r>
+            <m:rPr>
+              <m:sty m:val="p"/>
+            </m:rPr>
+            <m:t>=</m:t>
+          </m:r>
+          <m:r>
+            <m:t>c</m:t>
+          </m:r>
+          <m:nary>
+            <m:naryPr>
+              <m:chr m:val="∑"/>
+              <m:limLoc m:val="undOvr"/>
+              <m:subHide m:val="off"/>
+              <m:supHide m:val="off"/>
+            </m:naryPr>
+            <m:sub>
+              <m:r>
+                <m:t>i</m:t>
+              </m:r>
+              <m:r>
+                <m:rPr>
+                  <m:sty m:val="p"/>
+                </m:rPr>
+                <m:t>=</m:t>
+              </m:r>
+              <m:r>
+                <m:t>m</m:t>
+              </m:r>
+            </m:sub>
+            <m:sup>
+              <m:r>
+                <m:t>n</m:t>
+              </m:r>
+            </m:sup>
+            <m:e>
+              <m:sSub>
+                <m:e>
+                  <m:r>
+                    <m:t>a</m:t>
+                  </m:r>
+                </m:e>
+                <m:sub>
+                  <m:r>
+                    <m:t>i</m:t>
+                  </m:r>
+                </m:sub>
+              </m:sSub>
+            </m:e>
+          </m:nary>
+        </m:oMath>
+      </m:oMathPara>
+    </w:p>
+    <w:bookmarkEnd w:id="58"/>
+    <w:p>
+      <w:pPr>
+        <w:pStyle w:val="FirstParagraph"/>
+      </w:pPr>
+      <w:r>
+        <w:rPr>
+          <w:i/>
+          <w:iCs/>
+        </w:rPr>
+        <w:t xml:space="preserve">Proof</w:t>
+      </w:r>
+      <w:r>
+        <w:t xml:space="preserve">. </w:t>
+      </w:r>
+      <w:r>
+        <w:t xml:space="preserve">By</w:t>
+      </w:r>
+      <w:r>
+        <w:t xml:space="preserve"> </w:t>
+      </w:r>
+      <w:hyperlink w:anchor="sol-sum-rules">
+        <w:r>
+          <w:rPr>
+            <w:rStyle w:val="Hyperlink"/>
+          </w:rPr>
+          <w:t xml:space="preserve">Solution 5</w:t>
+        </w:r>
+      </w:hyperlink>
+      <w:r>
+        <w:t xml:space="preserve">, part 1.</w:t>
+      </w:r>
+    </w:p>
+    <w:bookmarkStart w:id="59" w:name="thm-sum-of-sums"/>
+    <w:p>
+      <w:pPr>
+        <w:pStyle w:val="BodyText"/>
+      </w:pPr>
+      <w:r>
+        <w:rPr>
+          <w:b/>
+          <w:bCs/>
+        </w:rPr>
+        <w:t xml:space="preserve">Theorem 17 (A sum of sums splits)</w:t>
+      </w:r>
+      <w:r>
+        <w:t xml:space="preserve"> </w:t>
+      </w:r>
+      <w:r>
+        <w:t xml:space="preserve">For any numbers</w:t>
+      </w:r>
+      <w:r>
+        <w:t xml:space="preserve"> </w:t>
+      </w:r>
+      <m:oMath>
+        <m:sSub>
+          <m:e>
+            <m:r>
+              <m:t>a</m:t>
+            </m:r>
+          </m:e>
+          <m:sub>
+            <m:r>
+              <m:t>m</m:t>
+            </m:r>
+          </m:sub>
+        </m:sSub>
+        <m:r>
+          <m:rPr>
+            <m:sty m:val="p"/>
+          </m:rPr>
+          <m:t>,</m:t>
+        </m:r>
+        <m:r>
+          <m:rPr>
+            <m:sty m:val="p"/>
+          </m:rPr>
+          <m:t>…</m:t>
+        </m:r>
+        <m:r>
+          <m:rPr>
+            <m:sty m:val="p"/>
+          </m:rPr>
+          <m:t>,</m:t>
+        </m:r>
+        <m:sSub>
+          <m:e>
+            <m:r>
+              <m:t>a</m:t>
+            </m:r>
+          </m:e>
+          <m:sub>
+            <m:r>
+              <m:t>n</m:t>
+            </m:r>
+          </m:sub>
+        </m:sSub>
+      </m:oMath>
+      <w:r>
+        <w:t xml:space="preserve"> </w:t>
+      </w:r>
+      <w:r>
+        <w:t xml:space="preserve">and</w:t>
+      </w:r>
+      <w:r>
+        <w:t xml:space="preserve"> </w:t>
+      </w:r>
+      <m:oMath>
+        <m:sSub>
+          <m:e>
+            <m:r>
+              <m:t>b</m:t>
+            </m:r>
+          </m:e>
+          <m:sub>
+            <m:r>
+              <m:t>m</m:t>
+            </m:r>
+          </m:sub>
+        </m:sSub>
+        <m:r>
+          <m:rPr>
+            <m:sty m:val="p"/>
+          </m:rPr>
+          <m:t>,</m:t>
+        </m:r>
+        <m:r>
+          <m:rPr>
+            <m:sty m:val="p"/>
+          </m:rPr>
+          <m:t>…</m:t>
+        </m:r>
+        <m:r>
+          <m:rPr>
+            <m:sty m:val="p"/>
+          </m:rPr>
+          <m:t>,</m:t>
+        </m:r>
+        <m:sSub>
+          <m:e>
+            <m:r>
+              <m:t>b</m:t>
+            </m:r>
+          </m:e>
+          <m:sub>
+            <m:r>
+              <m:t>n</m:t>
+            </m:r>
+          </m:sub>
+        </m:sSub>
+      </m:oMath>
+      <w:r>
+        <w:t xml:space="preserve">,</w:t>
+      </w:r>
+    </w:p>
+    <w:p>
+      <w:pPr>
+        <w:pStyle w:val="BodyText"/>
+      </w:pPr>
+      <m:oMathPara>
+        <m:oMathParaPr>
+          <m:jc m:val="center"/>
+        </m:oMathParaPr>
+        <m:oMath>
+          <m:nary>
+            <m:naryPr>
+              <m:chr m:val="∑"/>
+              <m:limLoc m:val="undOvr"/>
+              <m:subHide m:val="off"/>
+              <m:supHide m:val="off"/>
+            </m:naryPr>
+            <m:sub>
+              <m:r>
+                <m:t>i</m:t>
+              </m:r>
+              <m:r>
+                <m:rPr>
+                  <m:sty m:val="p"/>
+                </m:rPr>
+                <m:t>=</m:t>
+              </m:r>
+              <m:r>
+                <m:t>m</m:t>
+              </m:r>
+            </m:sub>
+            <m:sup>
+              <m:r>
+                <m:t>n</m:t>
+              </m:r>
+            </m:sup>
+            <m:e>
+              <m:d>
+                <m:dPr>
+                  <m:begChr m:val="("/>
+                  <m:sepChr m:val=""/>
+                  <m:endChr m:val=")"/>
+                  <m:grow/>
+                </m:dPr>
+                <m:e>
+                  <m:sSub>
+                    <m:e>
+                      <m:r>
+                        <m:t>a</m:t>
+                      </m:r>
+                    </m:e>
+                    <m:sub>
+                      <m:r>
+                        <m:t>i</m:t>
+                      </m:r>
+                    </m:sub>
+                  </m:sSub>
+                  <m:r>
+                    <m:rPr>
+                      <m:sty m:val="p"/>
+                    </m:rPr>
+                    <m:t>+</m:t>
+                  </m:r>
+                  <m:sSub>
+                    <m:e>
+                      <m:r>
+                        <m:t>b</m:t>
+                      </m:r>
+                    </m:e>
+                    <m:sub>
+                      <m:r>
+                        <m:t>i</m:t>
+                      </m:r>
+                    </m:sub>
+                  </m:sSub>
+                </m:e>
+              </m:d>
+            </m:e>
+          </m:nary>
+          <m:r>
+            <m:rPr>
+              <m:sty m:val="p"/>
+            </m:rPr>
+            <m:t>=</m:t>
+          </m:r>
+          <m:nary>
+            <m:naryPr>
+              <m:chr m:val="∑"/>
+              <m:limLoc m:val="undOvr"/>
+              <m:subHide m:val="off"/>
+              <m:supHide m:val="off"/>
+            </m:naryPr>
+            <m:sub>
+              <m:r>
+                <m:t>i</m:t>
+              </m:r>
+              <m:r>
+                <m:rPr>
+                  <m:sty m:val="p"/>
+                </m:rPr>
+                <m:t>=</m:t>
+              </m:r>
+              <m:r>
+                <m:t>m</m:t>
+              </m:r>
+            </m:sub>
+            <m:sup>
+              <m:r>
+                <m:t>n</m:t>
+              </m:r>
+            </m:sup>
+            <m:e>
+              <m:sSub>
+                <m:e>
+                  <m:r>
+                    <m:t>a</m:t>
+                  </m:r>
+                </m:e>
+                <m:sub>
+                  <m:r>
+                    <m:t>i</m:t>
+                  </m:r>
+                </m:sub>
+              </m:sSub>
+            </m:e>
+          </m:nary>
+          <m:r>
+            <m:rPr>
+              <m:sty m:val="p"/>
+            </m:rPr>
+            <m:t>+</m:t>
+          </m:r>
+          <m:nary>
+            <m:naryPr>
+              <m:chr m:val="∑"/>
+              <m:limLoc m:val="undOvr"/>
+              <m:subHide m:val="off"/>
+              <m:supHide m:val="off"/>
+            </m:naryPr>
+            <m:sub>
+              <m:r>
+                <m:t>i</m:t>
+              </m:r>
+              <m:r>
+                <m:rPr>
+                  <m:sty m:val="p"/>
+                </m:rPr>
+                <m:t>=</m:t>
+              </m:r>
+              <m:r>
+                <m:t>m</m:t>
+              </m:r>
+            </m:sub>
+            <m:sup>
+              <m:r>
+                <m:t>n</m:t>
+              </m:r>
+            </m:sup>
+            <m:e>
+              <m:sSub>
+                <m:e>
+                  <m:r>
+                    <m:t>b</m:t>
+                  </m:r>
+                </m:e>
+                <m:sub>
+                  <m:r>
+                    <m:t>i</m:t>
+                  </m:r>
+                </m:sub>
+              </m:sSub>
+            </m:e>
+          </m:nary>
+        </m:oMath>
+      </m:oMathPara>
+    </w:p>
+    <w:bookmarkEnd w:id="59"/>
+    <w:p>
+      <w:pPr>
+        <w:pStyle w:val="FirstParagraph"/>
+      </w:pPr>
+      <w:r>
+        <w:rPr>
+          <w:i/>
+          <w:iCs/>
+        </w:rPr>
+        <w:t xml:space="preserve">Proof</w:t>
+      </w:r>
+      <w:r>
+        <w:t xml:space="preserve">. </w:t>
+      </w:r>
+      <w:r>
+        <w:t xml:space="preserve">By</w:t>
+      </w:r>
+      <w:r>
+        <w:t xml:space="preserve"> </w:t>
+      </w:r>
+      <w:hyperlink w:anchor="sol-sum-rules">
+        <w:r>
+          <w:rPr>
+            <w:rStyle w:val="Hyperlink"/>
+          </w:rPr>
+          <w:t xml:space="preserve">Solution 5</w:t>
+        </w:r>
+      </w:hyperlink>
+      <w:r>
+        <w:t xml:space="preserve">, part 2.</w:t>
+      </w:r>
+    </w:p>
+    <w:bookmarkEnd w:id="60"/>
+    <w:bookmarkStart w:id="72" w:name="quotients"/>
+    <w:p>
+      <w:pPr>
+        <w:pStyle w:val="Heading2"/>
+      </w:pPr>
+      <w:r>
+        <w:t xml:space="preserve">11 Quotients</w:t>
+      </w:r>
+    </w:p>
+    <w:bookmarkStart w:id="61" w:name="def-quotient"/>
+    <w:p>
+      <w:pPr>
+        <w:pStyle w:val="FirstParagraph"/>
+      </w:pPr>
+      <w:r>
+        <w:rPr>
+          <w:b/>
+          <w:bCs/>
+        </w:rPr>
+        <w:t xml:space="preserve">Definition 10 (Quotient)</w:t>
+      </w:r>
+      <w:r>
+        <w:t xml:space="preserve"> </w:t>
+      </w:r>
+      <w:r>
+        <w:t xml:space="preserve">For real numbers</w:t>
+      </w:r>
+      <w:r>
+        <w:t xml:space="preserve"> </w:t>
+      </w:r>
+      <m:oMath>
+        <m:r>
+          <m:t>a</m:t>
+        </m:r>
+      </m:oMath>
+      <w:r>
+        <w:t xml:space="preserve"> </w:t>
+      </w:r>
+      <w:r>
+        <w:t xml:space="preserve">and</w:t>
+      </w:r>
+      <w:r>
+        <w:t xml:space="preserve"> </w:t>
+      </w:r>
+      <m:oMath>
+        <m:r>
+          <m:t>b</m:t>
+        </m:r>
+      </m:oMath>
+      <w:r>
+        <w:t xml:space="preserve"> </w:t>
+      </w:r>
+      <w:r>
+        <w:t xml:space="preserve">with</w:t>
+      </w:r>
+      <w:r>
+        <w:t xml:space="preserve"> </w:t>
+      </w:r>
+      <m:oMath>
+        <m:r>
+          <m:t>b</m:t>
+        </m:r>
+        <m:r>
+          <m:rPr>
+            <m:sty m:val="p"/>
+          </m:rPr>
+          <m:t>≠</m:t>
+        </m:r>
+        <m:r>
+          <m:t>0</m:t>
+        </m:r>
+      </m:oMath>
+      <w:r>
+        <w:t xml:space="preserve">,</w:t>
+      </w:r>
+      <w:r>
+        <w:t xml:space="preserve"> </w:t>
+      </w:r>
+      <w:r>
+        <w:t xml:space="preserve">the</w:t>
+      </w:r>
+      <w:r>
+        <w:t xml:space="preserve"> </w:t>
+      </w:r>
+      <w:r>
+        <w:rPr>
+          <w:b/>
+          <w:bCs/>
+        </w:rPr>
+        <w:t xml:space="preserve">quotient</w:t>
+      </w:r>
+      <w:r>
+        <w:t xml:space="preserve"> </w:t>
+      </w:r>
+      <w:r>
+        <w:t xml:space="preserve">of</w:t>
+      </w:r>
+      <w:r>
+        <w:t xml:space="preserve"> </w:t>
+      </w:r>
+      <m:oMath>
+        <m:r>
+          <m:t>a</m:t>
+        </m:r>
+      </m:oMath>
+      <w:r>
+        <w:t xml:space="preserve"> </w:t>
+      </w:r>
+      <w:r>
+        <w:t xml:space="preserve">by</w:t>
+      </w:r>
+      <w:r>
+        <w:t xml:space="preserve"> </w:t>
+      </w:r>
+      <m:oMath>
+        <m:r>
+          <m:t>b</m:t>
+        </m:r>
+      </m:oMath>
+      <w:r>
+        <w:t xml:space="preserve"> </w:t>
+      </w:r>
+      <w:r>
+        <w:t xml:space="preserve">is the result of dividing</w:t>
+      </w:r>
+      <w:r>
+        <w:t xml:space="preserve"> </w:t>
+      </w:r>
+      <m:oMath>
+        <m:r>
+          <m:t>a</m:t>
+        </m:r>
+      </m:oMath>
+      <w:r>
+        <w:t xml:space="preserve"> </w:t>
+      </w:r>
+      <w:r>
+        <w:t xml:space="preserve">by</w:t>
+      </w:r>
+      <w:r>
+        <w:t xml:space="preserve"> </w:t>
+      </w:r>
+      <m:oMath>
+        <m:r>
+          <m:t>b</m:t>
+        </m:r>
+      </m:oMath>
+      <w:r>
+        <w:t xml:space="preserve">:</w:t>
+      </w:r>
+    </w:p>
+    <w:p>
+      <w:pPr>
+        <w:pStyle w:val="BodyText"/>
+      </w:pPr>
+      <m:oMathPara>
+        <m:oMathParaPr>
+          <m:jc m:val="center"/>
+        </m:oMathParaPr>
+        <m:oMath>
+          <m:f>
+            <m:fPr>
+              <m:type m:val="bar"/>
+            </m:fPr>
+            <m:num>
+              <m:r>
                 <m:t>a</m:t>
               </m:r>
             </m:num>
@@ -10390,7 +13896,7 @@
         </m:oMath>
       </m:oMathPara>
     </w:p>
-    <w:bookmarkEnd w:id="53"/>
+    <w:bookmarkEnd w:id="61"/>
     <w:p>
       <w:pPr>
         <w:pStyle w:val="FirstParagraph"/>
@@ -10507,7 +14013,7 @@
       <w:r>
         <w:t xml:space="preserve">cf. </w:t>
       </w:r>
-      <w:hyperlink r:id="rId54">
+      <w:hyperlink r:id="rId62">
         <w:r>
           <w:rPr>
             <w:rStyle w:val="Hyperlink"/>
@@ -10516,7 +14022,7 @@
         </w:r>
       </w:hyperlink>
     </w:p>
-    <w:bookmarkStart w:id="55" w:name="exm-quotient"/>
+    <w:bookmarkStart w:id="63" w:name="exm-quotient"/>
     <w:p>
       <w:pPr>
         <w:pStyle w:val="BodyText"/>
@@ -10642,7 +14148,7 @@
           <w:rPr>
             <w:rStyle w:val="Hyperlink"/>
           </w:rPr>
-          <w:t xml:space="preserve">Definition 9</w:t>
+          <w:t xml:space="preserve">Definition 10</w:t>
         </w:r>
       </w:hyperlink>
       <w:r>
@@ -10652,8 +14158,8 @@
         <w:t xml:space="preserve">requires a nonzero denominator.</w:t>
       </w:r>
     </w:p>
-    <w:bookmarkEnd w:id="55"/>
-    <w:bookmarkStart w:id="57" w:name="def-ratio"/>
+    <w:bookmarkEnd w:id="63"/>
+    <w:bookmarkStart w:id="65" w:name="def-ratio"/>
     <w:p>
       <w:pPr>
         <w:pStyle w:val="BodyText"/>
@@ -10663,7 +14169,7 @@
           <w:b/>
           <w:bCs/>
         </w:rPr>
-        <w:t xml:space="preserve">Definition 10 (Ratios)</w:t>
+        <w:t xml:space="preserve">Definition 11 (Ratios)</w:t>
       </w:r>
       <w:r>
         <w:t xml:space="preserve"> </w:t>
@@ -10695,7 +14201,7 @@
       <w:r>
         <w:t xml:space="preserve">cf. </w:t>
       </w:r>
-      <w:hyperlink r:id="rId56">
+      <w:hyperlink r:id="rId64">
         <w:r>
           <w:rPr>
             <w:rStyle w:val="Hyperlink"/>
@@ -10704,8 +14210,8 @@
         </w:r>
       </w:hyperlink>
     </w:p>
-    <w:bookmarkEnd w:id="57"/>
-    <w:bookmarkStart w:id="60" w:name="def-proportion"/>
+    <w:bookmarkEnd w:id="65"/>
+    <w:bookmarkStart w:id="68" w:name="def-proportion"/>
     <w:p>
       <w:pPr>
         <w:pStyle w:val="BodyText"/>
@@ -10715,7 +14221,7 @@
           <w:b/>
           <w:bCs/>
         </w:rPr>
-        <w:t xml:space="preserve">Definition 11 (Proportion)</w:t>
+        <w:t xml:space="preserve">Definition 12 (Proportion)</w:t>
       </w:r>
       <w:r>
         <w:t xml:space="preserve"> </w:t>
@@ -10756,7 +14262,7 @@
       <w:r>
         <w:t xml:space="preserve"> </w:t>
       </w:r>
-      <w:hyperlink r:id="rId58">
+      <w:hyperlink r:id="rId66">
         <w:r>
           <w:rPr>
             <w:rStyle w:val="Hyperlink"/>
@@ -10778,7 +14284,7 @@
       <w:r>
         <w:t xml:space="preserve"> </w:t>
       </w:r>
-      <w:hyperlink r:id="rId59">
+      <w:hyperlink r:id="rId67">
         <w:r>
           <w:rPr>
             <w:rStyle w:val="Hyperlink"/>
@@ -10793,8 +14299,8 @@
         <w:t xml:space="preserve">for other meanings.</w:t>
       </w:r>
     </w:p>
-    <w:bookmarkEnd w:id="60"/>
-    <w:bookmarkStart w:id="62" w:name="def-proportional"/>
+    <w:bookmarkEnd w:id="68"/>
+    <w:bookmarkStart w:id="70" w:name="def-proportional"/>
     <w:p>
       <w:pPr>
         <w:pStyle w:val="BodyText"/>
@@ -10804,7 +14310,7 @@
           <w:b/>
           <w:bCs/>
         </w:rPr>
-        <w:t xml:space="preserve">Definition 12 (Proportional)</w:t>
+        <w:t xml:space="preserve">Definition 13 (Proportional)</w:t>
       </w:r>
       <w:r>
         <w:t xml:space="preserve"> </w:t>
@@ -10965,7 +14471,7 @@
       <w:r>
         <w:t xml:space="preserve">(cf. </w:t>
       </w:r>
-      <w:hyperlink r:id="rId61">
+      <w:hyperlink r:id="rId69">
         <w:r>
           <w:rPr>
             <w:rStyle w:val="Hyperlink"/>
@@ -10977,7 +14483,7 @@
         <w:t xml:space="preserve">)</w:t>
       </w:r>
     </w:p>
-    <w:bookmarkEnd w:id="62"/>
+    <w:bookmarkEnd w:id="70"/>
     <w:p>
       <w:pPr>
         <w:pStyle w:val="BodyText"/>
@@ -10988,7 +14494,7 @@
       <w:r>
         <w:t xml:space="preserve"> </w:t>
       </w:r>
-      <w:hyperlink r:id="rId63">
+      <w:hyperlink r:id="rId71">
         <w:r>
           <w:rPr>
             <w:rStyle w:val="Hyperlink"/>
@@ -10997,14 +14503,14 @@
         </w:r>
       </w:hyperlink>
     </w:p>
-    <w:bookmarkEnd w:id="64"/>
-    <w:bookmarkStart w:id="83" w:name="exponentials-and-logarithms"/>
+    <w:bookmarkEnd w:id="72"/>
+    <w:bookmarkStart w:id="91" w:name="exponentials-and-logarithms"/>
     <w:p>
       <w:pPr>
         <w:pStyle w:val="Heading2"/>
       </w:pPr>
       <w:r>
-        <w:t xml:space="preserve">11 Exponentials and Logarithms</w:t>
+        <w:t xml:space="preserve">12 Exponentials and Logarithms</w:t>
       </w:r>
     </w:p>
     <w:p>
@@ -11209,7 +14715,7 @@
         <w:t xml:space="preserve">for base 10.</w:t>
       </w:r>
     </w:p>
-    <w:bookmarkStart w:id="65" w:name="thm-exp-log-inverse"/>
+    <w:bookmarkStart w:id="73" w:name="thm-exp-log-inverse"/>
     <w:p>
       <w:pPr>
         <w:pStyle w:val="BodyText"/>
@@ -11219,7 +14725,7 @@
           <w:b/>
           <w:bCs/>
         </w:rPr>
-        <w:t xml:space="preserve">Theorem 16 (</w:t>
+        <w:t xml:space="preserve">Theorem 18 (</w:t>
       </w:r>
       <m:oMath>
         <m:r>
@@ -11314,7 +14820,7 @@
         <w:pStyle w:val="Compact"/>
         <w:numPr>
           <w:ilvl w:val="0"/>
-          <w:numId w:val="1007"/>
+          <w:numId w:val="1011"/>
         </w:numPr>
       </w:pPr>
       <w:r>
@@ -11410,7 +14916,7 @@
         <w:pStyle w:val="Compact"/>
         <w:numPr>
           <w:ilvl w:val="0"/>
-          <w:numId w:val="1007"/>
+          <w:numId w:val="1011"/>
         </w:numPr>
       </w:pPr>
       <w:r>
@@ -11505,8 +15011,8 @@
         <w:t xml:space="preserve">.</w:t>
       </w:r>
     </w:p>
-    <w:bookmarkEnd w:id="65"/>
-    <w:bookmarkStart w:id="66" w:name="thm-log-prod"/>
+    <w:bookmarkEnd w:id="73"/>
+    <w:bookmarkStart w:id="74" w:name="thm-log-prod"/>
     <w:p>
       <w:pPr>
         <w:pStyle w:val="FirstParagraph"/>
@@ -11516,7 +15022,7 @@
           <w:b/>
           <w:bCs/>
         </w:rPr>
-        <w:t xml:space="preserve">Theorem 17 (Logarithm of a product)</w:t>
+        <w:t xml:space="preserve">Theorem 19 (Logarithm of a product)</w:t>
       </w:r>
       <w:r>
         <w:t xml:space="preserve"> </w:t>
@@ -11676,8 +15182,8 @@
         </m:oMath>
       </m:oMathPara>
     </w:p>
-    <w:bookmarkEnd w:id="66"/>
-    <w:bookmarkStart w:id="67" w:name="cor-log-quot"/>
+    <w:bookmarkEnd w:id="74"/>
+    <w:bookmarkStart w:id="75" w:name="cor-log-quot"/>
     <w:p>
       <w:pPr>
         <w:pStyle w:val="FirstParagraph"/>
@@ -11850,7 +15356,7 @@
         </m:oMath>
       </m:oMathPara>
     </w:p>
-    <w:bookmarkEnd w:id="67"/>
+    <w:bookmarkEnd w:id="75"/>
     <w:p>
       <w:pPr>
         <w:pStyle w:val="FirstParagraph"/>
@@ -11951,7 +15457,7 @@
           <w:rPr>
             <w:rStyle w:val="Hyperlink"/>
           </w:rPr>
-          <w:t xml:space="preserve">Theorem 17</w:t>
+          <w:t xml:space="preserve">Theorem 19</w:t>
         </w:r>
       </w:hyperlink>
       <w:r>
@@ -12249,7 +15755,7 @@
           <w:rPr>
             <w:rStyle w:val="Hyperlink"/>
           </w:rPr>
-          <w:t xml:space="preserve">Theorem 17</w:t>
+          <w:t xml:space="preserve">Theorem 19</w:t>
         </w:r>
       </w:hyperlink>
       <w:r>
@@ -12405,7 +15911,7 @@
         <w:t xml:space="preserve">.</w:t>
       </w:r>
     </w:p>
-    <w:bookmarkStart w:id="68" w:name="thm-log-exp"/>
+    <w:bookmarkStart w:id="76" w:name="thm-log-exp"/>
     <w:p>
       <w:pPr>
         <w:pStyle w:val="BodyText"/>
@@ -12415,7 +15921,7 @@
           <w:b/>
           <w:bCs/>
         </w:rPr>
-        <w:t xml:space="preserve">Theorem 18 (Logarithm of a power)</w:t>
+        <w:t xml:space="preserve">Theorem 20 (Logarithm of a power)</w:t>
       </w:r>
       <w:r>
         <w:t xml:space="preserve"> </w:t>
@@ -12557,8 +16063,8 @@
         </m:oMath>
       </m:oMathPara>
     </w:p>
-    <w:bookmarkEnd w:id="68"/>
-    <w:bookmarkStart w:id="69" w:name="thm-exp-sum"/>
+    <w:bookmarkEnd w:id="76"/>
+    <w:bookmarkStart w:id="77" w:name="thm-exp-sum"/>
     <w:p>
       <w:pPr>
         <w:pStyle w:val="FirstParagraph"/>
@@ -12568,7 +16074,7 @@
           <w:b/>
           <w:bCs/>
         </w:rPr>
-        <w:t xml:space="preserve">Theorem 19 (exponential of a sum)</w:t>
+        <w:t xml:space="preserve">Theorem 21 (exponential of a sum)</w:t>
       </w:r>
       <w:r>
         <w:t xml:space="preserve"> </w:t>
@@ -12693,8 +16199,8 @@
         </m:oMath>
       </m:oMathPara>
     </w:p>
-    <w:bookmarkEnd w:id="69"/>
-    <w:bookmarkStart w:id="70" w:name="cor-exp-sum"/>
+    <w:bookmarkEnd w:id="77"/>
+    <w:bookmarkStart w:id="78" w:name="cor-exp-sum"/>
     <w:p>
       <w:pPr>
         <w:pStyle w:val="FirstParagraph"/>
@@ -12844,8 +16350,8 @@
         </m:oMath>
       </m:oMathPara>
     </w:p>
-    <w:bookmarkEnd w:id="70"/>
-    <w:bookmarkStart w:id="71" w:name="thm-double-exp"/>
+    <w:bookmarkEnd w:id="78"/>
+    <w:bookmarkStart w:id="79" w:name="thm-double-exp"/>
     <w:p>
       <w:pPr>
         <w:pStyle w:val="FirstParagraph"/>
@@ -12855,7 +16361,7 @@
           <w:b/>
           <w:bCs/>
         </w:rPr>
-        <w:t xml:space="preserve">Theorem 20 (Power of a power)</w:t>
+        <w:t xml:space="preserve">Theorem 22 (Power of a power)</w:t>
       </w:r>
       <w:r>
         <w:t xml:space="preserve"> </w:t>
@@ -13033,8 +16539,8 @@
         </m:oMath>
       </m:oMathPara>
     </w:p>
-    <w:bookmarkEnd w:id="71"/>
-    <w:bookmarkStart w:id="72" w:name="exm-double-exp-negative-base"/>
+    <w:bookmarkEnd w:id="79"/>
+    <w:bookmarkStart w:id="80" w:name="exm-double-exp-negative-base"/>
     <w:p>
       <w:pPr>
         <w:pStyle w:val="FirstParagraph"/>
@@ -13559,7 +17065,7 @@
           <w:rPr>
             <w:rStyle w:val="Hyperlink"/>
           </w:rPr>
-          <w:t xml:space="preserve">Theorem 20</w:t>
+          <w:t xml:space="preserve">Theorem 22</w:t>
         </w:r>
       </w:hyperlink>
       <w:r>
@@ -13719,8 +17225,8 @@
         <w:t xml:space="preserve">is not even a real number.</w:t>
       </w:r>
     </w:p>
-    <w:bookmarkEnd w:id="72"/>
-    <w:bookmarkStart w:id="73" w:name="cor-exp-ab"/>
+    <w:bookmarkEnd w:id="80"/>
+    <w:bookmarkStart w:id="81" w:name="cor-exp-ab"/>
     <w:p>
       <w:pPr>
         <w:pStyle w:val="BodyText"/>
@@ -13877,8 +17383,8 @@
         </m:oMath>
       </m:oMathPara>
     </w:p>
-    <w:bookmarkEnd w:id="73"/>
-    <w:bookmarkStart w:id="74" w:name="exr-exp-vs-mult"/>
+    <w:bookmarkEnd w:id="81"/>
+    <w:bookmarkStart w:id="82" w:name="exr-exp-vs-mult"/>
     <w:p>
       <w:pPr>
         <w:pStyle w:val="FirstParagraph"/>
@@ -13888,7 +17394,7 @@
           <w:b/>
           <w:bCs/>
         </w:rPr>
-        <w:t xml:space="preserve">Exercise 4</w:t>
+        <w:t xml:space="preserve">Exercise 6</w:t>
       </w:r>
       <w:r>
         <w:t xml:space="preserve"> </w:t>
@@ -13962,8 +17468,8 @@
         <w:t xml:space="preserve">?</w:t>
       </w:r>
     </w:p>
-    <w:bookmarkEnd w:id="74"/>
-    <w:bookmarkStart w:id="77" w:name="sol-exp-vs-mult"/>
+    <w:bookmarkEnd w:id="82"/>
+    <w:bookmarkStart w:id="85" w:name="sol-exp-vs-mult"/>
     <w:p>
       <w:pPr>
         <w:pStyle w:val="BodyText"/>
@@ -13973,7 +17479,7 @@
           <w:i/>
           <w:iCs/>
         </w:rPr>
-        <w:t xml:space="preserve">Solution 4</w:t>
+        <w:t xml:space="preserve">Solution 6</w:t>
       </w:r>
       <w:r>
         <w:t xml:space="preserve">. </w:t>
@@ -14156,7 +17662,7 @@
         <w:pStyle w:val="Compact"/>
         <w:numPr>
           <w:ilvl w:val="0"/>
-          <w:numId w:val="1008"/>
+          <w:numId w:val="1012"/>
         </w:numPr>
       </w:pPr>
       <m:oMath>
@@ -14193,7 +17699,7 @@
         <w:pStyle w:val="Compact"/>
         <w:numPr>
           <w:ilvl w:val="0"/>
-          <w:numId w:val="1008"/>
+          <w:numId w:val="1012"/>
         </w:numPr>
       </w:pPr>
       <m:oMath>
@@ -14376,7 +17882,7 @@
         <w:pStyle w:val="Compact"/>
         <w:numPr>
           <w:ilvl w:val="0"/>
-          <w:numId w:val="1008"/>
+          <w:numId w:val="1012"/>
         </w:numPr>
       </w:pPr>
       <m:oMath>
@@ -14897,7 +18403,7 @@
         <w:pStyle w:val="Compact"/>
         <w:numPr>
           <w:ilvl w:val="0"/>
-          <w:numId w:val="1008"/>
+          <w:numId w:val="1012"/>
         </w:numPr>
       </w:pPr>
       <m:oMath>
@@ -15155,7 +18661,7 @@
         <w:pStyle w:val="Compact"/>
         <w:numPr>
           <w:ilvl w:val="0"/>
-          <w:numId w:val="1008"/>
+          <w:numId w:val="1012"/>
         </w:numPr>
       </w:pPr>
       <m:oMath>
@@ -15747,7 +19253,7 @@
       <w:tr>
         <w:tc>
           <w:tcPr/>
-          <w:bookmarkStart w:id="75" w:name="fig-double-exponential"/>
+          <w:bookmarkStart w:id="83" w:name="fig-double-exponential"/>
           <w:p>
             <w:pPr>
               <w:pStyle w:val="Compact"/>
@@ -15814,7 +19320,7 @@
               </m:sSup>
             </m:oMath>
           </w:p>
-          <w:bookmarkEnd w:id="75"/>
+          <w:bookmarkEnd w:id="83"/>
         </w:tc>
       </w:tr>
     </w:tbl>
@@ -15839,7 +19345,7 @@
       <w:tr>
         <w:tc>
           <w:tcPr/>
-          <w:bookmarkStart w:id="76" w:name="fig-double-exponential2"/>
+          <w:bookmarkStart w:id="84" w:name="fig-double-exponential2"/>
           <w:p>
             <w:pPr>
               <w:pStyle w:val="Compact"/>
@@ -15956,12 +19462,12 @@
               <w:t xml:space="preserve">.</w:t>
             </w:r>
           </w:p>
-          <w:bookmarkEnd w:id="76"/>
+          <w:bookmarkEnd w:id="84"/>
         </w:tc>
       </w:tr>
     </w:tbl>
-    <w:bookmarkEnd w:id="77"/>
-    <w:bookmarkStart w:id="78" w:name="exr-double-exponential"/>
+    <w:bookmarkEnd w:id="85"/>
+    <w:bookmarkStart w:id="86" w:name="exr-double-exponential"/>
     <w:p>
       <w:pPr>
         <w:pStyle w:val="BodyText"/>
@@ -15971,7 +19477,7 @@
           <w:b/>
           <w:bCs/>
         </w:rPr>
-        <w:t xml:space="preserve">Exercise 5</w:t>
+        <w:t xml:space="preserve">Exercise 7</w:t>
       </w:r>
       <w:r>
         <w:t xml:space="preserve"> </w:t>
@@ -16120,8 +19626,8 @@
         <w:t xml:space="preserve">?</w:t>
       </w:r>
     </w:p>
-    <w:bookmarkEnd w:id="78"/>
-    <w:bookmarkStart w:id="80" w:name="sol-double-exponential"/>
+    <w:bookmarkEnd w:id="86"/>
+    <w:bookmarkStart w:id="88" w:name="sol-double-exponential"/>
     <w:p>
       <w:pPr>
         <w:pStyle w:val="BodyText"/>
@@ -16131,7 +19637,7 @@
           <w:i/>
           <w:iCs/>
         </w:rPr>
-        <w:t xml:space="preserve">Solution 5</w:t>
+        <w:t xml:space="preserve">Solution 7</w:t>
       </w:r>
       <w:r>
         <w:t xml:space="preserve">. </w:t>
@@ -16301,7 +19807,7 @@
           <w:rPr>
             <w:rStyle w:val="Hyperlink"/>
           </w:rPr>
-          <w:t xml:space="preserve">Theorem 20</w:t>
+          <w:t xml:space="preserve">Theorem 22</w:t>
         </w:r>
       </w:hyperlink>
       <w:r>
@@ -16535,7 +20041,7 @@
           <w:rPr>
             <w:rStyle w:val="Hyperlink"/>
           </w:rPr>
-          <w:t xml:space="preserve">Theorem 18</w:t>
+          <w:t xml:space="preserve">Theorem 20</w:t>
         </w:r>
       </w:hyperlink>
       <w:r>
@@ -16546,7 +20052,7 @@
       <w:pPr>
         <w:pStyle w:val="BodyText"/>
       </w:pPr>
-      <w:bookmarkStart w:id="79" w:name="eq-double-exp-log-scale"/>
+      <w:bookmarkStart w:id="87" w:name="eq-double-exp-log-scale"/>
       <m:oMathPara>
         <m:oMathParaPr>
           <m:jc m:val="center"/>
@@ -16853,7 +20359,7 @@
           </m:r>
         </m:oMath>
       </m:oMathPara>
-      <w:bookmarkEnd w:id="79"/>
+      <w:bookmarkEnd w:id="87"/>
     </w:p>
     <w:p>
       <w:pPr>
@@ -16885,7 +20391,7 @@
         <w:pStyle w:val="Compact"/>
         <w:numPr>
           <w:ilvl w:val="0"/>
-          <w:numId w:val="1009"/>
+          <w:numId w:val="1013"/>
         </w:numPr>
       </w:pPr>
       <m:oMath>
@@ -16956,7 +20462,7 @@
         <w:pStyle w:val="Compact"/>
         <w:numPr>
           <w:ilvl w:val="0"/>
-          <w:numId w:val="1009"/>
+          <w:numId w:val="1013"/>
         </w:numPr>
       </w:pPr>
       <m:oMath>
@@ -16999,7 +20505,7 @@
           <w:rPr>
             <w:rStyle w:val="Hyperlink"/>
           </w:rPr>
-          <w:t xml:space="preserve">Exercise 4</w:t>
+          <w:t xml:space="preserve">Exercise 6</w:t>
         </w:r>
       </w:hyperlink>
       <w:r>
@@ -17198,7 +20704,7 @@
         <w:pStyle w:val="Compact"/>
         <w:numPr>
           <w:ilvl w:val="0"/>
-          <w:numId w:val="1010"/>
+          <w:numId w:val="1014"/>
         </w:numPr>
       </w:pPr>
       <w:r>
@@ -17297,7 +20803,7 @@
         <w:pStyle w:val="Compact"/>
         <w:numPr>
           <w:ilvl w:val="0"/>
-          <w:numId w:val="1010"/>
+          <w:numId w:val="1014"/>
         </w:numPr>
       </w:pPr>
       <w:r>
@@ -17496,7 +21002,7 @@
         <w:pStyle w:val="Compact"/>
         <w:numPr>
           <w:ilvl w:val="0"/>
-          <w:numId w:val="1010"/>
+          <w:numId w:val="1014"/>
         </w:numPr>
       </w:pPr>
       <w:r>
@@ -18175,9 +21681,9 @@
         </m:oMath>
       </m:oMathPara>
     </w:p>
-    <w:bookmarkEnd w:id="80"/>
-    <w:bookmarkStart w:id="82" w:name="refs"/>
-    <w:bookmarkStart w:id="81" w:name="ref-rudin1976principles"/>
+    <w:bookmarkEnd w:id="88"/>
+    <w:bookmarkStart w:id="90" w:name="refs"/>
+    <w:bookmarkStart w:id="89" w:name="ref-rudin1976principles"/>
     <w:p>
       <w:pPr>
         <w:pStyle w:val="Bibliography"/>
@@ -18199,9 +21705,9 @@
         <w:t xml:space="preserve">. 3rd ed. International Series in Pure and Applied Mathematics. McGraw-Hill.</w:t>
       </w:r>
     </w:p>
-    <w:bookmarkEnd w:id="81"/>
-    <w:bookmarkEnd w:id="82"/>
-    <w:bookmarkEnd w:id="83"/>
+    <w:bookmarkEnd w:id="89"/>
+    <w:bookmarkEnd w:id="90"/>
+    <w:bookmarkEnd w:id="91"/>
     <w:sectPr>
       <w:footnotePr>
         <w:numRestart w:val="eachSect"/>
@@ -18720,6 +22226,126 @@
     </w:lvlOverride>
   </w:num>
   <w:num w:numId="1010">
+    <w:abstractNumId w:val="99411"/>
+    <w:lvlOverride w:ilvl="0">
+      <w:startOverride w:val="1"/>
+    </w:lvlOverride>
+    <w:lvlOverride w:ilvl="1">
+      <w:startOverride w:val="1"/>
+    </w:lvlOverride>
+    <w:lvlOverride w:ilvl="2">
+      <w:startOverride w:val="1"/>
+    </w:lvlOverride>
+    <w:lvlOverride w:ilvl="3">
+      <w:startOverride w:val="1"/>
+    </w:lvlOverride>
+    <w:lvlOverride w:ilvl="4">
+      <w:startOverride w:val="1"/>
+    </w:lvlOverride>
+    <w:lvlOverride w:ilvl="5">
+      <w:startOverride w:val="1"/>
+    </w:lvlOverride>
+    <w:lvlOverride w:ilvl="6">
+      <w:startOverride w:val="1"/>
+    </w:lvlOverride>
+    <w:lvlOverride w:ilvl="7">
+      <w:startOverride w:val="1"/>
+    </w:lvlOverride>
+    <w:lvlOverride w:ilvl="8">
+      <w:startOverride w:val="1"/>
+    </w:lvlOverride>
+  </w:num>
+  <w:num w:numId="1011">
+    <w:abstractNumId w:val="99411"/>
+    <w:lvlOverride w:ilvl="0">
+      <w:startOverride w:val="1"/>
+    </w:lvlOverride>
+    <w:lvlOverride w:ilvl="1">
+      <w:startOverride w:val="1"/>
+    </w:lvlOverride>
+    <w:lvlOverride w:ilvl="2">
+      <w:startOverride w:val="1"/>
+    </w:lvlOverride>
+    <w:lvlOverride w:ilvl="3">
+      <w:startOverride w:val="1"/>
+    </w:lvlOverride>
+    <w:lvlOverride w:ilvl="4">
+      <w:startOverride w:val="1"/>
+    </w:lvlOverride>
+    <w:lvlOverride w:ilvl="5">
+      <w:startOverride w:val="1"/>
+    </w:lvlOverride>
+    <w:lvlOverride w:ilvl="6">
+      <w:startOverride w:val="1"/>
+    </w:lvlOverride>
+    <w:lvlOverride w:ilvl="7">
+      <w:startOverride w:val="1"/>
+    </w:lvlOverride>
+    <w:lvlOverride w:ilvl="8">
+      <w:startOverride w:val="1"/>
+    </w:lvlOverride>
+  </w:num>
+  <w:num w:numId="1012">
+    <w:abstractNumId w:val="99411"/>
+    <w:lvlOverride w:ilvl="0">
+      <w:startOverride w:val="1"/>
+    </w:lvlOverride>
+    <w:lvlOverride w:ilvl="1">
+      <w:startOverride w:val="1"/>
+    </w:lvlOverride>
+    <w:lvlOverride w:ilvl="2">
+      <w:startOverride w:val="1"/>
+    </w:lvlOverride>
+    <w:lvlOverride w:ilvl="3">
+      <w:startOverride w:val="1"/>
+    </w:lvlOverride>
+    <w:lvlOverride w:ilvl="4">
+      <w:startOverride w:val="1"/>
+    </w:lvlOverride>
+    <w:lvlOverride w:ilvl="5">
+      <w:startOverride w:val="1"/>
+    </w:lvlOverride>
+    <w:lvlOverride w:ilvl="6">
+      <w:startOverride w:val="1"/>
+    </w:lvlOverride>
+    <w:lvlOverride w:ilvl="7">
+      <w:startOverride w:val="1"/>
+    </w:lvlOverride>
+    <w:lvlOverride w:ilvl="8">
+      <w:startOverride w:val="1"/>
+    </w:lvlOverride>
+  </w:num>
+  <w:num w:numId="1013">
+    <w:abstractNumId w:val="99411"/>
+    <w:lvlOverride w:ilvl="0">
+      <w:startOverride w:val="1"/>
+    </w:lvlOverride>
+    <w:lvlOverride w:ilvl="1">
+      <w:startOverride w:val="1"/>
+    </w:lvlOverride>
+    <w:lvlOverride w:ilvl="2">
+      <w:startOverride w:val="1"/>
+    </w:lvlOverride>
+    <w:lvlOverride w:ilvl="3">
+      <w:startOverride w:val="1"/>
+    </w:lvlOverride>
+    <w:lvlOverride w:ilvl="4">
+      <w:startOverride w:val="1"/>
+    </w:lvlOverride>
+    <w:lvlOverride w:ilvl="5">
+      <w:startOverride w:val="1"/>
+    </w:lvlOverride>
+    <w:lvlOverride w:ilvl="6">
+      <w:startOverride w:val="1"/>
+    </w:lvlOverride>
+    <w:lvlOverride w:ilvl="7">
+      <w:startOverride w:val="1"/>
+    </w:lvlOverride>
+    <w:lvlOverride w:ilvl="8">
+      <w:startOverride w:val="1"/>
+    </w:lvlOverride>
+  </w:num>
+  <w:num w:numId="1014">
     <w:abstractNumId w:val="991"/>
   </w:num>
 </w:numbering>

</xml_diff>

<commit_message>
Deploying to gh-pages from @ Morrison-Lab/mds@280808ded1064fc01fe9e118149e0c4deb3ddf8d 🚀
</commit_message>
<xml_diff>
--- a/algebra.docx
+++ b/algebra.docx
@@ -15,7 +15,7 @@
         <w:pStyle w:val="Date"/>
       </w:pPr>
       <w:r>
-        <w:t xml:space="preserve">Last modified: 2026-10-02 01:27:22 (PDT)</w:t>
+        <w:t xml:space="preserve">Last modified: 2026-10-02 01:35:25 (PDT)</w:t>
       </w:r>
     </w:p>
     <w:bookmarkStart w:id="12" w:name="equalities"/>
@@ -18931,13 +18931,2390 @@
       </w:hyperlink>
     </w:p>
     <w:bookmarkEnd w:id="77"/>
-    <w:bookmarkStart w:id="96" w:name="exponentials-and-logarithms"/>
+    <w:bookmarkStart w:id="83" w:name="sec-polynomials"/>
     <w:p>
       <w:pPr>
         <w:pStyle w:val="Heading2"/>
       </w:pPr>
       <w:r>
-        <w:t xml:space="preserve">13 Exponentials and Logarithms</w:t>
+        <w:t xml:space="preserve">13 Polynomials</w:t>
+      </w:r>
+    </w:p>
+    <w:bookmarkStart w:id="78" w:name="exr-polynomial-degree"/>
+    <w:p>
+      <w:pPr>
+        <w:pStyle w:val="FirstParagraph"/>
+      </w:pPr>
+      <w:r>
+        <w:rPr>
+          <w:b/>
+          <w:bCs/>
+        </w:rPr>
+        <w:t xml:space="preserve">Exercise 7 (Reading a polynomial)</w:t>
+      </w:r>
+      <w:r>
+        <w:t xml:space="preserve"> </w:t>
+      </w:r>
+      <w:r>
+        <w:t xml:space="preserve">Let</w:t>
+      </w:r>
+      <w:r>
+        <w:t xml:space="preserve"> </w:t>
+      </w:r>
+      <m:oMath>
+        <m:r>
+          <m:t>f</m:t>
+        </m:r>
+        <m:r>
+          <m:rPr>
+            <m:sty m:val="p"/>
+          </m:rPr>
+          <m:t>(</m:t>
+        </m:r>
+        <m:r>
+          <m:t>x</m:t>
+        </m:r>
+        <m:r>
+          <m:rPr>
+            <m:sty m:val="p"/>
+          </m:rPr>
+          <m:t>)</m:t>
+        </m:r>
+        <m:r>
+          <m:rPr>
+            <m:sty m:val="p"/>
+          </m:rPr>
+          <m:t>=</m:t>
+        </m:r>
+        <m:r>
+          <m:t>3</m:t>
+        </m:r>
+        <m:sSup>
+          <m:e>
+            <m:r>
+              <m:t>x</m:t>
+            </m:r>
+          </m:e>
+          <m:sup>
+            <m:r>
+              <m:t>4</m:t>
+            </m:r>
+          </m:sup>
+        </m:sSup>
+        <m:r>
+          <m:rPr>
+            <m:sty m:val="p"/>
+          </m:rPr>
+          <m:t>−</m:t>
+        </m:r>
+        <m:r>
+          <m:t>x</m:t>
+        </m:r>
+        <m:r>
+          <m:rPr>
+            <m:sty m:val="p"/>
+          </m:rPr>
+          <m:t>+</m:t>
+        </m:r>
+        <m:r>
+          <m:t>7</m:t>
+        </m:r>
+      </m:oMath>
+      <w:r>
+        <w:t xml:space="preserve">.</w:t>
+      </w:r>
+    </w:p>
+    <w:p>
+      <w:pPr>
+        <w:pStyle w:val="Compact"/>
+        <w:numPr>
+          <w:ilvl w:val="0"/>
+          <w:numId w:val="1013"/>
+        </w:numPr>
+      </w:pPr>
+      <w:r>
+        <w:t xml:space="preserve">Write</w:t>
+      </w:r>
+      <w:r>
+        <w:t xml:space="preserve"> </w:t>
+      </w:r>
+      <m:oMath>
+        <m:r>
+          <m:t>f</m:t>
+        </m:r>
+      </m:oMath>
+      <w:r>
+        <w:t xml:space="preserve"> </w:t>
+      </w:r>
+      <w:r>
+        <w:t xml:space="preserve">in the form</w:t>
+      </w:r>
+      <w:r>
+        <w:t xml:space="preserve"> </w:t>
+      </w:r>
+      <m:oMath>
+        <m:sSub>
+          <m:e>
+            <m:r>
+              <m:t>a</m:t>
+            </m:r>
+          </m:e>
+          <m:sub>
+            <m:r>
+              <m:t>n</m:t>
+            </m:r>
+          </m:sub>
+        </m:sSub>
+        <m:sSup>
+          <m:e>
+            <m:r>
+              <m:t>x</m:t>
+            </m:r>
+          </m:e>
+          <m:sup>
+            <m:r>
+              <m:t>n</m:t>
+            </m:r>
+          </m:sup>
+        </m:sSup>
+        <m:r>
+          <m:rPr>
+            <m:sty m:val="p"/>
+          </m:rPr>
+          <m:t>+</m:t>
+        </m:r>
+        <m:sSub>
+          <m:e>
+            <m:r>
+              <m:t>a</m:t>
+            </m:r>
+          </m:e>
+          <m:sub>
+            <m:r>
+              <m:t>n</m:t>
+            </m:r>
+            <m:r>
+              <m:rPr>
+                <m:sty m:val="p"/>
+              </m:rPr>
+              <m:t>−</m:t>
+            </m:r>
+            <m:r>
+              <m:t>1</m:t>
+            </m:r>
+          </m:sub>
+        </m:sSub>
+        <m:sSup>
+          <m:e>
+            <m:r>
+              <m:t>x</m:t>
+            </m:r>
+          </m:e>
+          <m:sup>
+            <m:r>
+              <m:t>n</m:t>
+            </m:r>
+            <m:r>
+              <m:rPr>
+                <m:sty m:val="p"/>
+              </m:rPr>
+              <m:t>−</m:t>
+            </m:r>
+            <m:r>
+              <m:t>1</m:t>
+            </m:r>
+          </m:sup>
+        </m:sSup>
+        <m:r>
+          <m:rPr>
+            <m:sty m:val="p"/>
+          </m:rPr>
+          <m:t>+</m:t>
+        </m:r>
+        <m:r>
+          <m:rPr>
+            <m:sty m:val="p"/>
+          </m:rPr>
+          <m:t>⋯</m:t>
+        </m:r>
+        <m:r>
+          <m:rPr>
+            <m:sty m:val="p"/>
+          </m:rPr>
+          <m:t>+</m:t>
+        </m:r>
+        <m:sSub>
+          <m:e>
+            <m:r>
+              <m:t>a</m:t>
+            </m:r>
+          </m:e>
+          <m:sub>
+            <m:r>
+              <m:t>1</m:t>
+            </m:r>
+          </m:sub>
+        </m:sSub>
+        <m:r>
+          <m:t>x</m:t>
+        </m:r>
+        <m:r>
+          <m:rPr>
+            <m:sty m:val="p"/>
+          </m:rPr>
+          <m:t>+</m:t>
+        </m:r>
+        <m:sSub>
+          <m:e>
+            <m:r>
+              <m:t>a</m:t>
+            </m:r>
+          </m:e>
+          <m:sub>
+            <m:r>
+              <m:t>0</m:t>
+            </m:r>
+          </m:sub>
+        </m:sSub>
+      </m:oMath>
+      <w:r>
+        <w:t xml:space="preserve">,</w:t>
+      </w:r>
+      <w:r>
+        <w:t xml:space="preserve"> </w:t>
+      </w:r>
+      <w:r>
+        <w:t xml:space="preserve">listing every coefficient</w:t>
+      </w:r>
+      <w:r>
+        <w:t xml:space="preserve"> </w:t>
+      </w:r>
+      <m:oMath>
+        <m:sSub>
+          <m:e>
+            <m:r>
+              <m:t>a</m:t>
+            </m:r>
+          </m:e>
+          <m:sub>
+            <m:r>
+              <m:t>4</m:t>
+            </m:r>
+          </m:sub>
+        </m:sSub>
+        <m:r>
+          <m:rPr>
+            <m:sty m:val="p"/>
+          </m:rPr>
+          <m:t>,</m:t>
+        </m:r>
+        <m:sSub>
+          <m:e>
+            <m:r>
+              <m:t>a</m:t>
+            </m:r>
+          </m:e>
+          <m:sub>
+            <m:r>
+              <m:t>3</m:t>
+            </m:r>
+          </m:sub>
+        </m:sSub>
+        <m:r>
+          <m:rPr>
+            <m:sty m:val="p"/>
+          </m:rPr>
+          <m:t>,</m:t>
+        </m:r>
+        <m:sSub>
+          <m:e>
+            <m:r>
+              <m:t>a</m:t>
+            </m:r>
+          </m:e>
+          <m:sub>
+            <m:r>
+              <m:t>2</m:t>
+            </m:r>
+          </m:sub>
+        </m:sSub>
+        <m:r>
+          <m:rPr>
+            <m:sty m:val="p"/>
+          </m:rPr>
+          <m:t>,</m:t>
+        </m:r>
+        <m:sSub>
+          <m:e>
+            <m:r>
+              <m:t>a</m:t>
+            </m:r>
+          </m:e>
+          <m:sub>
+            <m:r>
+              <m:t>1</m:t>
+            </m:r>
+          </m:sub>
+        </m:sSub>
+        <m:r>
+          <m:rPr>
+            <m:sty m:val="p"/>
+          </m:rPr>
+          <m:t>,</m:t>
+        </m:r>
+        <m:sSub>
+          <m:e>
+            <m:r>
+              <m:t>a</m:t>
+            </m:r>
+          </m:e>
+          <m:sub>
+            <m:r>
+              <m:t>0</m:t>
+            </m:r>
+          </m:sub>
+        </m:sSub>
+      </m:oMath>
+      <w:r>
+        <w:t xml:space="preserve">.</w:t>
+      </w:r>
+    </w:p>
+    <w:p>
+      <w:pPr>
+        <w:pStyle w:val="Compact"/>
+        <w:numPr>
+          <w:ilvl w:val="0"/>
+          <w:numId w:val="1013"/>
+        </w:numPr>
+      </w:pPr>
+      <w:r>
+        <w:t xml:space="preserve">What is the degree of</w:t>
+      </w:r>
+      <w:r>
+        <w:t xml:space="preserve"> </w:t>
+      </w:r>
+      <m:oMath>
+        <m:r>
+          <m:t>f</m:t>
+        </m:r>
+      </m:oMath>
+      <w:r>
+        <w:t xml:space="preserve">, and what is its leading coefficient?</w:t>
+      </w:r>
+    </w:p>
+    <w:bookmarkEnd w:id="78"/>
+    <w:bookmarkStart w:id="79" w:name="sol-polynomial-degree"/>
+    <w:p>
+      <w:pPr>
+        <w:pStyle w:val="FirstParagraph"/>
+      </w:pPr>
+      <w:r>
+        <w:rPr>
+          <w:i/>
+          <w:iCs/>
+        </w:rPr>
+        <w:t xml:space="preserve">Solution 7</w:t>
+      </w:r>
+      <w:r>
+        <w:t xml:space="preserve">. </w:t>
+      </w:r>
+    </w:p>
+    <w:p>
+      <w:pPr>
+        <w:numPr>
+          <w:ilvl w:val="0"/>
+          <w:numId w:val="1014"/>
+        </w:numPr>
+      </w:pPr>
+      <m:oMath>
+        <m:r>
+          <m:t>f</m:t>
+        </m:r>
+        <m:r>
+          <m:rPr>
+            <m:sty m:val="p"/>
+          </m:rPr>
+          <m:t>(</m:t>
+        </m:r>
+        <m:r>
+          <m:t>x</m:t>
+        </m:r>
+        <m:r>
+          <m:rPr>
+            <m:sty m:val="p"/>
+          </m:rPr>
+          <m:t>)</m:t>
+        </m:r>
+        <m:r>
+          <m:rPr>
+            <m:sty m:val="p"/>
+          </m:rPr>
+          <m:t>=</m:t>
+        </m:r>
+        <m:r>
+          <m:t>3</m:t>
+        </m:r>
+        <m:sSup>
+          <m:e>
+            <m:r>
+              <m:t>x</m:t>
+            </m:r>
+          </m:e>
+          <m:sup>
+            <m:r>
+              <m:t>4</m:t>
+            </m:r>
+          </m:sup>
+        </m:sSup>
+        <m:r>
+          <m:rPr>
+            <m:sty m:val="p"/>
+          </m:rPr>
+          <m:t>+</m:t>
+        </m:r>
+        <m:r>
+          <m:t>0</m:t>
+        </m:r>
+        <m:r>
+          <m:rPr>
+            <m:sty m:val="p"/>
+          </m:rPr>
+          <m:t>⋅</m:t>
+        </m:r>
+        <m:sSup>
+          <m:e>
+            <m:r>
+              <m:t>x</m:t>
+            </m:r>
+          </m:e>
+          <m:sup>
+            <m:r>
+              <m:t>3</m:t>
+            </m:r>
+          </m:sup>
+        </m:sSup>
+        <m:r>
+          <m:rPr>
+            <m:sty m:val="p"/>
+          </m:rPr>
+          <m:t>+</m:t>
+        </m:r>
+        <m:r>
+          <m:t>0</m:t>
+        </m:r>
+        <m:r>
+          <m:rPr>
+            <m:sty m:val="p"/>
+          </m:rPr>
+          <m:t>⋅</m:t>
+        </m:r>
+        <m:sSup>
+          <m:e>
+            <m:r>
+              <m:t>x</m:t>
+            </m:r>
+          </m:e>
+          <m:sup>
+            <m:r>
+              <m:t>2</m:t>
+            </m:r>
+          </m:sup>
+        </m:sSup>
+        <m:r>
+          <m:rPr>
+            <m:sty m:val="p"/>
+          </m:rPr>
+          <m:t>+</m:t>
+        </m:r>
+        <m:r>
+          <m:rPr>
+            <m:sty m:val="p"/>
+          </m:rPr>
+          <m:t>(</m:t>
+        </m:r>
+        <m:r>
+          <m:rPr>
+            <m:sty m:val="p"/>
+          </m:rPr>
+          <m:t>−</m:t>
+        </m:r>
+        <m:r>
+          <m:t>1</m:t>
+        </m:r>
+        <m:r>
+          <m:rPr>
+            <m:sty m:val="p"/>
+          </m:rPr>
+          <m:t>)</m:t>
+        </m:r>
+        <m:r>
+          <m:rPr>
+            <m:sty m:val="p"/>
+          </m:rPr>
+          <m:t>⋅</m:t>
+        </m:r>
+        <m:r>
+          <m:t>x</m:t>
+        </m:r>
+        <m:r>
+          <m:rPr>
+            <m:sty m:val="p"/>
+          </m:rPr>
+          <m:t>+</m:t>
+        </m:r>
+        <m:r>
+          <m:t>7</m:t>
+        </m:r>
+      </m:oMath>
+      <w:r>
+        <w:t xml:space="preserve">,</w:t>
+      </w:r>
+      <w:r>
+        <w:t xml:space="preserve"> </w:t>
+      </w:r>
+      <w:r>
+        <w:t xml:space="preserve">so</w:t>
+      </w:r>
+      <w:r>
+        <w:t xml:space="preserve"> </w:t>
+      </w:r>
+      <m:oMath>
+        <m:sSub>
+          <m:e>
+            <m:r>
+              <m:t>a</m:t>
+            </m:r>
+          </m:e>
+          <m:sub>
+            <m:r>
+              <m:t>4</m:t>
+            </m:r>
+          </m:sub>
+        </m:sSub>
+        <m:r>
+          <m:rPr>
+            <m:sty m:val="p"/>
+          </m:rPr>
+          <m:t>=</m:t>
+        </m:r>
+        <m:r>
+          <m:t>3</m:t>
+        </m:r>
+      </m:oMath>
+      <w:r>
+        <w:t xml:space="preserve">,</w:t>
+      </w:r>
+      <w:r>
+        <w:t xml:space="preserve"> </w:t>
+      </w:r>
+      <m:oMath>
+        <m:sSub>
+          <m:e>
+            <m:r>
+              <m:t>a</m:t>
+            </m:r>
+          </m:e>
+          <m:sub>
+            <m:r>
+              <m:t>3</m:t>
+            </m:r>
+          </m:sub>
+        </m:sSub>
+        <m:r>
+          <m:rPr>
+            <m:sty m:val="p"/>
+          </m:rPr>
+          <m:t>=</m:t>
+        </m:r>
+        <m:r>
+          <m:t>0</m:t>
+        </m:r>
+      </m:oMath>
+      <w:r>
+        <w:t xml:space="preserve">,</w:t>
+      </w:r>
+      <w:r>
+        <w:t xml:space="preserve"> </w:t>
+      </w:r>
+      <m:oMath>
+        <m:sSub>
+          <m:e>
+            <m:r>
+              <m:t>a</m:t>
+            </m:r>
+          </m:e>
+          <m:sub>
+            <m:r>
+              <m:t>2</m:t>
+            </m:r>
+          </m:sub>
+        </m:sSub>
+        <m:r>
+          <m:rPr>
+            <m:sty m:val="p"/>
+          </m:rPr>
+          <m:t>=</m:t>
+        </m:r>
+        <m:r>
+          <m:t>0</m:t>
+        </m:r>
+      </m:oMath>
+      <w:r>
+        <w:t xml:space="preserve">,</w:t>
+      </w:r>
+      <w:r>
+        <w:t xml:space="preserve"> </w:t>
+      </w:r>
+      <m:oMath>
+        <m:sSub>
+          <m:e>
+            <m:r>
+              <m:t>a</m:t>
+            </m:r>
+          </m:e>
+          <m:sub>
+            <m:r>
+              <m:t>1</m:t>
+            </m:r>
+          </m:sub>
+        </m:sSub>
+        <m:r>
+          <m:rPr>
+            <m:sty m:val="p"/>
+          </m:rPr>
+          <m:t>=</m:t>
+        </m:r>
+        <m:r>
+          <m:rPr>
+            <m:sty m:val="p"/>
+          </m:rPr>
+          <m:t>−</m:t>
+        </m:r>
+        <m:r>
+          <m:t>1</m:t>
+        </m:r>
+      </m:oMath>
+      <w:r>
+        <w:t xml:space="preserve">, and</w:t>
+      </w:r>
+      <w:r>
+        <w:t xml:space="preserve"> </w:t>
+      </w:r>
+      <m:oMath>
+        <m:sSub>
+          <m:e>
+            <m:r>
+              <m:t>a</m:t>
+            </m:r>
+          </m:e>
+          <m:sub>
+            <m:r>
+              <m:t>0</m:t>
+            </m:r>
+          </m:sub>
+        </m:sSub>
+        <m:r>
+          <m:rPr>
+            <m:sty m:val="p"/>
+          </m:rPr>
+          <m:t>=</m:t>
+        </m:r>
+        <m:r>
+          <m:t>7</m:t>
+        </m:r>
+      </m:oMath>
+      <w:r>
+        <w:t xml:space="preserve">.</w:t>
+      </w:r>
+      <w:r>
+        <w:t xml:space="preserve"> </w:t>
+      </w:r>
+      <w:r>
+        <w:t xml:space="preserve">Powers of</w:t>
+      </w:r>
+      <w:r>
+        <w:t xml:space="preserve"> </w:t>
+      </w:r>
+      <m:oMath>
+        <m:r>
+          <m:t>x</m:t>
+        </m:r>
+      </m:oMath>
+      <w:r>
+        <w:t xml:space="preserve"> </w:t>
+      </w:r>
+      <w:r>
+        <w:t xml:space="preserve">that do not appear have coefficient</w:t>
+      </w:r>
+      <w:r>
+        <w:t xml:space="preserve"> </w:t>
+      </w:r>
+      <m:oMath>
+        <m:r>
+          <m:t>0</m:t>
+        </m:r>
+      </m:oMath>
+      <w:r>
+        <w:t xml:space="preserve">.</w:t>
+      </w:r>
+    </w:p>
+    <w:p>
+      <w:pPr>
+        <w:numPr>
+          <w:ilvl w:val="0"/>
+          <w:numId w:val="1014"/>
+        </w:numPr>
+      </w:pPr>
+      <w:r>
+        <w:t xml:space="preserve">The highest power with a nonzero coefficient is</w:t>
+      </w:r>
+      <w:r>
+        <w:t xml:space="preserve"> </w:t>
+      </w:r>
+      <m:oMath>
+        <m:sSup>
+          <m:e>
+            <m:r>
+              <m:t>x</m:t>
+            </m:r>
+          </m:e>
+          <m:sup>
+            <m:r>
+              <m:t>4</m:t>
+            </m:r>
+          </m:sup>
+        </m:sSup>
+      </m:oMath>
+      <w:r>
+        <w:t xml:space="preserve">,</w:t>
+      </w:r>
+      <w:r>
+        <w:t xml:space="preserve"> </w:t>
+      </w:r>
+      <w:r>
+        <w:t xml:space="preserve">so the degree is</w:t>
+      </w:r>
+      <w:r>
+        <w:t xml:space="preserve"> </w:t>
+      </w:r>
+      <m:oMath>
+        <m:r>
+          <m:t>4</m:t>
+        </m:r>
+      </m:oMath>
+      <w:r>
+        <w:t xml:space="preserve"> </w:t>
+      </w:r>
+      <w:r>
+        <w:t xml:space="preserve">and the leading coefficient is</w:t>
+      </w:r>
+      <w:r>
+        <w:t xml:space="preserve"> </w:t>
+      </w:r>
+      <m:oMath>
+        <m:sSub>
+          <m:e>
+            <m:r>
+              <m:t>a</m:t>
+            </m:r>
+          </m:e>
+          <m:sub>
+            <m:r>
+              <m:t>4</m:t>
+            </m:r>
+          </m:sub>
+        </m:sSub>
+        <m:r>
+          <m:rPr>
+            <m:sty m:val="p"/>
+          </m:rPr>
+          <m:t>=</m:t>
+        </m:r>
+        <m:r>
+          <m:t>3</m:t>
+        </m:r>
+      </m:oMath>
+      <w:r>
+        <w:t xml:space="preserve">.</w:t>
+      </w:r>
+    </w:p>
+    <w:bookmarkEnd w:id="79"/>
+    <w:bookmarkStart w:id="80" w:name="def-polynomial"/>
+    <w:p>
+      <w:pPr>
+        <w:pStyle w:val="FirstParagraph"/>
+      </w:pPr>
+      <w:r>
+        <w:rPr>
+          <w:b/>
+          <w:bCs/>
+        </w:rPr>
+        <w:t xml:space="preserve">Definition 15 (Polynomial)</w:t>
+      </w:r>
+      <w:r>
+        <w:t xml:space="preserve"> </w:t>
+      </w:r>
+      <w:r>
+        <w:t xml:space="preserve">A</w:t>
+      </w:r>
+      <w:r>
+        <w:t xml:space="preserve"> </w:t>
+      </w:r>
+      <w:r>
+        <w:rPr>
+          <w:b/>
+          <w:bCs/>
+        </w:rPr>
+        <w:t xml:space="preserve">polynomial</w:t>
+      </w:r>
+      <w:r>
+        <w:t xml:space="preserve"> </w:t>
+      </w:r>
+      <w:r>
+        <w:t xml:space="preserve">(in one variable</w:t>
+      </w:r>
+      <w:r>
+        <w:t xml:space="preserve"> </w:t>
+      </w:r>
+      <m:oMath>
+        <m:r>
+          <m:t>x</m:t>
+        </m:r>
+      </m:oMath>
+      <w:r>
+        <w:t xml:space="preserve">) is a</w:t>
+      </w:r>
+      <w:r>
+        <w:t xml:space="preserve"> </w:t>
+      </w:r>
+      <w:hyperlink r:id="rId22">
+        <w:r>
+          <w:rPr>
+            <w:rStyle w:val="Hyperlink"/>
+          </w:rPr>
+          <w:t xml:space="preserve">function</w:t>
+        </w:r>
+      </w:hyperlink>
+      <w:r>
+        <w:t xml:space="preserve"> </w:t>
+      </w:r>
+      <m:oMath>
+        <m:r>
+          <m:t>f</m:t>
+        </m:r>
+        <m:r>
+          <m:rPr>
+            <m:sty m:val="p"/>
+          </m:rPr>
+          <m:t>:</m:t>
+        </m:r>
+        <m:r>
+          <m:rPr>
+            <m:scr m:val="double-struck"/>
+            <m:sty m:val="p"/>
+          </m:rPr>
+          <m:t>R</m:t>
+        </m:r>
+        <m:r>
+          <m:rPr>
+            <m:sty m:val="p"/>
+          </m:rPr>
+          <m:t>→</m:t>
+        </m:r>
+        <m:r>
+          <m:rPr>
+            <m:scr m:val="double-struck"/>
+            <m:sty m:val="p"/>
+          </m:rPr>
+          <m:t>R</m:t>
+        </m:r>
+      </m:oMath>
+      <w:r>
+        <w:t xml:space="preserve"> </w:t>
+      </w:r>
+      <w:r>
+        <w:t xml:space="preserve">that can be written as</w:t>
+      </w:r>
+    </w:p>
+    <w:p>
+      <w:pPr>
+        <w:pStyle w:val="BodyText"/>
+      </w:pPr>
+      <m:oMathPara>
+        <m:oMathParaPr>
+          <m:jc m:val="center"/>
+        </m:oMathParaPr>
+        <m:oMath>
+          <m:r>
+            <m:t>f</m:t>
+          </m:r>
+          <m:r>
+            <m:rPr>
+              <m:sty m:val="p"/>
+            </m:rPr>
+            <m:t>(</m:t>
+          </m:r>
+          <m:r>
+            <m:t>x</m:t>
+          </m:r>
+          <m:r>
+            <m:rPr>
+              <m:sty m:val="p"/>
+            </m:rPr>
+            <m:t>)</m:t>
+          </m:r>
+          <m:r>
+            <m:rPr>
+              <m:sty m:val="p"/>
+            </m:rPr>
+            <m:t>=</m:t>
+          </m:r>
+          <m:sSub>
+            <m:e>
+              <m:r>
+                <m:t>a</m:t>
+              </m:r>
+            </m:e>
+            <m:sub>
+              <m:r>
+                <m:t>n</m:t>
+              </m:r>
+            </m:sub>
+          </m:sSub>
+          <m:sSup>
+            <m:e>
+              <m:r>
+                <m:t>x</m:t>
+              </m:r>
+            </m:e>
+            <m:sup>
+              <m:r>
+                <m:t>n</m:t>
+              </m:r>
+            </m:sup>
+          </m:sSup>
+          <m:r>
+            <m:rPr>
+              <m:sty m:val="p"/>
+            </m:rPr>
+            <m:t>+</m:t>
+          </m:r>
+          <m:sSub>
+            <m:e>
+              <m:r>
+                <m:t>a</m:t>
+              </m:r>
+            </m:e>
+            <m:sub>
+              <m:r>
+                <m:t>n</m:t>
+              </m:r>
+              <m:r>
+                <m:rPr>
+                  <m:sty m:val="p"/>
+                </m:rPr>
+                <m:t>−</m:t>
+              </m:r>
+              <m:r>
+                <m:t>1</m:t>
+              </m:r>
+            </m:sub>
+          </m:sSub>
+          <m:sSup>
+            <m:e>
+              <m:r>
+                <m:t>x</m:t>
+              </m:r>
+            </m:e>
+            <m:sup>
+              <m:r>
+                <m:t>n</m:t>
+              </m:r>
+              <m:r>
+                <m:rPr>
+                  <m:sty m:val="p"/>
+                </m:rPr>
+                <m:t>−</m:t>
+              </m:r>
+              <m:r>
+                <m:t>1</m:t>
+              </m:r>
+            </m:sup>
+          </m:sSup>
+          <m:r>
+            <m:rPr>
+              <m:sty m:val="p"/>
+            </m:rPr>
+            <m:t>+</m:t>
+          </m:r>
+          <m:r>
+            <m:rPr>
+              <m:sty m:val="p"/>
+            </m:rPr>
+            <m:t>⋯</m:t>
+          </m:r>
+          <m:r>
+            <m:rPr>
+              <m:sty m:val="p"/>
+            </m:rPr>
+            <m:t>+</m:t>
+          </m:r>
+          <m:sSub>
+            <m:e>
+              <m:r>
+                <m:t>a</m:t>
+              </m:r>
+            </m:e>
+            <m:sub>
+              <m:r>
+                <m:t>1</m:t>
+              </m:r>
+            </m:sub>
+          </m:sSub>
+          <m:r>
+            <m:t>x</m:t>
+          </m:r>
+          <m:r>
+            <m:rPr>
+              <m:sty m:val="p"/>
+            </m:rPr>
+            <m:t>+</m:t>
+          </m:r>
+          <m:sSub>
+            <m:e>
+              <m:r>
+                <m:t>a</m:t>
+              </m:r>
+            </m:e>
+            <m:sub>
+              <m:r>
+                <m:t>0</m:t>
+              </m:r>
+            </m:sub>
+          </m:sSub>
+        </m:oMath>
+      </m:oMathPara>
+    </w:p>
+    <w:p>
+      <w:pPr>
+        <w:pStyle w:val="FirstParagraph"/>
+      </w:pPr>
+      <w:r>
+        <w:t xml:space="preserve">for some integer</w:t>
+      </w:r>
+      <w:r>
+        <w:t xml:space="preserve"> </w:t>
+      </w:r>
+      <m:oMath>
+        <m:r>
+          <m:t>n</m:t>
+        </m:r>
+        <m:r>
+          <m:rPr>
+            <m:sty m:val="p"/>
+          </m:rPr>
+          <m:t>≥</m:t>
+        </m:r>
+        <m:r>
+          <m:t>0</m:t>
+        </m:r>
+      </m:oMath>
+      <w:r>
+        <w:t xml:space="preserve"> </w:t>
+      </w:r>
+      <w:r>
+        <w:t xml:space="preserve">and constants</w:t>
+      </w:r>
+      <w:r>
+        <w:t xml:space="preserve"> </w:t>
+      </w:r>
+      <m:oMath>
+        <m:sSub>
+          <m:e>
+            <m:r>
+              <m:t>a</m:t>
+            </m:r>
+          </m:e>
+          <m:sub>
+            <m:r>
+              <m:t>0</m:t>
+            </m:r>
+          </m:sub>
+        </m:sSub>
+        <m:r>
+          <m:rPr>
+            <m:sty m:val="p"/>
+          </m:rPr>
+          <m:t>,</m:t>
+        </m:r>
+        <m:sSub>
+          <m:e>
+            <m:r>
+              <m:t>a</m:t>
+            </m:r>
+          </m:e>
+          <m:sub>
+            <m:r>
+              <m:t>1</m:t>
+            </m:r>
+          </m:sub>
+        </m:sSub>
+        <m:r>
+          <m:rPr>
+            <m:sty m:val="p"/>
+          </m:rPr>
+          <m:t>,</m:t>
+        </m:r>
+        <m:r>
+          <m:rPr>
+            <m:sty m:val="p"/>
+          </m:rPr>
+          <m:t>…</m:t>
+        </m:r>
+        <m:r>
+          <m:rPr>
+            <m:sty m:val="p"/>
+          </m:rPr>
+          <m:t>,</m:t>
+        </m:r>
+        <m:sSub>
+          <m:e>
+            <m:r>
+              <m:t>a</m:t>
+            </m:r>
+          </m:e>
+          <m:sub>
+            <m:r>
+              <m:t>n</m:t>
+            </m:r>
+          </m:sub>
+        </m:sSub>
+        <m:r>
+          <m:rPr>
+            <m:sty m:val="p"/>
+          </m:rPr>
+          <m:t>∈</m:t>
+        </m:r>
+        <m:r>
+          <m:rPr>
+            <m:scr m:val="double-struck"/>
+            <m:sty m:val="p"/>
+          </m:rPr>
+          <m:t>R</m:t>
+        </m:r>
+      </m:oMath>
+      <w:r>
+        <w:t xml:space="preserve"> </w:t>
+      </w:r>
+      <w:r>
+        <w:t xml:space="preserve">with</w:t>
+      </w:r>
+      <w:r>
+        <w:t xml:space="preserve"> </w:t>
+      </w:r>
+      <m:oMath>
+        <m:sSub>
+          <m:e>
+            <m:r>
+              <m:t>a</m:t>
+            </m:r>
+          </m:e>
+          <m:sub>
+            <m:r>
+              <m:t>n</m:t>
+            </m:r>
+          </m:sub>
+        </m:sSub>
+        <m:r>
+          <m:rPr>
+            <m:sty m:val="p"/>
+          </m:rPr>
+          <m:t>≠</m:t>
+        </m:r>
+        <m:r>
+          <m:t>0</m:t>
+        </m:r>
+      </m:oMath>
+      <w:r>
+        <w:t xml:space="preserve">.</w:t>
+      </w:r>
+    </w:p>
+    <w:bookmarkEnd w:id="80"/>
+    <w:p>
+      <w:pPr>
+        <w:pStyle w:val="BodyText"/>
+      </w:pPr>
+      <w:r>
+        <w:t xml:space="preserve">In</w:t>
+      </w:r>
+      <w:r>
+        <w:t xml:space="preserve"> </w:t>
+      </w:r>
+      <w:hyperlink w:anchor="exr-polynomial-degree">
+        <w:r>
+          <w:rPr>
+            <w:rStyle w:val="Hyperlink"/>
+          </w:rPr>
+          <w:t xml:space="preserve">Exercise 7</w:t>
+        </w:r>
+      </w:hyperlink>
+      <w:r>
+        <w:t xml:space="preserve">,</w:t>
+      </w:r>
+      <w:r>
+        <w:t xml:space="preserve"> </w:t>
+      </w:r>
+      <m:oMath>
+        <m:r>
+          <m:t>f</m:t>
+        </m:r>
+        <m:r>
+          <m:rPr>
+            <m:sty m:val="p"/>
+          </m:rPr>
+          <m:t>(</m:t>
+        </m:r>
+        <m:r>
+          <m:t>x</m:t>
+        </m:r>
+        <m:r>
+          <m:rPr>
+            <m:sty m:val="p"/>
+          </m:rPr>
+          <m:t>)</m:t>
+        </m:r>
+        <m:r>
+          <m:rPr>
+            <m:sty m:val="p"/>
+          </m:rPr>
+          <m:t>=</m:t>
+        </m:r>
+        <m:r>
+          <m:t>3</m:t>
+        </m:r>
+        <m:sSup>
+          <m:e>
+            <m:r>
+              <m:t>x</m:t>
+            </m:r>
+          </m:e>
+          <m:sup>
+            <m:r>
+              <m:t>4</m:t>
+            </m:r>
+          </m:sup>
+        </m:sSup>
+        <m:r>
+          <m:rPr>
+            <m:sty m:val="p"/>
+          </m:rPr>
+          <m:t>−</m:t>
+        </m:r>
+        <m:r>
+          <m:t>x</m:t>
+        </m:r>
+        <m:r>
+          <m:rPr>
+            <m:sty m:val="p"/>
+          </m:rPr>
+          <m:t>+</m:t>
+        </m:r>
+        <m:r>
+          <m:t>7</m:t>
+        </m:r>
+      </m:oMath>
+      <w:r>
+        <w:t xml:space="preserve"> </w:t>
+      </w:r>
+      <w:r>
+        <w:t xml:space="preserve">is a polynomial</w:t>
+      </w:r>
+      <w:r>
+        <w:t xml:space="preserve"> </w:t>
+      </w:r>
+      <w:r>
+        <w:t xml:space="preserve">with</w:t>
+      </w:r>
+      <w:r>
+        <w:t xml:space="preserve"> </w:t>
+      </w:r>
+      <m:oMath>
+        <m:r>
+          <m:t>n</m:t>
+        </m:r>
+        <m:r>
+          <m:rPr>
+            <m:sty m:val="p"/>
+          </m:rPr>
+          <m:t>=</m:t>
+        </m:r>
+        <m:r>
+          <m:t>4</m:t>
+        </m:r>
+      </m:oMath>
+      <w:r>
+        <w:t xml:space="preserve">,</w:t>
+      </w:r>
+      <w:r>
+        <w:t xml:space="preserve"> </w:t>
+      </w:r>
+      <m:oMath>
+        <m:sSub>
+          <m:e>
+            <m:r>
+              <m:t>a</m:t>
+            </m:r>
+          </m:e>
+          <m:sub>
+            <m:r>
+              <m:t>4</m:t>
+            </m:r>
+          </m:sub>
+        </m:sSub>
+        <m:r>
+          <m:rPr>
+            <m:sty m:val="p"/>
+          </m:rPr>
+          <m:t>=</m:t>
+        </m:r>
+        <m:r>
+          <m:t>3</m:t>
+        </m:r>
+      </m:oMath>
+      <w:r>
+        <w:t xml:space="preserve">,</w:t>
+      </w:r>
+      <w:r>
+        <w:t xml:space="preserve"> </w:t>
+      </w:r>
+      <m:oMath>
+        <m:sSub>
+          <m:e>
+            <m:r>
+              <m:t>a</m:t>
+            </m:r>
+          </m:e>
+          <m:sub>
+            <m:r>
+              <m:t>3</m:t>
+            </m:r>
+          </m:sub>
+        </m:sSub>
+        <m:r>
+          <m:rPr>
+            <m:sty m:val="p"/>
+          </m:rPr>
+          <m:t>=</m:t>
+        </m:r>
+        <m:r>
+          <m:t>0</m:t>
+        </m:r>
+      </m:oMath>
+      <w:r>
+        <w:t xml:space="preserve">,</w:t>
+      </w:r>
+      <w:r>
+        <w:t xml:space="preserve"> </w:t>
+      </w:r>
+      <m:oMath>
+        <m:sSub>
+          <m:e>
+            <m:r>
+              <m:t>a</m:t>
+            </m:r>
+          </m:e>
+          <m:sub>
+            <m:r>
+              <m:t>2</m:t>
+            </m:r>
+          </m:sub>
+        </m:sSub>
+        <m:r>
+          <m:rPr>
+            <m:sty m:val="p"/>
+          </m:rPr>
+          <m:t>=</m:t>
+        </m:r>
+        <m:r>
+          <m:t>0</m:t>
+        </m:r>
+      </m:oMath>
+      <w:r>
+        <w:t xml:space="preserve">,</w:t>
+      </w:r>
+      <w:r>
+        <w:t xml:space="preserve"> </w:t>
+      </w:r>
+      <m:oMath>
+        <m:sSub>
+          <m:e>
+            <m:r>
+              <m:t>a</m:t>
+            </m:r>
+          </m:e>
+          <m:sub>
+            <m:r>
+              <m:t>1</m:t>
+            </m:r>
+          </m:sub>
+        </m:sSub>
+        <m:r>
+          <m:rPr>
+            <m:sty m:val="p"/>
+          </m:rPr>
+          <m:t>=</m:t>
+        </m:r>
+        <m:r>
+          <m:rPr>
+            <m:sty m:val="p"/>
+          </m:rPr>
+          <m:t>−</m:t>
+        </m:r>
+        <m:r>
+          <m:t>1</m:t>
+        </m:r>
+      </m:oMath>
+      <w:r>
+        <w:t xml:space="preserve">, and</w:t>
+      </w:r>
+      <w:r>
+        <w:t xml:space="preserve"> </w:t>
+      </w:r>
+      <m:oMath>
+        <m:sSub>
+          <m:e>
+            <m:r>
+              <m:t>a</m:t>
+            </m:r>
+          </m:e>
+          <m:sub>
+            <m:r>
+              <m:t>0</m:t>
+            </m:r>
+          </m:sub>
+        </m:sSub>
+        <m:r>
+          <m:rPr>
+            <m:sty m:val="p"/>
+          </m:rPr>
+          <m:t>=</m:t>
+        </m:r>
+        <m:r>
+          <m:t>7</m:t>
+        </m:r>
+      </m:oMath>
+      <w:r>
+        <w:t xml:space="preserve">.</w:t>
+      </w:r>
+      <w:r>
+        <w:t xml:space="preserve"> </w:t>
+      </w:r>
+      <w:r>
+        <w:t xml:space="preserve">A constant function</w:t>
+      </w:r>
+      <w:r>
+        <w:t xml:space="preserve"> </w:t>
+      </w:r>
+      <m:oMath>
+        <m:r>
+          <m:t>f</m:t>
+        </m:r>
+        <m:r>
+          <m:rPr>
+            <m:sty m:val="p"/>
+          </m:rPr>
+          <m:t>(</m:t>
+        </m:r>
+        <m:r>
+          <m:t>x</m:t>
+        </m:r>
+        <m:r>
+          <m:rPr>
+            <m:sty m:val="p"/>
+          </m:rPr>
+          <m:t>)</m:t>
+        </m:r>
+        <m:r>
+          <m:rPr>
+            <m:sty m:val="p"/>
+          </m:rPr>
+          <m:t>=</m:t>
+        </m:r>
+        <m:r>
+          <m:t>7</m:t>
+        </m:r>
+      </m:oMath>
+      <w:r>
+        <w:t xml:space="preserve"> </w:t>
+      </w:r>
+      <w:r>
+        <w:t xml:space="preserve">is a polynomial with</w:t>
+      </w:r>
+      <w:r>
+        <w:t xml:space="preserve"> </w:t>
+      </w:r>
+      <m:oMath>
+        <m:r>
+          <m:t>n</m:t>
+        </m:r>
+        <m:r>
+          <m:rPr>
+            <m:sty m:val="p"/>
+          </m:rPr>
+          <m:t>=</m:t>
+        </m:r>
+        <m:r>
+          <m:t>0</m:t>
+        </m:r>
+      </m:oMath>
+      <w:r>
+        <w:t xml:space="preserve"> </w:t>
+      </w:r>
+      <w:r>
+        <w:t xml:space="preserve">and</w:t>
+      </w:r>
+      <w:r>
+        <w:t xml:space="preserve"> </w:t>
+      </w:r>
+      <m:oMath>
+        <m:sSub>
+          <m:e>
+            <m:r>
+              <m:t>a</m:t>
+            </m:r>
+          </m:e>
+          <m:sub>
+            <m:r>
+              <m:t>0</m:t>
+            </m:r>
+          </m:sub>
+        </m:sSub>
+        <m:r>
+          <m:rPr>
+            <m:sty m:val="p"/>
+          </m:rPr>
+          <m:t>=</m:t>
+        </m:r>
+        <m:r>
+          <m:t>7</m:t>
+        </m:r>
+      </m:oMath>
+      <w:r>
+        <w:t xml:space="preserve">.</w:t>
+      </w:r>
+      <w:r>
+        <w:t xml:space="preserve"> </w:t>
+      </w:r>
+      <w:r>
+        <w:t xml:space="preserve">The requirement</w:t>
+      </w:r>
+      <w:r>
+        <w:t xml:space="preserve"> </w:t>
+      </w:r>
+      <m:oMath>
+        <m:sSub>
+          <m:e>
+            <m:r>
+              <m:t>a</m:t>
+            </m:r>
+          </m:e>
+          <m:sub>
+            <m:r>
+              <m:t>n</m:t>
+            </m:r>
+          </m:sub>
+        </m:sSub>
+        <m:r>
+          <m:rPr>
+            <m:sty m:val="p"/>
+          </m:rPr>
+          <m:t>≠</m:t>
+        </m:r>
+        <m:r>
+          <m:t>0</m:t>
+        </m:r>
+      </m:oMath>
+      <w:r>
+        <w:t xml:space="preserve"> </w:t>
+      </w:r>
+      <w:r>
+        <w:t xml:space="preserve">means this definition covers nonzero polynomials only,</w:t>
+      </w:r>
+      <w:r>
+        <w:t xml:space="preserve"> </w:t>
+      </w:r>
+      <w:r>
+        <w:t xml:space="preserve">so that the degree is defined (</w:t>
+      </w:r>
+      <w:hyperlink w:anchor="def-polynomial-degree">
+        <w:r>
+          <w:rPr>
+            <w:rStyle w:val="Hyperlink"/>
+          </w:rPr>
+          <w:t xml:space="preserve">Definition 16</w:t>
+        </w:r>
+      </w:hyperlink>
+      <w:r>
+        <w:t xml:space="preserve">);</w:t>
+      </w:r>
+      <w:r>
+        <w:t xml:space="preserve"> </w:t>
+      </w:r>
+      <w:r>
+        <w:t xml:space="preserve">the zero function</w:t>
+      </w:r>
+      <w:r>
+        <w:t xml:space="preserve"> </w:t>
+      </w:r>
+      <m:oMath>
+        <m:r>
+          <m:t>f</m:t>
+        </m:r>
+        <m:r>
+          <m:rPr>
+            <m:sty m:val="p"/>
+          </m:rPr>
+          <m:t>(</m:t>
+        </m:r>
+        <m:r>
+          <m:t>x</m:t>
+        </m:r>
+        <m:r>
+          <m:rPr>
+            <m:sty m:val="p"/>
+          </m:rPr>
+          <m:t>)</m:t>
+        </m:r>
+        <m:r>
+          <m:rPr>
+            <m:sty m:val="p"/>
+          </m:rPr>
+          <m:t>=</m:t>
+        </m:r>
+        <m:r>
+          <m:t>0</m:t>
+        </m:r>
+      </m:oMath>
+      <w:r>
+        <w:t xml:space="preserve"> </w:t>
+      </w:r>
+      <w:r>
+        <w:t xml:space="preserve">is excluded here.</w:t>
+      </w:r>
+    </w:p>
+    <w:bookmarkStart w:id="81" w:name="def-polynomial-degree"/>
+    <w:p>
+      <w:pPr>
+        <w:pStyle w:val="BodyText"/>
+      </w:pPr>
+      <w:r>
+        <w:rPr>
+          <w:b/>
+          <w:bCs/>
+        </w:rPr>
+        <w:t xml:space="preserve">Definition 16 (Degree of a polynomial)</w:t>
+      </w:r>
+      <w:r>
+        <w:t xml:space="preserve"> </w:t>
+      </w:r>
+      <w:r>
+        <w:t xml:space="preserve">Let</w:t>
+      </w:r>
+      <w:r>
+        <w:t xml:space="preserve"> </w:t>
+      </w:r>
+      <m:oMath>
+        <m:r>
+          <m:t>f</m:t>
+        </m:r>
+        <m:r>
+          <m:rPr>
+            <m:sty m:val="p"/>
+          </m:rPr>
+          <m:t>(</m:t>
+        </m:r>
+        <m:r>
+          <m:t>x</m:t>
+        </m:r>
+        <m:r>
+          <m:rPr>
+            <m:sty m:val="p"/>
+          </m:rPr>
+          <m:t>)</m:t>
+        </m:r>
+        <m:r>
+          <m:rPr>
+            <m:sty m:val="p"/>
+          </m:rPr>
+          <m:t>=</m:t>
+        </m:r>
+        <m:sSub>
+          <m:e>
+            <m:r>
+              <m:t>a</m:t>
+            </m:r>
+          </m:e>
+          <m:sub>
+            <m:r>
+              <m:t>n</m:t>
+            </m:r>
+          </m:sub>
+        </m:sSub>
+        <m:sSup>
+          <m:e>
+            <m:r>
+              <m:t>x</m:t>
+            </m:r>
+          </m:e>
+          <m:sup>
+            <m:r>
+              <m:t>n</m:t>
+            </m:r>
+          </m:sup>
+        </m:sSup>
+        <m:r>
+          <m:rPr>
+            <m:sty m:val="p"/>
+          </m:rPr>
+          <m:t>+</m:t>
+        </m:r>
+        <m:r>
+          <m:rPr>
+            <m:sty m:val="p"/>
+          </m:rPr>
+          <m:t>⋯</m:t>
+        </m:r>
+        <m:r>
+          <m:rPr>
+            <m:sty m:val="p"/>
+          </m:rPr>
+          <m:t>+</m:t>
+        </m:r>
+        <m:sSub>
+          <m:e>
+            <m:r>
+              <m:t>a</m:t>
+            </m:r>
+          </m:e>
+          <m:sub>
+            <m:r>
+              <m:t>1</m:t>
+            </m:r>
+          </m:sub>
+        </m:sSub>
+        <m:r>
+          <m:t>x</m:t>
+        </m:r>
+        <m:r>
+          <m:rPr>
+            <m:sty m:val="p"/>
+          </m:rPr>
+          <m:t>+</m:t>
+        </m:r>
+        <m:sSub>
+          <m:e>
+            <m:r>
+              <m:t>a</m:t>
+            </m:r>
+          </m:e>
+          <m:sub>
+            <m:r>
+              <m:t>0</m:t>
+            </m:r>
+          </m:sub>
+        </m:sSub>
+      </m:oMath>
+      <w:r>
+        <w:t xml:space="preserve"> </w:t>
+      </w:r>
+      <w:r>
+        <w:t xml:space="preserve">be a</w:t>
+      </w:r>
+      <w:r>
+        <w:t xml:space="preserve"> </w:t>
+      </w:r>
+      <w:hyperlink w:anchor="def-polynomial">
+        <w:r>
+          <w:rPr>
+            <w:rStyle w:val="Hyperlink"/>
+          </w:rPr>
+          <w:t xml:space="preserve">polynomial</w:t>
+        </w:r>
+      </w:hyperlink>
+      <w:r>
+        <w:t xml:space="preserve"> </w:t>
+      </w:r>
+      <w:r>
+        <w:t xml:space="preserve">with</w:t>
+      </w:r>
+      <w:r>
+        <w:t xml:space="preserve"> </w:t>
+      </w:r>
+      <m:oMath>
+        <m:sSub>
+          <m:e>
+            <m:r>
+              <m:t>a</m:t>
+            </m:r>
+          </m:e>
+          <m:sub>
+            <m:r>
+              <m:t>n</m:t>
+            </m:r>
+          </m:sub>
+        </m:sSub>
+        <m:r>
+          <m:rPr>
+            <m:sty m:val="p"/>
+          </m:rPr>
+          <m:t>≠</m:t>
+        </m:r>
+        <m:r>
+          <m:t>0</m:t>
+        </m:r>
+      </m:oMath>
+      <w:r>
+        <w:t xml:space="preserve">.</w:t>
+      </w:r>
+      <w:r>
+        <w:t xml:space="preserve"> </w:t>
+      </w:r>
+      <w:r>
+        <w:t xml:space="preserve">The integer</w:t>
+      </w:r>
+      <w:r>
+        <w:t xml:space="preserve"> </w:t>
+      </w:r>
+      <m:oMath>
+        <m:r>
+          <m:t>n</m:t>
+        </m:r>
+      </m:oMath>
+      <w:r>
+        <w:t xml:space="preserve"> </w:t>
+      </w:r>
+      <w:r>
+        <w:t xml:space="preserve">is the</w:t>
+      </w:r>
+      <w:r>
+        <w:t xml:space="preserve"> </w:t>
+      </w:r>
+      <w:r>
+        <w:rPr>
+          <w:b/>
+          <w:bCs/>
+        </w:rPr>
+        <w:t xml:space="preserve">degree</w:t>
+      </w:r>
+      <w:r>
+        <w:t xml:space="preserve"> </w:t>
+      </w:r>
+      <w:r>
+        <w:t xml:space="preserve">of</w:t>
+      </w:r>
+      <w:r>
+        <w:t xml:space="preserve"> </w:t>
+      </w:r>
+      <m:oMath>
+        <m:r>
+          <m:t>f</m:t>
+        </m:r>
+      </m:oMath>
+      <w:r>
+        <w:t xml:space="preserve">.</w:t>
+      </w:r>
+    </w:p>
+    <w:bookmarkEnd w:id="81"/>
+    <w:p>
+      <w:pPr>
+        <w:pStyle w:val="BodyText"/>
+      </w:pPr>
+      <w:r>
+        <w:t xml:space="preserve">In</w:t>
+      </w:r>
+      <w:r>
+        <w:t xml:space="preserve"> </w:t>
+      </w:r>
+      <w:hyperlink w:anchor="exr-polynomial-degree">
+        <w:r>
+          <w:rPr>
+            <w:rStyle w:val="Hyperlink"/>
+          </w:rPr>
+          <w:t xml:space="preserve">Exercise 7</w:t>
+        </w:r>
+      </w:hyperlink>
+      <w:r>
+        <w:t xml:space="preserve">,</w:t>
+      </w:r>
+      <w:r>
+        <w:t xml:space="preserve"> </w:t>
+      </w:r>
+      <m:oMath>
+        <m:r>
+          <m:t>f</m:t>
+        </m:r>
+        <m:r>
+          <m:rPr>
+            <m:sty m:val="p"/>
+          </m:rPr>
+          <m:t>(</m:t>
+        </m:r>
+        <m:r>
+          <m:t>x</m:t>
+        </m:r>
+        <m:r>
+          <m:rPr>
+            <m:sty m:val="p"/>
+          </m:rPr>
+          <m:t>)</m:t>
+        </m:r>
+        <m:r>
+          <m:rPr>
+            <m:sty m:val="p"/>
+          </m:rPr>
+          <m:t>=</m:t>
+        </m:r>
+        <m:r>
+          <m:t>3</m:t>
+        </m:r>
+        <m:sSup>
+          <m:e>
+            <m:r>
+              <m:t>x</m:t>
+            </m:r>
+          </m:e>
+          <m:sup>
+            <m:r>
+              <m:t>4</m:t>
+            </m:r>
+          </m:sup>
+        </m:sSup>
+        <m:r>
+          <m:rPr>
+            <m:sty m:val="p"/>
+          </m:rPr>
+          <m:t>−</m:t>
+        </m:r>
+        <m:r>
+          <m:t>x</m:t>
+        </m:r>
+        <m:r>
+          <m:rPr>
+            <m:sty m:val="p"/>
+          </m:rPr>
+          <m:t>+</m:t>
+        </m:r>
+        <m:r>
+          <m:t>7</m:t>
+        </m:r>
+      </m:oMath>
+      <w:r>
+        <w:t xml:space="preserve"> </w:t>
+      </w:r>
+      <w:r>
+        <w:t xml:space="preserve">has degree</w:t>
+      </w:r>
+      <w:r>
+        <w:t xml:space="preserve"> </w:t>
+      </w:r>
+      <m:oMath>
+        <m:r>
+          <m:t>4</m:t>
+        </m:r>
+      </m:oMath>
+      <w:r>
+        <w:t xml:space="preserve">.</w:t>
+      </w:r>
+      <w:r>
+        <w:t xml:space="preserve"> </w:t>
+      </w:r>
+      <w:r>
+        <w:t xml:space="preserve">A constant polynomial</w:t>
+      </w:r>
+      <w:r>
+        <w:t xml:space="preserve"> </w:t>
+      </w:r>
+      <m:oMath>
+        <m:r>
+          <m:t>f</m:t>
+        </m:r>
+        <m:r>
+          <m:rPr>
+            <m:sty m:val="p"/>
+          </m:rPr>
+          <m:t>(</m:t>
+        </m:r>
+        <m:r>
+          <m:t>x</m:t>
+        </m:r>
+        <m:r>
+          <m:rPr>
+            <m:sty m:val="p"/>
+          </m:rPr>
+          <m:t>)</m:t>
+        </m:r>
+        <m:r>
+          <m:rPr>
+            <m:sty m:val="p"/>
+          </m:rPr>
+          <m:t>=</m:t>
+        </m:r>
+        <m:r>
+          <m:t>7</m:t>
+        </m:r>
+      </m:oMath>
+      <w:r>
+        <w:t xml:space="preserve"> </w:t>
+      </w:r>
+      <w:r>
+        <w:t xml:space="preserve">has degree</w:t>
+      </w:r>
+      <w:r>
+        <w:t xml:space="preserve"> </w:t>
+      </w:r>
+      <m:oMath>
+        <m:r>
+          <m:t>0</m:t>
+        </m:r>
+      </m:oMath>
+      <w:r>
+        <w:t xml:space="preserve">.</w:t>
+      </w:r>
+    </w:p>
+    <w:bookmarkStart w:id="82" w:name="def-polynomial-leading-coefficient"/>
+    <w:p>
+      <w:pPr>
+        <w:pStyle w:val="BodyText"/>
+      </w:pPr>
+      <w:r>
+        <w:rPr>
+          <w:b/>
+          <w:bCs/>
+        </w:rPr>
+        <w:t xml:space="preserve">Definition 17 (Leading coefficient)</w:t>
+      </w:r>
+      <w:r>
+        <w:t xml:space="preserve"> </w:t>
+      </w:r>
+      <w:r>
+        <w:t xml:space="preserve">Let</w:t>
+      </w:r>
+      <w:r>
+        <w:t xml:space="preserve"> </w:t>
+      </w:r>
+      <m:oMath>
+        <m:r>
+          <m:t>f</m:t>
+        </m:r>
+        <m:r>
+          <m:rPr>
+            <m:sty m:val="p"/>
+          </m:rPr>
+          <m:t>(</m:t>
+        </m:r>
+        <m:r>
+          <m:t>x</m:t>
+        </m:r>
+        <m:r>
+          <m:rPr>
+            <m:sty m:val="p"/>
+          </m:rPr>
+          <m:t>)</m:t>
+        </m:r>
+        <m:r>
+          <m:rPr>
+            <m:sty m:val="p"/>
+          </m:rPr>
+          <m:t>=</m:t>
+        </m:r>
+        <m:sSub>
+          <m:e>
+            <m:r>
+              <m:t>a</m:t>
+            </m:r>
+          </m:e>
+          <m:sub>
+            <m:r>
+              <m:t>n</m:t>
+            </m:r>
+          </m:sub>
+        </m:sSub>
+        <m:sSup>
+          <m:e>
+            <m:r>
+              <m:t>x</m:t>
+            </m:r>
+          </m:e>
+          <m:sup>
+            <m:r>
+              <m:t>n</m:t>
+            </m:r>
+          </m:sup>
+        </m:sSup>
+        <m:r>
+          <m:rPr>
+            <m:sty m:val="p"/>
+          </m:rPr>
+          <m:t>+</m:t>
+        </m:r>
+        <m:r>
+          <m:rPr>
+            <m:sty m:val="p"/>
+          </m:rPr>
+          <m:t>⋯</m:t>
+        </m:r>
+        <m:r>
+          <m:rPr>
+            <m:sty m:val="p"/>
+          </m:rPr>
+          <m:t>+</m:t>
+        </m:r>
+        <m:sSub>
+          <m:e>
+            <m:r>
+              <m:t>a</m:t>
+            </m:r>
+          </m:e>
+          <m:sub>
+            <m:r>
+              <m:t>1</m:t>
+            </m:r>
+          </m:sub>
+        </m:sSub>
+        <m:r>
+          <m:t>x</m:t>
+        </m:r>
+        <m:r>
+          <m:rPr>
+            <m:sty m:val="p"/>
+          </m:rPr>
+          <m:t>+</m:t>
+        </m:r>
+        <m:sSub>
+          <m:e>
+            <m:r>
+              <m:t>a</m:t>
+            </m:r>
+          </m:e>
+          <m:sub>
+            <m:r>
+              <m:t>0</m:t>
+            </m:r>
+          </m:sub>
+        </m:sSub>
+      </m:oMath>
+      <w:r>
+        <w:t xml:space="preserve"> </w:t>
+      </w:r>
+      <w:r>
+        <w:t xml:space="preserve">be a</w:t>
+      </w:r>
+      <w:r>
+        <w:t xml:space="preserve"> </w:t>
+      </w:r>
+      <w:hyperlink w:anchor="def-polynomial">
+        <w:r>
+          <w:rPr>
+            <w:rStyle w:val="Hyperlink"/>
+          </w:rPr>
+          <w:t xml:space="preserve">polynomial</w:t>
+        </w:r>
+      </w:hyperlink>
+      <w:r>
+        <w:t xml:space="preserve"> </w:t>
+      </w:r>
+      <w:r>
+        <w:t xml:space="preserve">of</w:t>
+      </w:r>
+      <w:r>
+        <w:t xml:space="preserve"> </w:t>
+      </w:r>
+      <w:hyperlink w:anchor="def-polynomial-degree">
+        <w:r>
+          <w:rPr>
+            <w:rStyle w:val="Hyperlink"/>
+          </w:rPr>
+          <w:t xml:space="preserve">degree</w:t>
+        </w:r>
+      </w:hyperlink>
+      <w:r>
+        <w:t xml:space="preserve"> </w:t>
+      </w:r>
+      <m:oMath>
+        <m:r>
+          <m:t>n</m:t>
+        </m:r>
+      </m:oMath>
+      <w:r>
+        <w:t xml:space="preserve">.</w:t>
+      </w:r>
+      <w:r>
+        <w:t xml:space="preserve"> </w:t>
+      </w:r>
+      <w:r>
+        <w:t xml:space="preserve">The constant</w:t>
+      </w:r>
+      <w:r>
+        <w:t xml:space="preserve"> </w:t>
+      </w:r>
+      <m:oMath>
+        <m:sSub>
+          <m:e>
+            <m:r>
+              <m:t>a</m:t>
+            </m:r>
+          </m:e>
+          <m:sub>
+            <m:r>
+              <m:t>n</m:t>
+            </m:r>
+          </m:sub>
+        </m:sSub>
+      </m:oMath>
+      <w:r>
+        <w:t xml:space="preserve"> </w:t>
+      </w:r>
+      <w:r>
+        <w:t xml:space="preserve">is the</w:t>
+      </w:r>
+      <w:r>
+        <w:t xml:space="preserve"> </w:t>
+      </w:r>
+      <w:r>
+        <w:rPr>
+          <w:b/>
+          <w:bCs/>
+        </w:rPr>
+        <w:t xml:space="preserve">leading coefficient</w:t>
+      </w:r>
+      <w:r>
+        <w:t xml:space="preserve"> </w:t>
+      </w:r>
+      <w:r>
+        <w:t xml:space="preserve">of</w:t>
+      </w:r>
+      <w:r>
+        <w:t xml:space="preserve"> </w:t>
+      </w:r>
+      <m:oMath>
+        <m:r>
+          <m:t>f</m:t>
+        </m:r>
+      </m:oMath>
+      <w:r>
+        <w:t xml:space="preserve">.</w:t>
+      </w:r>
+    </w:p>
+    <w:bookmarkEnd w:id="82"/>
+    <w:p>
+      <w:pPr>
+        <w:pStyle w:val="BodyText"/>
+      </w:pPr>
+      <w:r>
+        <w:t xml:space="preserve">In</w:t>
+      </w:r>
+      <w:r>
+        <w:t xml:space="preserve"> </w:t>
+      </w:r>
+      <w:hyperlink w:anchor="exr-polynomial-degree">
+        <w:r>
+          <w:rPr>
+            <w:rStyle w:val="Hyperlink"/>
+          </w:rPr>
+          <w:t xml:space="preserve">Exercise 7</w:t>
+        </w:r>
+      </w:hyperlink>
+      <w:r>
+        <w:t xml:space="preserve">,</w:t>
+      </w:r>
+      <w:r>
+        <w:t xml:space="preserve"> </w:t>
+      </w:r>
+      <m:oMath>
+        <m:r>
+          <m:t>f</m:t>
+        </m:r>
+        <m:r>
+          <m:rPr>
+            <m:sty m:val="p"/>
+          </m:rPr>
+          <m:t>(</m:t>
+        </m:r>
+        <m:r>
+          <m:t>x</m:t>
+        </m:r>
+        <m:r>
+          <m:rPr>
+            <m:sty m:val="p"/>
+          </m:rPr>
+          <m:t>)</m:t>
+        </m:r>
+        <m:r>
+          <m:rPr>
+            <m:sty m:val="p"/>
+          </m:rPr>
+          <m:t>=</m:t>
+        </m:r>
+        <m:r>
+          <m:t>3</m:t>
+        </m:r>
+        <m:sSup>
+          <m:e>
+            <m:r>
+              <m:t>x</m:t>
+            </m:r>
+          </m:e>
+          <m:sup>
+            <m:r>
+              <m:t>4</m:t>
+            </m:r>
+          </m:sup>
+        </m:sSup>
+        <m:r>
+          <m:rPr>
+            <m:sty m:val="p"/>
+          </m:rPr>
+          <m:t>−</m:t>
+        </m:r>
+        <m:r>
+          <m:t>x</m:t>
+        </m:r>
+        <m:r>
+          <m:rPr>
+            <m:sty m:val="p"/>
+          </m:rPr>
+          <m:t>+</m:t>
+        </m:r>
+        <m:r>
+          <m:t>7</m:t>
+        </m:r>
+      </m:oMath>
+      <w:r>
+        <w:t xml:space="preserve"> </w:t>
+      </w:r>
+      <w:r>
+        <w:t xml:space="preserve">has leading coefficient</w:t>
+      </w:r>
+      <w:r>
+        <w:t xml:space="preserve"> </w:t>
+      </w:r>
+      <m:oMath>
+        <m:r>
+          <m:t>3</m:t>
+        </m:r>
+      </m:oMath>
+      <w:r>
+        <w:t xml:space="preserve">.</w:t>
+      </w:r>
+    </w:p>
+    <w:bookmarkEnd w:id="83"/>
+    <w:bookmarkStart w:id="102" w:name="exponentials-and-logarithms"/>
+    <w:p>
+      <w:pPr>
+        <w:pStyle w:val="Heading2"/>
+      </w:pPr>
+      <w:r>
+        <w:t xml:space="preserve">14 Exponentials and Logarithms</w:t>
       </w:r>
     </w:p>
     <w:p>
@@ -19142,7 +21519,7 @@
         <w:t xml:space="preserve">for base 10.</w:t>
       </w:r>
     </w:p>
-    <w:bookmarkStart w:id="78" w:name="thm-exp-log-inverse"/>
+    <w:bookmarkStart w:id="84" w:name="thm-exp-log-inverse"/>
     <w:p>
       <w:pPr>
         <w:pStyle w:val="BodyText"/>
@@ -19247,7 +21624,7 @@
         <w:pStyle w:val="Compact"/>
         <w:numPr>
           <w:ilvl w:val="0"/>
-          <w:numId w:val="1013"/>
+          <w:numId w:val="1015"/>
         </w:numPr>
       </w:pPr>
       <w:r>
@@ -19343,7 +21720,7 @@
         <w:pStyle w:val="Compact"/>
         <w:numPr>
           <w:ilvl w:val="0"/>
-          <w:numId w:val="1013"/>
+          <w:numId w:val="1015"/>
         </w:numPr>
       </w:pPr>
       <w:r>
@@ -19438,8 +21815,8 @@
         <w:t xml:space="preserve">.</w:t>
       </w:r>
     </w:p>
-    <w:bookmarkEnd w:id="78"/>
-    <w:bookmarkStart w:id="79" w:name="thm-log-prod"/>
+    <w:bookmarkEnd w:id="84"/>
+    <w:bookmarkStart w:id="85" w:name="thm-log-prod"/>
     <w:p>
       <w:pPr>
         <w:pStyle w:val="FirstParagraph"/>
@@ -19609,8 +21986,8 @@
         </m:oMath>
       </m:oMathPara>
     </w:p>
-    <w:bookmarkEnd w:id="79"/>
-    <w:bookmarkStart w:id="80" w:name="cor-log-quot"/>
+    <w:bookmarkEnd w:id="85"/>
+    <w:bookmarkStart w:id="86" w:name="cor-log-quot"/>
     <w:p>
       <w:pPr>
         <w:pStyle w:val="FirstParagraph"/>
@@ -19783,7 +22160,7 @@
         </m:oMath>
       </m:oMathPara>
     </w:p>
-    <w:bookmarkEnd w:id="80"/>
+    <w:bookmarkEnd w:id="86"/>
     <w:p>
       <w:pPr>
         <w:pStyle w:val="FirstParagraph"/>
@@ -20338,7 +22715,7 @@
         <w:t xml:space="preserve">.</w:t>
       </w:r>
     </w:p>
-    <w:bookmarkStart w:id="81" w:name="thm-log-exp"/>
+    <w:bookmarkStart w:id="87" w:name="thm-log-exp"/>
     <w:p>
       <w:pPr>
         <w:pStyle w:val="BodyText"/>
@@ -20490,8 +22867,8 @@
         </m:oMath>
       </m:oMathPara>
     </w:p>
-    <w:bookmarkEnd w:id="81"/>
-    <w:bookmarkStart w:id="82" w:name="thm-exp-sum"/>
+    <w:bookmarkEnd w:id="87"/>
+    <w:bookmarkStart w:id="88" w:name="thm-exp-sum"/>
     <w:p>
       <w:pPr>
         <w:pStyle w:val="FirstParagraph"/>
@@ -20626,8 +23003,8 @@
         </m:oMath>
       </m:oMathPara>
     </w:p>
-    <w:bookmarkEnd w:id="82"/>
-    <w:bookmarkStart w:id="83" w:name="cor-exp-sum"/>
+    <w:bookmarkEnd w:id="88"/>
+    <w:bookmarkStart w:id="89" w:name="cor-exp-sum"/>
     <w:p>
       <w:pPr>
         <w:pStyle w:val="FirstParagraph"/>
@@ -20777,8 +23154,8 @@
         </m:oMath>
       </m:oMathPara>
     </w:p>
-    <w:bookmarkEnd w:id="83"/>
-    <w:bookmarkStart w:id="84" w:name="thm-double-exp"/>
+    <w:bookmarkEnd w:id="89"/>
+    <w:bookmarkStart w:id="90" w:name="thm-double-exp"/>
     <w:p>
       <w:pPr>
         <w:pStyle w:val="FirstParagraph"/>
@@ -20966,8 +23343,8 @@
         </m:oMath>
       </m:oMathPara>
     </w:p>
-    <w:bookmarkEnd w:id="84"/>
-    <w:bookmarkStart w:id="85" w:name="exm-double-exp-negative-base"/>
+    <w:bookmarkEnd w:id="90"/>
+    <w:bookmarkStart w:id="91" w:name="exm-double-exp-negative-base"/>
     <w:p>
       <w:pPr>
         <w:pStyle w:val="FirstParagraph"/>
@@ -21652,8 +24029,8 @@
         <w:t xml:space="preserve">is not even a real number.</w:t>
       </w:r>
     </w:p>
-    <w:bookmarkEnd w:id="85"/>
-    <w:bookmarkStart w:id="86" w:name="cor-exp-ab"/>
+    <w:bookmarkEnd w:id="91"/>
+    <w:bookmarkStart w:id="92" w:name="cor-exp-ab"/>
     <w:p>
       <w:pPr>
         <w:pStyle w:val="BodyText"/>
@@ -21810,8 +24187,8 @@
         </m:oMath>
       </m:oMathPara>
     </w:p>
-    <w:bookmarkEnd w:id="86"/>
-    <w:bookmarkStart w:id="87" w:name="exr-exp-vs-mult"/>
+    <w:bookmarkEnd w:id="92"/>
+    <w:bookmarkStart w:id="93" w:name="exr-exp-vs-mult"/>
     <w:p>
       <w:pPr>
         <w:pStyle w:val="FirstParagraph"/>
@@ -21821,7 +24198,7 @@
           <w:b/>
           <w:bCs/>
         </w:rPr>
-        <w:t xml:space="preserve">Exercise 7</w:t>
+        <w:t xml:space="preserve">Exercise 8</w:t>
       </w:r>
       <w:r>
         <w:t xml:space="preserve"> </w:t>
@@ -21895,8 +24272,8 @@
         <w:t xml:space="preserve">?</w:t>
       </w:r>
     </w:p>
-    <w:bookmarkEnd w:id="87"/>
-    <w:bookmarkStart w:id="90" w:name="sol-exp-vs-mult"/>
+    <w:bookmarkEnd w:id="93"/>
+    <w:bookmarkStart w:id="96" w:name="sol-exp-vs-mult"/>
     <w:p>
       <w:pPr>
         <w:pStyle w:val="BodyText"/>
@@ -21906,7 +24283,7 @@
           <w:i/>
           <w:iCs/>
         </w:rPr>
-        <w:t xml:space="preserve">Solution 7</w:t>
+        <w:t xml:space="preserve">Solution 8</w:t>
       </w:r>
       <w:r>
         <w:t xml:space="preserve">. </w:t>
@@ -22089,7 +24466,7 @@
         <w:pStyle w:val="Compact"/>
         <w:numPr>
           <w:ilvl w:val="0"/>
-          <w:numId w:val="1014"/>
+          <w:numId w:val="1016"/>
         </w:numPr>
       </w:pPr>
       <m:oMath>
@@ -22126,7 +24503,7 @@
         <w:pStyle w:val="Compact"/>
         <w:numPr>
           <w:ilvl w:val="0"/>
-          <w:numId w:val="1014"/>
+          <w:numId w:val="1016"/>
         </w:numPr>
       </w:pPr>
       <m:oMath>
@@ -22309,7 +24686,7 @@
         <w:pStyle w:val="Compact"/>
         <w:numPr>
           <w:ilvl w:val="0"/>
-          <w:numId w:val="1014"/>
+          <w:numId w:val="1016"/>
         </w:numPr>
       </w:pPr>
       <m:oMath>
@@ -22830,7 +25207,7 @@
         <w:pStyle w:val="Compact"/>
         <w:numPr>
           <w:ilvl w:val="0"/>
-          <w:numId w:val="1014"/>
+          <w:numId w:val="1016"/>
         </w:numPr>
       </w:pPr>
       <m:oMath>
@@ -23088,7 +25465,7 @@
         <w:pStyle w:val="Compact"/>
         <w:numPr>
           <w:ilvl w:val="0"/>
-          <w:numId w:val="1014"/>
+          <w:numId w:val="1016"/>
         </w:numPr>
       </w:pPr>
       <m:oMath>
@@ -23680,7 +26057,7 @@
       <w:tr>
         <w:tc>
           <w:tcPr/>
-          <w:bookmarkStart w:id="88" w:name="fig-double-exponential"/>
+          <w:bookmarkStart w:id="94" w:name="fig-double-exponential"/>
           <w:p>
             <w:pPr>
               <w:pStyle w:val="Compact"/>
@@ -23747,7 +26124,7 @@
               </m:sSup>
             </m:oMath>
           </w:p>
-          <w:bookmarkEnd w:id="88"/>
+          <w:bookmarkEnd w:id="94"/>
         </w:tc>
       </w:tr>
     </w:tbl>
@@ -23772,7 +26149,7 @@
       <w:tr>
         <w:tc>
           <w:tcPr/>
-          <w:bookmarkStart w:id="89" w:name="fig-double-exponential2"/>
+          <w:bookmarkStart w:id="95" w:name="fig-double-exponential2"/>
           <w:p>
             <w:pPr>
               <w:pStyle w:val="Compact"/>
@@ -23889,12 +26266,12 @@
               <w:t xml:space="preserve">.</w:t>
             </w:r>
           </w:p>
-          <w:bookmarkEnd w:id="89"/>
+          <w:bookmarkEnd w:id="95"/>
         </w:tc>
       </w:tr>
     </w:tbl>
-    <w:bookmarkEnd w:id="90"/>
-    <w:bookmarkStart w:id="91" w:name="exr-double-exponential"/>
+    <w:bookmarkEnd w:id="96"/>
+    <w:bookmarkStart w:id="97" w:name="exr-double-exponential"/>
     <w:p>
       <w:pPr>
         <w:pStyle w:val="BodyText"/>
@@ -23904,7 +26281,7 @@
           <w:b/>
           <w:bCs/>
         </w:rPr>
-        <w:t xml:space="preserve">Exercise 8</w:t>
+        <w:t xml:space="preserve">Exercise 9</w:t>
       </w:r>
       <w:r>
         <w:t xml:space="preserve"> </w:t>
@@ -24053,8 +26430,8 @@
         <w:t xml:space="preserve">?</w:t>
       </w:r>
     </w:p>
-    <w:bookmarkEnd w:id="91"/>
-    <w:bookmarkStart w:id="93" w:name="sol-double-exponential"/>
+    <w:bookmarkEnd w:id="97"/>
+    <w:bookmarkStart w:id="99" w:name="sol-double-exponential"/>
     <w:p>
       <w:pPr>
         <w:pStyle w:val="BodyText"/>
@@ -24064,7 +26441,7 @@
           <w:i/>
           <w:iCs/>
         </w:rPr>
-        <w:t xml:space="preserve">Solution 8</w:t>
+        <w:t xml:space="preserve">Solution 9</w:t>
       </w:r>
       <w:r>
         <w:t xml:space="preserve">. </w:t>
@@ -24479,7 +26856,7 @@
       <w:pPr>
         <w:pStyle w:val="BodyText"/>
       </w:pPr>
-      <w:bookmarkStart w:id="92" w:name="eq-double-exp-log-scale"/>
+      <w:bookmarkStart w:id="98" w:name="eq-double-exp-log-scale"/>
       <m:oMathPara>
         <m:oMathParaPr>
           <m:jc m:val="center"/>
@@ -24786,7 +27163,7 @@
           </m:r>
         </m:oMath>
       </m:oMathPara>
-      <w:bookmarkEnd w:id="92"/>
+      <w:bookmarkEnd w:id="98"/>
     </w:p>
     <w:p>
       <w:pPr>
@@ -24818,7 +27195,7 @@
         <w:pStyle w:val="Compact"/>
         <w:numPr>
           <w:ilvl w:val="0"/>
-          <w:numId w:val="1015"/>
+          <w:numId w:val="1017"/>
         </w:numPr>
       </w:pPr>
       <m:oMath>
@@ -24889,7 +27266,7 @@
         <w:pStyle w:val="Compact"/>
         <w:numPr>
           <w:ilvl w:val="0"/>
-          <w:numId w:val="1015"/>
+          <w:numId w:val="1017"/>
         </w:numPr>
       </w:pPr>
       <m:oMath>
@@ -24932,7 +27309,7 @@
           <w:rPr>
             <w:rStyle w:val="Hyperlink"/>
           </w:rPr>
-          <w:t xml:space="preserve">Exercise 7</w:t>
+          <w:t xml:space="preserve">Exercise 8</w:t>
         </w:r>
       </w:hyperlink>
       <w:r>
@@ -25131,7 +27508,7 @@
         <w:pStyle w:val="Compact"/>
         <w:numPr>
           <w:ilvl w:val="0"/>
-          <w:numId w:val="1016"/>
+          <w:numId w:val="1018"/>
         </w:numPr>
       </w:pPr>
       <w:r>
@@ -25230,7 +27607,7 @@
         <w:pStyle w:val="Compact"/>
         <w:numPr>
           <w:ilvl w:val="0"/>
-          <w:numId w:val="1016"/>
+          <w:numId w:val="1018"/>
         </w:numPr>
       </w:pPr>
       <w:r>
@@ -25429,7 +27806,7 @@
         <w:pStyle w:val="Compact"/>
         <w:numPr>
           <w:ilvl w:val="0"/>
-          <w:numId w:val="1016"/>
+          <w:numId w:val="1018"/>
         </w:numPr>
       </w:pPr>
       <w:r>
@@ -26108,9 +28485,9 @@
         </m:oMath>
       </m:oMathPara>
     </w:p>
-    <w:bookmarkEnd w:id="93"/>
-    <w:bookmarkStart w:id="95" w:name="refs"/>
-    <w:bookmarkStart w:id="94" w:name="ref-rudin1976principles"/>
+    <w:bookmarkEnd w:id="99"/>
+    <w:bookmarkStart w:id="101" w:name="refs"/>
+    <w:bookmarkStart w:id="100" w:name="ref-rudin1976principles"/>
     <w:p>
       <w:pPr>
         <w:pStyle w:val="Bibliography"/>
@@ -26132,9 +28509,9 @@
         <w:t xml:space="preserve">. 3rd ed. International Series in Pure and Applied Mathematics. McGraw-Hill.</w:t>
       </w:r>
     </w:p>
-    <w:bookmarkEnd w:id="94"/>
-    <w:bookmarkEnd w:id="95"/>
-    <w:bookmarkEnd w:id="96"/>
+    <w:bookmarkEnd w:id="100"/>
+    <w:bookmarkEnd w:id="101"/>
+    <w:bookmarkEnd w:id="102"/>
     <w:sectPr>
       <w:footnotePr>
         <w:numRestart w:val="eachSect"/>
@@ -26833,6 +29210,66 @@
     </w:lvlOverride>
   </w:num>
   <w:num w:numId="1016">
+    <w:abstractNumId w:val="99411"/>
+    <w:lvlOverride w:ilvl="0">
+      <w:startOverride w:val="1"/>
+    </w:lvlOverride>
+    <w:lvlOverride w:ilvl="1">
+      <w:startOverride w:val="1"/>
+    </w:lvlOverride>
+    <w:lvlOverride w:ilvl="2">
+      <w:startOverride w:val="1"/>
+    </w:lvlOverride>
+    <w:lvlOverride w:ilvl="3">
+      <w:startOverride w:val="1"/>
+    </w:lvlOverride>
+    <w:lvlOverride w:ilvl="4">
+      <w:startOverride w:val="1"/>
+    </w:lvlOverride>
+    <w:lvlOverride w:ilvl="5">
+      <w:startOverride w:val="1"/>
+    </w:lvlOverride>
+    <w:lvlOverride w:ilvl="6">
+      <w:startOverride w:val="1"/>
+    </w:lvlOverride>
+    <w:lvlOverride w:ilvl="7">
+      <w:startOverride w:val="1"/>
+    </w:lvlOverride>
+    <w:lvlOverride w:ilvl="8">
+      <w:startOverride w:val="1"/>
+    </w:lvlOverride>
+  </w:num>
+  <w:num w:numId="1017">
+    <w:abstractNumId w:val="99411"/>
+    <w:lvlOverride w:ilvl="0">
+      <w:startOverride w:val="1"/>
+    </w:lvlOverride>
+    <w:lvlOverride w:ilvl="1">
+      <w:startOverride w:val="1"/>
+    </w:lvlOverride>
+    <w:lvlOverride w:ilvl="2">
+      <w:startOverride w:val="1"/>
+    </w:lvlOverride>
+    <w:lvlOverride w:ilvl="3">
+      <w:startOverride w:val="1"/>
+    </w:lvlOverride>
+    <w:lvlOverride w:ilvl="4">
+      <w:startOverride w:val="1"/>
+    </w:lvlOverride>
+    <w:lvlOverride w:ilvl="5">
+      <w:startOverride w:val="1"/>
+    </w:lvlOverride>
+    <w:lvlOverride w:ilvl="6">
+      <w:startOverride w:val="1"/>
+    </w:lvlOverride>
+    <w:lvlOverride w:ilvl="7">
+      <w:startOverride w:val="1"/>
+    </w:lvlOverride>
+    <w:lvlOverride w:ilvl="8">
+      <w:startOverride w:val="1"/>
+    </w:lvlOverride>
+  </w:num>
+  <w:num w:numId="1018">
     <w:abstractNumId w:val="991"/>
   </w:num>
 </w:numbering>

</xml_diff>

<commit_message>
Deploying to gh-pages from @ Morrison-Lab/mds@de722c2697c0b5a6b4e9daa4a8b9a72c2e9c7816 🚀
</commit_message>
<xml_diff>
--- a/algebra.docx
+++ b/algebra.docx
@@ -15,7 +15,7 @@
         <w:pStyle w:val="Date"/>
       </w:pPr>
       <w:r>
-        <w:t xml:space="preserve">Last modified: 2026-10-02 10:10:00 (PDT)</w:t>
+        <w:t xml:space="preserve">Last modified: 2026-10-02 10:19:10 (PDT)</w:t>
       </w:r>
     </w:p>
     <w:bookmarkStart w:id="12" w:name="equalities"/>
@@ -14639,7 +14639,7 @@
       </w:r>
     </w:p>
     <w:bookmarkEnd w:id="57"/>
-    <w:bookmarkStart w:id="65" w:name="sec-summation"/>
+    <w:bookmarkStart w:id="71" w:name="sec-summation"/>
     <w:p>
       <w:pPr>
         <w:pStyle w:val="Heading2"/>
@@ -18144,8 +18144,2241 @@
         <w:t xml:space="preserve">, part 2.</w:t>
       </w:r>
     </w:p>
+    <w:bookmarkStart w:id="65" w:name="exr-sum-over-set"/>
+    <w:p>
+      <w:pPr>
+        <w:pStyle w:val="BodyText"/>
+      </w:pPr>
+      <w:r>
+        <w:rPr>
+          <w:b/>
+          <w:bCs/>
+        </w:rPr>
+        <w:t xml:space="preserve">Exercise 7 (Sum over a set)</w:t>
+      </w:r>
+      <w:r>
+        <w:t xml:space="preserve"> </w:t>
+      </w:r>
+      <w:r>
+        <w:t xml:space="preserve">Let</w:t>
+      </w:r>
+      <w:r>
+        <w:t xml:space="preserve"> </w:t>
+      </w:r>
+      <m:oMath>
+        <m:r>
+          <m:t>A</m:t>
+        </m:r>
+        <m:r>
+          <m:rPr>
+            <m:sty m:val="p"/>
+          </m:rPr>
+          <m:t>=</m:t>
+        </m:r>
+        <m:r>
+          <m:t>​</m:t>
+        </m:r>
+        <m:d>
+          <m:dPr>
+            <m:begChr m:val="{"/>
+            <m:sepChr m:val=""/>
+            <m:endChr m:val="}"/>
+            <m:grow/>
+          </m:dPr>
+          <m:e>
+            <m:r>
+              <m:rPr>
+                <m:sty m:val="p"/>
+              </m:rPr>
+              <m:t>−</m:t>
+            </m:r>
+            <m:r>
+              <m:t>1</m:t>
+            </m:r>
+            <m:r>
+              <m:rPr>
+                <m:sty m:val="p"/>
+              </m:rPr>
+              <m:t>,</m:t>
+            </m:r>
+            <m:r>
+              <m:t>2</m:t>
+            </m:r>
+            <m:r>
+              <m:rPr>
+                <m:sty m:val="p"/>
+              </m:rPr>
+              <m:t>,</m:t>
+            </m:r>
+            <m:r>
+              <m:t>5</m:t>
+            </m:r>
+          </m:e>
+        </m:d>
+        <m:r>
+          <m:t>​</m:t>
+        </m:r>
+      </m:oMath>
+      <w:r>
+        <w:t xml:space="preserve"> </w:t>
+      </w:r>
+      <w:r>
+        <w:t xml:space="preserve">and let</w:t>
+      </w:r>
+      <w:r>
+        <w:t xml:space="preserve"> </w:t>
+      </w:r>
+      <m:oMath>
+        <m:r>
+          <m:t>f</m:t>
+        </m:r>
+        <m:r>
+          <m:rPr>
+            <m:sty m:val="p"/>
+          </m:rPr>
+          <m:t>(</m:t>
+        </m:r>
+        <m:r>
+          <m:t>x</m:t>
+        </m:r>
+        <m:r>
+          <m:rPr>
+            <m:sty m:val="p"/>
+          </m:rPr>
+          <m:t>)</m:t>
+        </m:r>
+        <m:r>
+          <m:rPr>
+            <m:sty m:val="p"/>
+          </m:rPr>
+          <m:t>=</m:t>
+        </m:r>
+        <m:sSup>
+          <m:e>
+            <m:r>
+              <m:t>x</m:t>
+            </m:r>
+          </m:e>
+          <m:sup>
+            <m:r>
+              <m:t>2</m:t>
+            </m:r>
+          </m:sup>
+        </m:sSup>
+      </m:oMath>
+      <w:r>
+        <w:t xml:space="preserve">.</w:t>
+      </w:r>
+      <w:r>
+        <w:t xml:space="preserve"> </w:t>
+      </w:r>
+      <w:r>
+        <w:t xml:space="preserve">The expression</w:t>
+      </w:r>
+      <w:r>
+        <w:t xml:space="preserve"> </w:t>
+      </w:r>
+      <m:oMath>
+        <m:nary>
+          <m:naryPr>
+            <m:chr m:val="∑"/>
+            <m:limLoc m:val="undOvr"/>
+            <m:subHide m:val="off"/>
+            <m:supHide m:val="on"/>
+          </m:naryPr>
+          <m:sub>
+            <m:r>
+              <m:t>x</m:t>
+            </m:r>
+            <m:r>
+              <m:rPr>
+                <m:sty m:val="p"/>
+              </m:rPr>
+              <m:t>∈</m:t>
+            </m:r>
+            <m:r>
+              <m:t>A</m:t>
+            </m:r>
+          </m:sub>
+          <m:sup>
+            <m:r>
+              <m:t>​</m:t>
+            </m:r>
+          </m:sup>
+          <m:e>
+            <m:r>
+              <m:t>f</m:t>
+            </m:r>
+          </m:e>
+        </m:nary>
+        <m:r>
+          <m:rPr>
+            <m:sty m:val="p"/>
+          </m:rPr>
+          <m:t>(</m:t>
+        </m:r>
+        <m:r>
+          <m:t>x</m:t>
+        </m:r>
+        <m:r>
+          <m:rPr>
+            <m:sty m:val="p"/>
+          </m:rPr>
+          <m:t>)</m:t>
+        </m:r>
+      </m:oMath>
+      <w:r>
+        <w:t xml:space="preserve"> </w:t>
+      </w:r>
+      <w:r>
+        <w:t xml:space="preserve">means: add up</w:t>
+      </w:r>
+      <w:r>
+        <w:t xml:space="preserve"> </w:t>
+      </w:r>
+      <m:oMath>
+        <m:r>
+          <m:t>f</m:t>
+        </m:r>
+        <m:r>
+          <m:rPr>
+            <m:sty m:val="p"/>
+          </m:rPr>
+          <m:t>(</m:t>
+        </m:r>
+        <m:r>
+          <m:t>x</m:t>
+        </m:r>
+        <m:r>
+          <m:rPr>
+            <m:sty m:val="p"/>
+          </m:rPr>
+          <m:t>)</m:t>
+        </m:r>
+      </m:oMath>
+      <w:r>
+        <w:t xml:space="preserve"> </w:t>
+      </w:r>
+      <w:r>
+        <w:t xml:space="preserve">for each element</w:t>
+      </w:r>
+      <w:r>
+        <w:t xml:space="preserve"> </w:t>
+      </w:r>
+      <m:oMath>
+        <m:r>
+          <m:t>x</m:t>
+        </m:r>
+      </m:oMath>
+      <w:r>
+        <w:t xml:space="preserve"> </w:t>
+      </w:r>
+      <w:r>
+        <w:t xml:space="preserve">of</w:t>
+      </w:r>
+      <w:r>
+        <w:t xml:space="preserve"> </w:t>
+      </w:r>
+      <m:oMath>
+        <m:r>
+          <m:t>A</m:t>
+        </m:r>
+      </m:oMath>
+      <w:r>
+        <w:t xml:space="preserve">.</w:t>
+      </w:r>
+    </w:p>
+    <w:p>
+      <w:pPr>
+        <w:pStyle w:val="Compact"/>
+        <w:numPr>
+          <w:ilvl w:val="0"/>
+          <w:numId w:val="1013"/>
+        </w:numPr>
+      </w:pPr>
+      <w:r>
+        <w:t xml:space="preserve">Write</w:t>
+      </w:r>
+      <w:r>
+        <w:t xml:space="preserve"> </w:t>
+      </w:r>
+      <m:oMath>
+        <m:nary>
+          <m:naryPr>
+            <m:chr m:val="∑"/>
+            <m:limLoc m:val="undOvr"/>
+            <m:subHide m:val="off"/>
+            <m:supHide m:val="on"/>
+          </m:naryPr>
+          <m:sub>
+            <m:r>
+              <m:t>x</m:t>
+            </m:r>
+            <m:r>
+              <m:rPr>
+                <m:sty m:val="p"/>
+              </m:rPr>
+              <m:t>∈</m:t>
+            </m:r>
+            <m:r>
+              <m:t>A</m:t>
+            </m:r>
+          </m:sub>
+          <m:sup>
+            <m:r>
+              <m:t>​</m:t>
+            </m:r>
+          </m:sup>
+          <m:e>
+            <m:r>
+              <m:t>f</m:t>
+            </m:r>
+          </m:e>
+        </m:nary>
+        <m:r>
+          <m:rPr>
+            <m:sty m:val="p"/>
+          </m:rPr>
+          <m:t>(</m:t>
+        </m:r>
+        <m:r>
+          <m:t>x</m:t>
+        </m:r>
+        <m:r>
+          <m:rPr>
+            <m:sty m:val="p"/>
+          </m:rPr>
+          <m:t>)</m:t>
+        </m:r>
+      </m:oMath>
+      <w:r>
+        <w:t xml:space="preserve"> </w:t>
+      </w:r>
+      <w:r>
+        <w:t xml:space="preserve">without the</w:t>
+      </w:r>
+      <w:r>
+        <w:t xml:space="preserve"> </w:t>
+      </w:r>
+      <m:oMath>
+        <m:r>
+          <m:rPr>
+            <m:sty m:val="p"/>
+          </m:rPr>
+          <m:t>∑</m:t>
+        </m:r>
+      </m:oMath>
+      <w:r>
+        <w:t xml:space="preserve"> </w:t>
+      </w:r>
+      <w:r>
+        <w:t xml:space="preserve">symbol,</w:t>
+      </w:r>
+      <w:r>
+        <w:t xml:space="preserve"> </w:t>
+      </w:r>
+      <w:r>
+        <w:t xml:space="preserve">and compute its value.</w:t>
+      </w:r>
+    </w:p>
+    <w:p>
+      <w:pPr>
+        <w:pStyle w:val="Compact"/>
+        <w:numPr>
+          <w:ilvl w:val="0"/>
+          <w:numId w:val="1013"/>
+        </w:numPr>
+      </w:pPr>
+      <w:r>
+        <w:t xml:space="preserve">List the elements of</w:t>
+      </w:r>
+      <w:r>
+        <w:t xml:space="preserve"> </w:t>
+      </w:r>
+      <m:oMath>
+        <m:r>
+          <m:t>A</m:t>
+        </m:r>
+      </m:oMath>
+      <w:r>
+        <w:t xml:space="preserve"> </w:t>
+      </w:r>
+      <w:r>
+        <w:t xml:space="preserve">in a different order,</w:t>
+      </w:r>
+      <w:r>
+        <w:t xml:space="preserve"> </w:t>
+      </w:r>
+      <w:r>
+        <w:t xml:space="preserve">and add up the same terms in that order.</w:t>
+      </w:r>
+      <w:r>
+        <w:t xml:space="preserve"> </w:t>
+      </w:r>
+      <w:r>
+        <w:t xml:space="preserve">Is the total the same?</w:t>
+      </w:r>
+    </w:p>
     <w:bookmarkEnd w:id="65"/>
-    <w:bookmarkStart w:id="77" w:name="quotients"/>
+    <w:bookmarkStart w:id="66" w:name="sol-sum-over-set"/>
+    <w:p>
+      <w:pPr>
+        <w:pStyle w:val="FirstParagraph"/>
+      </w:pPr>
+      <w:r>
+        <w:rPr>
+          <w:i/>
+          <w:iCs/>
+        </w:rPr>
+        <w:t xml:space="preserve">Solution 7</w:t>
+      </w:r>
+      <w:r>
+        <w:t xml:space="preserve">. </w:t>
+      </w:r>
+    </w:p>
+    <w:p>
+      <w:pPr>
+        <w:numPr>
+          <w:ilvl w:val="0"/>
+          <w:numId w:val="1014"/>
+        </w:numPr>
+      </w:pPr>
+      <w:r>
+        <w:t xml:space="preserve">Replace</w:t>
+      </w:r>
+      <w:r>
+        <w:t xml:space="preserve"> </w:t>
+      </w:r>
+      <m:oMath>
+        <m:r>
+          <m:t>x</m:t>
+        </m:r>
+      </m:oMath>
+      <w:r>
+        <w:t xml:space="preserve"> </w:t>
+      </w:r>
+      <w:r>
+        <w:t xml:space="preserve">by each element of</w:t>
+      </w:r>
+      <w:r>
+        <w:t xml:space="preserve"> </w:t>
+      </w:r>
+      <m:oMath>
+        <m:r>
+          <m:t>A</m:t>
+        </m:r>
+      </m:oMath>
+      <w:r>
+        <w:t xml:space="preserve"> </w:t>
+      </w:r>
+      <w:r>
+        <w:t xml:space="preserve">in turn, and add the results:</w:t>
+      </w:r>
+    </w:p>
+    <w:p>
+      <w:pPr>
+        <w:pStyle w:val="BodyText"/>
+      </w:pPr>
+      <m:oMathPara>
+        <m:oMathParaPr>
+          <m:jc m:val="center"/>
+        </m:oMathParaPr>
+        <m:oMath>
+          <m:eqArr>
+            <m:e>
+              <m:nary>
+                <m:naryPr>
+                  <m:chr m:val="∑"/>
+                  <m:limLoc m:val="undOvr"/>
+                  <m:subHide m:val="off"/>
+                  <m:supHide m:val="on"/>
+                </m:naryPr>
+                <m:sub>
+                  <m:r>
+                    <m:t>x</m:t>
+                  </m:r>
+                  <m:r>
+                    <m:rPr>
+                      <m:sty m:val="p"/>
+                    </m:rPr>
+                    <m:t>∈</m:t>
+                  </m:r>
+                  <m:r>
+                    <m:t>A</m:t>
+                  </m:r>
+                </m:sub>
+                <m:sup>
+                  <m:r>
+                    <m:t>​</m:t>
+                  </m:r>
+                </m:sup>
+                <m:e>
+                  <m:r>
+                    <m:t>f</m:t>
+                  </m:r>
+                </m:e>
+              </m:nary>
+              <m:r>
+                <m:rPr>
+                  <m:sty m:val="p"/>
+                </m:rPr>
+                <m:t>(</m:t>
+              </m:r>
+              <m:r>
+                <m:t>x</m:t>
+              </m:r>
+              <m:r>
+                <m:rPr>
+                  <m:sty m:val="p"/>
+                </m:rPr>
+                <m:t>)</m:t>
+              </m:r>
+              <m:r>
+                <m:t>&amp;</m:t>
+              </m:r>
+              <m:r>
+                <m:rPr>
+                  <m:sty m:val="p"/>
+                </m:rPr>
+                <m:t>=</m:t>
+              </m:r>
+              <m:r>
+                <m:t>f</m:t>
+              </m:r>
+              <m:r>
+                <m:rPr>
+                  <m:sty m:val="p"/>
+                </m:rPr>
+                <m:t>(</m:t>
+              </m:r>
+              <m:r>
+                <m:rPr>
+                  <m:sty m:val="p"/>
+                </m:rPr>
+                <m:t>−</m:t>
+              </m:r>
+              <m:r>
+                <m:t>1</m:t>
+              </m:r>
+              <m:r>
+                <m:rPr>
+                  <m:sty m:val="p"/>
+                </m:rPr>
+                <m:t>)</m:t>
+              </m:r>
+              <m:r>
+                <m:rPr>
+                  <m:sty m:val="p"/>
+                </m:rPr>
+                <m:t>+</m:t>
+              </m:r>
+              <m:r>
+                <m:t>f</m:t>
+              </m:r>
+              <m:r>
+                <m:rPr>
+                  <m:sty m:val="p"/>
+                </m:rPr>
+                <m:t>(</m:t>
+              </m:r>
+              <m:r>
+                <m:t>2</m:t>
+              </m:r>
+              <m:r>
+                <m:rPr>
+                  <m:sty m:val="p"/>
+                </m:rPr>
+                <m:t>)</m:t>
+              </m:r>
+              <m:r>
+                <m:rPr>
+                  <m:sty m:val="p"/>
+                </m:rPr>
+                <m:t>+</m:t>
+              </m:r>
+              <m:r>
+                <m:t>f</m:t>
+              </m:r>
+              <m:r>
+                <m:rPr>
+                  <m:sty m:val="p"/>
+                </m:rPr>
+                <m:t>(</m:t>
+              </m:r>
+              <m:r>
+                <m:t>5</m:t>
+              </m:r>
+              <m:r>
+                <m:rPr>
+                  <m:sty m:val="p"/>
+                </m:rPr>
+                <m:t>)</m:t>
+              </m:r>
+            </m:e>
+            <m:e>
+              <m:r>
+                <m:t>&amp;</m:t>
+              </m:r>
+              <m:r>
+                <m:rPr>
+                  <m:sty m:val="p"/>
+                </m:rPr>
+                <m:t>=</m:t>
+              </m:r>
+              <m:r>
+                <m:rPr>
+                  <m:sty m:val="p"/>
+                </m:rPr>
+                <m:t>(</m:t>
+              </m:r>
+              <m:r>
+                <m:rPr>
+                  <m:sty m:val="p"/>
+                </m:rPr>
+                <m:t>−</m:t>
+              </m:r>
+              <m:r>
+                <m:t>1</m:t>
+              </m:r>
+              <m:sSup>
+                <m:e>
+                  <m:r>
+                    <m:rPr>
+                      <m:sty m:val="p"/>
+                    </m:rPr>
+                    <m:t>)</m:t>
+                  </m:r>
+                </m:e>
+                <m:sup>
+                  <m:r>
+                    <m:t>2</m:t>
+                  </m:r>
+                </m:sup>
+              </m:sSup>
+              <m:r>
+                <m:rPr>
+                  <m:sty m:val="p"/>
+                </m:rPr>
+                <m:t>+</m:t>
+              </m:r>
+              <m:sSup>
+                <m:e>
+                  <m:r>
+                    <m:t>2</m:t>
+                  </m:r>
+                </m:e>
+                <m:sup>
+                  <m:r>
+                    <m:t>2</m:t>
+                  </m:r>
+                </m:sup>
+              </m:sSup>
+              <m:r>
+                <m:rPr>
+                  <m:sty m:val="p"/>
+                </m:rPr>
+                <m:t>+</m:t>
+              </m:r>
+              <m:sSup>
+                <m:e>
+                  <m:r>
+                    <m:t>5</m:t>
+                  </m:r>
+                </m:e>
+                <m:sup>
+                  <m:r>
+                    <m:t>2</m:t>
+                  </m:r>
+                </m:sup>
+              </m:sSup>
+            </m:e>
+            <m:e>
+              <m:r>
+                <m:t>&amp;</m:t>
+              </m:r>
+              <m:r>
+                <m:rPr>
+                  <m:sty m:val="p"/>
+                </m:rPr>
+                <m:t>=</m:t>
+              </m:r>
+              <m:r>
+                <m:t>1</m:t>
+              </m:r>
+              <m:r>
+                <m:rPr>
+                  <m:sty m:val="p"/>
+                </m:rPr>
+                <m:t>+</m:t>
+              </m:r>
+              <m:r>
+                <m:t>4</m:t>
+              </m:r>
+              <m:r>
+                <m:rPr>
+                  <m:sty m:val="p"/>
+                </m:rPr>
+                <m:t>+</m:t>
+              </m:r>
+              <m:r>
+                <m:t>25</m:t>
+              </m:r>
+            </m:e>
+            <m:e>
+              <m:r>
+                <m:t>&amp;</m:t>
+              </m:r>
+              <m:r>
+                <m:rPr>
+                  <m:sty m:val="p"/>
+                </m:rPr>
+                <m:t>=</m:t>
+              </m:r>
+              <m:r>
+                <m:t>30</m:t>
+              </m:r>
+            </m:e>
+          </m:eqArr>
+        </m:oMath>
+      </m:oMathPara>
+    </w:p>
+    <w:p>
+      <w:pPr>
+        <w:numPr>
+          <w:ilvl w:val="0"/>
+          <w:numId w:val="1014"/>
+        </w:numPr>
+      </w:pPr>
+      <w:r>
+        <w:t xml:space="preserve">In the order</w:t>
+      </w:r>
+      <w:r>
+        <w:t xml:space="preserve"> </w:t>
+      </w:r>
+      <m:oMath>
+        <m:r>
+          <m:t>5</m:t>
+        </m:r>
+        <m:r>
+          <m:rPr>
+            <m:sty m:val="p"/>
+          </m:rPr>
+          <m:t>,</m:t>
+        </m:r>
+        <m:r>
+          <m:rPr>
+            <m:sty m:val="p"/>
+          </m:rPr>
+          <m:t>−</m:t>
+        </m:r>
+        <m:r>
+          <m:t>1</m:t>
+        </m:r>
+        <m:r>
+          <m:rPr>
+            <m:sty m:val="p"/>
+          </m:rPr>
+          <m:t>,</m:t>
+        </m:r>
+        <m:r>
+          <m:t>2</m:t>
+        </m:r>
+      </m:oMath>
+      <w:r>
+        <w:t xml:space="preserve">, the terms are</w:t>
+      </w:r>
+      <w:r>
+        <w:t xml:space="preserve"> </w:t>
+      </w:r>
+      <m:oMath>
+        <m:r>
+          <m:t>25</m:t>
+        </m:r>
+      </m:oMath>
+      <w:r>
+        <w:t xml:space="preserve">,</w:t>
+      </w:r>
+      <w:r>
+        <w:t xml:space="preserve"> </w:t>
+      </w:r>
+      <m:oMath>
+        <m:r>
+          <m:t>1</m:t>
+        </m:r>
+      </m:oMath>
+      <w:r>
+        <w:t xml:space="preserve"> </w:t>
+      </w:r>
+      <w:r>
+        <w:t xml:space="preserve">and</w:t>
+      </w:r>
+      <w:r>
+        <w:t xml:space="preserve"> </w:t>
+      </w:r>
+      <m:oMath>
+        <m:r>
+          <m:t>4</m:t>
+        </m:r>
+      </m:oMath>
+      <w:r>
+        <w:t xml:space="preserve">.</w:t>
+      </w:r>
+      <w:r>
+        <w:t xml:space="preserve"> </w:t>
+      </w:r>
+      <w:r>
+        <w:t xml:space="preserve">Their total is</w:t>
+      </w:r>
+      <w:r>
+        <w:t xml:space="preserve"> </w:t>
+      </w:r>
+      <m:oMath>
+        <m:r>
+          <m:t>25</m:t>
+        </m:r>
+        <m:r>
+          <m:rPr>
+            <m:sty m:val="p"/>
+          </m:rPr>
+          <m:t>+</m:t>
+        </m:r>
+        <m:r>
+          <m:t>1</m:t>
+        </m:r>
+        <m:r>
+          <m:rPr>
+            <m:sty m:val="p"/>
+          </m:rPr>
+          <m:t>+</m:t>
+        </m:r>
+        <m:r>
+          <m:t>4</m:t>
+        </m:r>
+        <m:r>
+          <m:rPr>
+            <m:sty m:val="p"/>
+          </m:rPr>
+          <m:t>=</m:t>
+        </m:r>
+        <m:r>
+          <m:t>30</m:t>
+        </m:r>
+      </m:oMath>
+      <w:r>
+        <w:t xml:space="preserve">.</w:t>
+      </w:r>
+      <w:r>
+        <w:t xml:space="preserve"> </w:t>
+      </w:r>
+      <w:r>
+        <w:t xml:space="preserve">The total is the same,</w:t>
+      </w:r>
+      <w:r>
+        <w:t xml:space="preserve"> </w:t>
+      </w:r>
+      <w:r>
+        <w:t xml:space="preserve">because addition does not depend on the order of the terms.</w:t>
+      </w:r>
+    </w:p>
+    <w:bookmarkEnd w:id="66"/>
+    <w:bookmarkStart w:id="68" w:name="def-sum-over-set"/>
+    <w:p>
+      <w:pPr>
+        <w:pStyle w:val="FirstParagraph"/>
+      </w:pPr>
+      <w:r>
+        <w:rPr>
+          <w:b/>
+          <w:bCs/>
+        </w:rPr>
+        <w:t xml:space="preserve">Definition 11 (Sum over a finite set)</w:t>
+      </w:r>
+      <w:r>
+        <w:t xml:space="preserve"> </w:t>
+      </w:r>
+      <w:r>
+        <w:t xml:space="preserve">Let</w:t>
+      </w:r>
+      <w:r>
+        <w:t xml:space="preserve"> </w:t>
+      </w:r>
+      <m:oMath>
+        <m:r>
+          <m:t>A</m:t>
+        </m:r>
+        <m:r>
+          <m:rPr>
+            <m:sty m:val="p"/>
+          </m:rPr>
+          <m:t>=</m:t>
+        </m:r>
+        <m:r>
+          <m:t>​</m:t>
+        </m:r>
+        <m:d>
+          <m:dPr>
+            <m:begChr m:val="{"/>
+            <m:sepChr m:val=""/>
+            <m:endChr m:val="}"/>
+            <m:grow/>
+          </m:dPr>
+          <m:e>
+            <m:sSub>
+              <m:e>
+                <m:r>
+                  <m:t>x</m:t>
+                </m:r>
+              </m:e>
+              <m:sub>
+                <m:r>
+                  <m:t>1</m:t>
+                </m:r>
+              </m:sub>
+            </m:sSub>
+            <m:r>
+              <m:rPr>
+                <m:sty m:val="p"/>
+              </m:rPr>
+              <m:t>,</m:t>
+            </m:r>
+            <m:sSub>
+              <m:e>
+                <m:r>
+                  <m:t>x</m:t>
+                </m:r>
+              </m:e>
+              <m:sub>
+                <m:r>
+                  <m:t>2</m:t>
+                </m:r>
+              </m:sub>
+            </m:sSub>
+            <m:r>
+              <m:rPr>
+                <m:sty m:val="p"/>
+              </m:rPr>
+              <m:t>,</m:t>
+            </m:r>
+            <m:r>
+              <m:rPr>
+                <m:sty m:val="p"/>
+              </m:rPr>
+              <m:t>…</m:t>
+            </m:r>
+            <m:r>
+              <m:rPr>
+                <m:sty m:val="p"/>
+              </m:rPr>
+              <m:t>,</m:t>
+            </m:r>
+            <m:sSub>
+              <m:e>
+                <m:r>
+                  <m:t>x</m:t>
+                </m:r>
+              </m:e>
+              <m:sub>
+                <m:r>
+                  <m:t>k</m:t>
+                </m:r>
+              </m:sub>
+            </m:sSub>
+          </m:e>
+        </m:d>
+        <m:r>
+          <m:t>​</m:t>
+        </m:r>
+      </m:oMath>
+      <w:r>
+        <w:t xml:space="preserve"> </w:t>
+      </w:r>
+      <w:r>
+        <w:t xml:space="preserve">be a finite</w:t>
+      </w:r>
+      <w:r>
+        <w:t xml:space="preserve"> </w:t>
+      </w:r>
+      <w:hyperlink r:id="rId67">
+        <w:r>
+          <w:rPr>
+            <w:rStyle w:val="Hyperlink"/>
+          </w:rPr>
+          <w:t xml:space="preserve">set</w:t>
+        </w:r>
+      </w:hyperlink>
+      <w:r>
+        <w:t xml:space="preserve"> </w:t>
+      </w:r>
+      <w:r>
+        <w:t xml:space="preserve">with</w:t>
+      </w:r>
+      <w:r>
+        <w:t xml:space="preserve"> </w:t>
+      </w:r>
+      <m:oMath>
+        <m:r>
+          <m:t>k</m:t>
+        </m:r>
+        <m:r>
+          <m:rPr>
+            <m:sty m:val="p"/>
+          </m:rPr>
+          <m:t>≥</m:t>
+        </m:r>
+        <m:r>
+          <m:t>1</m:t>
+        </m:r>
+      </m:oMath>
+      <w:r>
+        <w:t xml:space="preserve"> </w:t>
+      </w:r>
+      <w:r>
+        <w:t xml:space="preserve">different elements.</w:t>
+      </w:r>
+      <w:r>
+        <w:t xml:space="preserve"> </w:t>
+      </w:r>
+      <w:r>
+        <w:t xml:space="preserve">Let</w:t>
+      </w:r>
+      <w:r>
+        <w:t xml:space="preserve"> </w:t>
+      </w:r>
+      <m:oMath>
+        <m:r>
+          <m:t>f</m:t>
+        </m:r>
+      </m:oMath>
+      <w:r>
+        <w:t xml:space="preserve"> </w:t>
+      </w:r>
+      <w:r>
+        <w:t xml:space="preserve">be a</w:t>
+      </w:r>
+      <w:r>
+        <w:t xml:space="preserve"> </w:t>
+      </w:r>
+      <w:hyperlink r:id="rId22">
+        <w:r>
+          <w:rPr>
+            <w:rStyle w:val="Hyperlink"/>
+          </w:rPr>
+          <w:t xml:space="preserve">function</w:t>
+        </w:r>
+      </w:hyperlink>
+      <w:r>
+        <w:t xml:space="preserve"> </w:t>
+      </w:r>
+      <w:r>
+        <w:t xml:space="preserve">that gives a number</w:t>
+      </w:r>
+      <w:r>
+        <w:t xml:space="preserve"> </w:t>
+      </w:r>
+      <m:oMath>
+        <m:r>
+          <m:t>f</m:t>
+        </m:r>
+        <m:r>
+          <m:rPr>
+            <m:sty m:val="p"/>
+          </m:rPr>
+          <m:t>(</m:t>
+        </m:r>
+        <m:r>
+          <m:t>x</m:t>
+        </m:r>
+        <m:r>
+          <m:rPr>
+            <m:sty m:val="p"/>
+          </m:rPr>
+          <m:t>)</m:t>
+        </m:r>
+      </m:oMath>
+      <w:r>
+        <w:t xml:space="preserve"> </w:t>
+      </w:r>
+      <w:r>
+        <w:t xml:space="preserve">for each element</w:t>
+      </w:r>
+      <w:r>
+        <w:t xml:space="preserve"> </w:t>
+      </w:r>
+      <m:oMath>
+        <m:r>
+          <m:t>x</m:t>
+        </m:r>
+      </m:oMath>
+      <w:r>
+        <w:t xml:space="preserve"> </w:t>
+      </w:r>
+      <w:r>
+        <w:t xml:space="preserve">of</w:t>
+      </w:r>
+      <w:r>
+        <w:t xml:space="preserve"> </w:t>
+      </w:r>
+      <m:oMath>
+        <m:r>
+          <m:t>A</m:t>
+        </m:r>
+      </m:oMath>
+      <w:r>
+        <w:t xml:space="preserve">.</w:t>
+      </w:r>
+      <w:r>
+        <w:t xml:space="preserve"> </w:t>
+      </w:r>
+      <w:r>
+        <w:t xml:space="preserve">The</w:t>
+      </w:r>
+      <w:r>
+        <w:t xml:space="preserve"> </w:t>
+      </w:r>
+      <w:r>
+        <w:rPr>
+          <w:b/>
+          <w:bCs/>
+        </w:rPr>
+        <w:t xml:space="preserve">sum of</w:t>
+      </w:r>
+      <w:r>
+        <w:rPr>
+          <w:b/>
+          <w:bCs/>
+        </w:rPr>
+        <w:t xml:space="preserve"> </w:t>
+      </w:r>
+      <m:oMath>
+        <m:r>
+          <m:t>f</m:t>
+        </m:r>
+      </m:oMath>
+      <w:r>
+        <w:rPr>
+          <w:b/>
+          <w:bCs/>
+        </w:rPr>
+        <w:t xml:space="preserve"> </w:t>
+      </w:r>
+      <w:r>
+        <w:rPr>
+          <w:b/>
+          <w:bCs/>
+        </w:rPr>
+        <w:t xml:space="preserve">over</w:t>
+      </w:r>
+      <w:r>
+        <w:rPr>
+          <w:b/>
+          <w:bCs/>
+        </w:rPr>
+        <w:t xml:space="preserve"> </w:t>
+      </w:r>
+      <m:oMath>
+        <m:r>
+          <m:t>A</m:t>
+        </m:r>
+      </m:oMath>
+      <w:r>
+        <w:t xml:space="preserve"> </w:t>
+      </w:r>
+      <w:r>
+        <w:t xml:space="preserve">is</w:t>
+      </w:r>
+    </w:p>
+    <w:p>
+      <w:pPr>
+        <w:pStyle w:val="BodyText"/>
+      </w:pPr>
+      <m:oMathPara>
+        <m:oMathParaPr>
+          <m:jc m:val="center"/>
+        </m:oMathParaPr>
+        <m:oMath>
+          <m:nary>
+            <m:naryPr>
+              <m:chr m:val="∑"/>
+              <m:limLoc m:val="undOvr"/>
+              <m:subHide m:val="off"/>
+              <m:supHide m:val="on"/>
+            </m:naryPr>
+            <m:sub>
+              <m:r>
+                <m:t>x</m:t>
+              </m:r>
+              <m:r>
+                <m:rPr>
+                  <m:sty m:val="p"/>
+                </m:rPr>
+                <m:t>∈</m:t>
+              </m:r>
+              <m:r>
+                <m:t>A</m:t>
+              </m:r>
+            </m:sub>
+            <m:sup>
+              <m:r>
+                <m:t>​</m:t>
+              </m:r>
+            </m:sup>
+            <m:e>
+              <m:r>
+                <m:t>f</m:t>
+              </m:r>
+            </m:e>
+          </m:nary>
+          <m:r>
+            <m:rPr>
+              <m:sty m:val="p"/>
+            </m:rPr>
+            <m:t>(</m:t>
+          </m:r>
+          <m:r>
+            <m:t>x</m:t>
+          </m:r>
+          <m:r>
+            <m:rPr>
+              <m:sty m:val="p"/>
+            </m:rPr>
+            <m:t>)</m:t>
+          </m:r>
+          <m:limUpp>
+            <m:e>
+              <m:r>
+                <m:rPr>
+                  <m:sty m:val="p"/>
+                </m:rPr>
+                <m:t>=</m:t>
+              </m:r>
+            </m:e>
+            <m:lim>
+              <m:r>
+                <m:rPr>
+                  <m:nor/>
+                  <m:sty m:val="p"/>
+                </m:rPr>
+                <m:t>def</m:t>
+              </m:r>
+            </m:lim>
+          </m:limUpp>
+          <m:r>
+            <m:t>f</m:t>
+          </m:r>
+          <m:r>
+            <m:rPr>
+              <m:sty m:val="p"/>
+            </m:rPr>
+            <m:t>(</m:t>
+          </m:r>
+          <m:sSub>
+            <m:e>
+              <m:r>
+                <m:t>x</m:t>
+              </m:r>
+            </m:e>
+            <m:sub>
+              <m:r>
+                <m:t>1</m:t>
+              </m:r>
+            </m:sub>
+          </m:sSub>
+          <m:r>
+            <m:rPr>
+              <m:sty m:val="p"/>
+            </m:rPr>
+            <m:t>)</m:t>
+          </m:r>
+          <m:r>
+            <m:rPr>
+              <m:sty m:val="p"/>
+            </m:rPr>
+            <m:t>+</m:t>
+          </m:r>
+          <m:r>
+            <m:t>f</m:t>
+          </m:r>
+          <m:r>
+            <m:rPr>
+              <m:sty m:val="p"/>
+            </m:rPr>
+            <m:t>(</m:t>
+          </m:r>
+          <m:sSub>
+            <m:e>
+              <m:r>
+                <m:t>x</m:t>
+              </m:r>
+            </m:e>
+            <m:sub>
+              <m:r>
+                <m:t>2</m:t>
+              </m:r>
+            </m:sub>
+          </m:sSub>
+          <m:r>
+            <m:rPr>
+              <m:sty m:val="p"/>
+            </m:rPr>
+            <m:t>)</m:t>
+          </m:r>
+          <m:r>
+            <m:rPr>
+              <m:sty m:val="p"/>
+            </m:rPr>
+            <m:t>+</m:t>
+          </m:r>
+          <m:r>
+            <m:rPr>
+              <m:sty m:val="p"/>
+            </m:rPr>
+            <m:t>⋯</m:t>
+          </m:r>
+          <m:r>
+            <m:rPr>
+              <m:sty m:val="p"/>
+            </m:rPr>
+            <m:t>+</m:t>
+          </m:r>
+          <m:r>
+            <m:t>f</m:t>
+          </m:r>
+          <m:r>
+            <m:rPr>
+              <m:sty m:val="p"/>
+            </m:rPr>
+            <m:t>(</m:t>
+          </m:r>
+          <m:sSub>
+            <m:e>
+              <m:r>
+                <m:t>x</m:t>
+              </m:r>
+            </m:e>
+            <m:sub>
+              <m:r>
+                <m:t>k</m:t>
+              </m:r>
+            </m:sub>
+          </m:sSub>
+          <m:r>
+            <m:rPr>
+              <m:sty m:val="p"/>
+            </m:rPr>
+            <m:t>)</m:t>
+          </m:r>
+        </m:oMath>
+      </m:oMathPara>
+    </w:p>
+    <w:p>
+      <w:pPr>
+        <w:pStyle w:val="FirstParagraph"/>
+      </w:pPr>
+      <w:r>
+        <w:t xml:space="preserve">If</w:t>
+      </w:r>
+      <w:r>
+        <w:t xml:space="preserve"> </w:t>
+      </w:r>
+      <m:oMath>
+        <m:r>
+          <m:t>A</m:t>
+        </m:r>
+      </m:oMath>
+      <w:r>
+        <w:t xml:space="preserve"> </w:t>
+      </w:r>
+      <w:r>
+        <w:t xml:space="preserve">has no elements, the sum has no terms,</w:t>
+      </w:r>
+      <w:r>
+        <w:t xml:space="preserve"> </w:t>
+      </w:r>
+      <w:r>
+        <w:t xml:space="preserve">and by convention it equals</w:t>
+      </w:r>
+      <w:r>
+        <w:t xml:space="preserve"> </w:t>
+      </w:r>
+      <m:oMath>
+        <m:r>
+          <m:t>0</m:t>
+        </m:r>
+      </m:oMath>
+      <w:r>
+        <w:t xml:space="preserve">.</w:t>
+      </w:r>
+      <w:r>
+        <w:t xml:space="preserve"> </w:t>
+      </w:r>
+      <w:r>
+        <w:t xml:space="preserve">For example,</w:t>
+      </w:r>
+      <w:r>
+        <w:t xml:space="preserve"> </w:t>
+      </w:r>
+      <m:oMath>
+        <m:nary>
+          <m:naryPr>
+            <m:chr m:val="∑"/>
+            <m:limLoc m:val="undOvr"/>
+            <m:subHide m:val="off"/>
+            <m:supHide m:val="on"/>
+          </m:naryPr>
+          <m:sub>
+            <m:r>
+              <m:t>x</m:t>
+            </m:r>
+            <m:r>
+              <m:rPr>
+                <m:sty m:val="p"/>
+              </m:rPr>
+              <m:t>∈</m:t>
+            </m:r>
+            <m:r>
+              <m:t>​</m:t>
+            </m:r>
+            <m:d>
+              <m:dPr>
+                <m:begChr m:val="{"/>
+                <m:sepChr m:val=""/>
+                <m:endChr m:val="}"/>
+                <m:grow/>
+              </m:dPr>
+              <m:e/>
+            </m:d>
+            <m:r>
+              <m:t>​</m:t>
+            </m:r>
+          </m:sub>
+          <m:sup>
+            <m:r>
+              <m:t>​</m:t>
+            </m:r>
+          </m:sup>
+          <m:e>
+            <m:sSup>
+              <m:e>
+                <m:r>
+                  <m:t>x</m:t>
+                </m:r>
+              </m:e>
+              <m:sup>
+                <m:r>
+                  <m:t>2</m:t>
+                </m:r>
+              </m:sup>
+            </m:sSup>
+          </m:e>
+        </m:nary>
+        <m:r>
+          <m:rPr>
+            <m:sty m:val="p"/>
+          </m:rPr>
+          <m:t>=</m:t>
+        </m:r>
+        <m:r>
+          <m:t>0</m:t>
+        </m:r>
+      </m:oMath>
+      <w:r>
+        <w:t xml:space="preserve">.</w:t>
+      </w:r>
+    </w:p>
+    <w:bookmarkEnd w:id="68"/>
+    <w:bookmarkStart w:id="69" w:name="rem-sum-over-set-order"/>
+    <w:p>
+      <w:pPr>
+        <w:pStyle w:val="BodyText"/>
+      </w:pPr>
+      <w:r>
+        <w:rPr>
+          <w:i/>
+          <w:iCs/>
+        </w:rPr>
+        <w:t xml:space="preserve">Remark 1</w:t>
+      </w:r>
+      <w:r>
+        <w:t xml:space="preserve"> (The order of the terms does not matter). </w:t>
+      </w:r>
+      <w:r>
+        <w:t xml:space="preserve">The order in which we list the elements of</w:t>
+      </w:r>
+      <w:r>
+        <w:t xml:space="preserve"> </w:t>
+      </w:r>
+      <m:oMath>
+        <m:r>
+          <m:t>A</m:t>
+        </m:r>
+      </m:oMath>
+      <w:r>
+        <w:t xml:space="preserve"> </w:t>
+      </w:r>
+      <w:r>
+        <w:t xml:space="preserve">does not change the sum.</w:t>
+      </w:r>
+      <w:r>
+        <w:t xml:space="preserve"> </w:t>
+      </w:r>
+      <w:r>
+        <w:t xml:space="preserve">The reason is that addition is commutative and associative:</w:t>
+      </w:r>
+      <w:r>
+        <w:t xml:space="preserve"> </w:t>
+      </w:r>
+      <w:r>
+        <w:t xml:space="preserve">we can reorder and regroup the terms of a finite sum</w:t>
+      </w:r>
+      <w:r>
+        <w:t xml:space="preserve"> </w:t>
+      </w:r>
+      <w:r>
+        <w:t xml:space="preserve">without changing the total.</w:t>
+      </w:r>
+      <w:r>
+        <w:t xml:space="preserve"> </w:t>
+      </w:r>
+      <w:r>
+        <w:t xml:space="preserve">For example, if</w:t>
+      </w:r>
+      <w:r>
+        <w:t xml:space="preserve"> </w:t>
+      </w:r>
+      <m:oMath>
+        <m:r>
+          <m:t>A</m:t>
+        </m:r>
+        <m:r>
+          <m:rPr>
+            <m:sty m:val="p"/>
+          </m:rPr>
+          <m:t>=</m:t>
+        </m:r>
+        <m:r>
+          <m:t>​</m:t>
+        </m:r>
+        <m:d>
+          <m:dPr>
+            <m:begChr m:val="{"/>
+            <m:sepChr m:val=""/>
+            <m:endChr m:val="}"/>
+            <m:grow/>
+          </m:dPr>
+          <m:e>
+            <m:r>
+              <m:t>1</m:t>
+            </m:r>
+            <m:r>
+              <m:rPr>
+                <m:sty m:val="p"/>
+              </m:rPr>
+              <m:t>,</m:t>
+            </m:r>
+            <m:r>
+              <m:t>2</m:t>
+            </m:r>
+            <m:r>
+              <m:rPr>
+                <m:sty m:val="p"/>
+              </m:rPr>
+              <m:t>,</m:t>
+            </m:r>
+            <m:r>
+              <m:t>3</m:t>
+            </m:r>
+          </m:e>
+        </m:d>
+        <m:r>
+          <m:t>​</m:t>
+        </m:r>
+      </m:oMath>
+      <w:r>
+        <w:t xml:space="preserve"> </w:t>
+      </w:r>
+      <w:r>
+        <w:t xml:space="preserve">and</w:t>
+      </w:r>
+      <w:r>
+        <w:t xml:space="preserve"> </w:t>
+      </w:r>
+      <m:oMath>
+        <m:r>
+          <m:t>f</m:t>
+        </m:r>
+        <m:r>
+          <m:rPr>
+            <m:sty m:val="p"/>
+          </m:rPr>
+          <m:t>(</m:t>
+        </m:r>
+        <m:r>
+          <m:t>x</m:t>
+        </m:r>
+        <m:r>
+          <m:rPr>
+            <m:sty m:val="p"/>
+          </m:rPr>
+          <m:t>)</m:t>
+        </m:r>
+        <m:r>
+          <m:rPr>
+            <m:sty m:val="p"/>
+          </m:rPr>
+          <m:t>=</m:t>
+        </m:r>
+        <m:sSup>
+          <m:e>
+            <m:r>
+              <m:t>x</m:t>
+            </m:r>
+          </m:e>
+          <m:sup>
+            <m:r>
+              <m:t>2</m:t>
+            </m:r>
+          </m:sup>
+        </m:sSup>
+      </m:oMath>
+      <w:r>
+        <w:t xml:space="preserve">,</w:t>
+      </w:r>
+      <w:r>
+        <w:t xml:space="preserve"> </w:t>
+      </w:r>
+      <w:r>
+        <w:t xml:space="preserve">listing</w:t>
+      </w:r>
+      <w:r>
+        <w:t xml:space="preserve"> </w:t>
+      </w:r>
+      <m:oMath>
+        <m:r>
+          <m:t>A</m:t>
+        </m:r>
+      </m:oMath>
+      <w:r>
+        <w:t xml:space="preserve"> </w:t>
+      </w:r>
+      <w:r>
+        <w:t xml:space="preserve">as</w:t>
+      </w:r>
+      <w:r>
+        <w:t xml:space="preserve"> </w:t>
+      </w:r>
+      <m:oMath>
+        <m:r>
+          <m:t>1</m:t>
+        </m:r>
+        <m:r>
+          <m:rPr>
+            <m:sty m:val="p"/>
+          </m:rPr>
+          <m:t>,</m:t>
+        </m:r>
+        <m:r>
+          <m:t>2</m:t>
+        </m:r>
+        <m:r>
+          <m:rPr>
+            <m:sty m:val="p"/>
+          </m:rPr>
+          <m:t>,</m:t>
+        </m:r>
+        <m:r>
+          <m:t>3</m:t>
+        </m:r>
+      </m:oMath>
+      <w:r>
+        <w:t xml:space="preserve"> </w:t>
+      </w:r>
+      <w:r>
+        <w:t xml:space="preserve">gives</w:t>
+      </w:r>
+      <w:r>
+        <w:t xml:space="preserve"> </w:t>
+      </w:r>
+      <m:oMath>
+        <m:r>
+          <m:t>1</m:t>
+        </m:r>
+        <m:r>
+          <m:rPr>
+            <m:sty m:val="p"/>
+          </m:rPr>
+          <m:t>+</m:t>
+        </m:r>
+        <m:r>
+          <m:t>4</m:t>
+        </m:r>
+        <m:r>
+          <m:rPr>
+            <m:sty m:val="p"/>
+          </m:rPr>
+          <m:t>+</m:t>
+        </m:r>
+        <m:r>
+          <m:t>9</m:t>
+        </m:r>
+        <m:r>
+          <m:rPr>
+            <m:sty m:val="p"/>
+          </m:rPr>
+          <m:t>=</m:t>
+        </m:r>
+        <m:r>
+          <m:t>14</m:t>
+        </m:r>
+      </m:oMath>
+      <w:r>
+        <w:t xml:space="preserve">,</w:t>
+      </w:r>
+      <w:r>
+        <w:t xml:space="preserve"> </w:t>
+      </w:r>
+      <w:r>
+        <w:t xml:space="preserve">and listing</w:t>
+      </w:r>
+      <w:r>
+        <w:t xml:space="preserve"> </w:t>
+      </w:r>
+      <m:oMath>
+        <m:r>
+          <m:t>A</m:t>
+        </m:r>
+      </m:oMath>
+      <w:r>
+        <w:t xml:space="preserve"> </w:t>
+      </w:r>
+      <w:r>
+        <w:t xml:space="preserve">as</w:t>
+      </w:r>
+      <w:r>
+        <w:t xml:space="preserve"> </w:t>
+      </w:r>
+      <m:oMath>
+        <m:r>
+          <m:t>3</m:t>
+        </m:r>
+        <m:r>
+          <m:rPr>
+            <m:sty m:val="p"/>
+          </m:rPr>
+          <m:t>,</m:t>
+        </m:r>
+        <m:r>
+          <m:t>1</m:t>
+        </m:r>
+        <m:r>
+          <m:rPr>
+            <m:sty m:val="p"/>
+          </m:rPr>
+          <m:t>,</m:t>
+        </m:r>
+        <m:r>
+          <m:t>2</m:t>
+        </m:r>
+      </m:oMath>
+      <w:r>
+        <w:t xml:space="preserve"> </w:t>
+      </w:r>
+      <w:r>
+        <w:t xml:space="preserve">gives</w:t>
+      </w:r>
+      <w:r>
+        <w:t xml:space="preserve"> </w:t>
+      </w:r>
+      <m:oMath>
+        <m:r>
+          <m:t>9</m:t>
+        </m:r>
+        <m:r>
+          <m:rPr>
+            <m:sty m:val="p"/>
+          </m:rPr>
+          <m:t>+</m:t>
+        </m:r>
+        <m:r>
+          <m:t>1</m:t>
+        </m:r>
+        <m:r>
+          <m:rPr>
+            <m:sty m:val="p"/>
+          </m:rPr>
+          <m:t>+</m:t>
+        </m:r>
+        <m:r>
+          <m:t>4</m:t>
+        </m:r>
+        <m:r>
+          <m:rPr>
+            <m:sty m:val="p"/>
+          </m:rPr>
+          <m:t>=</m:t>
+        </m:r>
+        <m:r>
+          <m:t>14</m:t>
+        </m:r>
+      </m:oMath>
+      <w:r>
+        <w:t xml:space="preserve">.</w:t>
+      </w:r>
+      <w:r>
+        <w:t xml:space="preserve"> </w:t>
+      </w:r>
+      <w:hyperlink w:anchor="exr-sum-over-set">
+        <w:r>
+          <w:rPr>
+            <w:rStyle w:val="Hyperlink"/>
+          </w:rPr>
+          <w:t xml:space="preserve">Exercise 7</w:t>
+        </w:r>
+      </w:hyperlink>
+      <w:r>
+        <w:t xml:space="preserve">, part 2, shows another example.</w:t>
+      </w:r>
+    </w:p>
+    <w:p>
+      <w:pPr>
+        <w:pStyle w:val="BodyText"/>
+      </w:pPr>
+      <w:r>
+        <w:t xml:space="preserve">When</w:t>
+      </w:r>
+      <w:r>
+        <w:t xml:space="preserve"> </w:t>
+      </w:r>
+      <m:oMath>
+        <m:r>
+          <m:t>A</m:t>
+        </m:r>
+        <m:r>
+          <m:rPr>
+            <m:sty m:val="p"/>
+          </m:rPr>
+          <m:t>=</m:t>
+        </m:r>
+        <m:r>
+          <m:t>​</m:t>
+        </m:r>
+        <m:d>
+          <m:dPr>
+            <m:begChr m:val="{"/>
+            <m:sepChr m:val=""/>
+            <m:endChr m:val="}"/>
+            <m:grow/>
+          </m:dPr>
+          <m:e>
+            <m:r>
+              <m:t>m</m:t>
+            </m:r>
+            <m:r>
+              <m:rPr>
+                <m:sty m:val="p"/>
+              </m:rPr>
+              <m:t>,</m:t>
+            </m:r>
+            <m:r>
+              <m:t>m</m:t>
+            </m:r>
+            <m:r>
+              <m:rPr>
+                <m:sty m:val="p"/>
+              </m:rPr>
+              <m:t>+</m:t>
+            </m:r>
+            <m:r>
+              <m:t>1</m:t>
+            </m:r>
+            <m:r>
+              <m:rPr>
+                <m:sty m:val="p"/>
+              </m:rPr>
+              <m:t>,</m:t>
+            </m:r>
+            <m:r>
+              <m:rPr>
+                <m:sty m:val="p"/>
+              </m:rPr>
+              <m:t>…</m:t>
+            </m:r>
+            <m:r>
+              <m:rPr>
+                <m:sty m:val="p"/>
+              </m:rPr>
+              <m:t>,</m:t>
+            </m:r>
+            <m:r>
+              <m:t>n</m:t>
+            </m:r>
+          </m:e>
+        </m:d>
+        <m:r>
+          <m:t>​</m:t>
+        </m:r>
+      </m:oMath>
+      <w:r>
+        <w:t xml:space="preserve">,</w:t>
+      </w:r>
+      <w:r>
+        <w:t xml:space="preserve"> </w:t>
+      </w:r>
+      <w:r>
+        <w:t xml:space="preserve">this sum is the same as</w:t>
+      </w:r>
+      <w:r>
+        <w:t xml:space="preserve"> </w:t>
+      </w:r>
+      <m:oMath>
+        <m:nary>
+          <m:naryPr>
+            <m:chr m:val="∑"/>
+            <m:limLoc m:val="undOvr"/>
+            <m:subHide m:val="off"/>
+            <m:supHide m:val="off"/>
+          </m:naryPr>
+          <m:sub>
+            <m:r>
+              <m:t>i</m:t>
+            </m:r>
+            <m:r>
+              <m:rPr>
+                <m:sty m:val="p"/>
+              </m:rPr>
+              <m:t>=</m:t>
+            </m:r>
+            <m:r>
+              <m:t>m</m:t>
+            </m:r>
+          </m:sub>
+          <m:sup>
+            <m:r>
+              <m:t>n</m:t>
+            </m:r>
+          </m:sup>
+          <m:e>
+            <m:r>
+              <m:t>f</m:t>
+            </m:r>
+          </m:e>
+        </m:nary>
+        <m:r>
+          <m:rPr>
+            <m:sty m:val="p"/>
+          </m:rPr>
+          <m:t>(</m:t>
+        </m:r>
+        <m:r>
+          <m:t>i</m:t>
+        </m:r>
+        <m:r>
+          <m:rPr>
+            <m:sty m:val="p"/>
+          </m:rPr>
+          <m:t>)</m:t>
+        </m:r>
+      </m:oMath>
+      <w:r>
+        <w:t xml:space="preserve"> </w:t>
+      </w:r>
+      <w:r>
+        <w:t xml:space="preserve">from</w:t>
+      </w:r>
+      <w:r>
+        <w:t xml:space="preserve"> </w:t>
+      </w:r>
+      <w:hyperlink w:anchor="def-summation">
+        <w:r>
+          <w:rPr>
+            <w:rStyle w:val="Hyperlink"/>
+          </w:rPr>
+          <w:t xml:space="preserve">Definition 10</w:t>
+        </w:r>
+      </w:hyperlink>
+      <w:r>
+        <w:t xml:space="preserve">.</w:t>
+      </w:r>
+    </w:p>
+    <w:bookmarkEnd w:id="69"/>
+    <w:bookmarkStart w:id="70" w:name="rem-sum-without-set"/>
+    <w:p>
+      <w:pPr>
+        <w:pStyle w:val="BodyText"/>
+      </w:pPr>
+      <w:r>
+        <w:rPr>
+          <w:i/>
+          <w:iCs/>
+        </w:rPr>
+        <w:t xml:space="preserve">Remark 2</w:t>
+      </w:r>
+      <w:r>
+        <w:t xml:space="preserve"> (Leaving the set out). </w:t>
+      </w:r>
+      <w:r>
+        <w:t xml:space="preserve">Some authors leave the set out and write</w:t>
+      </w:r>
+      <w:r>
+        <w:t xml:space="preserve"> </w:t>
+      </w:r>
+      <m:oMath>
+        <m:nary>
+          <m:naryPr>
+            <m:chr m:val="∑"/>
+            <m:limLoc m:val="undOvr"/>
+            <m:subHide m:val="off"/>
+            <m:supHide m:val="on"/>
+          </m:naryPr>
+          <m:sub>
+            <m:r>
+              <m:t>x</m:t>
+            </m:r>
+          </m:sub>
+          <m:sup>
+            <m:r>
+              <m:t>​</m:t>
+            </m:r>
+          </m:sup>
+          <m:e>
+            <m:r>
+              <m:t>f</m:t>
+            </m:r>
+          </m:e>
+        </m:nary>
+        <m:r>
+          <m:rPr>
+            <m:sty m:val="p"/>
+          </m:rPr>
+          <m:t>(</m:t>
+        </m:r>
+        <m:r>
+          <m:t>x</m:t>
+        </m:r>
+        <m:r>
+          <m:rPr>
+            <m:sty m:val="p"/>
+          </m:rPr>
+          <m:t>)</m:t>
+        </m:r>
+      </m:oMath>
+      <w:r>
+        <w:t xml:space="preserve">.</w:t>
+      </w:r>
+      <w:r>
+        <w:t xml:space="preserve"> </w:t>
+      </w:r>
+      <w:r>
+        <w:t xml:space="preserve">This shorthand means the sum over every value</w:t>
+      </w:r>
+      <w:r>
+        <w:t xml:space="preserve"> </w:t>
+      </w:r>
+      <m:oMath>
+        <m:r>
+          <m:t>x</m:t>
+        </m:r>
+      </m:oMath>
+      <w:r>
+        <w:t xml:space="preserve"> </w:t>
+      </w:r>
+      <w:r>
+        <w:t xml:space="preserve">can take.</w:t>
+      </w:r>
+      <w:r>
+        <w:t xml:space="preserve"> </w:t>
+      </w:r>
+      <w:r>
+        <w:t xml:space="preserve">For example, if</w:t>
+      </w:r>
+      <w:r>
+        <w:t xml:space="preserve"> </w:t>
+      </w:r>
+      <m:oMath>
+        <m:r>
+          <m:t>x</m:t>
+        </m:r>
+      </m:oMath>
+      <w:r>
+        <w:t xml:space="preserve"> </w:t>
+      </w:r>
+      <w:r>
+        <w:t xml:space="preserve">is the outcome of one roll of a six-sided die,</w:t>
+      </w:r>
+      <w:r>
+        <w:t xml:space="preserve"> </w:t>
+      </w:r>
+      <m:oMath>
+        <m:nary>
+          <m:naryPr>
+            <m:chr m:val="∑"/>
+            <m:limLoc m:val="undOvr"/>
+            <m:subHide m:val="off"/>
+            <m:supHide m:val="on"/>
+          </m:naryPr>
+          <m:sub>
+            <m:r>
+              <m:t>x</m:t>
+            </m:r>
+          </m:sub>
+          <m:sup>
+            <m:r>
+              <m:t>​</m:t>
+            </m:r>
+          </m:sup>
+          <m:e>
+            <m:r>
+              <m:t>f</m:t>
+            </m:r>
+          </m:e>
+        </m:nary>
+        <m:r>
+          <m:rPr>
+            <m:sty m:val="p"/>
+          </m:rPr>
+          <m:t>(</m:t>
+        </m:r>
+        <m:r>
+          <m:t>x</m:t>
+        </m:r>
+        <m:r>
+          <m:rPr>
+            <m:sty m:val="p"/>
+          </m:rPr>
+          <m:t>)</m:t>
+        </m:r>
+      </m:oMath>
+      <w:r>
+        <w:t xml:space="preserve"> </w:t>
+      </w:r>
+      <w:r>
+        <w:t xml:space="preserve">means</w:t>
+      </w:r>
+      <w:r>
+        <w:t xml:space="preserve"> </w:t>
+      </w:r>
+      <m:oMath>
+        <m:nary>
+          <m:naryPr>
+            <m:chr m:val="∑"/>
+            <m:limLoc m:val="undOvr"/>
+            <m:subHide m:val="off"/>
+            <m:supHide m:val="on"/>
+          </m:naryPr>
+          <m:sub>
+            <m:r>
+              <m:t>x</m:t>
+            </m:r>
+            <m:r>
+              <m:rPr>
+                <m:sty m:val="p"/>
+              </m:rPr>
+              <m:t>∈</m:t>
+            </m:r>
+            <m:r>
+              <m:t>​</m:t>
+            </m:r>
+            <m:d>
+              <m:dPr>
+                <m:begChr m:val="{"/>
+                <m:sepChr m:val=""/>
+                <m:endChr m:val="}"/>
+                <m:grow/>
+              </m:dPr>
+              <m:e>
+                <m:r>
+                  <m:t>1</m:t>
+                </m:r>
+                <m:r>
+                  <m:rPr>
+                    <m:sty m:val="p"/>
+                  </m:rPr>
+                  <m:t>,</m:t>
+                </m:r>
+                <m:r>
+                  <m:t>2</m:t>
+                </m:r>
+                <m:r>
+                  <m:rPr>
+                    <m:sty m:val="p"/>
+                  </m:rPr>
+                  <m:t>,</m:t>
+                </m:r>
+                <m:r>
+                  <m:t>3</m:t>
+                </m:r>
+                <m:r>
+                  <m:rPr>
+                    <m:sty m:val="p"/>
+                  </m:rPr>
+                  <m:t>,</m:t>
+                </m:r>
+                <m:r>
+                  <m:t>4</m:t>
+                </m:r>
+                <m:r>
+                  <m:rPr>
+                    <m:sty m:val="p"/>
+                  </m:rPr>
+                  <m:t>,</m:t>
+                </m:r>
+                <m:r>
+                  <m:t>5</m:t>
+                </m:r>
+                <m:r>
+                  <m:rPr>
+                    <m:sty m:val="p"/>
+                  </m:rPr>
+                  <m:t>,</m:t>
+                </m:r>
+                <m:r>
+                  <m:t>6</m:t>
+                </m:r>
+              </m:e>
+            </m:d>
+            <m:r>
+              <m:t>​</m:t>
+            </m:r>
+          </m:sub>
+          <m:sup>
+            <m:r>
+              <m:t>​</m:t>
+            </m:r>
+          </m:sup>
+          <m:e>
+            <m:r>
+              <m:t>f</m:t>
+            </m:r>
+          </m:e>
+        </m:nary>
+        <m:r>
+          <m:rPr>
+            <m:sty m:val="p"/>
+          </m:rPr>
+          <m:t>(</m:t>
+        </m:r>
+        <m:r>
+          <m:t>x</m:t>
+        </m:r>
+        <m:r>
+          <m:rPr>
+            <m:sty m:val="p"/>
+          </m:rPr>
+          <m:t>)</m:t>
+        </m:r>
+      </m:oMath>
+      <w:r>
+        <w:t xml:space="preserve">.</w:t>
+      </w:r>
+      <w:r>
+        <w:t xml:space="preserve"> </w:t>
+      </w:r>
+      <w:r>
+        <w:t xml:space="preserve">In these notes, we write the set out in full.</w:t>
+      </w:r>
+    </w:p>
+    <w:bookmarkEnd w:id="70"/>
+    <w:bookmarkEnd w:id="71"/>
+    <w:bookmarkStart w:id="83" w:name="quotients"/>
     <w:p>
       <w:pPr>
         <w:pStyle w:val="Heading2"/>
@@ -18154,7 +20387,7 @@
         <w:t xml:space="preserve">12 Quotients</w:t>
       </w:r>
     </w:p>
-    <w:bookmarkStart w:id="66" w:name="def-quotient"/>
+    <w:bookmarkStart w:id="72" w:name="def-quotient"/>
     <w:p>
       <w:pPr>
         <w:pStyle w:val="FirstParagraph"/>
@@ -18164,7 +20397,7 @@
           <w:b/>
           <w:bCs/>
         </w:rPr>
-        <w:t xml:space="preserve">Definition 11 (Quotient)</w:t>
+        <w:t xml:space="preserve">Definition 12 (Quotient)</w:t>
       </w:r>
       <w:r>
         <w:t xml:space="preserve"> </w:t>
@@ -18323,7 +20556,7 @@
         </m:oMath>
       </m:oMathPara>
     </w:p>
-    <w:bookmarkEnd w:id="66"/>
+    <w:bookmarkEnd w:id="72"/>
     <w:p>
       <w:pPr>
         <w:pStyle w:val="FirstParagraph"/>
@@ -18440,7 +20673,7 @@
       <w:r>
         <w:t xml:space="preserve">cf. </w:t>
       </w:r>
-      <w:hyperlink r:id="rId67">
+      <w:hyperlink r:id="rId73">
         <w:r>
           <w:rPr>
             <w:rStyle w:val="Hyperlink"/>
@@ -18449,7 +20682,7 @@
         </w:r>
       </w:hyperlink>
     </w:p>
-    <w:bookmarkStart w:id="68" w:name="exm-quotient"/>
+    <w:bookmarkStart w:id="74" w:name="exm-quotient"/>
     <w:p>
       <w:pPr>
         <w:pStyle w:val="BodyText"/>
@@ -18575,7 +20808,7 @@
           <w:rPr>
             <w:rStyle w:val="Hyperlink"/>
           </w:rPr>
-          <w:t xml:space="preserve">Definition 11</w:t>
+          <w:t xml:space="preserve">Definition 12</w:t>
         </w:r>
       </w:hyperlink>
       <w:r>
@@ -18585,8 +20818,8 @@
         <w:t xml:space="preserve">requires a nonzero denominator.</w:t>
       </w:r>
     </w:p>
-    <w:bookmarkEnd w:id="68"/>
-    <w:bookmarkStart w:id="70" w:name="def-ratio"/>
+    <w:bookmarkEnd w:id="74"/>
+    <w:bookmarkStart w:id="76" w:name="def-ratio"/>
     <w:p>
       <w:pPr>
         <w:pStyle w:val="BodyText"/>
@@ -18596,7 +20829,7 @@
           <w:b/>
           <w:bCs/>
         </w:rPr>
-        <w:t xml:space="preserve">Definition 12 (Ratios)</w:t>
+        <w:t xml:space="preserve">Definition 13 (Ratios)</w:t>
       </w:r>
       <w:r>
         <w:t xml:space="preserve"> </w:t>
@@ -18628,7 +20861,7 @@
       <w:r>
         <w:t xml:space="preserve">cf. </w:t>
       </w:r>
-      <w:hyperlink r:id="rId69">
+      <w:hyperlink r:id="rId75">
         <w:r>
           <w:rPr>
             <w:rStyle w:val="Hyperlink"/>
@@ -18637,8 +20870,8 @@
         </w:r>
       </w:hyperlink>
     </w:p>
-    <w:bookmarkEnd w:id="70"/>
-    <w:bookmarkStart w:id="73" w:name="def-proportion"/>
+    <w:bookmarkEnd w:id="76"/>
+    <w:bookmarkStart w:id="79" w:name="def-proportion"/>
     <w:p>
       <w:pPr>
         <w:pStyle w:val="BodyText"/>
@@ -18648,7 +20881,7 @@
           <w:b/>
           <w:bCs/>
         </w:rPr>
-        <w:t xml:space="preserve">Definition 13 (Proportion)</w:t>
+        <w:t xml:space="preserve">Definition 14 (Proportion)</w:t>
       </w:r>
       <w:r>
         <w:t xml:space="preserve"> </w:t>
@@ -18689,7 +20922,7 @@
       <w:r>
         <w:t xml:space="preserve"> </w:t>
       </w:r>
-      <w:hyperlink r:id="rId71">
+      <w:hyperlink r:id="rId77">
         <w:r>
           <w:rPr>
             <w:rStyle w:val="Hyperlink"/>
@@ -18711,7 +20944,7 @@
       <w:r>
         <w:t xml:space="preserve"> </w:t>
       </w:r>
-      <w:hyperlink r:id="rId72">
+      <w:hyperlink r:id="rId78">
         <w:r>
           <w:rPr>
             <w:rStyle w:val="Hyperlink"/>
@@ -18726,8 +20959,8 @@
         <w:t xml:space="preserve">for other meanings.</w:t>
       </w:r>
     </w:p>
-    <w:bookmarkEnd w:id="73"/>
-    <w:bookmarkStart w:id="75" w:name="def-proportional"/>
+    <w:bookmarkEnd w:id="79"/>
+    <w:bookmarkStart w:id="81" w:name="def-proportional"/>
     <w:p>
       <w:pPr>
         <w:pStyle w:val="BodyText"/>
@@ -18737,7 +20970,7 @@
           <w:b/>
           <w:bCs/>
         </w:rPr>
-        <w:t xml:space="preserve">Definition 14 (Proportional)</w:t>
+        <w:t xml:space="preserve">Definition 15 (Proportional)</w:t>
       </w:r>
       <w:r>
         <w:t xml:space="preserve"> </w:t>
@@ -18898,7 +21131,7 @@
       <w:r>
         <w:t xml:space="preserve">(cf. </w:t>
       </w:r>
-      <w:hyperlink r:id="rId74">
+      <w:hyperlink r:id="rId80">
         <w:r>
           <w:rPr>
             <w:rStyle w:val="Hyperlink"/>
@@ -18910,7 +21143,7 @@
         <w:t xml:space="preserve">)</w:t>
       </w:r>
     </w:p>
-    <w:bookmarkEnd w:id="75"/>
+    <w:bookmarkEnd w:id="81"/>
     <w:p>
       <w:pPr>
         <w:pStyle w:val="BodyText"/>
@@ -18921,7 +21154,7 @@
       <w:r>
         <w:t xml:space="preserve"> </w:t>
       </w:r>
-      <w:hyperlink r:id="rId76">
+      <w:hyperlink r:id="rId82">
         <w:r>
           <w:rPr>
             <w:rStyle w:val="Hyperlink"/>
@@ -18930,8 +21163,8 @@
         </w:r>
       </w:hyperlink>
     </w:p>
-    <w:bookmarkEnd w:id="77"/>
-    <w:bookmarkStart w:id="83" w:name="sec-polynomials"/>
+    <w:bookmarkEnd w:id="83"/>
+    <w:bookmarkStart w:id="89" w:name="sec-polynomials"/>
     <w:p>
       <w:pPr>
         <w:pStyle w:val="Heading2"/>
@@ -18940,7 +21173,7 @@
         <w:t xml:space="preserve">13 Polynomials</w:t>
       </w:r>
     </w:p>
-    <w:bookmarkStart w:id="78" w:name="exr-polynomial-degree"/>
+    <w:bookmarkStart w:id="84" w:name="exr-polynomial-degree"/>
     <w:p>
       <w:pPr>
         <w:pStyle w:val="FirstParagraph"/>
@@ -18950,7 +21183,7 @@
           <w:b/>
           <w:bCs/>
         </w:rPr>
-        <w:t xml:space="preserve">Exercise 7 (Reading a polynomial)</w:t>
+        <w:t xml:space="preserve">Exercise 8 (Reading a polynomial)</w:t>
       </w:r>
       <w:r>
         <w:t xml:space="preserve"> </w:t>
@@ -19029,7 +21262,7 @@
         <w:pStyle w:val="Compact"/>
         <w:numPr>
           <w:ilvl w:val="0"/>
-          <w:numId w:val="1013"/>
+          <w:numId w:val="1015"/>
         </w:numPr>
       </w:pPr>
       <w:r>
@@ -19284,7 +21517,7 @@
         <w:pStyle w:val="Compact"/>
         <w:numPr>
           <w:ilvl w:val="0"/>
-          <w:numId w:val="1013"/>
+          <w:numId w:val="1015"/>
         </w:numPr>
       </w:pPr>
       <w:r>
@@ -19302,8 +21535,8 @@
         <w:t xml:space="preserve">, and what is its leading coefficient?</w:t>
       </w:r>
     </w:p>
-    <w:bookmarkEnd w:id="78"/>
-    <w:bookmarkStart w:id="79" w:name="sol-polynomial-degree"/>
+    <w:bookmarkEnd w:id="84"/>
+    <w:bookmarkStart w:id="85" w:name="sol-polynomial-degree"/>
     <w:p>
       <w:pPr>
         <w:pStyle w:val="FirstParagraph"/>
@@ -19313,7 +21546,7 @@
           <w:i/>
           <w:iCs/>
         </w:rPr>
-        <w:t xml:space="preserve">Solution 7</w:t>
+        <w:t xml:space="preserve">Solution 8</w:t>
       </w:r>
       <w:r>
         <w:t xml:space="preserve">. </w:t>
@@ -19323,7 +21556,7 @@
       <w:pPr>
         <w:numPr>
           <w:ilvl w:val="0"/>
-          <w:numId w:val="1014"/>
+          <w:numId w:val="1016"/>
         </w:numPr>
       </w:pPr>
       <m:oMath>
@@ -19662,7 +21895,7 @@
       <w:pPr>
         <w:numPr>
           <w:ilvl w:val="0"/>
-          <w:numId w:val="1014"/>
+          <w:numId w:val="1016"/>
         </w:numPr>
       </w:pPr>
       <w:r>
@@ -19738,8 +21971,8 @@
         <w:t xml:space="preserve">.</w:t>
       </w:r>
     </w:p>
-    <w:bookmarkEnd w:id="79"/>
-    <w:bookmarkStart w:id="80" w:name="def-polynomial"/>
+    <w:bookmarkEnd w:id="85"/>
+    <w:bookmarkStart w:id="86" w:name="def-polynomial"/>
     <w:p>
       <w:pPr>
         <w:pStyle w:val="FirstParagraph"/>
@@ -19749,7 +21982,7 @@
           <w:b/>
           <w:bCs/>
         </w:rPr>
-        <w:t xml:space="preserve">Definition 15 (Polynomial)</w:t>
+        <w:t xml:space="preserve">Definition 16 (Polynomial)</w:t>
       </w:r>
       <w:r>
         <w:t xml:space="preserve"> </w:t>
@@ -20139,7 +22372,7 @@
         <w:t xml:space="preserve">.</w:t>
       </w:r>
     </w:p>
-    <w:bookmarkEnd w:id="80"/>
+    <w:bookmarkEnd w:id="86"/>
     <w:p>
       <w:pPr>
         <w:pStyle w:val="BodyText"/>
@@ -20155,7 +22388,7 @@
           <w:rPr>
             <w:rStyle w:val="Hyperlink"/>
           </w:rPr>
-          <w:t xml:space="preserve">Exercise 7</w:t>
+          <w:t xml:space="preserve">Exercise 8</w:t>
         </w:r>
       </w:hyperlink>
       <w:r>
@@ -20551,7 +22784,7 @@
           <w:rPr>
             <w:rStyle w:val="Hyperlink"/>
           </w:rPr>
-          <w:t xml:space="preserve">Definition 16</w:t>
+          <w:t xml:space="preserve">Definition 17</w:t>
         </w:r>
       </w:hyperlink>
       <w:r>
@@ -20602,7 +22835,7 @@
         <w:t xml:space="preserve">is excluded here.</w:t>
       </w:r>
     </w:p>
-    <w:bookmarkStart w:id="81" w:name="def-polynomial-degree"/>
+    <w:bookmarkStart w:id="87" w:name="def-polynomial-degree"/>
     <w:p>
       <w:pPr>
         <w:pStyle w:val="BodyText"/>
@@ -20612,7 +22845,7 @@
           <w:b/>
           <w:bCs/>
         </w:rPr>
-        <w:t xml:space="preserve">Definition 16 (Degree of a polynomial)</w:t>
+        <w:t xml:space="preserve">Definition 17 (Degree of a polynomial)</w:t>
       </w:r>
       <w:r>
         <w:t xml:space="preserve"> </w:t>
@@ -20824,7 +23057,7 @@
         <w:t xml:space="preserve">.</w:t>
       </w:r>
     </w:p>
-    <w:bookmarkEnd w:id="81"/>
+    <w:bookmarkEnd w:id="87"/>
     <w:p>
       <w:pPr>
         <w:pStyle w:val="BodyText"/>
@@ -20840,7 +23073,7 @@
           <w:rPr>
             <w:rStyle w:val="Hyperlink"/>
           </w:rPr>
-          <w:t xml:space="preserve">Exercise 7</w:t>
+          <w:t xml:space="preserve">Exercise 8</w:t>
         </w:r>
       </w:hyperlink>
       <w:r>
@@ -20981,7 +23214,7 @@
         <w:t xml:space="preserve">.</w:t>
       </w:r>
     </w:p>
-    <w:bookmarkStart w:id="82" w:name="def-polynomial-leading-coefficient"/>
+    <w:bookmarkStart w:id="88" w:name="def-polynomial-leading-coefficient"/>
     <w:p>
       <w:pPr>
         <w:pStyle w:val="BodyText"/>
@@ -20991,7 +23224,7 @@
           <w:b/>
           <w:bCs/>
         </w:rPr>
-        <w:t xml:space="preserve">Definition 17 (Leading coefficient)</w:t>
+        <w:t xml:space="preserve">Definition 18 (Leading coefficient)</w:t>
       </w:r>
       <w:r>
         <w:t xml:space="preserve"> </w:t>
@@ -21205,7 +23438,7 @@
         <w:t xml:space="preserve">.</w:t>
       </w:r>
     </w:p>
-    <w:bookmarkEnd w:id="82"/>
+    <w:bookmarkEnd w:id="88"/>
     <w:p>
       <w:pPr>
         <w:pStyle w:val="BodyText"/>
@@ -21221,7 +23454,7 @@
           <w:rPr>
             <w:rStyle w:val="Hyperlink"/>
           </w:rPr>
-          <w:t xml:space="preserve">Exercise 7</w:t>
+          <w:t xml:space="preserve">Exercise 8</w:t>
         </w:r>
       </w:hyperlink>
       <w:r>
@@ -21307,8 +23540,8 @@
         <w:t xml:space="preserve">.</w:t>
       </w:r>
     </w:p>
-    <w:bookmarkEnd w:id="83"/>
-    <w:bookmarkStart w:id="102" w:name="exponentials-and-logarithms"/>
+    <w:bookmarkEnd w:id="89"/>
+    <w:bookmarkStart w:id="108" w:name="exponentials-and-logarithms"/>
     <w:p>
       <w:pPr>
         <w:pStyle w:val="Heading2"/>
@@ -21519,7 +23752,7 @@
         <w:t xml:space="preserve">for base 10.</w:t>
       </w:r>
     </w:p>
-    <w:bookmarkStart w:id="84" w:name="thm-exp-log-inverse"/>
+    <w:bookmarkStart w:id="90" w:name="thm-exp-log-inverse"/>
     <w:p>
       <w:pPr>
         <w:pStyle w:val="BodyText"/>
@@ -21624,7 +23857,7 @@
         <w:pStyle w:val="Compact"/>
         <w:numPr>
           <w:ilvl w:val="0"/>
-          <w:numId w:val="1015"/>
+          <w:numId w:val="1017"/>
         </w:numPr>
       </w:pPr>
       <w:r>
@@ -21720,7 +23953,7 @@
         <w:pStyle w:val="Compact"/>
         <w:numPr>
           <w:ilvl w:val="0"/>
-          <w:numId w:val="1015"/>
+          <w:numId w:val="1017"/>
         </w:numPr>
       </w:pPr>
       <w:r>
@@ -21815,8 +24048,8 @@
         <w:t xml:space="preserve">.</w:t>
       </w:r>
     </w:p>
-    <w:bookmarkEnd w:id="84"/>
-    <w:bookmarkStart w:id="85" w:name="thm-log-prod"/>
+    <w:bookmarkEnd w:id="90"/>
+    <w:bookmarkStart w:id="91" w:name="thm-log-prod"/>
     <w:p>
       <w:pPr>
         <w:pStyle w:val="FirstParagraph"/>
@@ -21986,8 +24219,8 @@
         </m:oMath>
       </m:oMathPara>
     </w:p>
-    <w:bookmarkEnd w:id="85"/>
-    <w:bookmarkStart w:id="86" w:name="cor-log-quot"/>
+    <w:bookmarkEnd w:id="91"/>
+    <w:bookmarkStart w:id="92" w:name="cor-log-quot"/>
     <w:p>
       <w:pPr>
         <w:pStyle w:val="FirstParagraph"/>
@@ -22160,7 +24393,7 @@
         </m:oMath>
       </m:oMathPara>
     </w:p>
-    <w:bookmarkEnd w:id="86"/>
+    <w:bookmarkEnd w:id="92"/>
     <w:p>
       <w:pPr>
         <w:pStyle w:val="FirstParagraph"/>
@@ -22715,7 +24948,7 @@
         <w:t xml:space="preserve">.</w:t>
       </w:r>
     </w:p>
-    <w:bookmarkStart w:id="87" w:name="thm-log-exp"/>
+    <w:bookmarkStart w:id="93" w:name="thm-log-exp"/>
     <w:p>
       <w:pPr>
         <w:pStyle w:val="BodyText"/>
@@ -22867,8 +25100,8 @@
         </m:oMath>
       </m:oMathPara>
     </w:p>
-    <w:bookmarkEnd w:id="87"/>
-    <w:bookmarkStart w:id="88" w:name="thm-exp-sum"/>
+    <w:bookmarkEnd w:id="93"/>
+    <w:bookmarkStart w:id="94" w:name="thm-exp-sum"/>
     <w:p>
       <w:pPr>
         <w:pStyle w:val="FirstParagraph"/>
@@ -23003,8 +25236,8 @@
         </m:oMath>
       </m:oMathPara>
     </w:p>
-    <w:bookmarkEnd w:id="88"/>
-    <w:bookmarkStart w:id="89" w:name="cor-exp-sum"/>
+    <w:bookmarkEnd w:id="94"/>
+    <w:bookmarkStart w:id="95" w:name="cor-exp-sum"/>
     <w:p>
       <w:pPr>
         <w:pStyle w:val="FirstParagraph"/>
@@ -23154,8 +25387,8 @@
         </m:oMath>
       </m:oMathPara>
     </w:p>
-    <w:bookmarkEnd w:id="89"/>
-    <w:bookmarkStart w:id="90" w:name="thm-double-exp"/>
+    <w:bookmarkEnd w:id="95"/>
+    <w:bookmarkStart w:id="96" w:name="thm-double-exp"/>
     <w:p>
       <w:pPr>
         <w:pStyle w:val="FirstParagraph"/>
@@ -23343,8 +25576,8 @@
         </m:oMath>
       </m:oMathPara>
     </w:p>
-    <w:bookmarkEnd w:id="90"/>
-    <w:bookmarkStart w:id="91" w:name="exm-double-exp-negative-base"/>
+    <w:bookmarkEnd w:id="96"/>
+    <w:bookmarkStart w:id="97" w:name="exm-double-exp-negative-base"/>
     <w:p>
       <w:pPr>
         <w:pStyle w:val="FirstParagraph"/>
@@ -24029,8 +26262,8 @@
         <w:t xml:space="preserve">is not even a real number.</w:t>
       </w:r>
     </w:p>
-    <w:bookmarkEnd w:id="91"/>
-    <w:bookmarkStart w:id="92" w:name="cor-exp-ab"/>
+    <w:bookmarkEnd w:id="97"/>
+    <w:bookmarkStart w:id="98" w:name="cor-exp-ab"/>
     <w:p>
       <w:pPr>
         <w:pStyle w:val="BodyText"/>
@@ -24187,8 +26420,8 @@
         </m:oMath>
       </m:oMathPara>
     </w:p>
-    <w:bookmarkEnd w:id="92"/>
-    <w:bookmarkStart w:id="93" w:name="exr-exp-vs-mult"/>
+    <w:bookmarkEnd w:id="98"/>
+    <w:bookmarkStart w:id="99" w:name="exr-exp-vs-mult"/>
     <w:p>
       <w:pPr>
         <w:pStyle w:val="FirstParagraph"/>
@@ -24198,7 +26431,7 @@
           <w:b/>
           <w:bCs/>
         </w:rPr>
-        <w:t xml:space="preserve">Exercise 8</w:t>
+        <w:t xml:space="preserve">Exercise 9</w:t>
       </w:r>
       <w:r>
         <w:t xml:space="preserve"> </w:t>
@@ -24272,8 +26505,8 @@
         <w:t xml:space="preserve">?</w:t>
       </w:r>
     </w:p>
-    <w:bookmarkEnd w:id="93"/>
-    <w:bookmarkStart w:id="96" w:name="sol-exp-vs-mult"/>
+    <w:bookmarkEnd w:id="99"/>
+    <w:bookmarkStart w:id="102" w:name="sol-exp-vs-mult"/>
     <w:p>
       <w:pPr>
         <w:pStyle w:val="BodyText"/>
@@ -24283,7 +26516,7 @@
           <w:i/>
           <w:iCs/>
         </w:rPr>
-        <w:t xml:space="preserve">Solution 8</w:t>
+        <w:t xml:space="preserve">Solution 9</w:t>
       </w:r>
       <w:r>
         <w:t xml:space="preserve">. </w:t>
@@ -24466,7 +26699,7 @@
         <w:pStyle w:val="Compact"/>
         <w:numPr>
           <w:ilvl w:val="0"/>
-          <w:numId w:val="1016"/>
+          <w:numId w:val="1018"/>
         </w:numPr>
       </w:pPr>
       <m:oMath>
@@ -24503,7 +26736,7 @@
         <w:pStyle w:val="Compact"/>
         <w:numPr>
           <w:ilvl w:val="0"/>
-          <w:numId w:val="1016"/>
+          <w:numId w:val="1018"/>
         </w:numPr>
       </w:pPr>
       <m:oMath>
@@ -24686,7 +26919,7 @@
         <w:pStyle w:val="Compact"/>
         <w:numPr>
           <w:ilvl w:val="0"/>
-          <w:numId w:val="1016"/>
+          <w:numId w:val="1018"/>
         </w:numPr>
       </w:pPr>
       <m:oMath>
@@ -25207,7 +27440,7 @@
         <w:pStyle w:val="Compact"/>
         <w:numPr>
           <w:ilvl w:val="0"/>
-          <w:numId w:val="1016"/>
+          <w:numId w:val="1018"/>
         </w:numPr>
       </w:pPr>
       <m:oMath>
@@ -25465,7 +27698,7 @@
         <w:pStyle w:val="Compact"/>
         <w:numPr>
           <w:ilvl w:val="0"/>
-          <w:numId w:val="1016"/>
+          <w:numId w:val="1018"/>
         </w:numPr>
       </w:pPr>
       <m:oMath>
@@ -26057,7 +28290,7 @@
       <w:tr>
         <w:tc>
           <w:tcPr/>
-          <w:bookmarkStart w:id="94" w:name="fig-double-exponential"/>
+          <w:bookmarkStart w:id="100" w:name="fig-double-exponential"/>
           <w:p>
             <w:pPr>
               <w:pStyle w:val="Compact"/>
@@ -26124,7 +28357,7 @@
               </m:sSup>
             </m:oMath>
           </w:p>
-          <w:bookmarkEnd w:id="94"/>
+          <w:bookmarkEnd w:id="100"/>
         </w:tc>
       </w:tr>
     </w:tbl>
@@ -26149,7 +28382,7 @@
       <w:tr>
         <w:tc>
           <w:tcPr/>
-          <w:bookmarkStart w:id="95" w:name="fig-double-exponential2"/>
+          <w:bookmarkStart w:id="101" w:name="fig-double-exponential2"/>
           <w:p>
             <w:pPr>
               <w:pStyle w:val="Compact"/>
@@ -26266,12 +28499,12 @@
               <w:t xml:space="preserve">.</w:t>
             </w:r>
           </w:p>
-          <w:bookmarkEnd w:id="95"/>
+          <w:bookmarkEnd w:id="101"/>
         </w:tc>
       </w:tr>
     </w:tbl>
-    <w:bookmarkEnd w:id="96"/>
-    <w:bookmarkStart w:id="97" w:name="exr-double-exponential"/>
+    <w:bookmarkEnd w:id="102"/>
+    <w:bookmarkStart w:id="103" w:name="exr-double-exponential"/>
     <w:p>
       <w:pPr>
         <w:pStyle w:val="BodyText"/>
@@ -26281,7 +28514,7 @@
           <w:b/>
           <w:bCs/>
         </w:rPr>
-        <w:t xml:space="preserve">Exercise 9</w:t>
+        <w:t xml:space="preserve">Exercise 10</w:t>
       </w:r>
       <w:r>
         <w:t xml:space="preserve"> </w:t>
@@ -26430,8 +28663,8 @@
         <w:t xml:space="preserve">?</w:t>
       </w:r>
     </w:p>
-    <w:bookmarkEnd w:id="97"/>
-    <w:bookmarkStart w:id="99" w:name="sol-double-exponential"/>
+    <w:bookmarkEnd w:id="103"/>
+    <w:bookmarkStart w:id="105" w:name="sol-double-exponential"/>
     <w:p>
       <w:pPr>
         <w:pStyle w:val="BodyText"/>
@@ -26441,7 +28674,7 @@
           <w:i/>
           <w:iCs/>
         </w:rPr>
-        <w:t xml:space="preserve">Solution 9</w:t>
+        <w:t xml:space="preserve">Solution 10</w:t>
       </w:r>
       <w:r>
         <w:t xml:space="preserve">. </w:t>
@@ -26856,7 +29089,7 @@
       <w:pPr>
         <w:pStyle w:val="BodyText"/>
       </w:pPr>
-      <w:bookmarkStart w:id="98" w:name="eq-double-exp-log-scale"/>
+      <w:bookmarkStart w:id="104" w:name="eq-double-exp-log-scale"/>
       <m:oMathPara>
         <m:oMathParaPr>
           <m:jc m:val="center"/>
@@ -27163,7 +29396,7 @@
           </m:r>
         </m:oMath>
       </m:oMathPara>
-      <w:bookmarkEnd w:id="98"/>
+      <w:bookmarkEnd w:id="104"/>
     </w:p>
     <w:p>
       <w:pPr>
@@ -27195,7 +29428,7 @@
         <w:pStyle w:val="Compact"/>
         <w:numPr>
           <w:ilvl w:val="0"/>
-          <w:numId w:val="1017"/>
+          <w:numId w:val="1019"/>
         </w:numPr>
       </w:pPr>
       <m:oMath>
@@ -27266,7 +29499,7 @@
         <w:pStyle w:val="Compact"/>
         <w:numPr>
           <w:ilvl w:val="0"/>
-          <w:numId w:val="1017"/>
+          <w:numId w:val="1019"/>
         </w:numPr>
       </w:pPr>
       <m:oMath>
@@ -27309,7 +29542,7 @@
           <w:rPr>
             <w:rStyle w:val="Hyperlink"/>
           </w:rPr>
-          <w:t xml:space="preserve">Exercise 8</w:t>
+          <w:t xml:space="preserve">Exercise 9</w:t>
         </w:r>
       </w:hyperlink>
       <w:r>
@@ -27508,7 +29741,7 @@
         <w:pStyle w:val="Compact"/>
         <w:numPr>
           <w:ilvl w:val="0"/>
-          <w:numId w:val="1018"/>
+          <w:numId w:val="1020"/>
         </w:numPr>
       </w:pPr>
       <w:r>
@@ -27607,7 +29840,7 @@
         <w:pStyle w:val="Compact"/>
         <w:numPr>
           <w:ilvl w:val="0"/>
-          <w:numId w:val="1018"/>
+          <w:numId w:val="1020"/>
         </w:numPr>
       </w:pPr>
       <w:r>
@@ -27806,7 +30039,7 @@
         <w:pStyle w:val="Compact"/>
         <w:numPr>
           <w:ilvl w:val="0"/>
-          <w:numId w:val="1018"/>
+          <w:numId w:val="1020"/>
         </w:numPr>
       </w:pPr>
       <w:r>
@@ -28485,9 +30718,9 @@
         </m:oMath>
       </m:oMathPara>
     </w:p>
-    <w:bookmarkEnd w:id="99"/>
-    <w:bookmarkStart w:id="101" w:name="refs"/>
-    <w:bookmarkStart w:id="100" w:name="ref-rudin1976principles"/>
+    <w:bookmarkEnd w:id="105"/>
+    <w:bookmarkStart w:id="107" w:name="refs"/>
+    <w:bookmarkStart w:id="106" w:name="ref-rudin1976principles"/>
     <w:p>
       <w:pPr>
         <w:pStyle w:val="Bibliography"/>
@@ -28509,9 +30742,9 @@
         <w:t xml:space="preserve">. 3rd ed. International Series in Pure and Applied Mathematics. McGraw-Hill.</w:t>
       </w:r>
     </w:p>
-    <w:bookmarkEnd w:id="100"/>
-    <w:bookmarkEnd w:id="101"/>
-    <w:bookmarkEnd w:id="102"/>
+    <w:bookmarkEnd w:id="106"/>
+    <w:bookmarkEnd w:id="107"/>
+    <w:bookmarkEnd w:id="108"/>
     <w:sectPr>
       <w:footnotePr>
         <w:numRestart w:val="eachSect"/>
@@ -29270,6 +31503,66 @@
     </w:lvlOverride>
   </w:num>
   <w:num w:numId="1018">
+    <w:abstractNumId w:val="99411"/>
+    <w:lvlOverride w:ilvl="0">
+      <w:startOverride w:val="1"/>
+    </w:lvlOverride>
+    <w:lvlOverride w:ilvl="1">
+      <w:startOverride w:val="1"/>
+    </w:lvlOverride>
+    <w:lvlOverride w:ilvl="2">
+      <w:startOverride w:val="1"/>
+    </w:lvlOverride>
+    <w:lvlOverride w:ilvl="3">
+      <w:startOverride w:val="1"/>
+    </w:lvlOverride>
+    <w:lvlOverride w:ilvl="4">
+      <w:startOverride w:val="1"/>
+    </w:lvlOverride>
+    <w:lvlOverride w:ilvl="5">
+      <w:startOverride w:val="1"/>
+    </w:lvlOverride>
+    <w:lvlOverride w:ilvl="6">
+      <w:startOverride w:val="1"/>
+    </w:lvlOverride>
+    <w:lvlOverride w:ilvl="7">
+      <w:startOverride w:val="1"/>
+    </w:lvlOverride>
+    <w:lvlOverride w:ilvl="8">
+      <w:startOverride w:val="1"/>
+    </w:lvlOverride>
+  </w:num>
+  <w:num w:numId="1019">
+    <w:abstractNumId w:val="99411"/>
+    <w:lvlOverride w:ilvl="0">
+      <w:startOverride w:val="1"/>
+    </w:lvlOverride>
+    <w:lvlOverride w:ilvl="1">
+      <w:startOverride w:val="1"/>
+    </w:lvlOverride>
+    <w:lvlOverride w:ilvl="2">
+      <w:startOverride w:val="1"/>
+    </w:lvlOverride>
+    <w:lvlOverride w:ilvl="3">
+      <w:startOverride w:val="1"/>
+    </w:lvlOverride>
+    <w:lvlOverride w:ilvl="4">
+      <w:startOverride w:val="1"/>
+    </w:lvlOverride>
+    <w:lvlOverride w:ilvl="5">
+      <w:startOverride w:val="1"/>
+    </w:lvlOverride>
+    <w:lvlOverride w:ilvl="6">
+      <w:startOverride w:val="1"/>
+    </w:lvlOverride>
+    <w:lvlOverride w:ilvl="7">
+      <w:startOverride w:val="1"/>
+    </w:lvlOverride>
+    <w:lvlOverride w:ilvl="8">
+      <w:startOverride w:val="1"/>
+    </w:lvlOverride>
+  </w:num>
+  <w:num w:numId="1020">
     <w:abstractNumId w:val="991"/>
   </w:num>
 </w:numbering>

</xml_diff>

<commit_message>
Deploying to gh-pages from @ Morrison-Lab/mds@b717796e6528ce8c41d21cf5a72283aa3cea6e7f 🚀
</commit_message>
<xml_diff>
--- a/algebra.docx
+++ b/algebra.docx
@@ -15,7 +15,7 @@
         <w:pStyle w:val="Date"/>
       </w:pPr>
       <w:r>
-        <w:t xml:space="preserve">Last modified: 2026-10-03 12:42:49 (PDT)</w:t>
+        <w:t xml:space="preserve">Last modified: 2026-10-03 13:02:29 (PDT)</w:t>
       </w:r>
     </w:p>
     <w:bookmarkStart w:id="12" w:name="equalities"/>
@@ -17009,7 +17009,7 @@
     </w:p>
     <w:bookmarkEnd w:id="67"/>
     <w:bookmarkEnd w:id="68"/>
-    <w:bookmarkStart w:id="84" w:name="sec-summation"/>
+    <w:bookmarkStart w:id="86" w:name="sec-summation"/>
     <w:p>
       <w:pPr>
         <w:pStyle w:val="Heading2"/>
@@ -22806,7 +22806,7 @@
       </w:r>
     </w:p>
     <w:bookmarkEnd w:id="82"/>
-    <w:bookmarkStart w:id="83" w:name="rem-sum-without-set"/>
+    <w:bookmarkStart w:id="85" w:name="rem-sum-without-set"/>
     <w:p>
       <w:pPr>
         <w:pStyle w:val="BodyText"/>
@@ -22888,7 +22888,148 @@
         <w:t xml:space="preserve"> </w:t>
       </w:r>
       <w:r>
-        <w:t xml:space="preserve">can take.</w:t>
+        <w:t xml:space="preserve">can take,</w:t>
+      </w:r>
+      <w:r>
+        <w:t xml:space="preserve"> </w:t>
+      </w:r>
+      <m:oMath>
+        <m:nary>
+          <m:naryPr>
+            <m:chr m:val="∑"/>
+            <m:limLoc m:val="undOvr"/>
+            <m:subHide m:val="off"/>
+            <m:supHide m:val="on"/>
+          </m:naryPr>
+          <m:sub>
+            <m:r>
+              <m:t>x</m:t>
+            </m:r>
+            <m:r>
+              <m:rPr>
+                <m:sty m:val="p"/>
+              </m:rPr>
+              <m:t>∈</m:t>
+            </m:r>
+            <m:r>
+              <m:rPr>
+                <m:scr m:val="script"/>
+                <m:sty m:val="p"/>
+              </m:rPr>
+              <m:t>R</m:t>
+            </m:r>
+            <m:r>
+              <m:rPr>
+                <m:sty m:val="p"/>
+              </m:rPr>
+              <m:t>(</m:t>
+            </m:r>
+            <m:r>
+              <m:t>x</m:t>
+            </m:r>
+            <m:r>
+              <m:rPr>
+                <m:sty m:val="p"/>
+              </m:rPr>
+              <m:t>)</m:t>
+            </m:r>
+          </m:sub>
+          <m:sup>
+            <m:r>
+              <m:t>​</m:t>
+            </m:r>
+          </m:sup>
+          <m:e>
+            <m:r>
+              <m:t>f</m:t>
+            </m:r>
+          </m:e>
+        </m:nary>
+        <m:r>
+          <m:rPr>
+            <m:sty m:val="p"/>
+          </m:rPr>
+          <m:t>(</m:t>
+        </m:r>
+        <m:r>
+          <m:t>x</m:t>
+        </m:r>
+        <m:r>
+          <m:rPr>
+            <m:sty m:val="p"/>
+          </m:rPr>
+          <m:t>)</m:t>
+        </m:r>
+      </m:oMath>
+      <w:r>
+        <w:t xml:space="preserve">,</w:t>
+      </w:r>
+      <w:r>
+        <w:t xml:space="preserve"> </w:t>
+      </w:r>
+      <w:r>
+        <w:t xml:space="preserve">where</w:t>
+      </w:r>
+      <w:r>
+        <w:t xml:space="preserve"> </w:t>
+      </w:r>
+      <m:oMath>
+        <m:r>
+          <m:rPr>
+            <m:scr m:val="script"/>
+            <m:sty m:val="p"/>
+          </m:rPr>
+          <m:t>R</m:t>
+        </m:r>
+        <m:r>
+          <m:rPr>
+            <m:sty m:val="p"/>
+          </m:rPr>
+          <m:t>(</m:t>
+        </m:r>
+        <m:r>
+          <m:t>x</m:t>
+        </m:r>
+        <m:r>
+          <m:rPr>
+            <m:sty m:val="p"/>
+          </m:rPr>
+          <m:t>)</m:t>
+        </m:r>
+      </m:oMath>
+      <w:r>
+        <w:t xml:space="preserve"> </w:t>
+      </w:r>
+      <w:r>
+        <w:t xml:space="preserve">is the</w:t>
+      </w:r>
+      <w:r>
+        <w:t xml:space="preserve"> </w:t>
+      </w:r>
+      <w:hyperlink r:id="rId83">
+        <w:r>
+          <w:rPr>
+            <w:rStyle w:val="Hyperlink"/>
+          </w:rPr>
+          <w:t xml:space="preserve">range</w:t>
+        </w:r>
+      </w:hyperlink>
+      <w:r>
+        <w:t xml:space="preserve"> </w:t>
+      </w:r>
+      <w:r>
+        <w:t xml:space="preserve">of</w:t>
+      </w:r>
+      <w:r>
+        <w:t xml:space="preserve"> </w:t>
+      </w:r>
+      <m:oMath>
+        <m:r>
+          <m:t>x</m:t>
+        </m:r>
+      </m:oMath>
+      <w:r>
+        <w:t xml:space="preserve">.</w:t>
       </w:r>
       <w:r>
         <w:t xml:space="preserve"> </w:t>
@@ -23079,12 +23220,32 @@
         <w:t xml:space="preserve"> </w:t>
       </w:r>
       <w:r>
-        <w:t xml:space="preserve">In these notes, we write the set out in full.</w:t>
+        <w:t xml:space="preserve">In these notes, we write the set out in full</w:t>
+      </w:r>
+      <w:r>
+        <w:t xml:space="preserve"> </w:t>
+      </w:r>
+      <w:r>
+        <w:t xml:space="preserve">(see</w:t>
+      </w:r>
+      <w:r>
+        <w:t xml:space="preserve"> </w:t>
+      </w:r>
+      <w:hyperlink r:id="rId84">
+        <w:r>
+          <w:rPr>
+            <w:rStyle w:val="Hyperlink"/>
+          </w:rPr>
+          <w:t xml:space="preserve">Notational shorthands</w:t>
+        </w:r>
+      </w:hyperlink>
+      <w:r>
+        <w:t xml:space="preserve">).</w:t>
       </w:r>
     </w:p>
-    <w:bookmarkEnd w:id="83"/>
-    <w:bookmarkEnd w:id="84"/>
-    <w:bookmarkStart w:id="98" w:name="quotients"/>
+    <w:bookmarkEnd w:id="85"/>
+    <w:bookmarkEnd w:id="86"/>
+    <w:bookmarkStart w:id="100" w:name="quotients"/>
     <w:p>
       <w:pPr>
         <w:pStyle w:val="Heading2"/>
@@ -23093,7 +23254,7 @@
         <w:t xml:space="preserve">12 Quotients</w:t>
       </w:r>
     </w:p>
-    <w:bookmarkStart w:id="85" w:name="def-quotient"/>
+    <w:bookmarkStart w:id="87" w:name="def-quotient"/>
     <w:p>
       <w:pPr>
         <w:pStyle w:val="FirstParagraph"/>
@@ -23262,8 +23423,8 @@
         </m:oMath>
       </m:oMathPara>
     </w:p>
-    <w:bookmarkEnd w:id="85"/>
-    <w:bookmarkStart w:id="86" w:name="def-fraction"/>
+    <w:bookmarkEnd w:id="87"/>
+    <w:bookmarkStart w:id="88" w:name="def-fraction"/>
     <w:p>
       <w:pPr>
         <w:pStyle w:val="FirstParagraph"/>
@@ -23446,8 +23607,8 @@
         <w:t xml:space="preserve">.</w:t>
       </w:r>
     </w:p>
-    <w:bookmarkEnd w:id="86"/>
-    <w:bookmarkStart w:id="87" w:name="exm-quotient"/>
+    <w:bookmarkEnd w:id="88"/>
+    <w:bookmarkStart w:id="89" w:name="exm-quotient"/>
     <w:p>
       <w:pPr>
         <w:pStyle w:val="BodyText"/>
@@ -23583,8 +23744,8 @@
         <w:t xml:space="preserve">requires a nonzero denominator.</w:t>
       </w:r>
     </w:p>
-    <w:bookmarkEnd w:id="87"/>
-    <w:bookmarkStart w:id="88" w:name="def-rate"/>
+    <w:bookmarkEnd w:id="89"/>
+    <w:bookmarkStart w:id="90" w:name="def-rate"/>
     <w:p>
       <w:pPr>
         <w:pStyle w:val="BodyText"/>
@@ -23799,7 +23960,7 @@
         <w:t xml:space="preserve">cases per person-year.</w:t>
       </w:r>
     </w:p>
-    <w:bookmarkEnd w:id="88"/>
+    <w:bookmarkEnd w:id="90"/>
     <w:p>
       <w:pPr>
         <w:pStyle w:val="BodyText"/>
@@ -23807,7 +23968,7 @@
       <w:r>
         <w:t xml:space="preserve">cf. </w:t>
       </w:r>
-      <w:hyperlink r:id="rId89">
+      <w:hyperlink r:id="rId91">
         <w:r>
           <w:rPr>
             <w:rStyle w:val="Hyperlink"/>
@@ -23816,7 +23977,7 @@
         </w:r>
       </w:hyperlink>
     </w:p>
-    <w:bookmarkStart w:id="91" w:name="def-ratio"/>
+    <w:bookmarkStart w:id="93" w:name="def-ratio"/>
     <w:p>
       <w:pPr>
         <w:pStyle w:val="BodyText"/>
@@ -23858,7 +24019,7 @@
       <w:r>
         <w:t xml:space="preserve">cf. </w:t>
       </w:r>
-      <w:hyperlink r:id="rId90">
+      <w:hyperlink r:id="rId92">
         <w:r>
           <w:rPr>
             <w:rStyle w:val="Hyperlink"/>
@@ -23867,8 +24028,8 @@
         </w:r>
       </w:hyperlink>
     </w:p>
-    <w:bookmarkEnd w:id="91"/>
-    <w:bookmarkStart w:id="94" w:name="def-proportion"/>
+    <w:bookmarkEnd w:id="93"/>
+    <w:bookmarkStart w:id="96" w:name="def-proportion"/>
     <w:p>
       <w:pPr>
         <w:pStyle w:val="BodyText"/>
@@ -23919,7 +24080,7 @@
       <w:r>
         <w:t xml:space="preserve"> </w:t>
       </w:r>
-      <w:hyperlink r:id="rId92">
+      <w:hyperlink r:id="rId94">
         <w:r>
           <w:rPr>
             <w:rStyle w:val="Hyperlink"/>
@@ -23941,7 +24102,7 @@
       <w:r>
         <w:t xml:space="preserve"> </w:t>
       </w:r>
-      <w:hyperlink r:id="rId93">
+      <w:hyperlink r:id="rId95">
         <w:r>
           <w:rPr>
             <w:rStyle w:val="Hyperlink"/>
@@ -23956,8 +24117,8 @@
         <w:t xml:space="preserve">for other meanings.</w:t>
       </w:r>
     </w:p>
-    <w:bookmarkEnd w:id="94"/>
-    <w:bookmarkStart w:id="96" w:name="def-proportional"/>
+    <w:bookmarkEnd w:id="96"/>
+    <w:bookmarkStart w:id="98" w:name="def-proportional"/>
     <w:p>
       <w:pPr>
         <w:pStyle w:val="BodyText"/>
@@ -24128,7 +24289,7 @@
       <w:r>
         <w:t xml:space="preserve">(cf. </w:t>
       </w:r>
-      <w:hyperlink r:id="rId95">
+      <w:hyperlink r:id="rId97">
         <w:r>
           <w:rPr>
             <w:rStyle w:val="Hyperlink"/>
@@ -24140,7 +24301,7 @@
         <w:t xml:space="preserve">)</w:t>
       </w:r>
     </w:p>
-    <w:bookmarkEnd w:id="96"/>
+    <w:bookmarkEnd w:id="98"/>
     <w:p>
       <w:pPr>
         <w:pStyle w:val="BodyText"/>
@@ -24151,7 +24312,7 @@
       <w:r>
         <w:t xml:space="preserve"> </w:t>
       </w:r>
-      <w:hyperlink r:id="rId97">
+      <w:hyperlink r:id="rId99">
         <w:r>
           <w:rPr>
             <w:rStyle w:val="Hyperlink"/>
@@ -24160,8 +24321,8 @@
         </w:r>
       </w:hyperlink>
     </w:p>
-    <w:bookmarkEnd w:id="98"/>
-    <w:bookmarkStart w:id="107" w:name="sec-polynomials"/>
+    <w:bookmarkEnd w:id="100"/>
+    <w:bookmarkStart w:id="109" w:name="sec-polynomials"/>
     <w:p>
       <w:pPr>
         <w:pStyle w:val="Heading2"/>
@@ -24170,7 +24331,7 @@
         <w:t xml:space="preserve">13 Polynomials</w:t>
       </w:r>
     </w:p>
-    <w:bookmarkStart w:id="99" w:name="exr-polynomial-degree"/>
+    <w:bookmarkStart w:id="101" w:name="exr-polynomial-degree"/>
     <w:p>
       <w:pPr>
         <w:pStyle w:val="FirstParagraph"/>
@@ -24532,8 +24693,8 @@
         <w:t xml:space="preserve">, and what is its leading coefficient?</w:t>
       </w:r>
     </w:p>
-    <w:bookmarkEnd w:id="99"/>
-    <w:bookmarkStart w:id="100" w:name="sol-polynomial-degree"/>
+    <w:bookmarkEnd w:id="101"/>
+    <w:bookmarkStart w:id="102" w:name="sol-polynomial-degree"/>
     <w:p>
       <w:pPr>
         <w:pStyle w:val="FirstParagraph"/>
@@ -24968,8 +25129,8 @@
         <w:t xml:space="preserve">.</w:t>
       </w:r>
     </w:p>
-    <w:bookmarkEnd w:id="100"/>
-    <w:bookmarkStart w:id="101" w:name="def-polynomial"/>
+    <w:bookmarkEnd w:id="102"/>
+    <w:bookmarkStart w:id="103" w:name="def-polynomial"/>
     <w:p>
       <w:pPr>
         <w:pStyle w:val="FirstParagraph"/>
@@ -25369,8 +25530,8 @@
         <w:t xml:space="preserve">.</w:t>
       </w:r>
     </w:p>
-    <w:bookmarkEnd w:id="101"/>
-    <w:bookmarkStart w:id="102" w:name="rem-polynomial-nonzero"/>
+    <w:bookmarkEnd w:id="103"/>
+    <w:bookmarkStart w:id="104" w:name="rem-polynomial-nonzero"/>
     <w:p>
       <w:pPr>
         <w:pStyle w:val="BodyText"/>
@@ -25587,8 +25748,8 @@
         <w:t xml:space="preserve">.</w:t>
       </w:r>
     </w:p>
-    <w:bookmarkEnd w:id="102"/>
-    <w:bookmarkStart w:id="103" w:name="def-polynomial-degree"/>
+    <w:bookmarkEnd w:id="104"/>
+    <w:bookmarkStart w:id="105" w:name="def-polynomial-degree"/>
     <w:p>
       <w:pPr>
         <w:pStyle w:val="BodyText"/>
@@ -25810,8 +25971,8 @@
         <w:t xml:space="preserve">.</w:t>
       </w:r>
     </w:p>
-    <w:bookmarkEnd w:id="103"/>
-    <w:bookmarkStart w:id="104" w:name="exm-polynomial-degree"/>
+    <w:bookmarkEnd w:id="105"/>
+    <w:bookmarkStart w:id="106" w:name="exm-polynomial-degree"/>
     <w:p>
       <w:pPr>
         <w:pStyle w:val="BodyText"/>
@@ -26055,8 +26216,8 @@
         <w:t xml:space="preserve">.</w:t>
       </w:r>
     </w:p>
-    <w:bookmarkEnd w:id="104"/>
-    <w:bookmarkStart w:id="105" w:name="def-polynomial-leading-coefficient"/>
+    <w:bookmarkEnd w:id="106"/>
+    <w:bookmarkStart w:id="107" w:name="def-polynomial-leading-coefficient"/>
     <w:p>
       <w:pPr>
         <w:pStyle w:val="FirstParagraph"/>
@@ -26280,8 +26441,8 @@
         <w:t xml:space="preserve">.</w:t>
       </w:r>
     </w:p>
-    <w:bookmarkEnd w:id="105"/>
-    <w:bookmarkStart w:id="106" w:name="exm-leading-coefficient"/>
+    <w:bookmarkEnd w:id="107"/>
+    <w:bookmarkStart w:id="108" w:name="exm-leading-coefficient"/>
     <w:p>
       <w:pPr>
         <w:pStyle w:val="BodyText"/>
@@ -26546,9 +26707,9 @@
         <w:t xml:space="preserve">.</w:t>
       </w:r>
     </w:p>
-    <w:bookmarkEnd w:id="106"/>
-    <w:bookmarkEnd w:id="107"/>
-    <w:bookmarkStart w:id="128" w:name="exponentials-and-logarithms"/>
+    <w:bookmarkEnd w:id="108"/>
+    <w:bookmarkEnd w:id="109"/>
+    <w:bookmarkStart w:id="130" w:name="exponentials-and-logarithms"/>
     <w:p>
       <w:pPr>
         <w:pStyle w:val="Heading2"/>
@@ -26759,7 +26920,7 @@
         <w:t xml:space="preserve">for base 10.</w:t>
       </w:r>
     </w:p>
-    <w:bookmarkStart w:id="108" w:name="thm-exp-log-inverse"/>
+    <w:bookmarkStart w:id="110" w:name="thm-exp-log-inverse"/>
     <w:p>
       <w:pPr>
         <w:pStyle w:val="BodyText"/>
@@ -27055,8 +27216,8 @@
         <w:t xml:space="preserve">.</w:t>
       </w:r>
     </w:p>
-    <w:bookmarkEnd w:id="108"/>
-    <w:bookmarkStart w:id="109" w:name="thm-log-prod"/>
+    <w:bookmarkEnd w:id="110"/>
+    <w:bookmarkStart w:id="111" w:name="thm-log-prod"/>
     <w:p>
       <w:pPr>
         <w:pStyle w:val="FirstParagraph"/>
@@ -27226,8 +27387,8 @@
         </m:oMath>
       </m:oMathPara>
     </w:p>
-    <w:bookmarkEnd w:id="109"/>
-    <w:bookmarkStart w:id="110" w:name="cor-log-quot"/>
+    <w:bookmarkEnd w:id="111"/>
+    <w:bookmarkStart w:id="112" w:name="cor-log-quot"/>
     <w:p>
       <w:pPr>
         <w:pStyle w:val="FirstParagraph"/>
@@ -27400,7 +27561,7 @@
         </m:oMath>
       </m:oMathPara>
     </w:p>
-    <w:bookmarkEnd w:id="110"/>
+    <w:bookmarkEnd w:id="112"/>
     <w:p>
       <w:pPr>
         <w:pStyle w:val="FirstParagraph"/>
@@ -27955,7 +28116,7 @@
         <w:t xml:space="preserve">.</w:t>
       </w:r>
     </w:p>
-    <w:bookmarkStart w:id="111" w:name="thm-log-exp"/>
+    <w:bookmarkStart w:id="113" w:name="thm-log-exp"/>
     <w:p>
       <w:pPr>
         <w:pStyle w:val="BodyText"/>
@@ -28107,8 +28268,8 @@
         </m:oMath>
       </m:oMathPara>
     </w:p>
-    <w:bookmarkEnd w:id="111"/>
-    <w:bookmarkStart w:id="112" w:name="thm-exp-sum"/>
+    <w:bookmarkEnd w:id="113"/>
+    <w:bookmarkStart w:id="114" w:name="thm-exp-sum"/>
     <w:p>
       <w:pPr>
         <w:pStyle w:val="FirstParagraph"/>
@@ -28235,8 +28396,8 @@
         </m:oMath>
       </m:oMathPara>
     </w:p>
-    <w:bookmarkEnd w:id="112"/>
-    <w:bookmarkStart w:id="113" w:name="exm-exp-sum"/>
+    <w:bookmarkEnd w:id="114"/>
+    <w:bookmarkStart w:id="115" w:name="exm-exp-sum"/>
     <w:p>
       <w:pPr>
         <w:pStyle w:val="FirstParagraph"/>
@@ -28477,8 +28638,8 @@
         <w:t xml:space="preserve">.</w:t>
       </w:r>
     </w:p>
-    <w:bookmarkEnd w:id="113"/>
-    <w:bookmarkStart w:id="114" w:name="cor-exp-sum"/>
+    <w:bookmarkEnd w:id="115"/>
+    <w:bookmarkStart w:id="116" w:name="cor-exp-sum"/>
     <w:p>
       <w:pPr>
         <w:pStyle w:val="BodyText"/>
@@ -28620,8 +28781,8 @@
         </m:oMath>
       </m:oMathPara>
     </w:p>
-    <w:bookmarkEnd w:id="114"/>
-    <w:bookmarkStart w:id="115" w:name="exm-exp-difference"/>
+    <w:bookmarkEnd w:id="116"/>
+    <w:bookmarkStart w:id="117" w:name="exm-exp-difference"/>
     <w:p>
       <w:pPr>
         <w:pStyle w:val="FirstParagraph"/>
@@ -28868,8 +29029,8 @@
         <w:t xml:space="preserve">.</w:t>
       </w:r>
     </w:p>
-    <w:bookmarkEnd w:id="115"/>
-    <w:bookmarkStart w:id="116" w:name="thm-double-exp"/>
+    <w:bookmarkEnd w:id="117"/>
+    <w:bookmarkStart w:id="118" w:name="thm-double-exp"/>
     <w:p>
       <w:pPr>
         <w:pStyle w:val="BodyText"/>
@@ -29057,8 +29218,8 @@
         </m:oMath>
       </m:oMathPara>
     </w:p>
-    <w:bookmarkEnd w:id="116"/>
-    <w:bookmarkStart w:id="117" w:name="exm-double-exp-negative-base"/>
+    <w:bookmarkEnd w:id="118"/>
+    <w:bookmarkStart w:id="119" w:name="exm-double-exp-negative-base"/>
     <w:p>
       <w:pPr>
         <w:pStyle w:val="FirstParagraph"/>
@@ -29743,8 +29904,8 @@
         <w:t xml:space="preserve">is not even a real number.</w:t>
       </w:r>
     </w:p>
-    <w:bookmarkEnd w:id="117"/>
-    <w:bookmarkStart w:id="118" w:name="cor-exp-ab"/>
+    <w:bookmarkEnd w:id="119"/>
+    <w:bookmarkStart w:id="120" w:name="cor-exp-ab"/>
     <w:p>
       <w:pPr>
         <w:pStyle w:val="BodyText"/>
@@ -29901,8 +30062,8 @@
         </m:oMath>
       </m:oMathPara>
     </w:p>
-    <w:bookmarkEnd w:id="118"/>
-    <w:bookmarkStart w:id="119" w:name="exr-exp-vs-mult"/>
+    <w:bookmarkEnd w:id="120"/>
+    <w:bookmarkStart w:id="121" w:name="exr-exp-vs-mult"/>
     <w:p>
       <w:pPr>
         <w:pStyle w:val="FirstParagraph"/>
@@ -29986,8 +30147,8 @@
         <w:t xml:space="preserve">?</w:t>
       </w:r>
     </w:p>
-    <w:bookmarkEnd w:id="119"/>
-    <w:bookmarkStart w:id="122" w:name="sol-exp-vs-mult"/>
+    <w:bookmarkEnd w:id="121"/>
+    <w:bookmarkStart w:id="124" w:name="sol-exp-vs-mult"/>
     <w:p>
       <w:pPr>
         <w:pStyle w:val="BodyText"/>
@@ -31771,7 +31932,7 @@
       <w:tr>
         <w:tc>
           <w:tcPr/>
-          <w:bookmarkStart w:id="120" w:name="fig-double-exponential"/>
+          <w:bookmarkStart w:id="122" w:name="fig-double-exponential"/>
           <w:p>
             <w:pPr>
               <w:pStyle w:val="Compact"/>
@@ -31838,7 +31999,7 @@
               </m:sSup>
             </m:oMath>
           </w:p>
-          <w:bookmarkEnd w:id="120"/>
+          <w:bookmarkEnd w:id="122"/>
         </w:tc>
       </w:tr>
     </w:tbl>
@@ -31863,7 +32024,7 @@
       <w:tr>
         <w:tc>
           <w:tcPr/>
-          <w:bookmarkStart w:id="121" w:name="fig-double-exponential2"/>
+          <w:bookmarkStart w:id="123" w:name="fig-double-exponential2"/>
           <w:p>
             <w:pPr>
               <w:pStyle w:val="Compact"/>
@@ -31980,12 +32141,12 @@
               <w:t xml:space="preserve">.</w:t>
             </w:r>
           </w:p>
-          <w:bookmarkEnd w:id="121"/>
+          <w:bookmarkEnd w:id="123"/>
         </w:tc>
       </w:tr>
     </w:tbl>
-    <w:bookmarkEnd w:id="122"/>
-    <w:bookmarkStart w:id="123" w:name="exr-double-exponential"/>
+    <w:bookmarkEnd w:id="124"/>
+    <w:bookmarkStart w:id="125" w:name="exr-double-exponential"/>
     <w:p>
       <w:pPr>
         <w:pStyle w:val="BodyText"/>
@@ -32144,8 +32305,8 @@
         <w:t xml:space="preserve">?</w:t>
       </w:r>
     </w:p>
-    <w:bookmarkEnd w:id="123"/>
-    <w:bookmarkStart w:id="125" w:name="sol-double-exponential"/>
+    <w:bookmarkEnd w:id="125"/>
+    <w:bookmarkStart w:id="127" w:name="sol-double-exponential"/>
     <w:p>
       <w:pPr>
         <w:pStyle w:val="BodyText"/>
@@ -32570,7 +32731,7 @@
       <w:pPr>
         <w:pStyle w:val="BodyText"/>
       </w:pPr>
-      <w:bookmarkStart w:id="124" w:name="eq-double-exp-log-scale"/>
+      <w:bookmarkStart w:id="126" w:name="eq-double-exp-log-scale"/>
       <m:oMathPara>
         <m:oMathParaPr>
           <m:jc m:val="center"/>
@@ -32877,7 +33038,7 @@
           </m:r>
         </m:oMath>
       </m:oMathPara>
-      <w:bookmarkEnd w:id="124"/>
+      <w:bookmarkEnd w:id="126"/>
     </w:p>
     <w:p>
       <w:pPr>
@@ -34199,9 +34360,9 @@
         </m:oMath>
       </m:oMathPara>
     </w:p>
-    <w:bookmarkEnd w:id="125"/>
-    <w:bookmarkStart w:id="127" w:name="refs"/>
-    <w:bookmarkStart w:id="126" w:name="ref-rudin1976principles"/>
+    <w:bookmarkEnd w:id="127"/>
+    <w:bookmarkStart w:id="129" w:name="refs"/>
+    <w:bookmarkStart w:id="128" w:name="ref-rudin1976principles"/>
     <w:p>
       <w:pPr>
         <w:pStyle w:val="Bibliography"/>
@@ -34223,9 +34384,9 @@
         <w:t xml:space="preserve">. 3rd ed. International Series in Pure and Applied Mathematics. McGraw-Hill.</w:t>
       </w:r>
     </w:p>
-    <w:bookmarkEnd w:id="126"/>
-    <w:bookmarkEnd w:id="127"/>
     <w:bookmarkEnd w:id="128"/>
+    <w:bookmarkEnd w:id="129"/>
+    <w:bookmarkEnd w:id="130"/>
     <w:sectPr>
       <w:footnotePr>
         <w:numRestart w:val="eachSect"/>

</xml_diff>

<commit_message>
Deploying to gh-pages from @ Morrison-Lab/mds@a599a8c9e0f237a92c94d6da98dc827ec4574c69 🚀
</commit_message>
<xml_diff>
--- a/algebra.docx
+++ b/algebra.docx
@@ -15,7 +15,7 @@
         <w:pStyle w:val="Date"/>
       </w:pPr>
       <w:r>
-        <w:t xml:space="preserve">Last modified: 2026-10-03 13:02:29 (PDT)</w:t>
+        <w:t xml:space="preserve">Last modified: 2026-10-03 14:54:29 (PDT)</w:t>
       </w:r>
     </w:p>
     <w:bookmarkStart w:id="12" w:name="equalities"/>
@@ -26709,7 +26709,7 @@
     </w:p>
     <w:bookmarkEnd w:id="108"/>
     <w:bookmarkEnd w:id="109"/>
-    <w:bookmarkStart w:id="130" w:name="exponentials-and-logarithms"/>
+    <w:bookmarkStart w:id="128" w:name="exponentials-and-logarithms"/>
     <w:p>
       <w:pPr>
         <w:pStyle w:val="Heading2"/>
@@ -34361,8 +34361,128 @@
       </m:oMathPara>
     </w:p>
     <w:bookmarkEnd w:id="127"/>
-    <w:bookmarkStart w:id="129" w:name="refs"/>
-    <w:bookmarkStart w:id="128" w:name="ref-rudin1976principles"/>
+    <w:bookmarkEnd w:id="128"/>
+    <w:bookmarkStart w:id="129" w:name="sec-further-reading"/>
+    <w:p>
+      <w:pPr>
+        <w:pStyle w:val="Heading2"/>
+      </w:pPr>
+      <w:r>
+        <w:t xml:space="preserve">15 Further reading</w:t>
+      </w:r>
+    </w:p>
+    <w:p>
+      <w:pPr>
+        <w:pStyle w:val="Compact"/>
+        <w:numPr>
+          <w:ilvl w:val="0"/>
+          <w:numId w:val="1023"/>
+        </w:numPr>
+      </w:pPr>
+      <w:r>
+        <w:t xml:space="preserve">Abramson et al.</w:t>
+      </w:r>
+      <w:r>
+        <w:t xml:space="preserve"> </w:t>
+      </w:r>
+      <w:r>
+        <w:t xml:space="preserve">(2021)</w:t>
+      </w:r>
+      <w:r>
+        <w:t xml:space="preserve"> </w:t>
+      </w:r>
+      <w:r>
+        <w:t xml:space="preserve">is a free online textbook on algebra and trigonometry.</w:t>
+      </w:r>
+      <w:r>
+        <w:t xml:space="preserve"> </w:t>
+      </w:r>
+      <w:r>
+        <w:t xml:space="preserve">It covers equations, inequalities, polynomials, exponentials, and logarithms,</w:t>
+      </w:r>
+      <w:r>
+        <w:t xml:space="preserve"> </w:t>
+      </w:r>
+      <w:r>
+        <w:t xml:space="preserve">which overlap with the algebra on this page.</w:t>
+      </w:r>
+    </w:p>
+    <w:p>
+      <w:pPr>
+        <w:pStyle w:val="Compact"/>
+        <w:numPr>
+          <w:ilvl w:val="0"/>
+          <w:numId w:val="1023"/>
+        </w:numPr>
+      </w:pPr>
+      <w:r>
+        <w:t xml:space="preserve">Rudin (1976)</w:t>
+      </w:r>
+      <w:r>
+        <w:t xml:space="preserve"> </w:t>
+      </w:r>
+      <w:r>
+        <w:t xml:space="preserve">develops the real numbers, including the least upper bound property</w:t>
+      </w:r>
+      <w:r>
+        <w:t xml:space="preserve"> </w:t>
+      </w:r>
+      <w:r>
+        <w:t xml:space="preserve">behind the infimum and supremum.</w:t>
+      </w:r>
+    </w:p>
+    <w:bookmarkEnd w:id="129"/>
+    <w:bookmarkStart w:id="134" w:name="references"/>
+    <w:p>
+      <w:pPr>
+        <w:pStyle w:val="Heading2"/>
+      </w:pPr>
+      <w:r>
+        <w:t xml:space="preserve">References</w:t>
+      </w:r>
+    </w:p>
+    <w:bookmarkStart w:id="133" w:name="refs"/>
+    <w:bookmarkStart w:id="131" w:name="ref-abramson2021algebra"/>
+    <w:p>
+      <w:pPr>
+        <w:pStyle w:val="Bibliography"/>
+      </w:pPr>
+      <w:r>
+        <w:t xml:space="preserve">Abramson, Jay et al.</w:t>
+      </w:r>
+      <w:r>
+        <w:t xml:space="preserve"> 2021.</w:t>
+      </w:r>
+      <w:r>
+        <w:t xml:space="preserve"> </w:t>
+      </w:r>
+      <w:r>
+        <w:rPr>
+          <w:i/>
+          <w:iCs/>
+        </w:rPr>
+        <w:t xml:space="preserve">Algebra and Trigonometry</w:t>
+      </w:r>
+      <w:r>
+        <w:t xml:space="preserve">. 2nd ed. OpenStax.</w:t>
+      </w:r>
+      <w:r>
+        <w:t xml:space="preserve"> </w:t>
+      </w:r>
+      <w:hyperlink r:id="rId130">
+        <w:r>
+          <w:rPr>
+            <w:rStyle w:val="Hyperlink"/>
+          </w:rPr>
+          <w:t xml:space="preserve">https://openstax.org/books/algebra-and-trigonometry-2e/pages/preface</w:t>
+        </w:r>
+      </w:hyperlink>
+      <w:r>
+        <w:t xml:space="preserve">.</w:t>
+      </w:r>
+    </w:p>
+    <w:bookmarkEnd w:id="131"/>
+    <w:bookmarkStart w:id="132" w:name="ref-rudin1976principles"/>
     <w:p>
       <w:pPr>
         <w:pStyle w:val="Bibliography"/>
@@ -34384,9 +34504,9 @@
         <w:t xml:space="preserve">. 3rd ed. International Series in Pure and Applied Mathematics. McGraw-Hill.</w:t>
       </w:r>
     </w:p>
-    <w:bookmarkEnd w:id="128"/>
-    <w:bookmarkEnd w:id="129"/>
-    <w:bookmarkEnd w:id="130"/>
+    <w:bookmarkEnd w:id="132"/>
+    <w:bookmarkEnd w:id="133"/>
+    <w:bookmarkEnd w:id="134"/>
     <w:sectPr>
       <w:footnotePr>
         <w:numRestart w:val="eachSect"/>
@@ -35211,6 +35331,9 @@
     </w:lvlOverride>
   </w:num>
   <w:num w:numId="1022">
+    <w:abstractNumId w:val="991"/>
+  </w:num>
+  <w:num w:numId="1023">
     <w:abstractNumId w:val="991"/>
   </w:num>
 </w:numbering>

</xml_diff>

<commit_message>
Deploying to gh-pages from @ Morrison-Lab/mds@3e4dd7c5cab167919c9a1dc08ad387622b6a367d 🚀
</commit_message>
<xml_diff>
--- a/algebra.docx
+++ b/algebra.docx
@@ -15,7 +15,7 @@
         <w:pStyle w:val="Date"/>
       </w:pPr>
       <w:r>
-        <w:t xml:space="preserve">Last modified: 2026-10-05 15:14:37 (PDT)</w:t>
+        <w:t xml:space="preserve">Last modified: 2026-10-05 17:21:55 (PDT)</w:t>
       </w:r>
     </w:p>
     <w:bookmarkStart w:id="12" w:name="equalities"/>
@@ -30282,7 +30282,7 @@
     </w:p>
     <w:bookmarkEnd w:id="115"/>
     <w:bookmarkEnd w:id="116"/>
-    <w:bookmarkStart w:id="135" w:name="exponentials-and-logarithms"/>
+    <w:bookmarkStart w:id="143" w:name="exponentials-and-logarithms"/>
     <w:p>
       <w:pPr>
         <w:pStyle w:val="Heading2"/>
@@ -32603,7 +32603,7 @@
       </w:r>
     </w:p>
     <w:bookmarkEnd w:id="124"/>
-    <w:bookmarkStart w:id="125" w:name="thm-double-exp"/>
+    <w:bookmarkStart w:id="125" w:name="thm-power-one"/>
     <w:p>
       <w:pPr>
         <w:pStyle w:val="BodyText"/>
@@ -32613,7 +32613,1040 @@
           <w:b/>
           <w:bCs/>
         </w:rPr>
-        <w:t xml:space="preserve">Theorem 23 (Power of a power)</w:t>
+        <w:t xml:space="preserve">Theorem 23 (Powers of 1 and first powers)</w:t>
+      </w:r>
+      <w:r>
+        <w:t xml:space="preserve"> </w:t>
+      </w:r>
+      <w:r>
+        <w:t xml:space="preserve">For every</w:t>
+      </w:r>
+      <w:r>
+        <w:t xml:space="preserve"> </w:t>
+      </w:r>
+      <m:oMath>
+        <m:r>
+          <m:t>b</m:t>
+        </m:r>
+        <m:r>
+          <m:rPr>
+            <m:sty m:val="p"/>
+          </m:rPr>
+          <m:t>∈</m:t>
+        </m:r>
+        <m:r>
+          <m:rPr>
+            <m:scr m:val="double-struck"/>
+            <m:sty m:val="p"/>
+          </m:rPr>
+          <m:t>R</m:t>
+        </m:r>
+      </m:oMath>
+      <w:r>
+        <w:t xml:space="preserve">,</w:t>
+      </w:r>
+    </w:p>
+    <w:p>
+      <w:pPr>
+        <w:pStyle w:val="BodyText"/>
+      </w:pPr>
+      <m:oMathPara>
+        <m:oMathParaPr>
+          <m:jc m:val="center"/>
+        </m:oMathParaPr>
+        <m:oMath>
+          <m:sSup>
+            <m:e>
+              <m:r>
+                <m:t>1</m:t>
+              </m:r>
+            </m:e>
+            <m:sup>
+              <m:r>
+                <m:t>b</m:t>
+              </m:r>
+            </m:sup>
+          </m:sSup>
+          <m:r>
+            <m:rPr>
+              <m:sty m:val="p"/>
+            </m:rPr>
+            <m:t>=</m:t>
+          </m:r>
+          <m:r>
+            <m:t>1</m:t>
+          </m:r>
+          <m:r>
+            <m:rPr>
+              <m:sty m:val="p"/>
+            </m:rPr>
+            <m:t>,</m:t>
+          </m:r>
+        </m:oMath>
+      </m:oMathPara>
+    </w:p>
+    <w:p>
+      <w:pPr>
+        <w:pStyle w:val="FirstParagraph"/>
+      </w:pPr>
+      <w:r>
+        <w:t xml:space="preserve">and for every</w:t>
+      </w:r>
+      <w:r>
+        <w:t xml:space="preserve"> </w:t>
+      </w:r>
+      <m:oMath>
+        <m:r>
+          <m:t>a</m:t>
+        </m:r>
+        <m:r>
+          <m:rPr>
+            <m:sty m:val="p"/>
+          </m:rPr>
+          <m:t>∈</m:t>
+        </m:r>
+        <m:r>
+          <m:rPr>
+            <m:scr m:val="double-struck"/>
+            <m:sty m:val="p"/>
+          </m:rPr>
+          <m:t>R</m:t>
+        </m:r>
+      </m:oMath>
+      <w:r>
+        <w:t xml:space="preserve">,</w:t>
+      </w:r>
+    </w:p>
+    <w:p>
+      <w:pPr>
+        <w:pStyle w:val="BodyText"/>
+      </w:pPr>
+      <m:oMathPara>
+        <m:oMathParaPr>
+          <m:jc m:val="center"/>
+        </m:oMathParaPr>
+        <m:oMath>
+          <m:sSup>
+            <m:e>
+              <m:r>
+                <m:t>a</m:t>
+              </m:r>
+            </m:e>
+            <m:sup>
+              <m:r>
+                <m:t>1</m:t>
+              </m:r>
+            </m:sup>
+          </m:sSup>
+          <m:r>
+            <m:rPr>
+              <m:sty m:val="p"/>
+            </m:rPr>
+            <m:t>=</m:t>
+          </m:r>
+          <m:r>
+            <m:t>a</m:t>
+          </m:r>
+          <m:r>
+            <m:rPr>
+              <m:sty m:val="p"/>
+            </m:rPr>
+            <m:t>.</m:t>
+          </m:r>
+        </m:oMath>
+      </m:oMathPara>
+    </w:p>
+    <w:bookmarkEnd w:id="125"/>
+    <w:bookmarkStart w:id="126" w:name="thm-power-sum"/>
+    <w:p>
+      <w:pPr>
+        <w:pStyle w:val="FirstParagraph"/>
+      </w:pPr>
+      <w:r>
+        <w:rPr>
+          <w:b/>
+          <w:bCs/>
+        </w:rPr>
+        <w:t xml:space="preserve">Theorem 24 (Power of a sum)</w:t>
+      </w:r>
+      <w:r>
+        <w:t xml:space="preserve"> </w:t>
+      </w:r>
+      <w:r>
+        <w:t xml:space="preserve">If</w:t>
+      </w:r>
+      <w:r>
+        <w:t xml:space="preserve"> </w:t>
+      </w:r>
+      <m:oMath>
+        <m:r>
+          <m:t>a</m:t>
+        </m:r>
+        <m:r>
+          <m:rPr>
+            <m:sty m:val="p"/>
+          </m:rPr>
+          <m:t>&gt;</m:t>
+        </m:r>
+        <m:r>
+          <m:t>0</m:t>
+        </m:r>
+      </m:oMath>
+      <w:r>
+        <w:t xml:space="preserve"> </w:t>
+      </w:r>
+      <w:r>
+        <w:t xml:space="preserve">and</w:t>
+      </w:r>
+      <w:r>
+        <w:t xml:space="preserve"> </w:t>
+      </w:r>
+      <m:oMath>
+        <m:r>
+          <m:t>b</m:t>
+        </m:r>
+        <m:r>
+          <m:rPr>
+            <m:sty m:val="p"/>
+          </m:rPr>
+          <m:t>,</m:t>
+        </m:r>
+        <m:r>
+          <m:t>c</m:t>
+        </m:r>
+        <m:r>
+          <m:rPr>
+            <m:sty m:val="p"/>
+          </m:rPr>
+          <m:t>∈</m:t>
+        </m:r>
+        <m:r>
+          <m:rPr>
+            <m:scr m:val="double-struck"/>
+            <m:sty m:val="p"/>
+          </m:rPr>
+          <m:t>R</m:t>
+        </m:r>
+      </m:oMath>
+      <w:r>
+        <w:t xml:space="preserve">, then</w:t>
+      </w:r>
+    </w:p>
+    <w:p>
+      <w:pPr>
+        <w:pStyle w:val="BodyText"/>
+      </w:pPr>
+      <m:oMathPara>
+        <m:oMathParaPr>
+          <m:jc m:val="center"/>
+        </m:oMathParaPr>
+        <m:oMath>
+          <m:sSup>
+            <m:e>
+              <m:r>
+                <m:t>a</m:t>
+              </m:r>
+            </m:e>
+            <m:sup>
+              <m:r>
+                <m:t>b</m:t>
+              </m:r>
+              <m:r>
+                <m:rPr>
+                  <m:sty m:val="p"/>
+                </m:rPr>
+                <m:t>+</m:t>
+              </m:r>
+              <m:r>
+                <m:t>c</m:t>
+              </m:r>
+            </m:sup>
+          </m:sSup>
+          <m:r>
+            <m:rPr>
+              <m:sty m:val="p"/>
+            </m:rPr>
+            <m:t>=</m:t>
+          </m:r>
+          <m:sSup>
+            <m:e>
+              <m:r>
+                <m:t>a</m:t>
+              </m:r>
+            </m:e>
+            <m:sup>
+              <m:r>
+                <m:t>b</m:t>
+              </m:r>
+            </m:sup>
+          </m:sSup>
+          <m:r>
+            <m:rPr>
+              <m:sty m:val="p"/>
+            </m:rPr>
+            <m:t>⋅</m:t>
+          </m:r>
+          <m:sSup>
+            <m:e>
+              <m:r>
+                <m:t>a</m:t>
+              </m:r>
+            </m:e>
+            <m:sup>
+              <m:r>
+                <m:t>c</m:t>
+              </m:r>
+            </m:sup>
+          </m:sSup>
+        </m:oMath>
+      </m:oMathPara>
+    </w:p>
+    <w:bookmarkEnd w:id="126"/>
+    <w:bookmarkStart w:id="127" w:name="exm-power-sum"/>
+    <w:p>
+      <w:pPr>
+        <w:pStyle w:val="FirstParagraph"/>
+      </w:pPr>
+      <w:r>
+        <w:rPr>
+          <w:b/>
+          <w:bCs/>
+        </w:rPr>
+        <w:t xml:space="preserve">Example 17 (Power of a sum)</w:t>
+      </w:r>
+      <w:r>
+        <w:t xml:space="preserve"> </w:t>
+      </w:r>
+      <w:r>
+        <w:t xml:space="preserve">With</w:t>
+      </w:r>
+      <w:r>
+        <w:t xml:space="preserve"> </w:t>
+      </w:r>
+      <m:oMath>
+        <m:r>
+          <m:t>a</m:t>
+        </m:r>
+        <m:r>
+          <m:rPr>
+            <m:sty m:val="p"/>
+          </m:rPr>
+          <m:t>=</m:t>
+        </m:r>
+        <m:r>
+          <m:t>2</m:t>
+        </m:r>
+      </m:oMath>
+      <w:r>
+        <w:t xml:space="preserve">,</w:t>
+      </w:r>
+      <w:r>
+        <w:t xml:space="preserve"> </w:t>
+      </w:r>
+      <m:oMath>
+        <m:r>
+          <m:t>b</m:t>
+        </m:r>
+        <m:r>
+          <m:rPr>
+            <m:sty m:val="p"/>
+          </m:rPr>
+          <m:t>=</m:t>
+        </m:r>
+        <m:r>
+          <m:t>3</m:t>
+        </m:r>
+      </m:oMath>
+      <w:r>
+        <w:t xml:space="preserve">, and</w:t>
+      </w:r>
+      <w:r>
+        <w:t xml:space="preserve"> </w:t>
+      </w:r>
+      <m:oMath>
+        <m:r>
+          <m:t>c</m:t>
+        </m:r>
+        <m:r>
+          <m:rPr>
+            <m:sty m:val="p"/>
+          </m:rPr>
+          <m:t>=</m:t>
+        </m:r>
+        <m:r>
+          <m:t>4</m:t>
+        </m:r>
+      </m:oMath>
+      <w:r>
+        <w:t xml:space="preserve">,</w:t>
+      </w:r>
+      <w:r>
+        <w:t xml:space="preserve"> </w:t>
+      </w:r>
+      <m:oMath>
+        <m:sSup>
+          <m:e>
+            <m:r>
+              <m:t>2</m:t>
+            </m:r>
+          </m:e>
+          <m:sup>
+            <m:r>
+              <m:t>3</m:t>
+            </m:r>
+            <m:r>
+              <m:rPr>
+                <m:sty m:val="p"/>
+              </m:rPr>
+              <m:t>+</m:t>
+            </m:r>
+            <m:r>
+              <m:t>4</m:t>
+            </m:r>
+          </m:sup>
+        </m:sSup>
+        <m:r>
+          <m:rPr>
+            <m:sty m:val="p"/>
+          </m:rPr>
+          <m:t>=</m:t>
+        </m:r>
+        <m:sSup>
+          <m:e>
+            <m:r>
+              <m:t>2</m:t>
+            </m:r>
+          </m:e>
+          <m:sup>
+            <m:r>
+              <m:t>7</m:t>
+            </m:r>
+          </m:sup>
+        </m:sSup>
+        <m:r>
+          <m:rPr>
+            <m:sty m:val="p"/>
+          </m:rPr>
+          <m:t>=</m:t>
+        </m:r>
+        <m:r>
+          <m:t>128</m:t>
+        </m:r>
+      </m:oMath>
+      <w:r>
+        <w:t xml:space="preserve">,</w:t>
+      </w:r>
+      <w:r>
+        <w:t xml:space="preserve"> </w:t>
+      </w:r>
+      <w:r>
+        <w:t xml:space="preserve">and</w:t>
+      </w:r>
+      <w:r>
+        <w:t xml:space="preserve"> </w:t>
+      </w:r>
+      <m:oMath>
+        <m:sSup>
+          <m:e>
+            <m:r>
+              <m:t>2</m:t>
+            </m:r>
+          </m:e>
+          <m:sup>
+            <m:r>
+              <m:t>3</m:t>
+            </m:r>
+          </m:sup>
+        </m:sSup>
+        <m:r>
+          <m:rPr>
+            <m:sty m:val="p"/>
+          </m:rPr>
+          <m:t>⋅</m:t>
+        </m:r>
+        <m:sSup>
+          <m:e>
+            <m:r>
+              <m:t>2</m:t>
+            </m:r>
+          </m:e>
+          <m:sup>
+            <m:r>
+              <m:t>4</m:t>
+            </m:r>
+          </m:sup>
+        </m:sSup>
+        <m:r>
+          <m:rPr>
+            <m:sty m:val="p"/>
+          </m:rPr>
+          <m:t>=</m:t>
+        </m:r>
+        <m:r>
+          <m:t>8</m:t>
+        </m:r>
+        <m:r>
+          <m:rPr>
+            <m:sty m:val="p"/>
+          </m:rPr>
+          <m:t>⋅</m:t>
+        </m:r>
+        <m:r>
+          <m:t>16</m:t>
+        </m:r>
+        <m:r>
+          <m:rPr>
+            <m:sty m:val="p"/>
+          </m:rPr>
+          <m:t>=</m:t>
+        </m:r>
+        <m:r>
+          <m:t>128</m:t>
+        </m:r>
+      </m:oMath>
+      <w:r>
+        <w:t xml:space="preserve">.</w:t>
+      </w:r>
+    </w:p>
+    <w:bookmarkEnd w:id="127"/>
+    <w:bookmarkStart w:id="128" w:name="thm-power-product"/>
+    <w:p>
+      <w:pPr>
+        <w:pStyle w:val="BodyText"/>
+      </w:pPr>
+      <w:r>
+        <w:rPr>
+          <w:b/>
+          <w:bCs/>
+        </w:rPr>
+        <w:t xml:space="preserve">Theorem 25 (Power of a product)</w:t>
+      </w:r>
+      <w:r>
+        <w:t xml:space="preserve"> </w:t>
+      </w:r>
+      <w:r>
+        <w:t xml:space="preserve">If</w:t>
+      </w:r>
+      <w:r>
+        <w:t xml:space="preserve"> </w:t>
+      </w:r>
+      <m:oMath>
+        <m:r>
+          <m:t>a</m:t>
+        </m:r>
+        <m:r>
+          <m:rPr>
+            <m:sty m:val="p"/>
+          </m:rPr>
+          <m:t>,</m:t>
+        </m:r>
+        <m:r>
+          <m:t>b</m:t>
+        </m:r>
+        <m:r>
+          <m:rPr>
+            <m:sty m:val="p"/>
+          </m:rPr>
+          <m:t>&gt;</m:t>
+        </m:r>
+        <m:r>
+          <m:t>0</m:t>
+        </m:r>
+      </m:oMath>
+      <w:r>
+        <w:t xml:space="preserve"> </w:t>
+      </w:r>
+      <w:r>
+        <w:t xml:space="preserve">and</w:t>
+      </w:r>
+      <w:r>
+        <w:t xml:space="preserve"> </w:t>
+      </w:r>
+      <m:oMath>
+        <m:r>
+          <m:t>c</m:t>
+        </m:r>
+        <m:r>
+          <m:rPr>
+            <m:sty m:val="p"/>
+          </m:rPr>
+          <m:t>∈</m:t>
+        </m:r>
+        <m:r>
+          <m:rPr>
+            <m:scr m:val="double-struck"/>
+            <m:sty m:val="p"/>
+          </m:rPr>
+          <m:t>R</m:t>
+        </m:r>
+      </m:oMath>
+      <w:r>
+        <w:t xml:space="preserve">, then</w:t>
+      </w:r>
+    </w:p>
+    <w:p>
+      <w:pPr>
+        <w:pStyle w:val="BodyText"/>
+      </w:pPr>
+      <m:oMathPara>
+        <m:oMathParaPr>
+          <m:jc m:val="center"/>
+        </m:oMathParaPr>
+        <m:oMath>
+          <m:r>
+            <m:rPr>
+              <m:sty m:val="p"/>
+            </m:rPr>
+            <m:t>(</m:t>
+          </m:r>
+          <m:r>
+            <m:t>a</m:t>
+          </m:r>
+          <m:r>
+            <m:t>b</m:t>
+          </m:r>
+          <m:sSup>
+            <m:e>
+              <m:r>
+                <m:rPr>
+                  <m:sty m:val="p"/>
+                </m:rPr>
+                <m:t>)</m:t>
+              </m:r>
+            </m:e>
+            <m:sup>
+              <m:r>
+                <m:t>c</m:t>
+              </m:r>
+            </m:sup>
+          </m:sSup>
+          <m:r>
+            <m:rPr>
+              <m:sty m:val="p"/>
+            </m:rPr>
+            <m:t>=</m:t>
+          </m:r>
+          <m:sSup>
+            <m:e>
+              <m:r>
+                <m:t>a</m:t>
+              </m:r>
+            </m:e>
+            <m:sup>
+              <m:r>
+                <m:t>c</m:t>
+              </m:r>
+            </m:sup>
+          </m:sSup>
+          <m:r>
+            <m:rPr>
+              <m:sty m:val="p"/>
+            </m:rPr>
+            <m:t>⋅</m:t>
+          </m:r>
+          <m:sSup>
+            <m:e>
+              <m:r>
+                <m:t>b</m:t>
+              </m:r>
+            </m:e>
+            <m:sup>
+              <m:r>
+                <m:t>c</m:t>
+              </m:r>
+            </m:sup>
+          </m:sSup>
+        </m:oMath>
+      </m:oMathPara>
+    </w:p>
+    <w:p>
+      <w:pPr>
+        <w:pStyle w:val="FirstParagraph"/>
+      </w:pPr>
+      <w:r>
+        <w:t xml:space="preserve">When</w:t>
+      </w:r>
+      <w:r>
+        <w:t xml:space="preserve"> </w:t>
+      </w:r>
+      <m:oMath>
+        <m:r>
+          <m:t>c</m:t>
+        </m:r>
+      </m:oMath>
+      <w:r>
+        <w:t xml:space="preserve"> </w:t>
+      </w:r>
+      <w:r>
+        <w:t xml:space="preserve">is a positive integer,</w:t>
+      </w:r>
+      <w:r>
+        <w:t xml:space="preserve"> </w:t>
+      </w:r>
+      <w:r>
+        <w:t xml:space="preserve">the same identity holds for all</w:t>
+      </w:r>
+      <w:r>
+        <w:t xml:space="preserve"> </w:t>
+      </w:r>
+      <m:oMath>
+        <m:r>
+          <m:t>a</m:t>
+        </m:r>
+        <m:r>
+          <m:rPr>
+            <m:sty m:val="p"/>
+          </m:rPr>
+          <m:t>,</m:t>
+        </m:r>
+        <m:r>
+          <m:t>b</m:t>
+        </m:r>
+        <m:r>
+          <m:rPr>
+            <m:sty m:val="p"/>
+          </m:rPr>
+          <m:t>∈</m:t>
+        </m:r>
+        <m:r>
+          <m:rPr>
+            <m:scr m:val="double-struck"/>
+            <m:sty m:val="p"/>
+          </m:rPr>
+          <m:t>R</m:t>
+        </m:r>
+      </m:oMath>
+      <w:r>
+        <w:t xml:space="preserve">,</w:t>
+      </w:r>
+      <w:r>
+        <w:t xml:space="preserve"> </w:t>
+      </w:r>
+      <w:r>
+        <w:t xml:space="preserve">because both sides are products of</w:t>
+      </w:r>
+      <w:r>
+        <w:t xml:space="preserve"> </w:t>
+      </w:r>
+      <m:oMath>
+        <m:r>
+          <m:t>c</m:t>
+        </m:r>
+      </m:oMath>
+      <w:r>
+        <w:t xml:space="preserve"> </w:t>
+      </w:r>
+      <w:r>
+        <w:t xml:space="preserve">copies of</w:t>
+      </w:r>
+      <w:r>
+        <w:t xml:space="preserve"> </w:t>
+      </w:r>
+      <m:oMath>
+        <m:r>
+          <m:t>a</m:t>
+        </m:r>
+      </m:oMath>
+      <w:r>
+        <w:t xml:space="preserve"> </w:t>
+      </w:r>
+      <w:r>
+        <w:t xml:space="preserve">and</w:t>
+      </w:r>
+      <w:r>
+        <w:t xml:space="preserve"> </w:t>
+      </w:r>
+      <m:oMath>
+        <m:r>
+          <m:t>c</m:t>
+        </m:r>
+      </m:oMath>
+      <w:r>
+        <w:t xml:space="preserve"> </w:t>
+      </w:r>
+      <w:r>
+        <w:t xml:space="preserve">copies of</w:t>
+      </w:r>
+      <w:r>
+        <w:t xml:space="preserve"> </w:t>
+      </w:r>
+      <m:oMath>
+        <m:r>
+          <m:t>b</m:t>
+        </m:r>
+      </m:oMath>
+      <w:r>
+        <w:t xml:space="preserve">,</w:t>
+      </w:r>
+      <w:r>
+        <w:t xml:space="preserve"> </w:t>
+      </w:r>
+      <w:r>
+        <w:t xml:space="preserve">which can be regrouped by</w:t>
+      </w:r>
+      <w:r>
+        <w:t xml:space="preserve"> </w:t>
+      </w:r>
+      <w:hyperlink w:anchor="thm-prod-symmetric">
+        <w:r>
+          <w:rPr>
+            <w:rStyle w:val="Hyperlink"/>
+          </w:rPr>
+          <w:t xml:space="preserve">Theorem 12</w:t>
+        </w:r>
+      </w:hyperlink>
+      <w:r>
+        <w:t xml:space="preserve"> </w:t>
+      </w:r>
+      <w:r>
+        <w:t xml:space="preserve">and</w:t>
+      </w:r>
+      <w:r>
+        <w:t xml:space="preserve"> </w:t>
+      </w:r>
+      <w:hyperlink w:anchor="thm-prod-assoc">
+        <w:r>
+          <w:rPr>
+            <w:rStyle w:val="Hyperlink"/>
+          </w:rPr>
+          <w:t xml:space="preserve">Theorem 13</w:t>
+        </w:r>
+      </w:hyperlink>
+      <w:r>
+        <w:t xml:space="preserve">.</w:t>
+      </w:r>
+    </w:p>
+    <w:bookmarkEnd w:id="128"/>
+    <w:bookmarkStart w:id="129" w:name="exm-power-product"/>
+    <w:p>
+      <w:pPr>
+        <w:pStyle w:val="BodyText"/>
+      </w:pPr>
+      <w:r>
+        <w:rPr>
+          <w:b/>
+          <w:bCs/>
+        </w:rPr>
+        <w:t xml:space="preserve">Example 18 (Power of a product)</w:t>
+      </w:r>
+      <w:r>
+        <w:t xml:space="preserve"> </w:t>
+      </w:r>
+      <w:r>
+        <w:t xml:space="preserve">With</w:t>
+      </w:r>
+      <w:r>
+        <w:t xml:space="preserve"> </w:t>
+      </w:r>
+      <m:oMath>
+        <m:r>
+          <m:t>a</m:t>
+        </m:r>
+        <m:r>
+          <m:rPr>
+            <m:sty m:val="p"/>
+          </m:rPr>
+          <m:t>=</m:t>
+        </m:r>
+        <m:r>
+          <m:t>2</m:t>
+        </m:r>
+      </m:oMath>
+      <w:r>
+        <w:t xml:space="preserve">,</w:t>
+      </w:r>
+      <w:r>
+        <w:t xml:space="preserve"> </w:t>
+      </w:r>
+      <m:oMath>
+        <m:r>
+          <m:t>b</m:t>
+        </m:r>
+        <m:r>
+          <m:rPr>
+            <m:sty m:val="p"/>
+          </m:rPr>
+          <m:t>=</m:t>
+        </m:r>
+        <m:r>
+          <m:t>3</m:t>
+        </m:r>
+      </m:oMath>
+      <w:r>
+        <w:t xml:space="preserve">, and</w:t>
+      </w:r>
+      <w:r>
+        <w:t xml:space="preserve"> </w:t>
+      </w:r>
+      <m:oMath>
+        <m:r>
+          <m:t>c</m:t>
+        </m:r>
+        <m:r>
+          <m:rPr>
+            <m:sty m:val="p"/>
+          </m:rPr>
+          <m:t>=</m:t>
+        </m:r>
+        <m:r>
+          <m:t>2</m:t>
+        </m:r>
+      </m:oMath>
+      <w:r>
+        <w:t xml:space="preserve">,</w:t>
+      </w:r>
+      <w:r>
+        <w:t xml:space="preserve"> </w:t>
+      </w:r>
+      <m:oMath>
+        <m:r>
+          <m:rPr>
+            <m:sty m:val="p"/>
+          </m:rPr>
+          <m:t>(</m:t>
+        </m:r>
+        <m:r>
+          <m:t>2</m:t>
+        </m:r>
+        <m:r>
+          <m:rPr>
+            <m:sty m:val="p"/>
+          </m:rPr>
+          <m:t>⋅</m:t>
+        </m:r>
+        <m:r>
+          <m:t>3</m:t>
+        </m:r>
+        <m:sSup>
+          <m:e>
+            <m:r>
+              <m:rPr>
+                <m:sty m:val="p"/>
+              </m:rPr>
+              <m:t>)</m:t>
+            </m:r>
+          </m:e>
+          <m:sup>
+            <m:r>
+              <m:t>2</m:t>
+            </m:r>
+          </m:sup>
+        </m:sSup>
+        <m:r>
+          <m:rPr>
+            <m:sty m:val="p"/>
+          </m:rPr>
+          <m:t>=</m:t>
+        </m:r>
+        <m:sSup>
+          <m:e>
+            <m:r>
+              <m:t>6</m:t>
+            </m:r>
+          </m:e>
+          <m:sup>
+            <m:r>
+              <m:t>2</m:t>
+            </m:r>
+          </m:sup>
+        </m:sSup>
+        <m:r>
+          <m:rPr>
+            <m:sty m:val="p"/>
+          </m:rPr>
+          <m:t>=</m:t>
+        </m:r>
+        <m:r>
+          <m:t>36</m:t>
+        </m:r>
+      </m:oMath>
+      <w:r>
+        <w:t xml:space="preserve">,</w:t>
+      </w:r>
+      <w:r>
+        <w:t xml:space="preserve"> </w:t>
+      </w:r>
+      <w:r>
+        <w:t xml:space="preserve">and</w:t>
+      </w:r>
+      <w:r>
+        <w:t xml:space="preserve"> </w:t>
+      </w:r>
+      <m:oMath>
+        <m:sSup>
+          <m:e>
+            <m:r>
+              <m:t>2</m:t>
+            </m:r>
+          </m:e>
+          <m:sup>
+            <m:r>
+              <m:t>2</m:t>
+            </m:r>
+          </m:sup>
+        </m:sSup>
+        <m:r>
+          <m:rPr>
+            <m:sty m:val="p"/>
+          </m:rPr>
+          <m:t>⋅</m:t>
+        </m:r>
+        <m:sSup>
+          <m:e>
+            <m:r>
+              <m:t>3</m:t>
+            </m:r>
+          </m:e>
+          <m:sup>
+            <m:r>
+              <m:t>2</m:t>
+            </m:r>
+          </m:sup>
+        </m:sSup>
+        <m:r>
+          <m:rPr>
+            <m:sty m:val="p"/>
+          </m:rPr>
+          <m:t>=</m:t>
+        </m:r>
+        <m:r>
+          <m:t>4</m:t>
+        </m:r>
+        <m:r>
+          <m:rPr>
+            <m:sty m:val="p"/>
+          </m:rPr>
+          <m:t>⋅</m:t>
+        </m:r>
+        <m:r>
+          <m:t>9</m:t>
+        </m:r>
+        <m:r>
+          <m:rPr>
+            <m:sty m:val="p"/>
+          </m:rPr>
+          <m:t>=</m:t>
+        </m:r>
+        <m:r>
+          <m:t>36</m:t>
+        </m:r>
+      </m:oMath>
+      <w:r>
+        <w:t xml:space="preserve">.</w:t>
+      </w:r>
+    </w:p>
+    <w:bookmarkEnd w:id="129"/>
+    <w:bookmarkStart w:id="130" w:name="thm-double-exp"/>
+    <w:p>
+      <w:pPr>
+        <w:pStyle w:val="BodyText"/>
+      </w:pPr>
+      <w:r>
+        <w:rPr>
+          <w:b/>
+          <w:bCs/>
+        </w:rPr>
+        <w:t xml:space="preserve">Theorem 26 (Power of a power)</w:t>
       </w:r>
       <w:r>
         <w:t xml:space="preserve"> </w:t>
@@ -32791,8 +33824,8 @@
         </m:oMath>
       </m:oMathPara>
     </w:p>
-    <w:bookmarkEnd w:id="125"/>
-    <w:bookmarkStart w:id="126" w:name="exm-double-exp-negative-base"/>
+    <w:bookmarkEnd w:id="130"/>
+    <w:bookmarkStart w:id="131" w:name="exm-double-exp-negative-base"/>
     <w:p>
       <w:pPr>
         <w:pStyle w:val="FirstParagraph"/>
@@ -32802,7 +33835,7 @@
           <w:b/>
           <w:bCs/>
         </w:rPr>
-        <w:t xml:space="preserve">Example 17 (A negative base)</w:t>
+        <w:t xml:space="preserve">Example 19 (A negative base)</w:t>
       </w:r>
       <w:r>
         <w:t xml:space="preserve"> </w:t>
@@ -33317,7 +34350,7 @@
           <w:rPr>
             <w:rStyle w:val="Hyperlink"/>
           </w:rPr>
-          <w:t xml:space="preserve">Theorem 23</w:t>
+          <w:t xml:space="preserve">Theorem 26</w:t>
         </w:r>
       </w:hyperlink>
       <w:r>
@@ -33477,8 +34510,8 @@
         <w:t xml:space="preserve">is not even a real number.</w:t>
       </w:r>
     </w:p>
-    <w:bookmarkEnd w:id="126"/>
-    <w:bookmarkStart w:id="127" w:name="cor-exp-ab"/>
+    <w:bookmarkEnd w:id="131"/>
+    <w:bookmarkStart w:id="132" w:name="cor-exp-ab"/>
     <w:p>
       <w:pPr>
         <w:pStyle w:val="BodyText"/>
@@ -33635,278 +34668,68 @@
         </m:oMath>
       </m:oMathPara>
     </w:p>
-    <w:bookmarkEnd w:id="127"/>
-    <w:bookmarkStart w:id="128" w:name="exr-exp-vs-mult"/>
+    <w:bookmarkEnd w:id="132"/>
+    <w:bookmarkStart w:id="134" w:name="rem-tarski-identities"/>
     <w:p>
       <w:pPr>
         <w:pStyle w:val="FirstParagraph"/>
       </w:pPr>
       <w:r>
         <w:rPr>
-          <w:b/>
-          <w:bCs/>
-        </w:rPr>
-        <w:t xml:space="preserve">Exercise 9</w:t>
-      </w:r>
-      <w:r>
-        <w:t xml:space="preserve"> </w:t>
-      </w:r>
-      <w:r>
-        <w:t xml:space="preserve">For</w:t>
-      </w:r>
-      <w:r>
-        <w:t xml:space="preserve"> </w:t>
-      </w:r>
-      <m:oMath>
-        <m:r>
-          <m:t>b</m:t>
-        </m:r>
-        <m:r>
-          <m:rPr>
-            <m:sty m:val="p"/>
-          </m:rPr>
-          <m:t>,</m:t>
-        </m:r>
-        <m:r>
-          <m:t>c</m:t>
-        </m:r>
-        <m:r>
-          <m:rPr>
-            <m:sty m:val="p"/>
-          </m:rPr>
-          <m:t>∈</m:t>
-        </m:r>
-        <m:r>
-          <m:rPr>
-            <m:scr m:val="double-struck"/>
-            <m:sty m:val="p"/>
-          </m:rPr>
-          <m:t>R</m:t>
-        </m:r>
-      </m:oMath>
-      <w:r>
-        <w:t xml:space="preserve">, when does</w:t>
-      </w:r>
-      <w:r>
-        <w:t xml:space="preserve"> </w:t>
-      </w:r>
-      <m:oMath>
-        <m:sSup>
-          <m:e>
-            <m:r>
-              <m:t>b</m:t>
-            </m:r>
-          </m:e>
-          <m:sup>
-            <m:r>
-              <m:t>c</m:t>
-            </m:r>
-          </m:sup>
-        </m:sSup>
-        <m:r>
-          <m:rPr>
-            <m:sty m:val="p"/>
-          </m:rPr>
-          <m:t>=</m:t>
-        </m:r>
-        <m:r>
-          <m:t>b</m:t>
-        </m:r>
-        <m:r>
-          <m:t>c</m:t>
-        </m:r>
-      </m:oMath>
-      <w:r>
-        <w:t xml:space="preserve">?</w:t>
-      </w:r>
-    </w:p>
-    <w:bookmarkEnd w:id="128"/>
-    <w:bookmarkStart w:id="131" w:name="sol-exp-vs-mult"/>
-    <w:p>
-      <w:pPr>
-        <w:pStyle w:val="BodyText"/>
-      </w:pPr>
-      <w:r>
-        <w:rPr>
           <w:i/>
           <w:iCs/>
         </w:rPr>
-        <w:t xml:space="preserve">Solution 9</w:t>
-      </w:r>
-      <w:r>
-        <w:t xml:space="preserve">. </w:t>
-      </w:r>
-      <w:r>
-        <w:t xml:space="preserve">We only count a pair</w:t>
-      </w:r>
-      <w:r>
-        <w:t xml:space="preserve"> </w:t>
-      </w:r>
-      <m:oMath>
-        <m:r>
-          <m:rPr>
-            <m:sty m:val="p"/>
-          </m:rPr>
-          <m:t>(</m:t>
-        </m:r>
-        <m:r>
-          <m:t>b</m:t>
-        </m:r>
-        <m:r>
-          <m:rPr>
-            <m:sty m:val="p"/>
-          </m:rPr>
-          <m:t>,</m:t>
-        </m:r>
-        <m:r>
-          <m:t>c</m:t>
-        </m:r>
-        <m:r>
-          <m:rPr>
-            <m:sty m:val="p"/>
-          </m:rPr>
-          <m:t>)</m:t>
-        </m:r>
-      </m:oMath>
-      <w:r>
-        <w:t xml:space="preserve"> </w:t>
-      </w:r>
-      <w:r>
-        <w:t xml:space="preserve">when</w:t>
-      </w:r>
-      <w:r>
-        <w:t xml:space="preserve"> </w:t>
-      </w:r>
-      <m:oMath>
-        <m:sSup>
-          <m:e>
-            <m:r>
-              <m:t>b</m:t>
-            </m:r>
-          </m:e>
-          <m:sup>
-            <m:r>
-              <m:t>c</m:t>
-            </m:r>
-          </m:sup>
-        </m:sSup>
-      </m:oMath>
-      <w:r>
-        <w:t xml:space="preserve"> </w:t>
-      </w:r>
-      <w:r>
-        <w:t xml:space="preserve">is a real number,</w:t>
-      </w:r>
-      <w:r>
-        <w:t xml:space="preserve"> </w:t>
-      </w:r>
-      <w:r>
-        <w:t xml:space="preserve">so for</w:t>
-      </w:r>
-      <w:r>
-        <w:t xml:space="preserve"> </w:t>
-      </w:r>
-      <m:oMath>
-        <m:r>
-          <m:t>b</m:t>
-        </m:r>
-        <m:r>
-          <m:rPr>
-            <m:sty m:val="p"/>
-          </m:rPr>
-          <m:t>&lt;</m:t>
-        </m:r>
-        <m:r>
-          <m:t>0</m:t>
-        </m:r>
-      </m:oMath>
-      <w:r>
-        <w:t xml:space="preserve"> </w:t>
-      </w:r>
-      <w:r>
-        <w:t xml:space="preserve">we only consider integer</w:t>
-      </w:r>
-      <w:r>
-        <w:t xml:space="preserve"> </w:t>
-      </w:r>
-      <m:oMath>
-        <m:r>
-          <m:t>c</m:t>
-        </m:r>
-      </m:oMath>
-      <w:r>
-        <w:t xml:space="preserve"> </w:t>
-      </w:r>
-      <w:r>
-        <w:t xml:space="preserve">(R agrees:</w:t>
-      </w:r>
-      <w:r>
-        <w:t xml:space="preserve"> </w:t>
-      </w:r>
-      <w:r>
-        <w:rPr>
-          <w:rStyle w:val="VerbatimChar"/>
-        </w:rPr>
-        <w:t xml:space="preserve">(-8)^(1/3)</w:t>
-      </w:r>
-      <w:r>
-        <w:t xml:space="preserve"> </w:t>
-      </w:r>
-      <w:r>
-        <w:t xml:space="preserve">is</w:t>
-      </w:r>
-      <w:r>
-        <w:t xml:space="preserve"> </w:t>
-      </w:r>
-      <w:r>
-        <w:rPr>
-          <w:rStyle w:val="VerbatimChar"/>
-        </w:rPr>
-        <w:t xml:space="preserve">NaN</w:t>
-      </w:r>
-      <w:r>
-        <w:t xml:space="preserve">).</w:t>
-      </w:r>
-      <w:r>
-        <w:t xml:space="preserve"> </w:t>
-      </w:r>
-      <w:r>
-        <w:t xml:space="preserve">With that convention,</w:t>
-      </w:r>
-      <w:r>
-        <w:t xml:space="preserve"> </w:t>
-      </w:r>
-      <m:oMath>
-        <m:r>
-          <m:t>b</m:t>
-        </m:r>
-        <m:r>
-          <m:t>c</m:t>
-        </m:r>
-        <m:r>
-          <m:rPr>
-            <m:sty m:val="p"/>
-          </m:rPr>
-          <m:t>=</m:t>
-        </m:r>
-        <m:sSup>
-          <m:e>
-            <m:r>
-              <m:t>b</m:t>
-            </m:r>
-          </m:e>
-          <m:sup>
-            <m:r>
-              <m:t>c</m:t>
-            </m:r>
-          </m:sup>
-        </m:sSup>
-      </m:oMath>
-      <w:r>
-        <w:t xml:space="preserve"> </w:t>
-      </w:r>
-      <w:r>
-        <w:t xml:space="preserve">in each of the following cases:</w:t>
+        <w:t xml:space="preserve">Remark 13</w:t>
+      </w:r>
+      <w:r>
+        <w:t xml:space="preserve"> (Tarski’s high school identities). </w:t>
+      </w:r>
+      <w:r>
+        <w:t xml:space="preserve">Restricted to positive integers,</w:t>
+      </w:r>
+      <w:r>
+        <w:t xml:space="preserve"> </w:t>
+      </w:r>
+      <w:r>
+        <w:t xml:space="preserve">the following results are</w:t>
+      </w:r>
+      <w:r>
+        <w:t xml:space="preserve"> </w:t>
+      </w:r>
+      <w:hyperlink r:id="rId133">
+        <w:r>
+          <w:rPr>
+            <w:rStyle w:val="Hyperlink"/>
+          </w:rPr>
+          <w:t xml:space="preserve">Tarski’s eleven</w:t>
+        </w:r>
+        <w:r>
+          <w:rPr>
+            <w:rStyle w:val="Hyperlink"/>
+          </w:rPr>
+          <w:t xml:space="preserve"> </w:t>
+        </w:r>
+        <w:r>
+          <w:rPr>
+            <w:rStyle w:val="Hyperlink"/>
+          </w:rPr>
+          <w:t xml:space="preserve">“high school”</w:t>
+        </w:r>
+        <w:r>
+          <w:rPr>
+            <w:rStyle w:val="Hyperlink"/>
+          </w:rPr>
+          <w:t xml:space="preserve"> </w:t>
+        </w:r>
+        <w:r>
+          <w:rPr>
+            <w:rStyle w:val="Hyperlink"/>
+          </w:rPr>
+          <w:t xml:space="preserve">identities</w:t>
+        </w:r>
+      </w:hyperlink>
+      <w:r>
+        <w:t xml:space="preserve">:</w:t>
       </w:r>
     </w:p>
     <w:p>
@@ -33917,33 +34740,39 @@
           <w:numId w:val="1025"/>
         </w:numPr>
       </w:pPr>
-      <m:oMath>
-        <m:r>
-          <m:t>c</m:t>
-        </m:r>
-        <m:r>
-          <m:rPr>
-            <m:sty m:val="p"/>
-          </m:rPr>
-          <m:t>=</m:t>
-        </m:r>
-        <m:r>
-          <m:t>1</m:t>
-        </m:r>
-      </m:oMath>
-      <w:r>
-        <w:t xml:space="preserve">, for every</w:t>
-      </w:r>
-      <w:r>
-        <w:t xml:space="preserve"> </w:t>
-      </w:r>
-      <m:oMath>
-        <m:r>
-          <m:t>b</m:t>
-        </m:r>
-      </m:oMath>
-      <w:r>
-        <w:t xml:space="preserve">.</w:t>
+      <w:r>
+        <w:t xml:space="preserve">sums are symmetric and associative</w:t>
+      </w:r>
+      <w:r>
+        <w:t xml:space="preserve"> </w:t>
+      </w:r>
+      <w:r>
+        <w:t xml:space="preserve">(</w:t>
+      </w:r>
+      <w:hyperlink w:anchor="thm-sum-symmetric">
+        <w:r>
+          <w:rPr>
+            <w:rStyle w:val="Hyperlink"/>
+          </w:rPr>
+          <w:t xml:space="preserve">Theorem 9</w:t>
+        </w:r>
+      </w:hyperlink>
+      <w:r>
+        <w:t xml:space="preserve">,</w:t>
+      </w:r>
+      <w:r>
+        <w:t xml:space="preserve"> </w:t>
+      </w:r>
+      <w:hyperlink w:anchor="thm-sum-assoc">
+        <w:r>
+          <w:rPr>
+            <w:rStyle w:val="Hyperlink"/>
+          </w:rPr>
+          <w:t xml:space="preserve">Theorem 10</w:t>
+        </w:r>
+      </w:hyperlink>
+      <w:r>
+        <w:t xml:space="preserve">);</w:t>
       </w:r>
     </w:p>
     <w:p>
@@ -33954,179 +34783,73 @@
           <w:numId w:val="1025"/>
         </w:numPr>
       </w:pPr>
-      <m:oMath>
-        <m:r>
-          <m:t>b</m:t>
-        </m:r>
-        <m:r>
-          <m:rPr>
-            <m:sty m:val="p"/>
-          </m:rPr>
-          <m:t>=</m:t>
-        </m:r>
-        <m:r>
-          <m:t>0</m:t>
-        </m:r>
-      </m:oMath>
-      <w:r>
-        <w:t xml:space="preserve"> </w:t>
-      </w:r>
-      <w:r>
-        <w:t xml:space="preserve">and</w:t>
-      </w:r>
-      <w:r>
-        <w:t xml:space="preserve"> </w:t>
-      </w:r>
-      <m:oMath>
-        <m:r>
-          <m:t>c</m:t>
-        </m:r>
-        <m:r>
-          <m:rPr>
-            <m:sty m:val="p"/>
-          </m:rPr>
-          <m:t>&gt;</m:t>
-        </m:r>
-        <m:r>
-          <m:t>0</m:t>
-        </m:r>
-      </m:oMath>
+      <w:r>
+        <w:t xml:space="preserve">multiplying by 1 changes nothing, products are symmetric and associative,</w:t>
+      </w:r>
+      <w:r>
+        <w:t xml:space="preserve"> </w:t>
+      </w:r>
+      <w:r>
+        <w:t xml:space="preserve">and multiplication is distributive</w:t>
+      </w:r>
+      <w:r>
+        <w:t xml:space="preserve"> </w:t>
+      </w:r>
+      <w:r>
+        <w:t xml:space="preserve">(</w:t>
+      </w:r>
+      <w:hyperlink w:anchor="thm-mult-one">
+        <w:r>
+          <w:rPr>
+            <w:rStyle w:val="Hyperlink"/>
+          </w:rPr>
+          <w:t xml:space="preserve">Theorem 11</w:t>
+        </w:r>
+      </w:hyperlink>
       <w:r>
         <w:t xml:space="preserve">,</w:t>
       </w:r>
       <w:r>
         <w:t xml:space="preserve"> </w:t>
       </w:r>
-      <w:r>
-        <w:t xml:space="preserve">since then</w:t>
-      </w:r>
-      <w:r>
-        <w:t xml:space="preserve"> </w:t>
-      </w:r>
-      <m:oMath>
-        <m:sSup>
-          <m:e>
-            <m:r>
-              <m:t>b</m:t>
-            </m:r>
-          </m:e>
-          <m:sup>
-            <m:r>
-              <m:t>c</m:t>
-            </m:r>
-          </m:sup>
-        </m:sSup>
-        <m:r>
-          <m:rPr>
-            <m:sty m:val="p"/>
-          </m:rPr>
-          <m:t>=</m:t>
-        </m:r>
-        <m:r>
-          <m:t>0</m:t>
-        </m:r>
-        <m:r>
-          <m:rPr>
-            <m:sty m:val="p"/>
-          </m:rPr>
-          <m:t>=</m:t>
-        </m:r>
-        <m:r>
-          <m:t>b</m:t>
-        </m:r>
-        <m:r>
-          <m:t>c</m:t>
-        </m:r>
-      </m:oMath>
-      <w:r>
-        <w:t xml:space="preserve">.</w:t>
-      </w:r>
-      <w:r>
-        <w:t xml:space="preserve"> </w:t>
-      </w:r>
-      <w:r>
-        <w:t xml:space="preserve">(</w:t>
-      </w:r>
-      <m:oMath>
-        <m:r>
-          <m:t>b</m:t>
-        </m:r>
-        <m:r>
-          <m:rPr>
-            <m:sty m:val="p"/>
-          </m:rPr>
-          <m:t>=</m:t>
-        </m:r>
-        <m:r>
-          <m:t>0</m:t>
-        </m:r>
-      </m:oMath>
-      <w:r>
-        <w:t xml:space="preserve"> </w:t>
-      </w:r>
-      <w:r>
-        <w:t xml:space="preserve">and</w:t>
-      </w:r>
-      <w:r>
-        <w:t xml:space="preserve"> </w:t>
-      </w:r>
-      <m:oMath>
-        <m:r>
-          <m:t>c</m:t>
-        </m:r>
-        <m:r>
-          <m:rPr>
-            <m:sty m:val="p"/>
-          </m:rPr>
-          <m:t>=</m:t>
-        </m:r>
-        <m:r>
-          <m:t>0</m:t>
-        </m:r>
-      </m:oMath>
-      <w:r>
-        <w:t xml:space="preserve"> </w:t>
-      </w:r>
-      <w:r>
-        <w:t xml:space="preserve">fails, since</w:t>
-      </w:r>
-      <w:r>
-        <w:t xml:space="preserve"> </w:t>
-      </w:r>
-      <m:oMath>
-        <m:sSup>
-          <m:e>
-            <m:r>
-              <m:t>0</m:t>
-            </m:r>
-          </m:e>
-          <m:sup>
-            <m:r>
-              <m:t>0</m:t>
-            </m:r>
-          </m:sup>
-        </m:sSup>
-        <m:r>
-          <m:rPr>
-            <m:sty m:val="p"/>
-          </m:rPr>
-          <m:t>=</m:t>
-        </m:r>
-        <m:r>
-          <m:t>1</m:t>
-        </m:r>
-        <m:r>
-          <m:rPr>
-            <m:sty m:val="p"/>
-          </m:rPr>
-          <m:t>≠</m:t>
-        </m:r>
-        <m:r>
-          <m:t>0</m:t>
-        </m:r>
-      </m:oMath>
-      <w:r>
-        <w:t xml:space="preserve">.)</w:t>
+      <w:hyperlink w:anchor="thm-prod-symmetric">
+        <w:r>
+          <w:rPr>
+            <w:rStyle w:val="Hyperlink"/>
+          </w:rPr>
+          <w:t xml:space="preserve">Theorem 12</w:t>
+        </w:r>
+      </w:hyperlink>
+      <w:r>
+        <w:t xml:space="preserve">,</w:t>
+      </w:r>
+      <w:r>
+        <w:t xml:space="preserve"> </w:t>
+      </w:r>
+      <w:hyperlink w:anchor="thm-prod-assoc">
+        <w:r>
+          <w:rPr>
+            <w:rStyle w:val="Hyperlink"/>
+          </w:rPr>
+          <w:t xml:space="preserve">Theorem 13</w:t>
+        </w:r>
+      </w:hyperlink>
+      <w:r>
+        <w:t xml:space="preserve">,</w:t>
+      </w:r>
+      <w:r>
+        <w:t xml:space="preserve"> </w:t>
+      </w:r>
+      <w:hyperlink w:anchor="thm-mult-distr">
+        <w:r>
+          <w:rPr>
+            <w:rStyle w:val="Hyperlink"/>
+          </w:rPr>
+          <w:t xml:space="preserve">Theorem 15</w:t>
+        </w:r>
+      </w:hyperlink>
+      <w:r>
+        <w:t xml:space="preserve">);</w:t>
       </w:r>
     </w:p>
     <w:p>
@@ -34135,6 +34858,721 @@
         <w:numPr>
           <w:ilvl w:val="0"/>
           <w:numId w:val="1025"/>
+        </w:numPr>
+      </w:pPr>
+      <m:oMath>
+        <m:sSup>
+          <m:e>
+            <m:r>
+              <m:t>1</m:t>
+            </m:r>
+          </m:e>
+          <m:sup>
+            <m:r>
+              <m:t>b</m:t>
+            </m:r>
+          </m:sup>
+        </m:sSup>
+        <m:r>
+          <m:rPr>
+            <m:sty m:val="p"/>
+          </m:rPr>
+          <m:t>=</m:t>
+        </m:r>
+        <m:r>
+          <m:t>1</m:t>
+        </m:r>
+      </m:oMath>
+      <w:r>
+        <w:t xml:space="preserve">,</w:t>
+      </w:r>
+      <w:r>
+        <w:t xml:space="preserve"> </w:t>
+      </w:r>
+      <m:oMath>
+        <m:sSup>
+          <m:e>
+            <m:r>
+              <m:t>a</m:t>
+            </m:r>
+          </m:e>
+          <m:sup>
+            <m:r>
+              <m:t>1</m:t>
+            </m:r>
+          </m:sup>
+        </m:sSup>
+        <m:r>
+          <m:rPr>
+            <m:sty m:val="p"/>
+          </m:rPr>
+          <m:t>=</m:t>
+        </m:r>
+        <m:r>
+          <m:t>a</m:t>
+        </m:r>
+      </m:oMath>
+      <w:r>
+        <w:t xml:space="preserve">, and the power of a sum, of a product, and of a power</w:t>
+      </w:r>
+      <w:r>
+        <w:t xml:space="preserve"> </w:t>
+      </w:r>
+      <w:r>
+        <w:t xml:space="preserve">(</w:t>
+      </w:r>
+      <w:hyperlink w:anchor="thm-power-one">
+        <w:r>
+          <w:rPr>
+            <w:rStyle w:val="Hyperlink"/>
+          </w:rPr>
+          <w:t xml:space="preserve">Theorem 23</w:t>
+        </w:r>
+      </w:hyperlink>
+      <w:r>
+        <w:t xml:space="preserve">,</w:t>
+      </w:r>
+      <w:r>
+        <w:t xml:space="preserve"> </w:t>
+      </w:r>
+      <w:hyperlink w:anchor="thm-power-sum">
+        <w:r>
+          <w:rPr>
+            <w:rStyle w:val="Hyperlink"/>
+          </w:rPr>
+          <w:t xml:space="preserve">Theorem 24</w:t>
+        </w:r>
+      </w:hyperlink>
+      <w:r>
+        <w:t xml:space="preserve">,</w:t>
+      </w:r>
+      <w:r>
+        <w:t xml:space="preserve"> </w:t>
+      </w:r>
+      <w:hyperlink w:anchor="thm-power-product">
+        <w:r>
+          <w:rPr>
+            <w:rStyle w:val="Hyperlink"/>
+          </w:rPr>
+          <w:t xml:space="preserve">Theorem 25</w:t>
+        </w:r>
+      </w:hyperlink>
+      <w:r>
+        <w:t xml:space="preserve">,</w:t>
+      </w:r>
+      <w:r>
+        <w:t xml:space="preserve"> </w:t>
+      </w:r>
+      <w:hyperlink w:anchor="thm-double-exp">
+        <w:r>
+          <w:rPr>
+            <w:rStyle w:val="Hyperlink"/>
+          </w:rPr>
+          <w:t xml:space="preserve">Theorem 26</w:t>
+        </w:r>
+      </w:hyperlink>
+      <w:r>
+        <w:t xml:space="preserve">).</w:t>
+      </w:r>
+    </w:p>
+    <w:bookmarkEnd w:id="134"/>
+    <w:bookmarkStart w:id="135" w:name="rem-tarski-incomplete"/>
+    <w:p>
+      <w:pPr>
+        <w:pStyle w:val="FirstParagraph"/>
+      </w:pPr>
+      <w:r>
+        <w:rPr>
+          <w:i/>
+          <w:iCs/>
+        </w:rPr>
+        <w:t xml:space="preserve">Remark 14</w:t>
+      </w:r>
+      <w:r>
+        <w:t xml:space="preserve"> (Tarski’s identities are not complete). </w:t>
+      </w:r>
+      <w:r>
+        <w:t xml:space="preserve">Tarski asked whether every identity in</w:t>
+      </w:r>
+      <w:r>
+        <w:t xml:space="preserve"> </w:t>
+      </w:r>
+      <m:oMath>
+        <m:r>
+          <m:rPr>
+            <m:sty m:val="p"/>
+          </m:rPr>
+          <m:t>+</m:t>
+        </m:r>
+      </m:oMath>
+      <w:r>
+        <w:t xml:space="preserve">,</w:t>
+      </w:r>
+      <w:r>
+        <w:t xml:space="preserve"> </w:t>
+      </w:r>
+      <m:oMath>
+        <m:r>
+          <m:rPr>
+            <m:sty m:val="p"/>
+          </m:rPr>
+          <m:t>×</m:t>
+        </m:r>
+      </m:oMath>
+      <w:r>
+        <w:t xml:space="preserve">, exponentiation and 1</w:t>
+      </w:r>
+      <w:r>
+        <w:t xml:space="preserve"> </w:t>
+      </w:r>
+      <w:r>
+        <w:t xml:space="preserve">that is true for all positive integers</w:t>
+      </w:r>
+      <w:r>
+        <w:t xml:space="preserve"> </w:t>
+      </w:r>
+      <w:r>
+        <w:t xml:space="preserve">can be derived from the eleven identities in</w:t>
+      </w:r>
+      <w:r>
+        <w:t xml:space="preserve"> </w:t>
+      </w:r>
+      <w:hyperlink w:anchor="rem-tarski-identities">
+        <w:r>
+          <w:rPr>
+            <w:rStyle w:val="Hyperlink"/>
+          </w:rPr>
+          <w:t xml:space="preserve">Remark 13</w:t>
+        </w:r>
+      </w:hyperlink>
+      <w:r>
+        <w:t xml:space="preserve">.</w:t>
+      </w:r>
+      <w:r>
+        <w:t xml:space="preserve"> </w:t>
+      </w:r>
+      <w:r>
+        <w:t xml:space="preserve">It cannot:</w:t>
+      </w:r>
+      <w:r>
+        <w:t xml:space="preserve"> </w:t>
+      </w:r>
+      <w:r>
+        <w:t xml:space="preserve">Wilkie found an identity that is true for all positive integers</w:t>
+      </w:r>
+      <w:r>
+        <w:t xml:space="preserve"> </w:t>
+      </w:r>
+      <w:r>
+        <w:t xml:space="preserve">but does not follow from them.</w:t>
+      </w:r>
+      <w:r>
+        <w:t xml:space="preserve"> </w:t>
+      </w:r>
+      <w:r>
+        <w:t xml:space="preserve">So this list is a useful core, not a complete rulebook.</w:t>
+      </w:r>
+    </w:p>
+    <w:bookmarkEnd w:id="135"/>
+    <w:bookmarkStart w:id="136" w:name="exr-exp-vs-mult"/>
+    <w:p>
+      <w:pPr>
+        <w:pStyle w:val="BodyText"/>
+      </w:pPr>
+      <w:r>
+        <w:rPr>
+          <w:b/>
+          <w:bCs/>
+        </w:rPr>
+        <w:t xml:space="preserve">Exercise 9</w:t>
+      </w:r>
+      <w:r>
+        <w:t xml:space="preserve"> </w:t>
+      </w:r>
+      <w:r>
+        <w:t xml:space="preserve">For</w:t>
+      </w:r>
+      <w:r>
+        <w:t xml:space="preserve"> </w:t>
+      </w:r>
+      <m:oMath>
+        <m:r>
+          <m:t>b</m:t>
+        </m:r>
+        <m:r>
+          <m:rPr>
+            <m:sty m:val="p"/>
+          </m:rPr>
+          <m:t>,</m:t>
+        </m:r>
+        <m:r>
+          <m:t>c</m:t>
+        </m:r>
+        <m:r>
+          <m:rPr>
+            <m:sty m:val="p"/>
+          </m:rPr>
+          <m:t>∈</m:t>
+        </m:r>
+        <m:r>
+          <m:rPr>
+            <m:scr m:val="double-struck"/>
+            <m:sty m:val="p"/>
+          </m:rPr>
+          <m:t>R</m:t>
+        </m:r>
+      </m:oMath>
+      <w:r>
+        <w:t xml:space="preserve">, when does</w:t>
+      </w:r>
+      <w:r>
+        <w:t xml:space="preserve"> </w:t>
+      </w:r>
+      <m:oMath>
+        <m:sSup>
+          <m:e>
+            <m:r>
+              <m:t>b</m:t>
+            </m:r>
+          </m:e>
+          <m:sup>
+            <m:r>
+              <m:t>c</m:t>
+            </m:r>
+          </m:sup>
+        </m:sSup>
+        <m:r>
+          <m:rPr>
+            <m:sty m:val="p"/>
+          </m:rPr>
+          <m:t>=</m:t>
+        </m:r>
+        <m:r>
+          <m:t>b</m:t>
+        </m:r>
+        <m:r>
+          <m:t>c</m:t>
+        </m:r>
+      </m:oMath>
+      <w:r>
+        <w:t xml:space="preserve">?</w:t>
+      </w:r>
+    </w:p>
+    <w:bookmarkEnd w:id="136"/>
+    <w:bookmarkStart w:id="139" w:name="sol-exp-vs-mult"/>
+    <w:p>
+      <w:pPr>
+        <w:pStyle w:val="BodyText"/>
+      </w:pPr>
+      <w:r>
+        <w:rPr>
+          <w:i/>
+          <w:iCs/>
+        </w:rPr>
+        <w:t xml:space="preserve">Solution 9</w:t>
+      </w:r>
+      <w:r>
+        <w:t xml:space="preserve">. </w:t>
+      </w:r>
+      <w:r>
+        <w:t xml:space="preserve">We only count a pair</w:t>
+      </w:r>
+      <w:r>
+        <w:t xml:space="preserve"> </w:t>
+      </w:r>
+      <m:oMath>
+        <m:r>
+          <m:rPr>
+            <m:sty m:val="p"/>
+          </m:rPr>
+          <m:t>(</m:t>
+        </m:r>
+        <m:r>
+          <m:t>b</m:t>
+        </m:r>
+        <m:r>
+          <m:rPr>
+            <m:sty m:val="p"/>
+          </m:rPr>
+          <m:t>,</m:t>
+        </m:r>
+        <m:r>
+          <m:t>c</m:t>
+        </m:r>
+        <m:r>
+          <m:rPr>
+            <m:sty m:val="p"/>
+          </m:rPr>
+          <m:t>)</m:t>
+        </m:r>
+      </m:oMath>
+      <w:r>
+        <w:t xml:space="preserve"> </w:t>
+      </w:r>
+      <w:r>
+        <w:t xml:space="preserve">when</w:t>
+      </w:r>
+      <w:r>
+        <w:t xml:space="preserve"> </w:t>
+      </w:r>
+      <m:oMath>
+        <m:sSup>
+          <m:e>
+            <m:r>
+              <m:t>b</m:t>
+            </m:r>
+          </m:e>
+          <m:sup>
+            <m:r>
+              <m:t>c</m:t>
+            </m:r>
+          </m:sup>
+        </m:sSup>
+      </m:oMath>
+      <w:r>
+        <w:t xml:space="preserve"> </w:t>
+      </w:r>
+      <w:r>
+        <w:t xml:space="preserve">is a real number,</w:t>
+      </w:r>
+      <w:r>
+        <w:t xml:space="preserve"> </w:t>
+      </w:r>
+      <w:r>
+        <w:t xml:space="preserve">so for</w:t>
+      </w:r>
+      <w:r>
+        <w:t xml:space="preserve"> </w:t>
+      </w:r>
+      <m:oMath>
+        <m:r>
+          <m:t>b</m:t>
+        </m:r>
+        <m:r>
+          <m:rPr>
+            <m:sty m:val="p"/>
+          </m:rPr>
+          <m:t>&lt;</m:t>
+        </m:r>
+        <m:r>
+          <m:t>0</m:t>
+        </m:r>
+      </m:oMath>
+      <w:r>
+        <w:t xml:space="preserve"> </w:t>
+      </w:r>
+      <w:r>
+        <w:t xml:space="preserve">we only consider integer</w:t>
+      </w:r>
+      <w:r>
+        <w:t xml:space="preserve"> </w:t>
+      </w:r>
+      <m:oMath>
+        <m:r>
+          <m:t>c</m:t>
+        </m:r>
+      </m:oMath>
+      <w:r>
+        <w:t xml:space="preserve"> </w:t>
+      </w:r>
+      <w:r>
+        <w:t xml:space="preserve">(R agrees:</w:t>
+      </w:r>
+      <w:r>
+        <w:t xml:space="preserve"> </w:t>
+      </w:r>
+      <w:r>
+        <w:rPr>
+          <w:rStyle w:val="VerbatimChar"/>
+        </w:rPr>
+        <w:t xml:space="preserve">(-8)^(1/3)</w:t>
+      </w:r>
+      <w:r>
+        <w:t xml:space="preserve"> </w:t>
+      </w:r>
+      <w:r>
+        <w:t xml:space="preserve">is</w:t>
+      </w:r>
+      <w:r>
+        <w:t xml:space="preserve"> </w:t>
+      </w:r>
+      <w:r>
+        <w:rPr>
+          <w:rStyle w:val="VerbatimChar"/>
+        </w:rPr>
+        <w:t xml:space="preserve">NaN</w:t>
+      </w:r>
+      <w:r>
+        <w:t xml:space="preserve">).</w:t>
+      </w:r>
+      <w:r>
+        <w:t xml:space="preserve"> </w:t>
+      </w:r>
+      <w:r>
+        <w:t xml:space="preserve">With that convention,</w:t>
+      </w:r>
+      <w:r>
+        <w:t xml:space="preserve"> </w:t>
+      </w:r>
+      <m:oMath>
+        <m:r>
+          <m:t>b</m:t>
+        </m:r>
+        <m:r>
+          <m:t>c</m:t>
+        </m:r>
+        <m:r>
+          <m:rPr>
+            <m:sty m:val="p"/>
+          </m:rPr>
+          <m:t>=</m:t>
+        </m:r>
+        <m:sSup>
+          <m:e>
+            <m:r>
+              <m:t>b</m:t>
+            </m:r>
+          </m:e>
+          <m:sup>
+            <m:r>
+              <m:t>c</m:t>
+            </m:r>
+          </m:sup>
+        </m:sSup>
+      </m:oMath>
+      <w:r>
+        <w:t xml:space="preserve"> </w:t>
+      </w:r>
+      <w:r>
+        <w:t xml:space="preserve">in each of the following cases:</w:t>
+      </w:r>
+    </w:p>
+    <w:p>
+      <w:pPr>
+        <w:pStyle w:val="Compact"/>
+        <w:numPr>
+          <w:ilvl w:val="0"/>
+          <w:numId w:val="1026"/>
+        </w:numPr>
+      </w:pPr>
+      <m:oMath>
+        <m:r>
+          <m:t>c</m:t>
+        </m:r>
+        <m:r>
+          <m:rPr>
+            <m:sty m:val="p"/>
+          </m:rPr>
+          <m:t>=</m:t>
+        </m:r>
+        <m:r>
+          <m:t>1</m:t>
+        </m:r>
+      </m:oMath>
+      <w:r>
+        <w:t xml:space="preserve">, for every</w:t>
+      </w:r>
+      <w:r>
+        <w:t xml:space="preserve"> </w:t>
+      </w:r>
+      <m:oMath>
+        <m:r>
+          <m:t>b</m:t>
+        </m:r>
+      </m:oMath>
+      <w:r>
+        <w:t xml:space="preserve">.</w:t>
+      </w:r>
+    </w:p>
+    <w:p>
+      <w:pPr>
+        <w:pStyle w:val="Compact"/>
+        <w:numPr>
+          <w:ilvl w:val="0"/>
+          <w:numId w:val="1026"/>
+        </w:numPr>
+      </w:pPr>
+      <m:oMath>
+        <m:r>
+          <m:t>b</m:t>
+        </m:r>
+        <m:r>
+          <m:rPr>
+            <m:sty m:val="p"/>
+          </m:rPr>
+          <m:t>=</m:t>
+        </m:r>
+        <m:r>
+          <m:t>0</m:t>
+        </m:r>
+      </m:oMath>
+      <w:r>
+        <w:t xml:space="preserve"> </w:t>
+      </w:r>
+      <w:r>
+        <w:t xml:space="preserve">and</w:t>
+      </w:r>
+      <w:r>
+        <w:t xml:space="preserve"> </w:t>
+      </w:r>
+      <m:oMath>
+        <m:r>
+          <m:t>c</m:t>
+        </m:r>
+        <m:r>
+          <m:rPr>
+            <m:sty m:val="p"/>
+          </m:rPr>
+          <m:t>&gt;</m:t>
+        </m:r>
+        <m:r>
+          <m:t>0</m:t>
+        </m:r>
+      </m:oMath>
+      <w:r>
+        <w:t xml:space="preserve">,</w:t>
+      </w:r>
+      <w:r>
+        <w:t xml:space="preserve"> </w:t>
+      </w:r>
+      <w:r>
+        <w:t xml:space="preserve">since then</w:t>
+      </w:r>
+      <w:r>
+        <w:t xml:space="preserve"> </w:t>
+      </w:r>
+      <m:oMath>
+        <m:sSup>
+          <m:e>
+            <m:r>
+              <m:t>b</m:t>
+            </m:r>
+          </m:e>
+          <m:sup>
+            <m:r>
+              <m:t>c</m:t>
+            </m:r>
+          </m:sup>
+        </m:sSup>
+        <m:r>
+          <m:rPr>
+            <m:sty m:val="p"/>
+          </m:rPr>
+          <m:t>=</m:t>
+        </m:r>
+        <m:r>
+          <m:t>0</m:t>
+        </m:r>
+        <m:r>
+          <m:rPr>
+            <m:sty m:val="p"/>
+          </m:rPr>
+          <m:t>=</m:t>
+        </m:r>
+        <m:r>
+          <m:t>b</m:t>
+        </m:r>
+        <m:r>
+          <m:t>c</m:t>
+        </m:r>
+      </m:oMath>
+      <w:r>
+        <w:t xml:space="preserve">.</w:t>
+      </w:r>
+      <w:r>
+        <w:t xml:space="preserve"> </w:t>
+      </w:r>
+      <w:r>
+        <w:t xml:space="preserve">(</w:t>
+      </w:r>
+      <m:oMath>
+        <m:r>
+          <m:t>b</m:t>
+        </m:r>
+        <m:r>
+          <m:rPr>
+            <m:sty m:val="p"/>
+          </m:rPr>
+          <m:t>=</m:t>
+        </m:r>
+        <m:r>
+          <m:t>0</m:t>
+        </m:r>
+      </m:oMath>
+      <w:r>
+        <w:t xml:space="preserve"> </w:t>
+      </w:r>
+      <w:r>
+        <w:t xml:space="preserve">and</w:t>
+      </w:r>
+      <w:r>
+        <w:t xml:space="preserve"> </w:t>
+      </w:r>
+      <m:oMath>
+        <m:r>
+          <m:t>c</m:t>
+        </m:r>
+        <m:r>
+          <m:rPr>
+            <m:sty m:val="p"/>
+          </m:rPr>
+          <m:t>=</m:t>
+        </m:r>
+        <m:r>
+          <m:t>0</m:t>
+        </m:r>
+      </m:oMath>
+      <w:r>
+        <w:t xml:space="preserve"> </w:t>
+      </w:r>
+      <w:r>
+        <w:t xml:space="preserve">fails, since</w:t>
+      </w:r>
+      <w:r>
+        <w:t xml:space="preserve"> </w:t>
+      </w:r>
+      <m:oMath>
+        <m:sSup>
+          <m:e>
+            <m:r>
+              <m:t>0</m:t>
+            </m:r>
+          </m:e>
+          <m:sup>
+            <m:r>
+              <m:t>0</m:t>
+            </m:r>
+          </m:sup>
+        </m:sSup>
+        <m:r>
+          <m:rPr>
+            <m:sty m:val="p"/>
+          </m:rPr>
+          <m:t>=</m:t>
+        </m:r>
+        <m:r>
+          <m:t>1</m:t>
+        </m:r>
+        <m:r>
+          <m:rPr>
+            <m:sty m:val="p"/>
+          </m:rPr>
+          <m:t>≠</m:t>
+        </m:r>
+        <m:r>
+          <m:t>0</m:t>
+        </m:r>
+      </m:oMath>
+      <w:r>
+        <w:t xml:space="preserve">.)</w:t>
+      </w:r>
+    </w:p>
+    <w:p>
+      <w:pPr>
+        <w:pStyle w:val="Compact"/>
+        <w:numPr>
+          <w:ilvl w:val="0"/>
+          <w:numId w:val="1026"/>
         </w:numPr>
       </w:pPr>
       <m:oMath>
@@ -34655,7 +36093,7 @@
         <w:pStyle w:val="Compact"/>
         <w:numPr>
           <w:ilvl w:val="0"/>
-          <w:numId w:val="1025"/>
+          <w:numId w:val="1026"/>
         </w:numPr>
       </w:pPr>
       <m:oMath>
@@ -34913,7 +36351,7 @@
         <w:pStyle w:val="Compact"/>
         <w:numPr>
           <w:ilvl w:val="0"/>
-          <w:numId w:val="1025"/>
+          <w:numId w:val="1026"/>
         </w:numPr>
       </w:pPr>
       <m:oMath>
@@ -35505,7 +36943,7 @@
       <w:tr>
         <w:tc>
           <w:tcPr/>
-          <w:bookmarkStart w:id="129" w:name="fig-double-exponential"/>
+          <w:bookmarkStart w:id="137" w:name="fig-double-exponential"/>
           <w:p>
             <w:pPr>
               <w:pStyle w:val="Compact"/>
@@ -35572,7 +37010,7 @@
               </m:sSup>
             </m:oMath>
           </w:p>
-          <w:bookmarkEnd w:id="129"/>
+          <w:bookmarkEnd w:id="137"/>
         </w:tc>
       </w:tr>
     </w:tbl>
@@ -35597,7 +37035,7 @@
       <w:tr>
         <w:tc>
           <w:tcPr/>
-          <w:bookmarkStart w:id="130" w:name="fig-double-exponential2"/>
+          <w:bookmarkStart w:id="138" w:name="fig-double-exponential2"/>
           <w:p>
             <w:pPr>
               <w:pStyle w:val="Compact"/>
@@ -35714,12 +37152,12 @@
               <w:t xml:space="preserve">.</w:t>
             </w:r>
           </w:p>
-          <w:bookmarkEnd w:id="130"/>
+          <w:bookmarkEnd w:id="138"/>
         </w:tc>
       </w:tr>
     </w:tbl>
-    <w:bookmarkEnd w:id="131"/>
-    <w:bookmarkStart w:id="132" w:name="exr-double-exponential"/>
+    <w:bookmarkEnd w:id="139"/>
+    <w:bookmarkStart w:id="140" w:name="exr-double-exponential"/>
     <w:p>
       <w:pPr>
         <w:pStyle w:val="BodyText"/>
@@ -35878,8 +37316,8 @@
         <w:t xml:space="preserve">?</w:t>
       </w:r>
     </w:p>
-    <w:bookmarkEnd w:id="132"/>
-    <w:bookmarkStart w:id="134" w:name="sol-double-exponential"/>
+    <w:bookmarkEnd w:id="140"/>
+    <w:bookmarkStart w:id="142" w:name="sol-double-exponential"/>
     <w:p>
       <w:pPr>
         <w:pStyle w:val="BodyText"/>
@@ -36059,7 +37497,7 @@
           <w:rPr>
             <w:rStyle w:val="Hyperlink"/>
           </w:rPr>
-          <w:t xml:space="preserve">Theorem 23</w:t>
+          <w:t xml:space="preserve">Theorem 26</w:t>
         </w:r>
       </w:hyperlink>
       <w:r>
@@ -36304,7 +37742,7 @@
       <w:pPr>
         <w:pStyle w:val="BodyText"/>
       </w:pPr>
-      <w:bookmarkStart w:id="133" w:name="eq-double-exp-log-scale"/>
+      <w:bookmarkStart w:id="141" w:name="eq-double-exp-log-scale"/>
       <m:oMathPara>
         <m:oMathParaPr>
           <m:jc m:val="center"/>
@@ -36611,7 +38049,7 @@
           </m:r>
         </m:oMath>
       </m:oMathPara>
-      <w:bookmarkEnd w:id="133"/>
+      <w:bookmarkEnd w:id="141"/>
     </w:p>
     <w:p>
       <w:pPr>
@@ -36636,319 +38074,6 @@
       </w:r>
       <w:r>
         <w:t xml:space="preserve">holds exactly when</w:t>
-      </w:r>
-    </w:p>
-    <w:p>
-      <w:pPr>
-        <w:pStyle w:val="Compact"/>
-        <w:numPr>
-          <w:ilvl w:val="0"/>
-          <w:numId w:val="1026"/>
-        </w:numPr>
-      </w:pPr>
-      <m:oMath>
-        <m:r>
-          <m:t>a</m:t>
-        </m:r>
-        <m:r>
-          <m:rPr>
-            <m:sty m:val="p"/>
-          </m:rPr>
-          <m:t>=</m:t>
-        </m:r>
-        <m:r>
-          <m:t>1</m:t>
-        </m:r>
-      </m:oMath>
-      <w:r>
-        <w:t xml:space="preserve"> </w:t>
-      </w:r>
-      <w:r>
-        <w:t xml:space="preserve">(so that</w:t>
-      </w:r>
-      <w:r>
-        <w:t xml:space="preserve"> </w:t>
-      </w:r>
-      <m:oMath>
-        <m:r>
-          <m:rPr>
-            <m:sty m:val="p"/>
-          </m:rPr>
-          <m:t>log</m:t>
-        </m:r>
-        <m:r>
-          <m:t>​</m:t>
-        </m:r>
-        <m:d>
-          <m:dPr>
-            <m:begChr m:val="{"/>
-            <m:sepChr m:val=""/>
-            <m:endChr m:val="}"/>
-            <m:grow/>
-          </m:dPr>
-          <m:e>
-            <m:r>
-              <m:t>a</m:t>
-            </m:r>
-          </m:e>
-        </m:d>
-        <m:r>
-          <m:t>​</m:t>
-        </m:r>
-        <m:r>
-          <m:rPr>
-            <m:sty m:val="p"/>
-          </m:rPr>
-          <m:t>=</m:t>
-        </m:r>
-        <m:r>
-          <m:t>0</m:t>
-        </m:r>
-      </m:oMath>
-      <w:r>
-        <w:t xml:space="preserve">), or</w:t>
-      </w:r>
-    </w:p>
-    <w:p>
-      <w:pPr>
-        <w:pStyle w:val="Compact"/>
-        <w:numPr>
-          <w:ilvl w:val="0"/>
-          <w:numId w:val="1026"/>
-        </w:numPr>
-      </w:pPr>
-      <m:oMath>
-        <m:r>
-          <m:t>b</m:t>
-        </m:r>
-        <m:r>
-          <m:t>c</m:t>
-        </m:r>
-        <m:r>
-          <m:rPr>
-            <m:sty m:val="p"/>
-          </m:rPr>
-          <m:t>=</m:t>
-        </m:r>
-        <m:sSup>
-          <m:e>
-            <m:r>
-              <m:t>b</m:t>
-            </m:r>
-          </m:e>
-          <m:sup>
-            <m:r>
-              <m:t>c</m:t>
-            </m:r>
-          </m:sup>
-        </m:sSup>
-      </m:oMath>
-      <w:r>
-        <w:t xml:space="preserve"> </w:t>
-      </w:r>
-      <w:r>
-        <w:t xml:space="preserve">(see</w:t>
-      </w:r>
-      <w:r>
-        <w:t xml:space="preserve"> </w:t>
-      </w:r>
-      <w:hyperlink w:anchor="exr-exp-vs-mult">
-        <w:r>
-          <w:rPr>
-            <w:rStyle w:val="Hyperlink"/>
-          </w:rPr>
-          <w:t xml:space="preserve">Exercise 9</w:t>
-        </w:r>
-      </w:hyperlink>
-      <w:r>
-        <w:t xml:space="preserve">).</w:t>
-      </w:r>
-    </w:p>
-    <w:p>
-      <w:pPr>
-        <w:pStyle w:val="FirstParagraph"/>
-      </w:pPr>
-      <w:r>
-        <w:rPr>
-          <w:b/>
-          <w:bCs/>
-        </w:rPr>
-        <w:t xml:space="preserve">Case</w:t>
-      </w:r>
-      <w:r>
-        <w:rPr>
-          <w:b/>
-          <w:bCs/>
-        </w:rPr>
-        <w:t xml:space="preserve"> </w:t>
-      </w:r>
-      <m:oMath>
-        <m:r>
-          <m:t>a</m:t>
-        </m:r>
-        <m:r>
-          <m:rPr>
-            <m:sty m:val="p"/>
-          </m:rPr>
-          <m:t>=</m:t>
-        </m:r>
-        <m:r>
-          <m:t>0</m:t>
-        </m:r>
-      </m:oMath>
-      <w:r>
-        <w:rPr>
-          <w:b/>
-          <w:bCs/>
-        </w:rPr>
-        <w:t xml:space="preserve">.</w:t>
-      </w:r>
-      <w:r>
-        <w:t xml:space="preserve"> </w:t>
-      </w:r>
-      <w:r>
-        <w:t xml:space="preserve">Here we cannot take logarithms, so we work from the values of powers of</w:t>
-      </w:r>
-      <w:r>
-        <w:t xml:space="preserve"> </w:t>
-      </w:r>
-      <m:oMath>
-        <m:r>
-          <m:t>0</m:t>
-        </m:r>
-      </m:oMath>
-      <w:r>
-        <w:t xml:space="preserve">:</w:t>
-      </w:r>
-      <w:r>
-        <w:t xml:space="preserve"> </w:t>
-      </w:r>
-      <m:oMath>
-        <m:sSup>
-          <m:e>
-            <m:r>
-              <m:t>0</m:t>
-            </m:r>
-          </m:e>
-          <m:sup>
-            <m:r>
-              <m:t>s</m:t>
-            </m:r>
-          </m:sup>
-        </m:sSup>
-        <m:r>
-          <m:rPr>
-            <m:sty m:val="p"/>
-          </m:rPr>
-          <m:t>=</m:t>
-        </m:r>
-        <m:r>
-          <m:t>0</m:t>
-        </m:r>
-      </m:oMath>
-      <w:r>
-        <w:t xml:space="preserve"> </w:t>
-      </w:r>
-      <w:r>
-        <w:t xml:space="preserve">for</w:t>
-      </w:r>
-      <w:r>
-        <w:t xml:space="preserve"> </w:t>
-      </w:r>
-      <m:oMath>
-        <m:r>
-          <m:t>s</m:t>
-        </m:r>
-        <m:r>
-          <m:rPr>
-            <m:sty m:val="p"/>
-          </m:rPr>
-          <m:t>&gt;</m:t>
-        </m:r>
-        <m:r>
-          <m:t>0</m:t>
-        </m:r>
-      </m:oMath>
-      <w:r>
-        <w:t xml:space="preserve">,</w:t>
-      </w:r>
-      <w:r>
-        <w:t xml:space="preserve"> </w:t>
-      </w:r>
-      <m:oMath>
-        <m:sSup>
-          <m:e>
-            <m:r>
-              <m:t>0</m:t>
-            </m:r>
-          </m:e>
-          <m:sup>
-            <m:r>
-              <m:t>0</m:t>
-            </m:r>
-          </m:sup>
-        </m:sSup>
-        <m:r>
-          <m:rPr>
-            <m:sty m:val="p"/>
-          </m:rPr>
-          <m:t>=</m:t>
-        </m:r>
-        <m:r>
-          <m:t>1</m:t>
-        </m:r>
-      </m:oMath>
-      <w:r>
-        <w:t xml:space="preserve">,</w:t>
-      </w:r>
-      <w:r>
-        <w:t xml:space="preserve"> </w:t>
-      </w:r>
-      <w:r>
-        <w:t xml:space="preserve">and</w:t>
-      </w:r>
-      <w:r>
-        <w:t xml:space="preserve"> </w:t>
-      </w:r>
-      <m:oMath>
-        <m:sSup>
-          <m:e>
-            <m:r>
-              <m:t>0</m:t>
-            </m:r>
-          </m:e>
-          <m:sup>
-            <m:r>
-              <m:t>s</m:t>
-            </m:r>
-          </m:sup>
-        </m:sSup>
-      </m:oMath>
-      <w:r>
-        <w:t xml:space="preserve"> </w:t>
-      </w:r>
-      <w:r>
-        <w:t xml:space="preserve">is undefined for</w:t>
-      </w:r>
-      <w:r>
-        <w:t xml:space="preserve"> </w:t>
-      </w:r>
-      <m:oMath>
-        <m:r>
-          <m:t>s</m:t>
-        </m:r>
-        <m:r>
-          <m:rPr>
-            <m:sty m:val="p"/>
-          </m:rPr>
-          <m:t>&lt;</m:t>
-        </m:r>
-        <m:r>
-          <m:t>0</m:t>
-        </m:r>
-      </m:oMath>
-      <w:r>
-        <w:t xml:space="preserve">.</w:t>
       </w:r>
     </w:p>
     <w:p>
@@ -36959,95 +38084,67 @@
           <w:numId w:val="1027"/>
         </w:numPr>
       </w:pPr>
-      <w:r>
-        <w:t xml:space="preserve">If</w:t>
-      </w:r>
-      <w:r>
-        <w:t xml:space="preserve"> </w:t>
-      </w:r>
-      <m:oMath>
-        <m:r>
-          <m:t>b</m:t>
-        </m:r>
-        <m:r>
-          <m:rPr>
-            <m:sty m:val="p"/>
-          </m:rPr>
-          <m:t>&lt;</m:t>
+      <m:oMath>
+        <m:r>
+          <m:t>a</m:t>
+        </m:r>
+        <m:r>
+          <m:rPr>
+            <m:sty m:val="p"/>
+          </m:rPr>
+          <m:t>=</m:t>
+        </m:r>
+        <m:r>
+          <m:t>1</m:t>
+        </m:r>
+      </m:oMath>
+      <w:r>
+        <w:t xml:space="preserve"> </w:t>
+      </w:r>
+      <w:r>
+        <w:t xml:space="preserve">(so that</w:t>
+      </w:r>
+      <w:r>
+        <w:t xml:space="preserve"> </w:t>
+      </w:r>
+      <m:oMath>
+        <m:r>
+          <m:rPr>
+            <m:sty m:val="p"/>
+          </m:rPr>
+          <m:t>log</m:t>
+        </m:r>
+        <m:r>
+          <m:t>​</m:t>
+        </m:r>
+        <m:d>
+          <m:dPr>
+            <m:begChr m:val="{"/>
+            <m:sepChr m:val=""/>
+            <m:endChr m:val="}"/>
+            <m:grow/>
+          </m:dPr>
+          <m:e>
+            <m:r>
+              <m:t>a</m:t>
+            </m:r>
+          </m:e>
+        </m:d>
+        <m:r>
+          <m:t>​</m:t>
+        </m:r>
+        <m:r>
+          <m:rPr>
+            <m:sty m:val="p"/>
+          </m:rPr>
+          <m:t>=</m:t>
         </m:r>
         <m:r>
           <m:t>0</m:t>
         </m:r>
       </m:oMath>
       <w:r>
-        <w:t xml:space="preserve">, then</w:t>
-      </w:r>
-      <w:r>
-        <w:t xml:space="preserve"> </w:t>
-      </w:r>
-      <m:oMath>
-        <m:sSup>
-          <m:e>
-            <m:r>
-              <m:t>0</m:t>
-            </m:r>
-          </m:e>
-          <m:sup>
-            <m:r>
-              <m:t>b</m:t>
-            </m:r>
-          </m:sup>
-        </m:sSup>
-      </m:oMath>
-      <w:r>
-        <w:t xml:space="preserve"> </w:t>
-      </w:r>
-      <w:r>
-        <w:t xml:space="preserve">is undefined, so</w:t>
-      </w:r>
-      <w:r>
-        <w:t xml:space="preserve"> </w:t>
-      </w:r>
-      <m:oMath>
-        <m:r>
-          <m:rPr>
-            <m:sty m:val="p"/>
-          </m:rPr>
-          <m:t>(</m:t>
-        </m:r>
-        <m:sSup>
-          <m:e>
-            <m:r>
-              <m:t>a</m:t>
-            </m:r>
-          </m:e>
-          <m:sup>
-            <m:r>
-              <m:t>b</m:t>
-            </m:r>
-          </m:sup>
-        </m:sSup>
-        <m:sSup>
-          <m:e>
-            <m:r>
-              <m:rPr>
-                <m:sty m:val="p"/>
-              </m:rPr>
-              <m:t>)</m:t>
-            </m:r>
-          </m:e>
-          <m:sup>
-            <m:r>
-              <m:t>c</m:t>
-            </m:r>
-          </m:sup>
-        </m:sSup>
-      </m:oMath>
-      <w:r>
-        <w:t xml:space="preserve"> </w:t>
-      </w:r>
-      <w:r>
-        <w:t xml:space="preserve">is undefined.</w:t>
+        <w:t xml:space="preserve">), or</w:t>
       </w:r>
     </w:p>
     <w:p>
@@ -37056,6 +38153,347 @@
         <w:numPr>
           <w:ilvl w:val="0"/>
           <w:numId w:val="1027"/>
+        </w:numPr>
+      </w:pPr>
+      <m:oMath>
+        <m:r>
+          <m:t>b</m:t>
+        </m:r>
+        <m:r>
+          <m:t>c</m:t>
+        </m:r>
+        <m:r>
+          <m:rPr>
+            <m:sty m:val="p"/>
+          </m:rPr>
+          <m:t>=</m:t>
+        </m:r>
+        <m:sSup>
+          <m:e>
+            <m:r>
+              <m:t>b</m:t>
+            </m:r>
+          </m:e>
+          <m:sup>
+            <m:r>
+              <m:t>c</m:t>
+            </m:r>
+          </m:sup>
+        </m:sSup>
+      </m:oMath>
+      <w:r>
+        <w:t xml:space="preserve"> </w:t>
+      </w:r>
+      <w:r>
+        <w:t xml:space="preserve">(see</w:t>
+      </w:r>
+      <w:r>
+        <w:t xml:space="preserve"> </w:t>
+      </w:r>
+      <w:hyperlink w:anchor="exr-exp-vs-mult">
+        <w:r>
+          <w:rPr>
+            <w:rStyle w:val="Hyperlink"/>
+          </w:rPr>
+          <w:t xml:space="preserve">Exercise 9</w:t>
+        </w:r>
+      </w:hyperlink>
+      <w:r>
+        <w:t xml:space="preserve">).</w:t>
+      </w:r>
+    </w:p>
+    <w:p>
+      <w:pPr>
+        <w:pStyle w:val="FirstParagraph"/>
+      </w:pPr>
+      <w:r>
+        <w:rPr>
+          <w:b/>
+          <w:bCs/>
+        </w:rPr>
+        <w:t xml:space="preserve">Case</w:t>
+      </w:r>
+      <w:r>
+        <w:rPr>
+          <w:b/>
+          <w:bCs/>
+        </w:rPr>
+        <w:t xml:space="preserve"> </w:t>
+      </w:r>
+      <m:oMath>
+        <m:r>
+          <m:t>a</m:t>
+        </m:r>
+        <m:r>
+          <m:rPr>
+            <m:sty m:val="p"/>
+          </m:rPr>
+          <m:t>=</m:t>
+        </m:r>
+        <m:r>
+          <m:t>0</m:t>
+        </m:r>
+      </m:oMath>
+      <w:r>
+        <w:rPr>
+          <w:b/>
+          <w:bCs/>
+        </w:rPr>
+        <w:t xml:space="preserve">.</w:t>
+      </w:r>
+      <w:r>
+        <w:t xml:space="preserve"> </w:t>
+      </w:r>
+      <w:r>
+        <w:t xml:space="preserve">Here we cannot take logarithms, so we work from the values of powers of</w:t>
+      </w:r>
+      <w:r>
+        <w:t xml:space="preserve"> </w:t>
+      </w:r>
+      <m:oMath>
+        <m:r>
+          <m:t>0</m:t>
+        </m:r>
+      </m:oMath>
+      <w:r>
+        <w:t xml:space="preserve">:</w:t>
+      </w:r>
+      <w:r>
+        <w:t xml:space="preserve"> </w:t>
+      </w:r>
+      <m:oMath>
+        <m:sSup>
+          <m:e>
+            <m:r>
+              <m:t>0</m:t>
+            </m:r>
+          </m:e>
+          <m:sup>
+            <m:r>
+              <m:t>s</m:t>
+            </m:r>
+          </m:sup>
+        </m:sSup>
+        <m:r>
+          <m:rPr>
+            <m:sty m:val="p"/>
+          </m:rPr>
+          <m:t>=</m:t>
+        </m:r>
+        <m:r>
+          <m:t>0</m:t>
+        </m:r>
+      </m:oMath>
+      <w:r>
+        <w:t xml:space="preserve"> </w:t>
+      </w:r>
+      <w:r>
+        <w:t xml:space="preserve">for</w:t>
+      </w:r>
+      <w:r>
+        <w:t xml:space="preserve"> </w:t>
+      </w:r>
+      <m:oMath>
+        <m:r>
+          <m:t>s</m:t>
+        </m:r>
+        <m:r>
+          <m:rPr>
+            <m:sty m:val="p"/>
+          </m:rPr>
+          <m:t>&gt;</m:t>
+        </m:r>
+        <m:r>
+          <m:t>0</m:t>
+        </m:r>
+      </m:oMath>
+      <w:r>
+        <w:t xml:space="preserve">,</w:t>
+      </w:r>
+      <w:r>
+        <w:t xml:space="preserve"> </w:t>
+      </w:r>
+      <m:oMath>
+        <m:sSup>
+          <m:e>
+            <m:r>
+              <m:t>0</m:t>
+            </m:r>
+          </m:e>
+          <m:sup>
+            <m:r>
+              <m:t>0</m:t>
+            </m:r>
+          </m:sup>
+        </m:sSup>
+        <m:r>
+          <m:rPr>
+            <m:sty m:val="p"/>
+          </m:rPr>
+          <m:t>=</m:t>
+        </m:r>
+        <m:r>
+          <m:t>1</m:t>
+        </m:r>
+      </m:oMath>
+      <w:r>
+        <w:t xml:space="preserve">,</w:t>
+      </w:r>
+      <w:r>
+        <w:t xml:space="preserve"> </w:t>
+      </w:r>
+      <w:r>
+        <w:t xml:space="preserve">and</w:t>
+      </w:r>
+      <w:r>
+        <w:t xml:space="preserve"> </w:t>
+      </w:r>
+      <m:oMath>
+        <m:sSup>
+          <m:e>
+            <m:r>
+              <m:t>0</m:t>
+            </m:r>
+          </m:e>
+          <m:sup>
+            <m:r>
+              <m:t>s</m:t>
+            </m:r>
+          </m:sup>
+        </m:sSup>
+      </m:oMath>
+      <w:r>
+        <w:t xml:space="preserve"> </w:t>
+      </w:r>
+      <w:r>
+        <w:t xml:space="preserve">is undefined for</w:t>
+      </w:r>
+      <w:r>
+        <w:t xml:space="preserve"> </w:t>
+      </w:r>
+      <m:oMath>
+        <m:r>
+          <m:t>s</m:t>
+        </m:r>
+        <m:r>
+          <m:rPr>
+            <m:sty m:val="p"/>
+          </m:rPr>
+          <m:t>&lt;</m:t>
+        </m:r>
+        <m:r>
+          <m:t>0</m:t>
+        </m:r>
+      </m:oMath>
+      <w:r>
+        <w:t xml:space="preserve">.</w:t>
+      </w:r>
+    </w:p>
+    <w:p>
+      <w:pPr>
+        <w:pStyle w:val="Compact"/>
+        <w:numPr>
+          <w:ilvl w:val="0"/>
+          <w:numId w:val="1028"/>
+        </w:numPr>
+      </w:pPr>
+      <w:r>
+        <w:t xml:space="preserve">If</w:t>
+      </w:r>
+      <w:r>
+        <w:t xml:space="preserve"> </w:t>
+      </w:r>
+      <m:oMath>
+        <m:r>
+          <m:t>b</m:t>
+        </m:r>
+        <m:r>
+          <m:rPr>
+            <m:sty m:val="p"/>
+          </m:rPr>
+          <m:t>&lt;</m:t>
+        </m:r>
+        <m:r>
+          <m:t>0</m:t>
+        </m:r>
+      </m:oMath>
+      <w:r>
+        <w:t xml:space="preserve">, then</w:t>
+      </w:r>
+      <w:r>
+        <w:t xml:space="preserve"> </w:t>
+      </w:r>
+      <m:oMath>
+        <m:sSup>
+          <m:e>
+            <m:r>
+              <m:t>0</m:t>
+            </m:r>
+          </m:e>
+          <m:sup>
+            <m:r>
+              <m:t>b</m:t>
+            </m:r>
+          </m:sup>
+        </m:sSup>
+      </m:oMath>
+      <w:r>
+        <w:t xml:space="preserve"> </w:t>
+      </w:r>
+      <w:r>
+        <w:t xml:space="preserve">is undefined, so</w:t>
+      </w:r>
+      <w:r>
+        <w:t xml:space="preserve"> </w:t>
+      </w:r>
+      <m:oMath>
+        <m:r>
+          <m:rPr>
+            <m:sty m:val="p"/>
+          </m:rPr>
+          <m:t>(</m:t>
+        </m:r>
+        <m:sSup>
+          <m:e>
+            <m:r>
+              <m:t>a</m:t>
+            </m:r>
+          </m:e>
+          <m:sup>
+            <m:r>
+              <m:t>b</m:t>
+            </m:r>
+          </m:sup>
+        </m:sSup>
+        <m:sSup>
+          <m:e>
+            <m:r>
+              <m:rPr>
+                <m:sty m:val="p"/>
+              </m:rPr>
+              <m:t>)</m:t>
+            </m:r>
+          </m:e>
+          <m:sup>
+            <m:r>
+              <m:t>c</m:t>
+            </m:r>
+          </m:sup>
+        </m:sSup>
+      </m:oMath>
+      <w:r>
+        <w:t xml:space="preserve"> </w:t>
+      </w:r>
+      <w:r>
+        <w:t xml:space="preserve">is undefined.</w:t>
+      </w:r>
+    </w:p>
+    <w:p>
+      <w:pPr>
+        <w:pStyle w:val="Compact"/>
+        <w:numPr>
+          <w:ilvl w:val="0"/>
+          <w:numId w:val="1028"/>
         </w:numPr>
       </w:pPr>
       <w:r>
@@ -37254,7 +38692,7 @@
         <w:pStyle w:val="Compact"/>
         <w:numPr>
           <w:ilvl w:val="0"/>
-          <w:numId w:val="1027"/>
+          <w:numId w:val="1028"/>
         </w:numPr>
       </w:pPr>
       <w:r>
@@ -37933,9 +39371,9 @@
         </m:oMath>
       </m:oMathPara>
     </w:p>
-    <w:bookmarkEnd w:id="134"/>
-    <w:bookmarkEnd w:id="135"/>
-    <w:bookmarkStart w:id="149" w:name="sec-complex-numbers"/>
+    <w:bookmarkEnd w:id="142"/>
+    <w:bookmarkEnd w:id="143"/>
+    <w:bookmarkStart w:id="157" w:name="sec-complex-numbers"/>
     <w:p>
       <w:pPr>
         <w:pStyle w:val="Heading2"/>
@@ -37944,7 +39382,7 @@
         <w:t xml:space="preserve">15 Complex numbers</w:t>
       </w:r>
     </w:p>
-    <w:bookmarkStart w:id="136" w:name="def-imaginary-unit"/>
+    <w:bookmarkStart w:id="144" w:name="def-imaginary-unit"/>
     <w:p>
       <w:pPr>
         <w:pStyle w:val="FirstParagraph"/>
@@ -38089,7 +39527,7 @@
         <w:pStyle w:val="Compact"/>
         <w:numPr>
           <w:ilvl w:val="0"/>
-          <w:numId w:val="1028"/>
+          <w:numId w:val="1029"/>
         </w:numPr>
       </w:pPr>
       <w:r>
@@ -38115,7 +39553,7 @@
         <w:pStyle w:val="Compact"/>
         <w:numPr>
           <w:ilvl w:val="0"/>
-          <w:numId w:val="1028"/>
+          <w:numId w:val="1029"/>
         </w:numPr>
       </w:pPr>
       <w:r>
@@ -38141,7 +39579,7 @@
         <w:pStyle w:val="Compact"/>
         <w:numPr>
           <w:ilvl w:val="0"/>
-          <w:numId w:val="1028"/>
+          <w:numId w:val="1029"/>
         </w:numPr>
       </w:pPr>
       <w:r>
@@ -38311,7 +39749,7 @@
         <w:t xml:space="preserve">names one of these two square roots, chosen once and for all.</w:t>
       </w:r>
     </w:p>
-    <w:bookmarkEnd w:id="136"/>
+    <w:bookmarkEnd w:id="144"/>
     <w:p>
       <w:pPr>
         <w:pStyle w:val="BodyText"/>
@@ -38486,7 +39924,7 @@
         <w:t xml:space="preserve">.</w:t>
       </w:r>
     </w:p>
-    <w:bookmarkStart w:id="137" w:name="exm-imaginary-unit-powers"/>
+    <w:bookmarkStart w:id="145" w:name="exm-imaginary-unit-powers"/>
     <w:p>
       <w:pPr>
         <w:pStyle w:val="BodyText"/>
@@ -38496,7 +39934,7 @@
           <w:b/>
           <w:bCs/>
         </w:rPr>
-        <w:t xml:space="preserve">Example 18 (Powers of the imaginary unit)</w:t>
+        <w:t xml:space="preserve">Example 20 (Powers of the imaginary unit)</w:t>
       </w:r>
       <w:r>
         <w:t xml:space="preserve"> </w:t>
@@ -39161,8 +40599,8 @@
         <w:t xml:space="preserve">.</w:t>
       </w:r>
     </w:p>
-    <w:bookmarkEnd w:id="137"/>
-    <w:bookmarkStart w:id="138" w:name="exm-no-real-imaginary-unit"/>
+    <w:bookmarkEnd w:id="145"/>
+    <w:bookmarkStart w:id="146" w:name="exm-no-real-imaginary-unit"/>
     <w:p>
       <w:pPr>
         <w:pStyle w:val="BodyText"/>
@@ -39172,7 +40610,7 @@
           <w:b/>
           <w:bCs/>
         </w:rPr>
-        <w:t xml:space="preserve">Example 19 (No real number squares to</w:t>
+        <w:t xml:space="preserve">Example 21 (No real number squares to</w:t>
       </w:r>
       <w:r>
         <w:rPr>
@@ -39242,7 +40680,7 @@
         <w:pStyle w:val="Compact"/>
         <w:numPr>
           <w:ilvl w:val="0"/>
-          <w:numId w:val="1029"/>
+          <w:numId w:val="1030"/>
         </w:numPr>
       </w:pPr>
       <w:r>
@@ -39344,7 +40782,7 @@
         <w:pStyle w:val="Compact"/>
         <w:numPr>
           <w:ilvl w:val="0"/>
-          <w:numId w:val="1029"/>
+          <w:numId w:val="1030"/>
         </w:numPr>
       </w:pPr>
       <w:r>
@@ -39618,8 +41056,8 @@
         <w:t xml:space="preserve">introduces a new number to solve it.</w:t>
       </w:r>
     </w:p>
-    <w:bookmarkEnd w:id="138"/>
-    <w:bookmarkStart w:id="139" w:name="def-complex-number"/>
+    <w:bookmarkEnd w:id="146"/>
+    <w:bookmarkStart w:id="147" w:name="def-complex-number"/>
     <w:p>
       <w:pPr>
         <w:pStyle w:val="BodyText"/>
@@ -39765,7 +41203,7 @@
         <w:pStyle w:val="Compact"/>
         <w:numPr>
           <w:ilvl w:val="0"/>
-          <w:numId w:val="1030"/>
+          <w:numId w:val="1031"/>
         </w:numPr>
       </w:pPr>
       <w:r>
@@ -39846,7 +41284,7 @@
         <w:pStyle w:val="Compact"/>
         <w:numPr>
           <w:ilvl w:val="0"/>
-          <w:numId w:val="1030"/>
+          <w:numId w:val="1031"/>
         </w:numPr>
       </w:pPr>
       <w:r>
@@ -39927,7 +41365,7 @@
         <w:pStyle w:val="Compact"/>
         <w:numPr>
           <w:ilvl w:val="0"/>
-          <w:numId w:val="1030"/>
+          <w:numId w:val="1031"/>
         </w:numPr>
       </w:pPr>
       <w:r>
@@ -40122,7 +41560,7 @@
         <w:t xml:space="preserve">.</w:t>
       </w:r>
     </w:p>
-    <w:bookmarkEnd w:id="139"/>
+    <w:bookmarkEnd w:id="147"/>
     <w:p>
       <w:pPr>
         <w:pStyle w:val="BodyText"/>
@@ -40231,7 +41669,7 @@
         <w:t xml:space="preserve">defines the real and imaginary parts.</w:t>
       </w:r>
     </w:p>
-    <w:bookmarkStart w:id="140" w:name="exm-complex-number"/>
+    <w:bookmarkStart w:id="148" w:name="exm-complex-number"/>
     <w:p>
       <w:pPr>
         <w:pStyle w:val="BodyText"/>
@@ -40241,7 +41679,7 @@
           <w:b/>
           <w:bCs/>
         </w:rPr>
-        <w:t xml:space="preserve">Example 20 (Real and imaginary parts)</w:t>
+        <w:t xml:space="preserve">Example 22 (Real and imaginary parts)</w:t>
       </w:r>
       <w:r>
         <w:t xml:space="preserve"> </w:t>
@@ -40579,8 +42017,8 @@
         <w:t xml:space="preserve">.</w:t>
       </w:r>
     </w:p>
-    <w:bookmarkEnd w:id="140"/>
-    <w:bookmarkStart w:id="141" w:name="thm-complex-arithmetic"/>
+    <w:bookmarkEnd w:id="148"/>
+    <w:bookmarkStart w:id="149" w:name="thm-complex-arithmetic"/>
     <w:p>
       <w:pPr>
         <w:pStyle w:val="BodyText"/>
@@ -40590,7 +42028,7 @@
           <w:b/>
           <w:bCs/>
         </w:rPr>
-        <w:t xml:space="preserve">Theorem 24 (Adding and multiplying complex numbers)</w:t>
+        <w:t xml:space="preserve">Theorem 27 (Adding and multiplying complex numbers)</w:t>
       </w:r>
       <w:r>
         <w:t xml:space="preserve"> </w:t>
@@ -40945,7 +42383,7 @@
         </m:oMath>
       </m:oMathPara>
     </w:p>
-    <w:bookmarkEnd w:id="141"/>
+    <w:bookmarkEnd w:id="149"/>
     <w:p>
       <w:pPr>
         <w:pStyle w:val="FirstParagraph"/>
@@ -41599,7 +43037,7 @@
         <w:t xml:space="preserve">takes these two formulas as the definitions of addition and multiplication.</w:t>
       </w:r>
     </w:p>
-    <w:bookmarkStart w:id="142" w:name="exm-complex-arithmetic"/>
+    <w:bookmarkStart w:id="150" w:name="exm-complex-arithmetic"/>
     <w:p>
       <w:pPr>
         <w:pStyle w:val="BodyText"/>
@@ -41609,7 +43047,7 @@
           <w:b/>
           <w:bCs/>
         </w:rPr>
-        <w:t xml:space="preserve">Example 21 (Adding and multiplying two complex numbers)</w:t>
+        <w:t xml:space="preserve">Example 23 (Adding and multiplying two complex numbers)</w:t>
       </w:r>
       <w:r>
         <w:t xml:space="preserve"> </w:t>
@@ -41819,7 +43257,7 @@
                   <m:nor/>
                   <m:sty m:val="p"/>
                 </m:rPr>
-                <m:t>Theorem 24</m:t>
+                <m:t>Theorem 27</m:t>
               </m:r>
               <m:r>
                 <m:rPr>
@@ -42341,7 +43779,7 @@
           <w:rPr>
             <w:rStyle w:val="Hyperlink"/>
           </w:rPr>
-          <w:t xml:space="preserve">Theorem 24</w:t>
+          <w:t xml:space="preserve">Theorem 27</w:t>
         </w:r>
       </w:hyperlink>
       <w:r>
@@ -42579,8 +44017,8 @@
         <w:t xml:space="preserve">.</w:t>
       </w:r>
     </w:p>
-    <w:bookmarkEnd w:id="142"/>
-    <w:bookmarkStart w:id="143" w:name="def-complex-conjugate"/>
+    <w:bookmarkEnd w:id="150"/>
+    <w:bookmarkStart w:id="151" w:name="def-complex-conjugate"/>
     <w:p>
       <w:pPr>
         <w:pStyle w:val="BodyText"/>
@@ -42729,7 +44167,7 @@
         </m:oMath>
       </m:oMathPara>
     </w:p>
-    <w:bookmarkEnd w:id="143"/>
+    <w:bookmarkEnd w:id="151"/>
     <w:p>
       <w:pPr>
         <w:pStyle w:val="FirstParagraph"/>
@@ -42810,7 +44248,7 @@
         <w:t xml:space="preserve">.</w:t>
       </w:r>
     </w:p>
-    <w:bookmarkStart w:id="144" w:name="exm-complex-conjugate"/>
+    <w:bookmarkStart w:id="152" w:name="exm-complex-conjugate"/>
     <w:p>
       <w:pPr>
         <w:pStyle w:val="BodyText"/>
@@ -42820,7 +44258,7 @@
           <w:b/>
           <w:bCs/>
         </w:rPr>
-        <w:t xml:space="preserve">Example 22 (Complex conjugates)</w:t>
+        <w:t xml:space="preserve">Example 24 (Complex conjugates)</w:t>
       </w:r>
       <w:r>
         <w:t xml:space="preserve"> </w:t>
@@ -42834,7 +44272,7 @@
         <w:pStyle w:val="Compact"/>
         <w:numPr>
           <w:ilvl w:val="0"/>
-          <w:numId w:val="1031"/>
+          <w:numId w:val="1032"/>
         </w:numPr>
       </w:pPr>
       <m:oMath>
@@ -42897,7 +44335,7 @@
         <w:pStyle w:val="Compact"/>
         <w:numPr>
           <w:ilvl w:val="0"/>
-          <w:numId w:val="1031"/>
+          <w:numId w:val="1032"/>
         </w:numPr>
       </w:pPr>
       <m:oMath>
@@ -43039,7 +44477,7 @@
         <w:pStyle w:val="Compact"/>
         <w:numPr>
           <w:ilvl w:val="0"/>
-          <w:numId w:val="1031"/>
+          <w:numId w:val="1032"/>
         </w:numPr>
       </w:pPr>
       <m:oMath>
@@ -43160,8 +44598,8 @@
         <w:t xml:space="preserve">, is not.</w:t>
       </w:r>
     </w:p>
-    <w:bookmarkEnd w:id="144"/>
-    <w:bookmarkStart w:id="145" w:name="def-complex-modulus"/>
+    <w:bookmarkEnd w:id="152"/>
+    <w:bookmarkStart w:id="153" w:name="def-complex-modulus"/>
     <w:p>
       <w:pPr>
         <w:pStyle w:val="FirstParagraph"/>
@@ -43349,7 +44787,7 @@
         </m:oMath>
       </m:oMathPara>
     </w:p>
-    <w:bookmarkEnd w:id="145"/>
+    <w:bookmarkEnd w:id="153"/>
     <w:p>
       <w:pPr>
         <w:pStyle w:val="FirstParagraph"/>
@@ -43364,7 +44802,7 @@
         <w:t xml:space="preserve">gives the same definition.</w:t>
       </w:r>
     </w:p>
-    <w:bookmarkStart w:id="146" w:name="exm-complex-modulus"/>
+    <w:bookmarkStart w:id="154" w:name="exm-complex-modulus"/>
     <w:p>
       <w:pPr>
         <w:pStyle w:val="BodyText"/>
@@ -43374,7 +44812,7 @@
           <w:b/>
           <w:bCs/>
         </w:rPr>
-        <w:t xml:space="preserve">Example 23 (Absolute values of complex numbers)</w:t>
+        <w:t xml:space="preserve">Example 25 (Absolute values of complex numbers)</w:t>
       </w:r>
       <w:r>
         <w:t xml:space="preserve"> </w:t>
@@ -43388,7 +44826,7 @@
         <w:pStyle w:val="Compact"/>
         <w:numPr>
           <w:ilvl w:val="0"/>
-          <w:numId w:val="1032"/>
+          <w:numId w:val="1033"/>
         </w:numPr>
       </w:pPr>
       <m:oMath>
@@ -43506,7 +44944,7 @@
         <w:pStyle w:val="Compact"/>
         <w:numPr>
           <w:ilvl w:val="0"/>
-          <w:numId w:val="1032"/>
+          <w:numId w:val="1033"/>
         </w:numPr>
       </w:pPr>
       <m:oMath>
@@ -43639,7 +45077,7 @@
         <w:pStyle w:val="Compact"/>
         <w:numPr>
           <w:ilvl w:val="0"/>
-          <w:numId w:val="1032"/>
+          <w:numId w:val="1033"/>
         </w:numPr>
       </w:pPr>
       <w:r>
@@ -43860,8 +45298,8 @@
         <w:t xml:space="preserve">.</w:t>
       </w:r>
     </w:p>
-    <w:bookmarkEnd w:id="146"/>
-    <w:bookmarkStart w:id="147" w:name="thm-conj-product"/>
+    <w:bookmarkEnd w:id="154"/>
+    <w:bookmarkStart w:id="155" w:name="thm-conj-product"/>
     <w:p>
       <w:pPr>
         <w:pStyle w:val="FirstParagraph"/>
@@ -43871,7 +45309,7 @@
           <w:b/>
           <w:bCs/>
         </w:rPr>
-        <w:t xml:space="preserve">Theorem 25 (A complex number times its conjugate)</w:t>
+        <w:t xml:space="preserve">Theorem 28 (A complex number times its conjugate)</w:t>
       </w:r>
       <w:r>
         <w:t xml:space="preserve"> </w:t>
@@ -43994,7 +45432,7 @@
         <w:t xml:space="preserve">is a nonnegative real number.</w:t>
       </w:r>
     </w:p>
-    <w:bookmarkEnd w:id="147"/>
+    <w:bookmarkEnd w:id="155"/>
     <w:p>
       <w:pPr>
         <w:pStyle w:val="BodyText"/>
@@ -44543,7 +45981,7 @@
         <w:t xml:space="preserve">lists this identity among the properties of complex numbers.</w:t>
       </w:r>
     </w:p>
-    <w:bookmarkStart w:id="148" w:name="exm-conj-product"/>
+    <w:bookmarkStart w:id="156" w:name="exm-conj-product"/>
     <w:p>
       <w:pPr>
         <w:pStyle w:val="BodyText"/>
@@ -44553,7 +45991,7 @@
           <w:b/>
           <w:bCs/>
         </w:rPr>
-        <w:t xml:space="preserve">Example 24 (Multiplying</w:t>
+        <w:t xml:space="preserve">Example 26 (Multiplying</w:t>
       </w:r>
       <w:r>
         <w:rPr>
@@ -44983,7 +46421,7 @@
           <w:rPr>
             <w:rStyle w:val="Hyperlink"/>
           </w:rPr>
-          <w:t xml:space="preserve">Example 23</w:t>
+          <w:t xml:space="preserve">Example 25</w:t>
         </w:r>
       </w:hyperlink>
       <w:r>
@@ -44997,7 +46435,7 @@
           <w:rPr>
             <w:rStyle w:val="Hyperlink"/>
           </w:rPr>
-          <w:t xml:space="preserve">Theorem 25</w:t>
+          <w:t xml:space="preserve">Theorem 28</w:t>
         </w:r>
       </w:hyperlink>
       <w:r>
@@ -45007,9 +46445,9 @@
         <w:t xml:space="preserve">says.</w:t>
       </w:r>
     </w:p>
-    <w:bookmarkEnd w:id="148"/>
-    <w:bookmarkEnd w:id="149"/>
-    <w:bookmarkStart w:id="150" w:name="sec-further-reading"/>
+    <w:bookmarkEnd w:id="156"/>
+    <w:bookmarkEnd w:id="157"/>
+    <w:bookmarkStart w:id="158" w:name="sec-further-reading"/>
     <w:p>
       <w:pPr>
         <w:pStyle w:val="Heading2"/>
@@ -45023,7 +46461,7 @@
         <w:pStyle w:val="Compact"/>
         <w:numPr>
           <w:ilvl w:val="0"/>
-          <w:numId w:val="1033"/>
+          <w:numId w:val="1034"/>
         </w:numPr>
       </w:pPr>
       <w:r>
@@ -45059,7 +46497,7 @@
         <w:pStyle w:val="Compact"/>
         <w:numPr>
           <w:ilvl w:val="0"/>
-          <w:numId w:val="1033"/>
+          <w:numId w:val="1034"/>
         </w:numPr>
       </w:pPr>
       <w:r>
@@ -45078,8 +46516,8 @@
         <w:t xml:space="preserve">behind the infimum and supremum.</w:t>
       </w:r>
     </w:p>
-    <w:bookmarkEnd w:id="150"/>
-    <w:bookmarkStart w:id="157" w:name="references"/>
+    <w:bookmarkEnd w:id="158"/>
+    <w:bookmarkStart w:id="165" w:name="references"/>
     <w:p>
       <w:pPr>
         <w:pStyle w:val="Heading2"/>
@@ -45088,8 +46526,8 @@
         <w:t xml:space="preserve">References</w:t>
       </w:r>
     </w:p>
-    <w:bookmarkStart w:id="156" w:name="refs"/>
-    <w:bookmarkStart w:id="152" w:name="ref-abramson2021algebra"/>
+    <w:bookmarkStart w:id="164" w:name="refs"/>
+    <w:bookmarkStart w:id="160" w:name="ref-abramson2021algebra"/>
     <w:p>
       <w:pPr>
         <w:pStyle w:val="Bibliography"/>
@@ -45116,7 +46554,7 @@
       <w:r>
         <w:t xml:space="preserve"> </w:t>
       </w:r>
-      <w:hyperlink r:id="rId151">
+      <w:hyperlink r:id="rId159">
         <w:r>
           <w:rPr>
             <w:rStyle w:val="Hyperlink"/>
@@ -45128,8 +46566,8 @@
         <w:t xml:space="preserve">.</w:t>
       </w:r>
     </w:p>
-    <w:bookmarkEnd w:id="152"/>
-    <w:bookmarkStart w:id="154" w:name="ref-axler2024linear"/>
+    <w:bookmarkEnd w:id="160"/>
+    <w:bookmarkStart w:id="162" w:name="ref-axler2024linear"/>
     <w:p>
       <w:pPr>
         <w:pStyle w:val="Bibliography"/>
@@ -45153,7 +46591,7 @@
       <w:r>
         <w:t xml:space="preserve"> </w:t>
       </w:r>
-      <w:hyperlink r:id="rId153">
+      <w:hyperlink r:id="rId161">
         <w:r>
           <w:rPr>
             <w:rStyle w:val="Hyperlink"/>
@@ -45165,8 +46603,8 @@
         <w:t xml:space="preserve">.</w:t>
       </w:r>
     </w:p>
-    <w:bookmarkEnd w:id="154"/>
-    <w:bookmarkStart w:id="155" w:name="ref-rudin1976principles"/>
+    <w:bookmarkEnd w:id="162"/>
+    <w:bookmarkStart w:id="163" w:name="ref-rudin1976principles"/>
     <w:p>
       <w:pPr>
         <w:pStyle w:val="Bibliography"/>
@@ -45188,9 +46626,9 @@
         <w:t xml:space="preserve">. 3rd ed. International Series in Pure and Applied Mathematics. McGraw-Hill.</w:t>
       </w:r>
     </w:p>
-    <w:bookmarkEnd w:id="155"/>
-    <w:bookmarkEnd w:id="156"/>
-    <w:bookmarkEnd w:id="157"/>
+    <w:bookmarkEnd w:id="163"/>
+    <w:bookmarkEnd w:id="164"/>
+    <w:bookmarkEnd w:id="165"/>
     <w:sectPr>
       <w:footnotePr>
         <w:numRestart w:val="eachSect"/>
@@ -45970,34 +47408,7 @@
     </w:lvlOverride>
   </w:num>
   <w:num w:numId="1025">
-    <w:abstractNumId w:val="99411"/>
-    <w:lvlOverride w:ilvl="0">
-      <w:startOverride w:val="1"/>
-    </w:lvlOverride>
-    <w:lvlOverride w:ilvl="1">
-      <w:startOverride w:val="1"/>
-    </w:lvlOverride>
-    <w:lvlOverride w:ilvl="2">
-      <w:startOverride w:val="1"/>
-    </w:lvlOverride>
-    <w:lvlOverride w:ilvl="3">
-      <w:startOverride w:val="1"/>
-    </w:lvlOverride>
-    <w:lvlOverride w:ilvl="4">
-      <w:startOverride w:val="1"/>
-    </w:lvlOverride>
-    <w:lvlOverride w:ilvl="5">
-      <w:startOverride w:val="1"/>
-    </w:lvlOverride>
-    <w:lvlOverride w:ilvl="6">
-      <w:startOverride w:val="1"/>
-    </w:lvlOverride>
-    <w:lvlOverride w:ilvl="7">
-      <w:startOverride w:val="1"/>
-    </w:lvlOverride>
-    <w:lvlOverride w:ilvl="8">
-      <w:startOverride w:val="1"/>
-    </w:lvlOverride>
+    <w:abstractNumId w:val="991"/>
   </w:num>
   <w:num w:numId="1026">
     <w:abstractNumId w:val="99411"/>
@@ -46030,7 +47441,34 @@
     </w:lvlOverride>
   </w:num>
   <w:num w:numId="1027">
-    <w:abstractNumId w:val="991"/>
+    <w:abstractNumId w:val="99411"/>
+    <w:lvlOverride w:ilvl="0">
+      <w:startOverride w:val="1"/>
+    </w:lvlOverride>
+    <w:lvlOverride w:ilvl="1">
+      <w:startOverride w:val="1"/>
+    </w:lvlOverride>
+    <w:lvlOverride w:ilvl="2">
+      <w:startOverride w:val="1"/>
+    </w:lvlOverride>
+    <w:lvlOverride w:ilvl="3">
+      <w:startOverride w:val="1"/>
+    </w:lvlOverride>
+    <w:lvlOverride w:ilvl="4">
+      <w:startOverride w:val="1"/>
+    </w:lvlOverride>
+    <w:lvlOverride w:ilvl="5">
+      <w:startOverride w:val="1"/>
+    </w:lvlOverride>
+    <w:lvlOverride w:ilvl="6">
+      <w:startOverride w:val="1"/>
+    </w:lvlOverride>
+    <w:lvlOverride w:ilvl="7">
+      <w:startOverride w:val="1"/>
+    </w:lvlOverride>
+    <w:lvlOverride w:ilvl="8">
+      <w:startOverride w:val="1"/>
+    </w:lvlOverride>
   </w:num>
   <w:num w:numId="1028">
     <w:abstractNumId w:val="991"/>
@@ -46048,6 +47486,9 @@
     <w:abstractNumId w:val="991"/>
   </w:num>
   <w:num w:numId="1033">
+    <w:abstractNumId w:val="991"/>
+  </w:num>
+  <w:num w:numId="1034">
     <w:abstractNumId w:val="991"/>
   </w:num>
 </w:numbering>

</xml_diff>

<commit_message>
Deploying to gh-pages from @ Morrison-Lab/mds@060f0b24233a789ef500ef2fe31d1ffeccabefa3 🚀
</commit_message>
<xml_diff>
--- a/algebra.docx
+++ b/algebra.docx
@@ -15,7 +15,7 @@
         <w:pStyle w:val="Date"/>
       </w:pPr>
       <w:r>
-        <w:t xml:space="preserve">Last modified: 2026-10-06 14:39:34 (PDT)</w:t>
+        <w:t xml:space="preserve">Last modified: 2026-10-06 16:45:05 (PDT)</w:t>
       </w:r>
     </w:p>
     <w:bookmarkStart w:id="18" w:name="equalities"/>
@@ -1724,7 +1724,7 @@
           <w:b/>
           <w:bCs/>
         </w:rPr>
-        <w:t xml:space="preserve">Theorem 4 (negating both sides of an inequality)</w:t>
+        <w:t xml:space="preserve">Theorem 4 (Negating both sides of an inequality)</w:t>
       </w:r>
       <w:r>
         <w:t xml:space="preserve"> </w:t>
@@ -26138,7 +26138,7 @@
           <w:b/>
           <w:bCs/>
         </w:rPr>
-        <w:t xml:space="preserve">Theorem 9 (adding zero changes nothing)</w:t>
+        <w:t xml:space="preserve">Theorem 9 (Adding zero changes nothing)</w:t>
       </w:r>
     </w:p>
     <w:p>
@@ -51824,21 +51824,6 @@
           </m:rPr>
           <m:t>exp</m:t>
         </m:r>
-        <m:r>
-          <m:t>​</m:t>
-        </m:r>
-        <m:d>
-          <m:dPr>
-            <m:begChr m:val="{"/>
-            <m:sepChr m:val=""/>
-            <m:endChr m:val="}"/>
-            <m:grow/>
-          </m:dPr>
-          <m:e/>
-        </m:d>
-        <m:r>
-          <m:t>​</m:t>
-        </m:r>
       </m:oMath>
       <w:r>
         <w:rPr>
@@ -51867,21 +51852,6 @@
             <m:sty m:val="p"/>
           </m:rPr>
           <m:t>log</m:t>
-        </m:r>
-        <m:r>
-          <m:t>​</m:t>
-        </m:r>
-        <m:d>
-          <m:dPr>
-            <m:begChr m:val="{"/>
-            <m:sepChr m:val=""/>
-            <m:endChr m:val="}"/>
-            <m:grow/>
-          </m:dPr>
-          <m:e/>
-        </m:d>
-        <m:r>
-          <m:t>​</m:t>
         </m:r>
       </m:oMath>
       <w:r>
@@ -53164,7 +53134,7 @@
           <w:b/>
           <w:bCs/>
         </w:rPr>
-        <w:t xml:space="preserve">Theorem 24 (exponential of a sum)</w:t>
+        <w:t xml:space="preserve">Theorem 24 (Exponential of a sum)</w:t>
       </w:r>
       <w:r>
         <w:t xml:space="preserve"> </w:t>
@@ -53548,7 +53518,7 @@
           <w:b/>
           <w:bCs/>
         </w:rPr>
-        <w:t xml:space="preserve">Corollary 2 (exponential of a difference)</w:t>
+        <w:t xml:space="preserve">Corollary 2 (Exponential of a difference)</w:t>
       </w:r>
       <w:r>
         <w:t xml:space="preserve"> </w:t>
@@ -55847,7 +55817,7 @@
           <w:b/>
           <w:bCs/>
         </w:rPr>
-        <w:t xml:space="preserve">Corollary 3 (natural exponential of a product)</w:t>
+        <w:t xml:space="preserve">Corollary 3 (Natural exponential of a product)</w:t>
       </w:r>
     </w:p>
     <w:p>
@@ -57241,7 +57211,7 @@
           <w:b/>
           <w:bCs/>
         </w:rPr>
-        <w:t xml:space="preserve">Exercise 9</w:t>
+        <w:t xml:space="preserve">Exercise 9 (Exponentiation versus multiplication)</w:t>
       </w:r>
       <w:r>
         <w:t xml:space="preserve"> </w:t>
@@ -57316,7 +57286,7 @@
       </w:r>
     </w:p>
     <w:bookmarkEnd w:id="213"/>
-    <w:bookmarkStart w:id="216" w:name="sol-exp-vs-mult"/>
+    <w:bookmarkStart w:id="214" w:name="sol-exp-vs-mult"/>
     <w:p>
       <w:pPr>
         <w:pStyle w:val="BodyText"/>
@@ -59071,6 +59041,7 @@
         <w:t xml:space="preserve">cases.</w:t>
       </w:r>
     </w:p>
+    <w:bookmarkEnd w:id="214"/>
     <w:tbl>
       <w:tblPr>
         <w:tblStyle w:val="Table"/>
@@ -59084,7 +59055,7 @@
       <w:tr>
         <w:tc>
           <w:tcPr/>
-          <w:bookmarkStart w:id="214" w:name="fig-double-exponential"/>
+          <w:bookmarkStart w:id="215" w:name="fig-double-exponential"/>
           <w:p>
             <w:pPr>
               <w:pStyle w:val="Compact"/>
@@ -59151,18 +59122,11 @@
               </m:sSup>
             </m:oMath>
           </w:p>
-          <w:bookmarkEnd w:id="214"/>
+          <w:bookmarkEnd w:id="215"/>
         </w:tc>
       </w:tr>
     </w:tbl>
-    <w:p>
-      <w:pPr>
-        <w:pStyle w:val="BodyText"/>
-      </w:pPr>
-      <w:r>
-        <w:t xml:space="preserve"> </w:t>
-      </w:r>
-    </w:p>
+    <w:p/>
     <w:tbl>
       <w:tblPr>
         <w:tblStyle w:val="Table"/>
@@ -59176,7 +59140,7 @@
       <w:tr>
         <w:tc>
           <w:tcPr/>
-          <w:bookmarkStart w:id="215" w:name="fig-double-exponential2"/>
+          <w:bookmarkStart w:id="216" w:name="fig-double-exponential2"/>
           <w:p>
             <w:pPr>
               <w:pStyle w:val="Compact"/>
@@ -59361,11 +59325,10 @@
               <w:t xml:space="preserve">.</w:t>
             </w:r>
           </w:p>
-          <w:bookmarkEnd w:id="215"/>
+          <w:bookmarkEnd w:id="216"/>
         </w:tc>
       </w:tr>
     </w:tbl>
-    <w:bookmarkEnd w:id="216"/>
     <w:bookmarkStart w:id="217" w:name="exr-double-exponential"/>
     <w:p>
       <w:pPr>
@@ -59376,7 +59339,7 @@
           <w:b/>
           <w:bCs/>
         </w:rPr>
-        <w:t xml:space="preserve">Exercise 10</w:t>
+        <w:t xml:space="preserve">Exercise 10 (Repeated exponentiation)</w:t>
       </w:r>
       <w:r>
         <w:t xml:space="preserve"> </w:t>
@@ -68315,6 +68278,9 @@
           <m:eqArr>
             <m:e>
               <m:r>
+                <m:t>&amp;</m:t>
+              </m:r>
+              <m:r>
                 <m:rPr>
                   <m:sty m:val="p"/>
                 </m:rPr>
@@ -68374,6 +68340,8 @@
                 </m:rPr>
                 <m:t>)</m:t>
               </m:r>
+            </m:e>
+            <m:e>
               <m:r>
                 <m:t>&amp;</m:t>
               </m:r>

</xml_diff>

<commit_message>
Deploying to gh-pages from @ Morrison-Lab/mds@9a4fb8d27bfc4c75a0d92761055e0abc54d67699 🚀
</commit_message>
<xml_diff>
--- a/algebra.docx
+++ b/algebra.docx
@@ -15,7 +15,7 @@
         <w:pStyle w:val="Date"/>
       </w:pPr>
       <w:r>
-        <w:t xml:space="preserve">Last modified: 2026-10-07 10:52:53 (PDT)</w:t>
+        <w:t xml:space="preserve">Last modified: 2026-10-07 12:36:56 (PDT)</w:t>
       </w:r>
     </w:p>
     <w:bookmarkStart w:id="18" w:name="equalities"/>
@@ -66840,7 +66840,7 @@
           <w:b/>
           <w:bCs/>
         </w:rPr>
-        <w:t xml:space="preserve">Definition 53 (Absolute value of a complex number)</w:t>
+        <w:t xml:space="preserve">Definition 53 (Absolute value (modulus) of a complex number)</w:t>
       </w:r>
       <w:r>
         <w:t xml:space="preserve"> </w:t>

</xml_diff>

<commit_message>
Deploying to gh-pages from @ Morrison-Lab/mds@ceae660bea9d63b584bea500c6aa5d533ff9601f 🚀
</commit_message>
<xml_diff>
--- a/algebra.docx
+++ b/algebra.docx
@@ -15,7 +15,7 @@
         <w:pStyle w:val="Date"/>
       </w:pPr>
       <w:r>
-        <w:t xml:space="preserve">Last modified: 2026-10-08 23:13:21 (UTC)</w:t>
+        <w:t xml:space="preserve">Last modified: 2026-10-09 00:29:41 (UTC)</w:t>
       </w:r>
     </w:p>
     <w:bookmarkStart w:id="18" w:name="equalities"/>
@@ -49967,7 +49967,7 @@
       </w:r>
       <m:oMath>
         <m:r>
-          <m:t>ϵ</m:t>
+          <m:t>ε</m:t>
         </m:r>
         <m:r>
           <m:rPr>
@@ -50053,7 +50053,7 @@
             <m:t>&lt;</m:t>
           </m:r>
           <m:r>
-            <m:t>ϵ</m:t>
+            <m:t>ε</m:t>
           </m:r>
           <m:r>
             <m:t> </m:t>
@@ -50432,7 +50432,7 @@
       </w:r>
       <m:oMath>
         <m:r>
-          <m:t>ϵ</m:t>
+          <m:t>ε</m:t>
         </m:r>
         <m:r>
           <m:rPr>
@@ -50476,7 +50476,7 @@
           </m:num>
           <m:den>
             <m:r>
-              <m:t>ϵ</m:t>
+              <m:t>ε</m:t>
             </m:r>
           </m:den>
         </m:f>
@@ -50603,7 +50603,7 @@
           <m:t>&lt;</m:t>
         </m:r>
         <m:r>
-          <m:t>ϵ</m:t>
+          <m:t>ε</m:t>
         </m:r>
       </m:oMath>
       <w:r>
@@ -50620,7 +50620,7 @@
       </w:r>
       <m:oMath>
         <m:r>
-          <m:t>ϵ</m:t>
+          <m:t>ε</m:t>
         </m:r>
         <m:r>
           <m:rPr>
@@ -50800,7 +50800,7 @@
       </w:r>
       <m:oMath>
         <m:r>
-          <m:t>ϵ</m:t>
+          <m:t>ε</m:t>
         </m:r>
         <m:r>
           <m:rPr>

</xml_diff>

<commit_message>
Deploying to gh-pages from @ Morrison-Lab/mds@26932966938ed7801d241a82d3bf44aaf7f4b1c9 🚀
</commit_message>
<xml_diff>
--- a/algebra.docx
+++ b/algebra.docx
@@ -15,7 +15,7 @@
         <w:pStyle w:val="Date"/>
       </w:pPr>
       <w:r>
-        <w:t xml:space="preserve">Last modified: 2026-10-08 22:26:48 (PDT)</w:t>
+        <w:t xml:space="preserve">Last modified: 2026-10-08 23:17:53 (PDT)</w:t>
       </w:r>
     </w:p>
     <w:bookmarkStart w:id="18" w:name="equalities"/>
@@ -12929,9 +12929,10 @@
               </m:r>
               <m:r>
                 <m:rPr>
-                  <m:sty m:val="p"/>
-                </m:rPr>
-                <m:t>=</m:t>
+                  <m:nor/>
+                  <m:sty m:val="p"/>
+                </m:rPr>
+                <m:t>, which equals </m:t>
               </m:r>
               <m:r>
                 <m:t>2</m:t>
@@ -58370,37 +58371,7 @@
           <m:jc m:val="center"/>
         </m:oMathParaPr>
         <m:oMath>
-          <m:sSup>
-            <m:e>
-              <m:r>
-                <m:t>a</m:t>
-              </m:r>
-            </m:e>
-            <m:sup>
-              <m:r>
-                <m:t>b</m:t>
-              </m:r>
-              <m:r>
-                <m:t>c</m:t>
-              </m:r>
-            </m:sup>
-          </m:sSup>
-          <m:r>
-            <m:rPr>
-              <m:sty m:val="p"/>
-            </m:rPr>
-            <m:t>=</m:t>
-          </m:r>
-          <m:r>
-            <m:t>​</m:t>
-          </m:r>
-          <m:d>
-            <m:dPr>
-              <m:begChr m:val="("/>
-              <m:sepChr m:val=""/>
-              <m:endChr m:val=")"/>
-              <m:grow/>
-            </m:dPr>
+          <m:eqArr>
             <m:e>
               <m:sSup>
                 <m:e>
@@ -58412,43 +58383,49 @@
                   <m:r>
                     <m:t>b</m:t>
                   </m:r>
+                  <m:r>
+                    <m:t>c</m:t>
+                  </m:r>
                 </m:sup>
               </m:sSup>
-            </m:e>
-          </m:d>
-          <m:sSup>
-            <m:e>
+              <m:r>
+                <m:t>&amp;</m:t>
+              </m:r>
+              <m:r>
+                <m:rPr>
+                  <m:sty m:val="p"/>
+                </m:rPr>
+                <m:t>=</m:t>
+              </m:r>
               <m:r>
                 <m:t>​</m:t>
               </m:r>
-            </m:e>
-            <m:sup>
-              <m:r>
-                <m:t>c</m:t>
-              </m:r>
-            </m:sup>
-          </m:sSup>
-          <m:r>
-            <m:rPr>
-              <m:sty m:val="p"/>
-            </m:rPr>
-            <m:t>=</m:t>
-          </m:r>
-          <m:r>
-            <m:t>​</m:t>
-          </m:r>
-          <m:d>
-            <m:dPr>
-              <m:begChr m:val="("/>
-              <m:sepChr m:val=""/>
-              <m:endChr m:val=")"/>
-              <m:grow/>
-            </m:dPr>
-            <m:e>
+              <m:d>
+                <m:dPr>
+                  <m:begChr m:val="("/>
+                  <m:sepChr m:val=""/>
+                  <m:endChr m:val=")"/>
+                  <m:grow/>
+                </m:dPr>
+                <m:e>
+                  <m:sSup>
+                    <m:e>
+                      <m:r>
+                        <m:t>a</m:t>
+                      </m:r>
+                    </m:e>
+                    <m:sup>
+                      <m:r>
+                        <m:t>b</m:t>
+                      </m:r>
+                    </m:sup>
+                  </m:sSup>
+                </m:e>
+              </m:d>
               <m:sSup>
                 <m:e>
                   <m:r>
-                    <m:t>a</m:t>
+                    <m:t>​</m:t>
                   </m:r>
                 </m:e>
                 <m:sup>
@@ -58458,19 +58435,55 @@
                 </m:sup>
               </m:sSup>
             </m:e>
-          </m:d>
-          <m:sSup>
             <m:e>
               <m:r>
+                <m:t>&amp;</m:t>
+              </m:r>
+              <m:r>
+                <m:rPr>
+                  <m:sty m:val="p"/>
+                </m:rPr>
+                <m:t>=</m:t>
+              </m:r>
+              <m:r>
                 <m:t>​</m:t>
               </m:r>
+              <m:d>
+                <m:dPr>
+                  <m:begChr m:val="("/>
+                  <m:sepChr m:val=""/>
+                  <m:endChr m:val=")"/>
+                  <m:grow/>
+                </m:dPr>
+                <m:e>
+                  <m:sSup>
+                    <m:e>
+                      <m:r>
+                        <m:t>a</m:t>
+                      </m:r>
+                    </m:e>
+                    <m:sup>
+                      <m:r>
+                        <m:t>c</m:t>
+                      </m:r>
+                    </m:sup>
+                  </m:sSup>
+                </m:e>
+              </m:d>
+              <m:sSup>
+                <m:e>
+                  <m:r>
+                    <m:t>​</m:t>
+                  </m:r>
+                </m:e>
+                <m:sup>
+                  <m:r>
+                    <m:t>b</m:t>
+                  </m:r>
+                </m:sup>
+              </m:sSup>
             </m:e>
-            <m:sup>
-              <m:r>
-                <m:t>b</m:t>
-              </m:r>
-            </m:sup>
-          </m:sSup>
+          </m:eqArr>
         </m:oMath>
       </m:oMathPara>
     </w:p>
@@ -59183,138 +59196,150 @@
           <m:jc m:val="center"/>
         </m:oMathParaPr>
         <m:oMath>
-          <m:r>
-            <m:rPr>
-              <m:sty m:val="p"/>
-            </m:rPr>
-            <m:t>exp</m:t>
-          </m:r>
-          <m:r>
-            <m:t>​</m:t>
-          </m:r>
-          <m:d>
-            <m:dPr>
-              <m:begChr m:val="{"/>
-              <m:sepChr m:val=""/>
-              <m:endChr m:val="}"/>
-              <m:grow/>
-            </m:dPr>
+          <m:eqArr>
             <m:e>
               <m:r>
-                <m:t>a</m:t>
-              </m:r>
-              <m:r>
-                <m:t>b</m:t>
-              </m:r>
+                <m:rPr>
+                  <m:sty m:val="p"/>
+                </m:rPr>
+                <m:t>exp</m:t>
+              </m:r>
+              <m:r>
+                <m:t>​</m:t>
+              </m:r>
+              <m:d>
+                <m:dPr>
+                  <m:begChr m:val="{"/>
+                  <m:sepChr m:val=""/>
+                  <m:endChr m:val="}"/>
+                  <m:grow/>
+                </m:dPr>
+                <m:e>
+                  <m:r>
+                    <m:t>a</m:t>
+                  </m:r>
+                  <m:r>
+                    <m:t>b</m:t>
+                  </m:r>
+                </m:e>
+              </m:d>
+              <m:r>
+                <m:t>​</m:t>
+              </m:r>
+              <m:r>
+                <m:t>&amp;</m:t>
+              </m:r>
+              <m:r>
+                <m:rPr>
+                  <m:sty m:val="p"/>
+                </m:rPr>
+                <m:t>=</m:t>
+              </m:r>
+              <m:r>
+                <m:rPr>
+                  <m:sty m:val="p"/>
+                </m:rPr>
+                <m:t>(</m:t>
+              </m:r>
+              <m:r>
+                <m:rPr>
+                  <m:sty m:val="p"/>
+                </m:rPr>
+                <m:t>exp</m:t>
+              </m:r>
+              <m:r>
+                <m:t>​</m:t>
+              </m:r>
+              <m:d>
+                <m:dPr>
+                  <m:begChr m:val="{"/>
+                  <m:sepChr m:val=""/>
+                  <m:endChr m:val="}"/>
+                  <m:grow/>
+                </m:dPr>
+                <m:e>
+                  <m:r>
+                    <m:t>a</m:t>
+                  </m:r>
+                </m:e>
+              </m:d>
+              <m:r>
+                <m:t>​</m:t>
+              </m:r>
+              <m:sSup>
+                <m:e>
+                  <m:r>
+                    <m:rPr>
+                      <m:sty m:val="p"/>
+                    </m:rPr>
+                    <m:t>)</m:t>
+                  </m:r>
+                </m:e>
+                <m:sup>
+                  <m:r>
+                    <m:t>b</m:t>
+                  </m:r>
+                </m:sup>
+              </m:sSup>
             </m:e>
-          </m:d>
-          <m:r>
-            <m:t>​</m:t>
-          </m:r>
-          <m:r>
-            <m:rPr>
-              <m:sty m:val="p"/>
-            </m:rPr>
-            <m:t>=</m:t>
-          </m:r>
-          <m:r>
-            <m:rPr>
-              <m:sty m:val="p"/>
-            </m:rPr>
-            <m:t>(</m:t>
-          </m:r>
-          <m:r>
-            <m:rPr>
-              <m:sty m:val="p"/>
-            </m:rPr>
-            <m:t>exp</m:t>
-          </m:r>
-          <m:r>
-            <m:t>​</m:t>
-          </m:r>
-          <m:d>
-            <m:dPr>
-              <m:begChr m:val="{"/>
-              <m:sepChr m:val=""/>
-              <m:endChr m:val="}"/>
-              <m:grow/>
-            </m:dPr>
             <m:e>
               <m:r>
-                <m:t>a</m:t>
-              </m:r>
+                <m:t>&amp;</m:t>
+              </m:r>
+              <m:r>
+                <m:rPr>
+                  <m:sty m:val="p"/>
+                </m:rPr>
+                <m:t>=</m:t>
+              </m:r>
+              <m:r>
+                <m:rPr>
+                  <m:sty m:val="p"/>
+                </m:rPr>
+                <m:t>(</m:t>
+              </m:r>
+              <m:r>
+                <m:rPr>
+                  <m:sty m:val="p"/>
+                </m:rPr>
+                <m:t>exp</m:t>
+              </m:r>
+              <m:r>
+                <m:t>​</m:t>
+              </m:r>
+              <m:d>
+                <m:dPr>
+                  <m:begChr m:val="{"/>
+                  <m:sepChr m:val=""/>
+                  <m:endChr m:val="}"/>
+                  <m:grow/>
+                </m:dPr>
+                <m:e>
+                  <m:r>
+                    <m:t>b</m:t>
+                  </m:r>
+                </m:e>
+              </m:d>
+              <m:r>
+                <m:t>​</m:t>
+              </m:r>
+              <m:sSup>
+                <m:e>
+                  <m:r>
+                    <m:rPr>
+                      <m:sty m:val="p"/>
+                    </m:rPr>
+                    <m:t>)</m:t>
+                  </m:r>
+                </m:e>
+                <m:sup>
+                  <m:r>
+                    <m:t>a</m:t>
+                  </m:r>
+                </m:sup>
+              </m:sSup>
             </m:e>
-          </m:d>
-          <m:r>
-            <m:t>​</m:t>
-          </m:r>
-          <m:sSup>
-            <m:e>
-              <m:r>
-                <m:rPr>
-                  <m:sty m:val="p"/>
-                </m:rPr>
-                <m:t>)</m:t>
-              </m:r>
-            </m:e>
-            <m:sup>
-              <m:r>
-                <m:t>b</m:t>
-              </m:r>
-            </m:sup>
-          </m:sSup>
-          <m:r>
-            <m:rPr>
-              <m:sty m:val="p"/>
-            </m:rPr>
-            <m:t>=</m:t>
-          </m:r>
-          <m:r>
-            <m:rPr>
-              <m:sty m:val="p"/>
-            </m:rPr>
-            <m:t>(</m:t>
-          </m:r>
-          <m:r>
-            <m:rPr>
-              <m:sty m:val="p"/>
-            </m:rPr>
-            <m:t>exp</m:t>
-          </m:r>
-          <m:r>
-            <m:t>​</m:t>
-          </m:r>
-          <m:d>
-            <m:dPr>
-              <m:begChr m:val="{"/>
-              <m:sepChr m:val=""/>
-              <m:endChr m:val="}"/>
-              <m:grow/>
-            </m:dPr>
-            <m:e>
-              <m:r>
-                <m:t>b</m:t>
-              </m:r>
-            </m:e>
-          </m:d>
-          <m:r>
-            <m:t>​</m:t>
-          </m:r>
-          <m:sSup>
-            <m:e>
-              <m:r>
-                <m:rPr>
-                  <m:sty m:val="p"/>
-                </m:rPr>
-                <m:t>)</m:t>
-              </m:r>
-            </m:e>
-            <m:sup>
-              <m:r>
-                <m:t>a</m:t>
-              </m:r>
-            </m:sup>
-          </m:sSup>
+          </m:eqArr>
         </m:oMath>
       </m:oMathPara>
     </w:p>

</xml_diff>

<commit_message>
Deploying to gh-pages from @ Morrison-Lab/mds@dc1555d111328498ad19d428141f7059bda11618 🚀
</commit_message>
<xml_diff>
--- a/algebra.docx
+++ b/algebra.docx
@@ -15,7 +15,7 @@
         <w:pStyle w:val="Date"/>
       </w:pPr>
       <w:r>
-        <w:t xml:space="preserve">Last modified: 2026-10-09 11:33:26 (PDT)</w:t>
+        <w:t xml:space="preserve">Last modified: 2026-10-09 11:58:26 (PDT)</w:t>
       </w:r>
     </w:p>
     <w:bookmarkStart w:id="18" w:name="equalities"/>
@@ -19671,6 +19671,9 @@
           </m:rPr>
           <m:t>min</m:t>
         </m:r>
+        <m:r>
+          <m:t>​</m:t>
+        </m:r>
         <m:d>
           <m:dPr>
             <m:begChr m:val="{"/>
@@ -19757,6 +19760,9 @@
             </m:f>
           </m:e>
         </m:d>
+        <m:r>
+          <m:t>​</m:t>
+        </m:r>
       </m:oMath>
       <w:r>
         <w:t xml:space="preserve">,</w:t>
@@ -20951,6 +20957,9 @@
           <m:r>
             <m:t>f</m:t>
           </m:r>
+          <m:r>
+            <m:t>​</m:t>
+          </m:r>
           <m:d>
             <m:dPr>
               <m:begChr m:val="("/>
@@ -21015,6 +21024,9 @@
             </m:e>
           </m:d>
           <m:r>
+            <m:t>​</m:t>
+          </m:r>
+          <m:r>
             <m:rPr>
               <m:sty m:val="p"/>
             </m:rPr>
@@ -21988,6 +22000,9 @@
         <m:oMath>
           <m:r>
             <m:t>f</m:t>
+          </m:r>
+          <m:r>
+            <m:t>​</m:t>
           </m:r>
           <m:d>
             <m:dPr>
@@ -22052,6 +22067,9 @@
               </m:sSub>
             </m:e>
           </m:d>
+          <m:r>
+            <m:t>​</m:t>
+          </m:r>
           <m:r>
             <m:rPr>
               <m:sty m:val="p"/>
@@ -22786,57 +22804,63 @@
             </m:rPr>
             <m:t>−</m:t>
           </m:r>
+          <m:r>
+            <m:t>​</m:t>
+          </m:r>
+          <m:d>
+            <m:dPr>
+              <m:begChr m:val="("/>
+              <m:sepChr m:val=""/>
+              <m:endChr m:val=")"/>
+              <m:grow/>
+            </m:dPr>
+            <m:e>
+              <m:r>
+                <m:t>t</m:t>
+              </m:r>
+              <m:r>
+                <m:t>x</m:t>
+              </m:r>
+              <m:r>
+                <m:rPr>
+                  <m:sty m:val="p"/>
+                </m:rPr>
+                <m:t>+</m:t>
+              </m:r>
+              <m:r>
+                <m:rPr>
+                  <m:sty m:val="p"/>
+                </m:rPr>
+                <m:t>(</m:t>
+              </m:r>
+              <m:r>
+                <m:t>1</m:t>
+              </m:r>
+              <m:r>
+                <m:rPr>
+                  <m:sty m:val="p"/>
+                </m:rPr>
+                <m:t>−</m:t>
+              </m:r>
+              <m:r>
+                <m:t>t</m:t>
+              </m:r>
+              <m:r>
+                <m:rPr>
+                  <m:sty m:val="p"/>
+                </m:rPr>
+                <m:t>)</m:t>
+              </m:r>
+              <m:r>
+                <m:t>y</m:t>
+              </m:r>
+            </m:e>
+          </m:d>
           <m:sSup>
             <m:e>
-              <m:d>
-                <m:dPr>
-                  <m:begChr m:val="("/>
-                  <m:sepChr m:val=""/>
-                  <m:endChr m:val=")"/>
-                  <m:grow/>
-                </m:dPr>
-                <m:e>
-                  <m:r>
-                    <m:t>t</m:t>
-                  </m:r>
-                  <m:r>
-                    <m:t>x</m:t>
-                  </m:r>
-                  <m:r>
-                    <m:rPr>
-                      <m:sty m:val="p"/>
-                    </m:rPr>
-                    <m:t>+</m:t>
-                  </m:r>
-                  <m:r>
-                    <m:rPr>
-                      <m:sty m:val="p"/>
-                    </m:rPr>
-                    <m:t>(</m:t>
-                  </m:r>
-                  <m:r>
-                    <m:t>1</m:t>
-                  </m:r>
-                  <m:r>
-                    <m:rPr>
-                      <m:sty m:val="p"/>
-                    </m:rPr>
-                    <m:t>−</m:t>
-                  </m:r>
-                  <m:r>
-                    <m:t>t</m:t>
-                  </m:r>
-                  <m:r>
-                    <m:rPr>
-                      <m:sty m:val="p"/>
-                    </m:rPr>
-                    <m:t>)</m:t>
-                  </m:r>
-                  <m:r>
-                    <m:t>y</m:t>
-                  </m:r>
-                </m:e>
-              </m:d>
+              <m:r>
+                <m:t>​</m:t>
+              </m:r>
             </m:e>
             <m:sup>
               <m:r>
@@ -23470,6 +23494,9 @@
             </m:r>
           </m:den>
         </m:f>
+        <m:r>
+          <m:t>​</m:t>
+        </m:r>
         <m:d>
           <m:dPr>
             <m:begChr m:val="("/>
@@ -23592,6 +23619,9 @@
           </m:e>
         </m:d>
         <m:r>
+          <m:t>​</m:t>
+        </m:r>
+        <m:r>
           <m:rPr>
             <m:sty m:val="p"/>
           </m:rPr>
@@ -23789,6 +23819,9 @@
       <m:oMath>
         <m:r>
           <m:t>f</m:t>
+        </m:r>
+        <m:r>
+          <m:t>​</m:t>
         </m:r>
         <m:d>
           <m:dPr>
@@ -23844,6 +23877,9 @@
             </m:sSub>
           </m:e>
         </m:d>
+        <m:r>
+          <m:t>​</m:t>
+        </m:r>
         <m:r>
           <m:rPr>
             <m:sty m:val="p"/>
@@ -34364,64 +34400,70 @@
             </m:r>
           </m:sup>
           <m:e>
-            <m:sSup>
-              <m:e>
-                <m:d>
-                  <m:dPr>
-                    <m:begChr m:val="("/>
-                    <m:sepChr m:val=""/>
-                    <m:endChr m:val=")"/>
-                    <m:grow/>
-                  </m:dPr>
-                  <m:e>
-                    <m:sSub>
-                      <m:e>
-                        <m:r>
-                          <m:t>y</m:t>
-                        </m:r>
-                      </m:e>
-                      <m:sub>
-                        <m:r>
-                          <m:t>i</m:t>
-                        </m:r>
-                      </m:sub>
-                    </m:sSub>
-                    <m:r>
-                      <m:rPr>
-                        <m:sty m:val="p"/>
-                      </m:rPr>
-                      <m:t>−</m:t>
-                    </m:r>
-                    <m:sSub>
-                      <m:e>
-                        <m:acc>
-                          <m:accPr>
-                            <m:chr m:val="̂"/>
-                          </m:accPr>
-                          <m:e>
-                            <m:r>
-                              <m:t>y</m:t>
-                            </m:r>
-                          </m:e>
-                        </m:acc>
-                      </m:e>
-                      <m:sub>
-                        <m:r>
-                          <m:t>i</m:t>
-                        </m:r>
-                      </m:sub>
-                    </m:sSub>
-                  </m:e>
-                </m:d>
-              </m:e>
-              <m:sup>
-                <m:r>
-                  <m:t>2</m:t>
-                </m:r>
-              </m:sup>
-            </m:sSup>
+            <m:r>
+              <m:t>​</m:t>
+            </m:r>
           </m:e>
         </m:nary>
+        <m:d>
+          <m:dPr>
+            <m:begChr m:val="("/>
+            <m:sepChr m:val=""/>
+            <m:endChr m:val=")"/>
+            <m:grow/>
+          </m:dPr>
+          <m:e>
+            <m:sSub>
+              <m:e>
+                <m:r>
+                  <m:t>y</m:t>
+                </m:r>
+              </m:e>
+              <m:sub>
+                <m:r>
+                  <m:t>i</m:t>
+                </m:r>
+              </m:sub>
+            </m:sSub>
+            <m:r>
+              <m:rPr>
+                <m:sty m:val="p"/>
+              </m:rPr>
+              <m:t>−</m:t>
+            </m:r>
+            <m:sSub>
+              <m:e>
+                <m:acc>
+                  <m:accPr>
+                    <m:chr m:val="̂"/>
+                  </m:accPr>
+                  <m:e>
+                    <m:r>
+                      <m:t>y</m:t>
+                    </m:r>
+                  </m:e>
+                </m:acc>
+              </m:e>
+              <m:sub>
+                <m:r>
+                  <m:t>i</m:t>
+                </m:r>
+              </m:sub>
+            </m:sSub>
+          </m:e>
+        </m:d>
+        <m:sSup>
+          <m:e>
+            <m:r>
+              <m:t>​</m:t>
+            </m:r>
+          </m:e>
+          <m:sup>
+            <m:r>
+              <m:t>2</m:t>
+            </m:r>
+          </m:sup>
+        </m:sSup>
       </m:oMath>
       <w:r>
         <w:t xml:space="preserve"> </w:t>
@@ -34883,64 +34925,70 @@
               </m:r>
             </m:sup>
             <m:e>
-              <m:sSup>
-                <m:e>
-                  <m:d>
-                    <m:dPr>
-                      <m:begChr m:val="("/>
-                      <m:sepChr m:val=""/>
-                      <m:endChr m:val=")"/>
-                      <m:grow/>
-                    </m:dPr>
-                    <m:e>
-                      <m:sSub>
-                        <m:e>
-                          <m:r>
-                            <m:t>y</m:t>
-                          </m:r>
-                        </m:e>
-                        <m:sub>
-                          <m:r>
-                            <m:t>i</m:t>
-                          </m:r>
-                        </m:sub>
-                      </m:sSub>
-                      <m:r>
-                        <m:rPr>
-                          <m:sty m:val="p"/>
-                        </m:rPr>
-                        <m:t>−</m:t>
-                      </m:r>
-                      <m:sSub>
-                        <m:e>
-                          <m:acc>
-                            <m:accPr>
-                              <m:chr m:val="̂"/>
-                            </m:accPr>
-                            <m:e>
-                              <m:r>
-                                <m:t>y</m:t>
-                              </m:r>
-                            </m:e>
-                          </m:acc>
-                        </m:e>
-                        <m:sub>
-                          <m:r>
-                            <m:t>i</m:t>
-                          </m:r>
-                        </m:sub>
-                      </m:sSub>
-                    </m:e>
-                  </m:d>
-                </m:e>
-                <m:sup>
-                  <m:r>
-                    <m:t>2</m:t>
-                  </m:r>
-                </m:sup>
-              </m:sSup>
+              <m:r>
+                <m:t>​</m:t>
+              </m:r>
             </m:e>
           </m:nary>
+          <m:d>
+            <m:dPr>
+              <m:begChr m:val="("/>
+              <m:sepChr m:val=""/>
+              <m:endChr m:val=")"/>
+              <m:grow/>
+            </m:dPr>
+            <m:e>
+              <m:sSub>
+                <m:e>
+                  <m:r>
+                    <m:t>y</m:t>
+                  </m:r>
+                </m:e>
+                <m:sub>
+                  <m:r>
+                    <m:t>i</m:t>
+                  </m:r>
+                </m:sub>
+              </m:sSub>
+              <m:r>
+                <m:rPr>
+                  <m:sty m:val="p"/>
+                </m:rPr>
+                <m:t>−</m:t>
+              </m:r>
+              <m:sSub>
+                <m:e>
+                  <m:acc>
+                    <m:accPr>
+                      <m:chr m:val="̂"/>
+                    </m:accPr>
+                    <m:e>
+                      <m:r>
+                        <m:t>y</m:t>
+                      </m:r>
+                    </m:e>
+                  </m:acc>
+                </m:e>
+                <m:sub>
+                  <m:r>
+                    <m:t>i</m:t>
+                  </m:r>
+                </m:sub>
+              </m:sSub>
+            </m:e>
+          </m:d>
+          <m:sSup>
+            <m:e>
+              <m:r>
+                <m:t>​</m:t>
+              </m:r>
+            </m:e>
+            <m:sup>
+              <m:r>
+                <m:t>2</m:t>
+              </m:r>
+            </m:sup>
+          </m:sSup>
           <m:r>
             <m:rPr>
               <m:sty m:val="p"/>
@@ -34962,6 +35010,9 @@
               </m:r>
             </m:den>
           </m:f>
+          <m:r>
+            <m:t>​</m:t>
+          </m:r>
           <m:d>
             <m:dPr>
               <m:begChr m:val="["/>
@@ -34970,55 +35021,61 @@
               <m:grow/>
             </m:dPr>
             <m:e>
-              <m:sSup>
+              <m:r>
+                <m:t>​</m:t>
+              </m:r>
+              <m:d>
+                <m:dPr>
+                  <m:begChr m:val="("/>
+                  <m:sepChr m:val=""/>
+                  <m:endChr m:val=")"/>
+                  <m:grow/>
+                </m:dPr>
                 <m:e>
-                  <m:d>
-                    <m:dPr>
-                      <m:begChr m:val="("/>
-                      <m:sepChr m:val=""/>
-                      <m:endChr m:val=")"/>
-                      <m:grow/>
-                    </m:dPr>
+                  <m:sSub>
                     <m:e>
-                      <m:sSub>
+                      <m:r>
+                        <m:t>y</m:t>
+                      </m:r>
+                    </m:e>
+                    <m:sub>
+                      <m:r>
+                        <m:t>1</m:t>
+                      </m:r>
+                    </m:sub>
+                  </m:sSub>
+                  <m:r>
+                    <m:rPr>
+                      <m:sty m:val="p"/>
+                    </m:rPr>
+                    <m:t>−</m:t>
+                  </m:r>
+                  <m:sSub>
+                    <m:e>
+                      <m:acc>
+                        <m:accPr>
+                          <m:chr m:val="̂"/>
+                        </m:accPr>
                         <m:e>
                           <m:r>
                             <m:t>y</m:t>
                           </m:r>
                         </m:e>
-                        <m:sub>
-                          <m:r>
-                            <m:t>1</m:t>
-                          </m:r>
-                        </m:sub>
-                      </m:sSub>
+                      </m:acc>
+                    </m:e>
+                    <m:sub>
                       <m:r>
-                        <m:rPr>
-                          <m:sty m:val="p"/>
-                        </m:rPr>
-                        <m:t>−</m:t>
+                        <m:t>1</m:t>
                       </m:r>
-                      <m:sSub>
-                        <m:e>
-                          <m:acc>
-                            <m:accPr>
-                              <m:chr m:val="̂"/>
-                            </m:accPr>
-                            <m:e>
-                              <m:r>
-                                <m:t>y</m:t>
-                              </m:r>
-                            </m:e>
-                          </m:acc>
-                        </m:e>
-                        <m:sub>
-                          <m:r>
-                            <m:t>1</m:t>
-                          </m:r>
-                        </m:sub>
-                      </m:sSub>
-                    </m:e>
-                  </m:d>
+                    </m:sub>
+                  </m:sSub>
+                </m:e>
+              </m:d>
+              <m:sSup>
+                <m:e>
+                  <m:r>
+                    <m:t>​</m:t>
+                  </m:r>
                 </m:e>
                 <m:sup>
                   <m:r>
@@ -35032,55 +35089,61 @@
                 </m:rPr>
                 <m:t>+</m:t>
               </m:r>
-              <m:sSup>
+              <m:r>
+                <m:t>​</m:t>
+              </m:r>
+              <m:d>
+                <m:dPr>
+                  <m:begChr m:val="("/>
+                  <m:sepChr m:val=""/>
+                  <m:endChr m:val=")"/>
+                  <m:grow/>
+                </m:dPr>
                 <m:e>
-                  <m:d>
-                    <m:dPr>
-                      <m:begChr m:val="("/>
-                      <m:sepChr m:val=""/>
-                      <m:endChr m:val=")"/>
-                      <m:grow/>
-                    </m:dPr>
+                  <m:sSub>
                     <m:e>
-                      <m:sSub>
+                      <m:r>
+                        <m:t>y</m:t>
+                      </m:r>
+                    </m:e>
+                    <m:sub>
+                      <m:r>
+                        <m:t>2</m:t>
+                      </m:r>
+                    </m:sub>
+                  </m:sSub>
+                  <m:r>
+                    <m:rPr>
+                      <m:sty m:val="p"/>
+                    </m:rPr>
+                    <m:t>−</m:t>
+                  </m:r>
+                  <m:sSub>
+                    <m:e>
+                      <m:acc>
+                        <m:accPr>
+                          <m:chr m:val="̂"/>
+                        </m:accPr>
                         <m:e>
                           <m:r>
                             <m:t>y</m:t>
                           </m:r>
                         </m:e>
-                        <m:sub>
-                          <m:r>
-                            <m:t>2</m:t>
-                          </m:r>
-                        </m:sub>
-                      </m:sSub>
+                      </m:acc>
+                    </m:e>
+                    <m:sub>
                       <m:r>
-                        <m:rPr>
-                          <m:sty m:val="p"/>
-                        </m:rPr>
-                        <m:t>−</m:t>
+                        <m:t>2</m:t>
                       </m:r>
-                      <m:sSub>
-                        <m:e>
-                          <m:acc>
-                            <m:accPr>
-                              <m:chr m:val="̂"/>
-                            </m:accPr>
-                            <m:e>
-                              <m:r>
-                                <m:t>y</m:t>
-                              </m:r>
-                            </m:e>
-                          </m:acc>
-                        </m:e>
-                        <m:sub>
-                          <m:r>
-                            <m:t>2</m:t>
-                          </m:r>
-                        </m:sub>
-                      </m:sSub>
-                    </m:e>
-                  </m:d>
+                    </m:sub>
+                  </m:sSub>
+                </m:e>
+              </m:d>
+              <m:sSup>
+                <m:e>
+                  <m:r>
+                    <m:t>​</m:t>
+                  </m:r>
                 </m:e>
                 <m:sup>
                   <m:r>
@@ -35094,55 +35157,61 @@
                 </m:rPr>
                 <m:t>+</m:t>
               </m:r>
-              <m:sSup>
+              <m:r>
+                <m:t>​</m:t>
+              </m:r>
+              <m:d>
+                <m:dPr>
+                  <m:begChr m:val="("/>
+                  <m:sepChr m:val=""/>
+                  <m:endChr m:val=")"/>
+                  <m:grow/>
+                </m:dPr>
                 <m:e>
-                  <m:d>
-                    <m:dPr>
-                      <m:begChr m:val="("/>
-                      <m:sepChr m:val=""/>
-                      <m:endChr m:val=")"/>
-                      <m:grow/>
-                    </m:dPr>
+                  <m:sSub>
                     <m:e>
-                      <m:sSub>
+                      <m:r>
+                        <m:t>y</m:t>
+                      </m:r>
+                    </m:e>
+                    <m:sub>
+                      <m:r>
+                        <m:t>3</m:t>
+                      </m:r>
+                    </m:sub>
+                  </m:sSub>
+                  <m:r>
+                    <m:rPr>
+                      <m:sty m:val="p"/>
+                    </m:rPr>
+                    <m:t>−</m:t>
+                  </m:r>
+                  <m:sSub>
+                    <m:e>
+                      <m:acc>
+                        <m:accPr>
+                          <m:chr m:val="̂"/>
+                        </m:accPr>
                         <m:e>
                           <m:r>
                             <m:t>y</m:t>
                           </m:r>
                         </m:e>
-                        <m:sub>
-                          <m:r>
-                            <m:t>3</m:t>
-                          </m:r>
-                        </m:sub>
-                      </m:sSub>
+                      </m:acc>
+                    </m:e>
+                    <m:sub>
                       <m:r>
-                        <m:rPr>
-                          <m:sty m:val="p"/>
-                        </m:rPr>
-                        <m:t>−</m:t>
+                        <m:t>3</m:t>
                       </m:r>
-                      <m:sSub>
-                        <m:e>
-                          <m:acc>
-                            <m:accPr>
-                              <m:chr m:val="̂"/>
-                            </m:accPr>
-                            <m:e>
-                              <m:r>
-                                <m:t>y</m:t>
-                              </m:r>
-                            </m:e>
-                          </m:acc>
-                        </m:e>
-                        <m:sub>
-                          <m:r>
-                            <m:t>3</m:t>
-                          </m:r>
-                        </m:sub>
-                      </m:sSub>
-                    </m:e>
-                  </m:d>
+                    </m:sub>
+                  </m:sSub>
+                </m:e>
+              </m:d>
+              <m:sSup>
+                <m:e>
+                  <m:r>
+                    <m:t>​</m:t>
+                  </m:r>
                 </m:e>
                 <m:sup>
                   <m:r>
@@ -35152,6 +35221,9 @@
               </m:sSup>
             </m:e>
           </m:d>
+          <m:r>
+            <m:t>​</m:t>
+          </m:r>
         </m:oMath>
       </m:oMathPara>
     </w:p>
@@ -36455,48 +36527,54 @@
             </m:r>
           </m:sup>
           <m:e>
-            <m:d>
-              <m:dPr>
-                <m:begChr m:val="("/>
-                <m:sepChr m:val=""/>
-                <m:endChr m:val=")"/>
-                <m:grow/>
-              </m:dPr>
-              <m:e>
-                <m:sSub>
-                  <m:e>
-                    <m:r>
-                      <m:t>a</m:t>
-                    </m:r>
-                  </m:e>
-                  <m:sub>
-                    <m:r>
-                      <m:t>i</m:t>
-                    </m:r>
-                  </m:sub>
-                </m:sSub>
-                <m:r>
-                  <m:rPr>
-                    <m:sty m:val="p"/>
-                  </m:rPr>
-                  <m:t>+</m:t>
-                </m:r>
-                <m:sSub>
-                  <m:e>
-                    <m:r>
-                      <m:t>b</m:t>
-                    </m:r>
-                  </m:e>
-                  <m:sub>
-                    <m:r>
-                      <m:t>i</m:t>
-                    </m:r>
-                  </m:sub>
-                </m:sSub>
-              </m:e>
-            </m:d>
+            <m:r>
+              <m:t>​</m:t>
+            </m:r>
           </m:e>
         </m:nary>
+        <m:d>
+          <m:dPr>
+            <m:begChr m:val="("/>
+            <m:sepChr m:val=""/>
+            <m:endChr m:val=")"/>
+            <m:grow/>
+          </m:dPr>
+          <m:e>
+            <m:sSub>
+              <m:e>
+                <m:r>
+                  <m:t>a</m:t>
+                </m:r>
+              </m:e>
+              <m:sub>
+                <m:r>
+                  <m:t>i</m:t>
+                </m:r>
+              </m:sub>
+            </m:sSub>
+            <m:r>
+              <m:rPr>
+                <m:sty m:val="p"/>
+              </m:rPr>
+              <m:t>+</m:t>
+            </m:r>
+            <m:sSub>
+              <m:e>
+                <m:r>
+                  <m:t>b</m:t>
+                </m:r>
+              </m:e>
+              <m:sub>
+                <m:r>
+                  <m:t>i</m:t>
+                </m:r>
+              </m:sub>
+            </m:sSub>
+          </m:e>
+        </m:d>
+        <m:r>
+          <m:t>​</m:t>
+        </m:r>
         <m:r>
           <m:rPr>
             <m:sty m:val="p"/>
@@ -36876,6 +36954,9 @@
               </m:r>
               <m:r>
                 <m:t>c</m:t>
+              </m:r>
+              <m:r>
+                <m:t>​</m:t>
               </m:r>
               <m:d>
                 <m:dPr>
@@ -36936,6 +37017,9 @@
                 </m:e>
               </m:d>
               <m:r>
+                <m:t>​</m:t>
+              </m:r>
+              <m:r>
                 <m:t>&amp;</m:t>
               </m:r>
               <m:r>
@@ -37070,48 +37154,54 @@
                   </m:r>
                 </m:sup>
                 <m:e>
-                  <m:d>
-                    <m:dPr>
-                      <m:begChr m:val="("/>
-                      <m:sepChr m:val=""/>
-                      <m:endChr m:val=")"/>
-                      <m:grow/>
-                    </m:dPr>
-                    <m:e>
-                      <m:sSub>
-                        <m:e>
-                          <m:r>
-                            <m:t>a</m:t>
-                          </m:r>
-                        </m:e>
-                        <m:sub>
-                          <m:r>
-                            <m:t>i</m:t>
-                          </m:r>
-                        </m:sub>
-                      </m:sSub>
-                      <m:r>
-                        <m:rPr>
-                          <m:sty m:val="p"/>
-                        </m:rPr>
-                        <m:t>+</m:t>
-                      </m:r>
-                      <m:sSub>
-                        <m:e>
-                          <m:r>
-                            <m:t>b</m:t>
-                          </m:r>
-                        </m:e>
-                        <m:sub>
-                          <m:r>
-                            <m:t>i</m:t>
-                          </m:r>
-                        </m:sub>
-                      </m:sSub>
-                    </m:e>
-                  </m:d>
+                  <m:r>
+                    <m:t>​</m:t>
+                  </m:r>
                 </m:e>
               </m:nary>
+              <m:d>
+                <m:dPr>
+                  <m:begChr m:val="("/>
+                  <m:sepChr m:val=""/>
+                  <m:endChr m:val=")"/>
+                  <m:grow/>
+                </m:dPr>
+                <m:e>
+                  <m:sSub>
+                    <m:e>
+                      <m:r>
+                        <m:t>a</m:t>
+                      </m:r>
+                    </m:e>
+                    <m:sub>
+                      <m:r>
+                        <m:t>i</m:t>
+                      </m:r>
+                    </m:sub>
+                  </m:sSub>
+                  <m:r>
+                    <m:rPr>
+                      <m:sty m:val="p"/>
+                    </m:rPr>
+                    <m:t>+</m:t>
+                  </m:r>
+                  <m:sSub>
+                    <m:e>
+                      <m:r>
+                        <m:t>b</m:t>
+                      </m:r>
+                    </m:e>
+                    <m:sub>
+                      <m:r>
+                        <m:t>i</m:t>
+                      </m:r>
+                    </m:sub>
+                  </m:sSub>
+                </m:e>
+              </m:d>
+              <m:r>
+                <m:t>​</m:t>
+              </m:r>
               <m:r>
                 <m:t>&amp;</m:t>
               </m:r>
@@ -37120,6 +37210,9 @@
                   <m:sty m:val="p"/>
                 </m:rPr>
                 <m:t>=</m:t>
+              </m:r>
+              <m:r>
+                <m:t>​</m:t>
               </m:r>
               <m:d>
                 <m:dPr>
@@ -37162,10 +37255,16 @@
                 </m:e>
               </m:d>
               <m:r>
+                <m:t>​</m:t>
+              </m:r>
+              <m:r>
                 <m:rPr>
                   <m:sty m:val="p"/>
                 </m:rPr>
                 <m:t>+</m:t>
+              </m:r>
+              <m:r>
+                <m:t>​</m:t>
               </m:r>
               <m:d>
                 <m:dPr>
@@ -37208,10 +37307,16 @@
                 </m:e>
               </m:d>
               <m:r>
+                <m:t>​</m:t>
+              </m:r>
+              <m:r>
                 <m:rPr>
                   <m:sty m:val="p"/>
                 </m:rPr>
                 <m:t>+</m:t>
+              </m:r>
+              <m:r>
+                <m:t>​</m:t>
               </m:r>
               <m:d>
                 <m:dPr>
@@ -37254,6 +37359,9 @@
                 </m:e>
               </m:d>
               <m:r>
+                <m:t>​</m:t>
+              </m:r>
+              <m:r>
                 <m:t>&amp;</m:t>
               </m:r>
               <m:r>
@@ -37276,6 +37384,9 @@
                   <m:sty m:val="p"/>
                 </m:rPr>
                 <m:t>=</m:t>
+              </m:r>
+              <m:r>
+                <m:t>​</m:t>
               </m:r>
               <m:d>
                 <m:dPr>
@@ -37336,10 +37447,16 @@
                 </m:e>
               </m:d>
               <m:r>
+                <m:t>​</m:t>
+              </m:r>
+              <m:r>
                 <m:rPr>
                   <m:sty m:val="p"/>
                 </m:rPr>
                 <m:t>+</m:t>
+              </m:r>
+              <m:r>
+                <m:t>​</m:t>
               </m:r>
               <m:d>
                 <m:dPr>
@@ -37400,6 +37517,9 @@
                 </m:e>
               </m:d>
               <m:r>
+                <m:t>​</m:t>
+              </m:r>
+              <m:r>
                 <m:t>&amp;</m:t>
               </m:r>
               <m:r>
@@ -37927,48 +38047,54 @@
               </m:r>
             </m:sup>
             <m:e>
-              <m:d>
-                <m:dPr>
-                  <m:begChr m:val="("/>
-                  <m:sepChr m:val=""/>
-                  <m:endChr m:val=")"/>
-                  <m:grow/>
-                </m:dPr>
-                <m:e>
-                  <m:sSub>
-                    <m:e>
-                      <m:r>
-                        <m:t>a</m:t>
-                      </m:r>
-                    </m:e>
-                    <m:sub>
-                      <m:r>
-                        <m:t>i</m:t>
-                      </m:r>
-                    </m:sub>
-                  </m:sSub>
-                  <m:r>
-                    <m:rPr>
-                      <m:sty m:val="p"/>
-                    </m:rPr>
-                    <m:t>+</m:t>
-                  </m:r>
-                  <m:sSub>
-                    <m:e>
-                      <m:r>
-                        <m:t>b</m:t>
-                      </m:r>
-                    </m:e>
-                    <m:sub>
-                      <m:r>
-                        <m:t>i</m:t>
-                      </m:r>
-                    </m:sub>
-                  </m:sSub>
-                </m:e>
-              </m:d>
+              <m:r>
+                <m:t>​</m:t>
+              </m:r>
             </m:e>
           </m:nary>
+          <m:d>
+            <m:dPr>
+              <m:begChr m:val="("/>
+              <m:sepChr m:val=""/>
+              <m:endChr m:val=")"/>
+              <m:grow/>
+            </m:dPr>
+            <m:e>
+              <m:sSub>
+                <m:e>
+                  <m:r>
+                    <m:t>a</m:t>
+                  </m:r>
+                </m:e>
+                <m:sub>
+                  <m:r>
+                    <m:t>i</m:t>
+                  </m:r>
+                </m:sub>
+              </m:sSub>
+              <m:r>
+                <m:rPr>
+                  <m:sty m:val="p"/>
+                </m:rPr>
+                <m:t>+</m:t>
+              </m:r>
+              <m:sSub>
+                <m:e>
+                  <m:r>
+                    <m:t>b</m:t>
+                  </m:r>
+                </m:e>
+                <m:sub>
+                  <m:r>
+                    <m:t>i</m:t>
+                  </m:r>
+                </m:sub>
+              </m:sSub>
+            </m:e>
+          </m:d>
+          <m:r>
+            <m:t>​</m:t>
+          </m:r>
           <m:r>
             <m:rPr>
               <m:sty m:val="p"/>

</xml_diff>

<commit_message>
Deploying to gh-pages from @ Morrison-Lab/mds@7062dbb117f366216703b9a991d0f0f00fb222f6 🚀
</commit_message>
<xml_diff>
--- a/algebra.docx
+++ b/algebra.docx
@@ -15,7 +15,7 @@
         <w:pStyle w:val="Date"/>
       </w:pPr>
       <w:r>
-        <w:t xml:space="preserve">Last modified: 2026-10-09 12:13:11 (PDT)</w:t>
+        <w:t xml:space="preserve">Last modified: 2026-10-09 13:04:05 (PDT)</w:t>
       </w:r>
     </w:p>
     <w:bookmarkStart w:id="18" w:name="equalities"/>
@@ -66500,7 +66500,7 @@
     </w:p>
     <w:bookmarkEnd w:id="223"/>
     <w:bookmarkEnd w:id="224"/>
-    <w:bookmarkStart w:id="238" w:name="sec-complex-numbers"/>
+    <w:bookmarkStart w:id="243" w:name="sec-complex-numbers"/>
     <w:p>
       <w:pPr>
         <w:pStyle w:val="Heading2"/>
@@ -66758,197 +66758,10 @@
         <w:t xml:space="preserve">over addition.</w:t>
       </w:r>
     </w:p>
+    <w:bookmarkEnd w:id="225"/>
     <w:p>
       <w:pPr>
         <w:pStyle w:val="FirstParagraph"/>
-      </w:pPr>
-      <w:r>
-        <w:t xml:space="preserve">The number</w:t>
-      </w:r>
-      <w:r>
-        <w:t xml:space="preserve"> </w:t>
-      </w:r>
-      <m:oMath>
-        <m:r>
-          <m:rPr>
-            <m:sty m:val="p"/>
-          </m:rPr>
-          <m:t>−</m:t>
-        </m:r>
-        <m:r>
-          <m:t>i</m:t>
-        </m:r>
-      </m:oMath>
-      <w:r>
-        <w:t xml:space="preserve"> </w:t>
-      </w:r>
-      <w:r>
-        <w:t xml:space="preserve">also squares to</w:t>
-      </w:r>
-      <w:r>
-        <w:t xml:space="preserve"> </w:t>
-      </w:r>
-      <m:oMath>
-        <m:r>
-          <m:rPr>
-            <m:sty m:val="p"/>
-          </m:rPr>
-          <m:t>−</m:t>
-        </m:r>
-        <m:r>
-          <m:t>1</m:t>
-        </m:r>
-      </m:oMath>
-      <w:r>
-        <w:t xml:space="preserve">, since</w:t>
-      </w:r>
-    </w:p>
-    <w:p>
-      <w:pPr>
-        <w:pStyle w:val="BodyText"/>
-      </w:pPr>
-      <m:oMathPara>
-        <m:oMathParaPr>
-          <m:jc m:val="center"/>
-        </m:oMathParaPr>
-        <m:oMath>
-          <m:eqArr>
-            <m:e>
-              <m:r>
-                <m:rPr>
-                  <m:sty m:val="p"/>
-                </m:rPr>
-                <m:t>(</m:t>
-              </m:r>
-              <m:r>
-                <m:rPr>
-                  <m:sty m:val="p"/>
-                </m:rPr>
-                <m:t>−</m:t>
-              </m:r>
-              <m:r>
-                <m:t>i</m:t>
-              </m:r>
-              <m:sSup>
-                <m:e>
-                  <m:r>
-                    <m:rPr>
-                      <m:sty m:val="p"/>
-                    </m:rPr>
-                    <m:t>)</m:t>
-                  </m:r>
-                </m:e>
-                <m:sup>
-                  <m:r>
-                    <m:t>2</m:t>
-                  </m:r>
-                </m:sup>
-              </m:sSup>
-              <m:r>
-                <m:t>&amp;</m:t>
-              </m:r>
-              <m:r>
-                <m:rPr>
-                  <m:sty m:val="p"/>
-                </m:rPr>
-                <m:t>=</m:t>
-              </m:r>
-              <m:r>
-                <m:rPr>
-                  <m:sty m:val="p"/>
-                </m:rPr>
-                <m:t>(</m:t>
-              </m:r>
-              <m:r>
-                <m:rPr>
-                  <m:sty m:val="p"/>
-                </m:rPr>
-                <m:t>−</m:t>
-              </m:r>
-              <m:r>
-                <m:t>1</m:t>
-              </m:r>
-              <m:sSup>
-                <m:e>
-                  <m:r>
-                    <m:rPr>
-                      <m:sty m:val="p"/>
-                    </m:rPr>
-                    <m:t>)</m:t>
-                  </m:r>
-                </m:e>
-                <m:sup>
-                  <m:r>
-                    <m:t>2</m:t>
-                  </m:r>
-                </m:sup>
-              </m:sSup>
-              <m:r>
-                <m:t> </m:t>
-              </m:r>
-              <m:sSup>
-                <m:e>
-                  <m:r>
-                    <m:t>i</m:t>
-                  </m:r>
-                </m:e>
-                <m:sup>
-                  <m:r>
-                    <m:t>2</m:t>
-                  </m:r>
-                </m:sup>
-              </m:sSup>
-            </m:e>
-            <m:e>
-              <m:r>
-                <m:t>&amp;</m:t>
-              </m:r>
-              <m:r>
-                <m:rPr>
-                  <m:sty m:val="p"/>
-                </m:rPr>
-                <m:t>=</m:t>
-              </m:r>
-              <m:r>
-                <m:rPr>
-                  <m:sty m:val="p"/>
-                </m:rPr>
-                <m:t>−</m:t>
-              </m:r>
-              <m:r>
-                <m:t>1</m:t>
-              </m:r>
-              <m:r>
-                <m:rPr>
-                  <m:sty m:val="p"/>
-                </m:rPr>
-                <m:t>;</m:t>
-              </m:r>
-            </m:e>
-          </m:eqArr>
-        </m:oMath>
-      </m:oMathPara>
-    </w:p>
-    <w:p>
-      <w:pPr>
-        <w:pStyle w:val="FirstParagraph"/>
-      </w:pPr>
-      <m:oMath>
-        <m:r>
-          <m:t>i</m:t>
-        </m:r>
-      </m:oMath>
-      <w:r>
-        <w:t xml:space="preserve"> </w:t>
-      </w:r>
-      <w:r>
-        <w:t xml:space="preserve">names one of these two square roots, chosen once and for all.</w:t>
-      </w:r>
-    </w:p>
-    <w:bookmarkEnd w:id="225"/>
-    <w:p>
-      <w:pPr>
-        <w:pStyle w:val="BodyText"/>
       </w:pPr>
       <w:r>
         <w:t xml:space="preserve">Axler (2024, Definition 1.1, p. 2)</w:t>
@@ -68253,7 +68066,1011 @@
       </w:r>
     </w:p>
     <w:bookmarkEnd w:id="227"/>
-    <w:bookmarkStart w:id="228" w:name="def-complex-number"/>
+    <w:bookmarkStart w:id="228" w:name="thm-negative-imaginary-unit"/>
+    <w:p>
+      <w:pPr>
+        <w:pStyle w:val="BodyText"/>
+      </w:pPr>
+      <w:r>
+        <w:rPr>
+          <w:b/>
+          <w:bCs/>
+        </w:rPr>
+        <w:t xml:space="preserve">Theorem 30 (The number</w:t>
+      </w:r>
+      <w:r>
+        <w:rPr>
+          <w:b/>
+          <w:bCs/>
+        </w:rPr>
+        <w:t xml:space="preserve"> </w:t>
+      </w:r>
+      <m:oMath>
+        <m:r>
+          <m:rPr>
+            <m:sty m:val="p"/>
+          </m:rPr>
+          <m:t>−</m:t>
+        </m:r>
+        <m:r>
+          <m:t>i</m:t>
+        </m:r>
+      </m:oMath>
+      <w:r>
+        <w:rPr>
+          <w:b/>
+          <w:bCs/>
+        </w:rPr>
+        <w:t xml:space="preserve"> </w:t>
+      </w:r>
+      <w:r>
+        <w:rPr>
+          <w:b/>
+          <w:bCs/>
+        </w:rPr>
+        <w:t xml:space="preserve">also squares to</w:t>
+      </w:r>
+      <w:r>
+        <w:rPr>
+          <w:b/>
+          <w:bCs/>
+        </w:rPr>
+        <w:t xml:space="preserve"> </w:t>
+      </w:r>
+      <m:oMath>
+        <m:r>
+          <m:rPr>
+            <m:sty m:val="p"/>
+          </m:rPr>
+          <m:t>−</m:t>
+        </m:r>
+        <m:r>
+          <m:t>1</m:t>
+        </m:r>
+      </m:oMath>
+      <w:r>
+        <w:rPr>
+          <w:b/>
+          <w:bCs/>
+        </w:rPr>
+        <w:t xml:space="preserve">)</w:t>
+      </w:r>
+    </w:p>
+    <w:p>
+      <w:pPr>
+        <w:pStyle w:val="BodyText"/>
+      </w:pPr>
+      <m:oMathPara>
+        <m:oMathParaPr>
+          <m:jc m:val="center"/>
+        </m:oMathParaPr>
+        <m:oMath>
+          <m:r>
+            <m:rPr>
+              <m:sty m:val="p"/>
+            </m:rPr>
+            <m:t>(</m:t>
+          </m:r>
+          <m:r>
+            <m:rPr>
+              <m:sty m:val="p"/>
+            </m:rPr>
+            <m:t>−</m:t>
+          </m:r>
+          <m:r>
+            <m:t>i</m:t>
+          </m:r>
+          <m:sSup>
+            <m:e>
+              <m:r>
+                <m:rPr>
+                  <m:sty m:val="p"/>
+                </m:rPr>
+                <m:t>)</m:t>
+              </m:r>
+            </m:e>
+            <m:sup>
+              <m:r>
+                <m:t>2</m:t>
+              </m:r>
+            </m:sup>
+          </m:sSup>
+          <m:r>
+            <m:rPr>
+              <m:sty m:val="p"/>
+            </m:rPr>
+            <m:t>=</m:t>
+          </m:r>
+          <m:r>
+            <m:rPr>
+              <m:sty m:val="p"/>
+            </m:rPr>
+            <m:t>−</m:t>
+          </m:r>
+          <m:r>
+            <m:t>1</m:t>
+          </m:r>
+          <m:r>
+            <m:rPr>
+              <m:sty m:val="p"/>
+            </m:rPr>
+            <m:t>.</m:t>
+          </m:r>
+        </m:oMath>
+      </m:oMathPara>
+    </w:p>
+    <w:bookmarkEnd w:id="228"/>
+    <w:p>
+      <w:pPr>
+        <w:pStyle w:val="FirstParagraph"/>
+      </w:pPr>
+      <w:r>
+        <w:rPr>
+          <w:i/>
+          <w:iCs/>
+        </w:rPr>
+        <w:t xml:space="preserve">Proof</w:t>
+      </w:r>
+      <w:r>
+        <w:t xml:space="preserve">. </w:t>
+      </w:r>
+    </w:p>
+    <w:p>
+      <w:pPr>
+        <w:pStyle w:val="BodyText"/>
+      </w:pPr>
+      <m:oMathPara>
+        <m:oMathParaPr>
+          <m:jc m:val="center"/>
+        </m:oMathParaPr>
+        <m:oMath>
+          <m:eqArr>
+            <m:e>
+              <m:r>
+                <m:rPr>
+                  <m:sty m:val="p"/>
+                </m:rPr>
+                <m:t>(</m:t>
+              </m:r>
+              <m:r>
+                <m:rPr>
+                  <m:sty m:val="p"/>
+                </m:rPr>
+                <m:t>−</m:t>
+              </m:r>
+              <m:r>
+                <m:t>i</m:t>
+              </m:r>
+              <m:sSup>
+                <m:e>
+                  <m:r>
+                    <m:rPr>
+                      <m:sty m:val="p"/>
+                    </m:rPr>
+                    <m:t>)</m:t>
+                  </m:r>
+                </m:e>
+                <m:sup>
+                  <m:r>
+                    <m:t>2</m:t>
+                  </m:r>
+                </m:sup>
+              </m:sSup>
+              <m:r>
+                <m:t>&amp;</m:t>
+              </m:r>
+              <m:r>
+                <m:rPr>
+                  <m:sty m:val="p"/>
+                </m:rPr>
+                <m:t>=</m:t>
+              </m:r>
+              <m:r>
+                <m:rPr>
+                  <m:sty m:val="p"/>
+                </m:rPr>
+                <m:t>(</m:t>
+              </m:r>
+              <m:r>
+                <m:rPr>
+                  <m:sty m:val="p"/>
+                </m:rPr>
+                <m:t>−</m:t>
+              </m:r>
+              <m:r>
+                <m:t>1</m:t>
+              </m:r>
+              <m:sSup>
+                <m:e>
+                  <m:r>
+                    <m:rPr>
+                      <m:sty m:val="p"/>
+                    </m:rPr>
+                    <m:t>)</m:t>
+                  </m:r>
+                </m:e>
+                <m:sup>
+                  <m:r>
+                    <m:t>2</m:t>
+                  </m:r>
+                </m:sup>
+              </m:sSup>
+              <m:r>
+                <m:t> </m:t>
+              </m:r>
+              <m:sSup>
+                <m:e>
+                  <m:r>
+                    <m:t>i</m:t>
+                  </m:r>
+                </m:e>
+                <m:sup>
+                  <m:r>
+                    <m:t>2</m:t>
+                  </m:r>
+                </m:sup>
+              </m:sSup>
+              <m:r>
+                <m:t>&amp;</m:t>
+              </m:r>
+              <m:r>
+                <m:t>&amp;</m:t>
+              </m:r>
+              <m:r>
+                <m:rPr>
+                  <m:nor/>
+                  <m:sty m:val="p"/>
+                </m:rPr>
+                <m:t>(</m:t>
+              </m:r>
+              <m:r>
+                <m:rPr>
+                  <m:sty m:val="p"/>
+                </m:rPr>
+                <m:t>−</m:t>
+              </m:r>
+              <m:r>
+                <m:t>i</m:t>
+              </m:r>
+              <m:r>
+                <m:rPr>
+                  <m:sty m:val="p"/>
+                </m:rPr>
+                <m:t>=</m:t>
+              </m:r>
+              <m:r>
+                <m:rPr>
+                  <m:sty m:val="p"/>
+                </m:rPr>
+                <m:t>(</m:t>
+              </m:r>
+              <m:r>
+                <m:rPr>
+                  <m:sty m:val="p"/>
+                </m:rPr>
+                <m:t>−</m:t>
+              </m:r>
+              <m:r>
+                <m:t>1</m:t>
+              </m:r>
+              <m:r>
+                <m:rPr>
+                  <m:sty m:val="p"/>
+                </m:rPr>
+                <m:t>)</m:t>
+              </m:r>
+              <m:r>
+                <m:rPr>
+                  <m:sty m:val="p"/>
+                </m:rPr>
+                <m:t>⋅</m:t>
+              </m:r>
+              <m:r>
+                <m:t>i</m:t>
+              </m:r>
+              <m:r>
+                <m:rPr>
+                  <m:nor/>
+                  <m:sty m:val="p"/>
+                </m:rPr>
+                <m:t>, and </m:t>
+              </m:r>
+              <m:r>
+                <m:rPr>
+                  <m:sty m:val="p"/>
+                </m:rPr>
+                <m:t>(</m:t>
+              </m:r>
+              <m:r>
+                <m:t>a</m:t>
+              </m:r>
+              <m:r>
+                <m:t>b</m:t>
+              </m:r>
+              <m:sSup>
+                <m:e>
+                  <m:r>
+                    <m:rPr>
+                      <m:sty m:val="p"/>
+                    </m:rPr>
+                    <m:t>)</m:t>
+                  </m:r>
+                </m:e>
+                <m:sup>
+                  <m:r>
+                    <m:t>2</m:t>
+                  </m:r>
+                </m:sup>
+              </m:sSup>
+              <m:r>
+                <m:rPr>
+                  <m:sty m:val="p"/>
+                </m:rPr>
+                <m:t>=</m:t>
+              </m:r>
+              <m:sSup>
+                <m:e>
+                  <m:r>
+                    <m:t>a</m:t>
+                  </m:r>
+                </m:e>
+                <m:sup>
+                  <m:r>
+                    <m:t>2</m:t>
+                  </m:r>
+                </m:sup>
+              </m:sSup>
+              <m:sSup>
+                <m:e>
+                  <m:r>
+                    <m:t>b</m:t>
+                  </m:r>
+                </m:e>
+                <m:sup>
+                  <m:r>
+                    <m:t>2</m:t>
+                  </m:r>
+                </m:sup>
+              </m:sSup>
+              <m:r>
+                <m:rPr>
+                  <m:nor/>
+                  <m:sty m:val="p"/>
+                </m:rPr>
+                <m:t> because products commute and associate)</m:t>
+              </m:r>
+            </m:e>
+            <m:e>
+              <m:r>
+                <m:t>&amp;</m:t>
+              </m:r>
+              <m:r>
+                <m:rPr>
+                  <m:sty m:val="p"/>
+                </m:rPr>
+                <m:t>=</m:t>
+              </m:r>
+              <m:r>
+                <m:t>1</m:t>
+              </m:r>
+              <m:r>
+                <m:rPr>
+                  <m:sty m:val="p"/>
+                </m:rPr>
+                <m:t>⋅</m:t>
+              </m:r>
+              <m:r>
+                <m:rPr>
+                  <m:sty m:val="p"/>
+                </m:rPr>
+                <m:t>(</m:t>
+              </m:r>
+              <m:r>
+                <m:rPr>
+                  <m:sty m:val="p"/>
+                </m:rPr>
+                <m:t>−</m:t>
+              </m:r>
+              <m:r>
+                <m:t>1</m:t>
+              </m:r>
+              <m:r>
+                <m:rPr>
+                  <m:sty m:val="p"/>
+                </m:rPr>
+                <m:t>)</m:t>
+              </m:r>
+              <m:r>
+                <m:t>&amp;</m:t>
+              </m:r>
+              <m:r>
+                <m:t>&amp;</m:t>
+              </m:r>
+              <m:r>
+                <m:rPr>
+                  <m:nor/>
+                  <m:sty m:val="p"/>
+                </m:rPr>
+                <m:t>(</m:t>
+              </m:r>
+              <m:r>
+                <m:rPr>
+                  <m:sty m:val="p"/>
+                </m:rPr>
+                <m:t>(</m:t>
+              </m:r>
+              <m:r>
+                <m:rPr>
+                  <m:sty m:val="p"/>
+                </m:rPr>
+                <m:t>−</m:t>
+              </m:r>
+              <m:r>
+                <m:t>1</m:t>
+              </m:r>
+              <m:sSup>
+                <m:e>
+                  <m:r>
+                    <m:rPr>
+                      <m:sty m:val="p"/>
+                    </m:rPr>
+                    <m:t>)</m:t>
+                  </m:r>
+                </m:e>
+                <m:sup>
+                  <m:r>
+                    <m:t>2</m:t>
+                  </m:r>
+                </m:sup>
+              </m:sSup>
+              <m:r>
+                <m:rPr>
+                  <m:sty m:val="p"/>
+                </m:rPr>
+                <m:t>=</m:t>
+              </m:r>
+              <m:r>
+                <m:t>1</m:t>
+              </m:r>
+              <m:r>
+                <m:rPr>
+                  <m:nor/>
+                  <m:sty m:val="p"/>
+                </m:rPr>
+                <m:t> and </m:t>
+              </m:r>
+              <m:r>
+                <m:rPr>
+                  <m:nor/>
+                  <m:sty m:val="p"/>
+                </m:rPr>
+                <m:t>Definition 50</m:t>
+              </m:r>
+              <m:r>
+                <m:rPr>
+                  <m:nor/>
+                  <m:sty m:val="p"/>
+                </m:rPr>
+                <m:t>)</m:t>
+              </m:r>
+            </m:e>
+            <m:e>
+              <m:r>
+                <m:t>&amp;</m:t>
+              </m:r>
+              <m:r>
+                <m:rPr>
+                  <m:sty m:val="p"/>
+                </m:rPr>
+                <m:t>=</m:t>
+              </m:r>
+              <m:r>
+                <m:rPr>
+                  <m:sty m:val="p"/>
+                </m:rPr>
+                <m:t>−</m:t>
+              </m:r>
+              <m:r>
+                <m:t>1</m:t>
+              </m:r>
+              <m:r>
+                <m:t>&amp;</m:t>
+              </m:r>
+              <m:r>
+                <m:t>&amp;</m:t>
+              </m:r>
+              <m:r>
+                <m:rPr>
+                  <m:nor/>
+                  <m:sty m:val="p"/>
+                </m:rPr>
+                <m:t>(multiply)</m:t>
+              </m:r>
+            </m:e>
+          </m:eqArr>
+        </m:oMath>
+      </m:oMathPara>
+    </w:p>
+    <w:bookmarkStart w:id="229" w:name="exm-negative-imaginary-unit"/>
+    <w:p>
+      <w:pPr>
+        <w:pStyle w:val="FirstParagraph"/>
+      </w:pPr>
+      <w:r>
+        <w:rPr>
+          <w:b/>
+          <w:bCs/>
+        </w:rPr>
+        <w:t xml:space="preserve">Example 51 (Squaring</w:t>
+      </w:r>
+      <w:r>
+        <w:rPr>
+          <w:b/>
+          <w:bCs/>
+        </w:rPr>
+        <w:t xml:space="preserve"> </w:t>
+      </w:r>
+      <m:oMath>
+        <m:r>
+          <m:t>i</m:t>
+        </m:r>
+      </m:oMath>
+      <w:r>
+        <w:rPr>
+          <w:b/>
+          <w:bCs/>
+        </w:rPr>
+        <w:t xml:space="preserve"> </w:t>
+      </w:r>
+      <w:r>
+        <w:rPr>
+          <w:b/>
+          <w:bCs/>
+        </w:rPr>
+        <w:t xml:space="preserve">and</w:t>
+      </w:r>
+      <w:r>
+        <w:rPr>
+          <w:b/>
+          <w:bCs/>
+        </w:rPr>
+        <w:t xml:space="preserve"> </w:t>
+      </w:r>
+      <m:oMath>
+        <m:r>
+          <m:rPr>
+            <m:sty m:val="p"/>
+          </m:rPr>
+          <m:t>−</m:t>
+        </m:r>
+        <m:r>
+          <m:t>i</m:t>
+        </m:r>
+      </m:oMath>
+      <w:r>
+        <w:rPr>
+          <w:b/>
+          <w:bCs/>
+        </w:rPr>
+        <w:t xml:space="preserve"> </w:t>
+      </w:r>
+      <w:r>
+        <w:rPr>
+          <w:b/>
+          <w:bCs/>
+        </w:rPr>
+        <w:t xml:space="preserve">in R)</w:t>
+      </w:r>
+      <w:r>
+        <w:t xml:space="preserve"> </w:t>
+      </w:r>
+      <w:r>
+        <w:t xml:space="preserve">R has the imaginary unit as</w:t>
+      </w:r>
+      <w:r>
+        <w:t xml:space="preserve"> </w:t>
+      </w:r>
+      <w:r>
+        <w:rPr>
+          <w:rStyle w:val="VerbatimChar"/>
+        </w:rPr>
+        <w:t xml:space="preserve">1i</w:t>
+      </w:r>
+      <w:r>
+        <w:t xml:space="preserve">.</w:t>
+      </w:r>
+      <w:r>
+        <w:t xml:space="preserve"> </w:t>
+      </w:r>
+      <w:r>
+        <w:t xml:space="preserve">The code below squares it and its negative.</w:t>
+      </w:r>
+    </w:p>
+    <w:p>
+      <w:pPr>
+        <w:pStyle w:val="SourceCode"/>
+      </w:pPr>
+      <w:r>
+        <w:rPr>
+          <w:rStyle w:val="NormalTok"/>
+        </w:rPr>
+        <w:t xml:space="preserve">squares </w:t>
+      </w:r>
+      <w:r>
+        <w:rPr>
+          <w:rStyle w:val="OtherTok"/>
+        </w:rPr>
+        <w:t xml:space="preserve">&lt;-</w:t>
+      </w:r>
+      <w:r>
+        <w:rPr>
+          <w:rStyle w:val="NormalTok"/>
+        </w:rPr>
+        <w:t xml:space="preserve"> </w:t>
+      </w:r>
+      <w:r>
+        <w:rPr>
+          <w:rStyle w:val="FunctionTok"/>
+        </w:rPr>
+        <w:t xml:space="preserve">c</w:t>
+      </w:r>
+      <w:r>
+        <w:rPr>
+          <w:rStyle w:val="NormalTok"/>
+        </w:rPr>
+        <w:t xml:space="preserve">(</w:t>
+      </w:r>
+      <w:r>
+        <w:rPr>
+          <w:rStyle w:val="AttributeTok"/>
+        </w:rPr>
+        <w:t xml:space="preserve">i =</w:t>
+      </w:r>
+      <w:r>
+        <w:rPr>
+          <w:rStyle w:val="NormalTok"/>
+        </w:rPr>
+        <w:t xml:space="preserve"> (</w:t>
+      </w:r>
+      <w:r>
+        <w:rPr>
+          <w:rStyle w:val="DecValTok"/>
+        </w:rPr>
+        <w:t xml:space="preserve">1</w:t>
+      </w:r>
+      <w:r>
+        <w:rPr>
+          <w:rStyle w:val="NormalTok"/>
+        </w:rPr>
+        <w:t xml:space="preserve">i)</w:t>
+      </w:r>
+      <w:r>
+        <w:rPr>
+          <w:rStyle w:val="SpecialCharTok"/>
+        </w:rPr>
+        <w:t xml:space="preserve">^</w:t>
+      </w:r>
+      <w:r>
+        <w:rPr>
+          <w:rStyle w:val="DecValTok"/>
+        </w:rPr>
+        <w:t xml:space="preserve">2</w:t>
+      </w:r>
+      <w:r>
+        <w:rPr>
+          <w:rStyle w:val="NormalTok"/>
+        </w:rPr>
+        <w:t xml:space="preserve">, </w:t>
+      </w:r>
+      <w:r>
+        <w:rPr>
+          <w:rStyle w:val="AttributeTok"/>
+        </w:rPr>
+        <w:t xml:space="preserve">minus_i =</w:t>
+      </w:r>
+      <w:r>
+        <w:rPr>
+          <w:rStyle w:val="NormalTok"/>
+        </w:rPr>
+        <w:t xml:space="preserve"> (</w:t>
+      </w:r>
+      <w:r>
+        <w:rPr>
+          <w:rStyle w:val="SpecialCharTok"/>
+        </w:rPr>
+        <w:t xml:space="preserve">-</w:t>
+      </w:r>
+      <w:r>
+        <w:rPr>
+          <w:rStyle w:val="DecValTok"/>
+        </w:rPr>
+        <w:t xml:space="preserve">1</w:t>
+      </w:r>
+      <w:r>
+        <w:rPr>
+          <w:rStyle w:val="NormalTok"/>
+        </w:rPr>
+        <w:t xml:space="preserve">i)</w:t>
+      </w:r>
+      <w:r>
+        <w:rPr>
+          <w:rStyle w:val="SpecialCharTok"/>
+        </w:rPr>
+        <w:t xml:space="preserve">^</w:t>
+      </w:r>
+      <w:r>
+        <w:rPr>
+          <w:rStyle w:val="DecValTok"/>
+        </w:rPr>
+        <w:t xml:space="preserve">2</w:t>
+      </w:r>
+      <w:r>
+        <w:rPr>
+          <w:rStyle w:val="NormalTok"/>
+        </w:rPr>
+        <w:t xml:space="preserve">)</w:t>
+      </w:r>
+      <w:r>
+        <w:br/>
+      </w:r>
+      <w:r>
+        <w:rPr>
+          <w:rStyle w:val="NormalTok"/>
+        </w:rPr>
+        <w:t xml:space="preserve">squares</w:t>
+      </w:r>
+      <w:r>
+        <w:br/>
+      </w:r>
+      <w:r>
+        <w:rPr>
+          <w:rStyle w:val="CommentTok"/>
+        </w:rPr>
+        <w:t xml:space="preserve">#&gt;       i minus_i </w:t>
+      </w:r>
+      <w:r>
+        <w:br/>
+      </w:r>
+      <w:r>
+        <w:rPr>
+          <w:rStyle w:val="CommentTok"/>
+        </w:rPr>
+        <w:t xml:space="preserve">#&gt; -1+0i -1+0i</w:t>
+      </w:r>
+    </w:p>
+    <w:p>
+      <w:pPr>
+        <w:pStyle w:val="FirstParagraph"/>
+      </w:pPr>
+      <w:r>
+        <w:t xml:space="preserve">Both squares have real part -1</w:t>
+      </w:r>
+      <w:r>
+        <w:t xml:space="preserve"> </w:t>
+      </w:r>
+      <w:r>
+        <w:t xml:space="preserve">and imaginary part 0,</w:t>
+      </w:r>
+      <w:r>
+        <w:t xml:space="preserve"> </w:t>
+      </w:r>
+      <w:r>
+        <w:t xml:space="preserve">as</w:t>
+      </w:r>
+      <w:r>
+        <w:t xml:space="preserve"> </w:t>
+      </w:r>
+      <w:hyperlink w:anchor="def-imaginary-unit">
+        <w:r>
+          <w:rPr>
+            <w:rStyle w:val="Hyperlink"/>
+          </w:rPr>
+          <w:t xml:space="preserve">Definition 50</w:t>
+        </w:r>
+      </w:hyperlink>
+      <w:r>
+        <w:t xml:space="preserve"> </w:t>
+      </w:r>
+      <w:r>
+        <w:t xml:space="preserve">and</w:t>
+      </w:r>
+      <w:r>
+        <w:t xml:space="preserve"> </w:t>
+      </w:r>
+      <w:hyperlink w:anchor="thm-negative-imaginary-unit">
+        <w:r>
+          <w:rPr>
+            <w:rStyle w:val="Hyperlink"/>
+          </w:rPr>
+          <w:t xml:space="preserve">Theorem 30</w:t>
+        </w:r>
+      </w:hyperlink>
+      <w:r>
+        <w:t xml:space="preserve"> </w:t>
+      </w:r>
+      <w:r>
+        <w:t xml:space="preserve">say.</w:t>
+      </w:r>
+    </w:p>
+    <w:bookmarkEnd w:id="229"/>
+    <w:bookmarkStart w:id="230" w:name="rem-imaginary-unit-choice"/>
+    <w:p>
+      <w:pPr>
+        <w:pStyle w:val="BodyText"/>
+      </w:pPr>
+      <w:r>
+        <w:rPr>
+          <w:i/>
+          <w:iCs/>
+        </w:rPr>
+        <w:t xml:space="preserve">Remark 18</w:t>
+      </w:r>
+      <w:r>
+        <w:t xml:space="preserve"> (The rule does not tell</w:t>
+      </w:r>
+      <w:r>
+        <w:t xml:space="preserve"> </w:t>
+      </w:r>
+      <m:oMath>
+        <m:r>
+          <m:t>i</m:t>
+        </m:r>
+      </m:oMath>
+      <w:r>
+        <w:t xml:space="preserve"> </w:t>
+      </w:r>
+      <w:r>
+        <w:t xml:space="preserve">from</w:t>
+      </w:r>
+      <w:r>
+        <w:t xml:space="preserve"> </w:t>
+      </w:r>
+      <m:oMath>
+        <m:r>
+          <m:rPr>
+            <m:sty m:val="p"/>
+          </m:rPr>
+          <m:t>−</m:t>
+        </m:r>
+        <m:r>
+          <m:t>i</m:t>
+        </m:r>
+      </m:oMath>
+      <w:r>
+        <w:t xml:space="preserve">). </w:t>
+      </w:r>
+      <w:r>
+        <w:t xml:space="preserve">Because</w:t>
+      </w:r>
+      <w:r>
+        <w:t xml:space="preserve"> </w:t>
+      </w:r>
+      <m:oMath>
+        <m:r>
+          <m:rPr>
+            <m:sty m:val="p"/>
+          </m:rPr>
+          <m:t>−</m:t>
+        </m:r>
+        <m:r>
+          <m:t>i</m:t>
+        </m:r>
+      </m:oMath>
+      <w:r>
+        <w:t xml:space="preserve"> </w:t>
+      </w:r>
+      <w:r>
+        <w:t xml:space="preserve">obeys the same rule as</w:t>
+      </w:r>
+      <w:r>
+        <w:t xml:space="preserve"> </w:t>
+      </w:r>
+      <m:oMath>
+        <m:r>
+          <m:t>i</m:t>
+        </m:r>
+      </m:oMath>
+      <w:r>
+        <w:t xml:space="preserve"> </w:t>
+      </w:r>
+      <w:r>
+        <w:t xml:space="preserve">(</w:t>
+      </w:r>
+      <w:hyperlink w:anchor="thm-negative-imaginary-unit">
+        <w:r>
+          <w:rPr>
+            <w:rStyle w:val="Hyperlink"/>
+          </w:rPr>
+          <w:t xml:space="preserve">Theorem 30</w:t>
+        </w:r>
+      </w:hyperlink>
+      <w:r>
+        <w:t xml:space="preserve">),</w:t>
+      </w:r>
+      <w:r>
+        <w:t xml:space="preserve"> </w:t>
+      </w:r>
+      <w:r>
+        <w:t xml:space="preserve">the rule</w:t>
+      </w:r>
+      <w:r>
+        <w:t xml:space="preserve"> </w:t>
+      </w:r>
+      <m:oMath>
+        <m:sSup>
+          <m:e>
+            <m:r>
+              <m:t>i</m:t>
+            </m:r>
+          </m:e>
+          <m:sup>
+            <m:r>
+              <m:t>2</m:t>
+            </m:r>
+          </m:sup>
+        </m:sSup>
+        <m:r>
+          <m:rPr>
+            <m:sty m:val="p"/>
+          </m:rPr>
+          <m:t>=</m:t>
+        </m:r>
+        <m:r>
+          <m:rPr>
+            <m:sty m:val="p"/>
+          </m:rPr>
+          <m:t>−</m:t>
+        </m:r>
+        <m:r>
+          <m:t>1</m:t>
+        </m:r>
+      </m:oMath>
+      <w:r>
+        <w:t xml:space="preserve"> </w:t>
+      </w:r>
+      <w:r>
+        <w:t xml:space="preserve">does not single one of them out.</w:t>
+      </w:r>
+      <w:r>
+        <w:t xml:space="preserve"> </w:t>
+      </w:r>
+      <w:r>
+        <w:t xml:space="preserve">The symbol</w:t>
+      </w:r>
+      <w:r>
+        <w:t xml:space="preserve"> </w:t>
+      </w:r>
+      <m:oMath>
+        <m:r>
+          <m:t>i</m:t>
+        </m:r>
+      </m:oMath>
+      <w:r>
+        <w:t xml:space="preserve"> </w:t>
+      </w:r>
+      <w:r>
+        <w:t xml:space="preserve">names one of these two square roots of</w:t>
+      </w:r>
+      <w:r>
+        <w:t xml:space="preserve"> </w:t>
+      </w:r>
+      <m:oMath>
+        <m:r>
+          <m:rPr>
+            <m:sty m:val="p"/>
+          </m:rPr>
+          <m:t>−</m:t>
+        </m:r>
+        <m:r>
+          <m:t>1</m:t>
+        </m:r>
+      </m:oMath>
+      <w:r>
+        <w:t xml:space="preserve">, chosen once and for all.</w:t>
+      </w:r>
+    </w:p>
+    <w:bookmarkEnd w:id="230"/>
+    <w:bookmarkStart w:id="231" w:name="def-complex-number"/>
     <w:p>
       <w:pPr>
         <w:pStyle w:val="BodyText"/>
@@ -68670,93 +69487,8 @@
       <w:r>
         <w:t xml:space="preserve">Two complex numbers are equal exactly when their real parts are equal and their imaginary parts are equal.</w:t>
       </w:r>
-      <w:r>
-        <w:t xml:space="preserve"> </w:t>
-      </w:r>
-      <w:r>
-        <w:t xml:space="preserve">A real number</w:t>
-      </w:r>
-      <w:r>
-        <w:t xml:space="preserve"> </w:t>
-      </w:r>
-      <m:oMath>
-        <m:r>
-          <m:t>a</m:t>
-        </m:r>
-      </m:oMath>
-      <w:r>
-        <w:t xml:space="preserve"> </w:t>
-      </w:r>
-      <w:r>
-        <w:t xml:space="preserve">is the complex number</w:t>
-      </w:r>
-      <w:r>
-        <w:t xml:space="preserve"> </w:t>
-      </w:r>
-      <m:oMath>
-        <m:r>
-          <m:t>a</m:t>
-        </m:r>
-        <m:r>
-          <m:rPr>
-            <m:sty m:val="p"/>
-          </m:rPr>
-          <m:t>+</m:t>
-        </m:r>
-        <m:r>
-          <m:t>0</m:t>
-        </m:r>
-        <m:r>
-          <m:t> </m:t>
-        </m:r>
-        <m:r>
-          <m:t>i</m:t>
-        </m:r>
-      </m:oMath>
-      <w:r>
-        <w:t xml:space="preserve">,</w:t>
-      </w:r>
-      <w:r>
-        <w:t xml:space="preserve"> </w:t>
-      </w:r>
-      <w:r>
-        <w:t xml:space="preserve">so</w:t>
-      </w:r>
-      <w:r>
-        <w:t xml:space="preserve"> </w:t>
-      </w:r>
-      <m:oMath>
-        <m:r>
-          <m:rPr>
-            <m:scr m:val="double-struck"/>
-            <m:sty m:val="p"/>
-          </m:rPr>
-          <m:t>R</m:t>
-        </m:r>
-      </m:oMath>
-      <w:r>
-        <w:t xml:space="preserve"> </w:t>
-      </w:r>
-      <w:r>
-        <w:t xml:space="preserve">is a subset of</w:t>
-      </w:r>
-      <w:r>
-        <w:t xml:space="preserve"> </w:t>
-      </w:r>
-      <m:oMath>
-        <m:r>
-          <m:rPr>
-            <m:scr m:val="double-struck"/>
-            <m:sty m:val="p"/>
-          </m:rPr>
-          <m:t>C</m:t>
-        </m:r>
-      </m:oMath>
-      <w:r>
-        <w:t xml:space="preserve">.</w:t>
-      </w:r>
     </w:p>
-    <w:bookmarkEnd w:id="228"/>
+    <w:bookmarkEnd w:id="231"/>
     <w:p>
       <w:pPr>
         <w:pStyle w:val="BodyText"/>
@@ -68865,7 +69597,7 @@
         <w:t xml:space="preserve">defines the real and imaginary parts.</w:t>
       </w:r>
     </w:p>
-    <w:bookmarkStart w:id="229" w:name="exm-complex-number"/>
+    <w:bookmarkStart w:id="232" w:name="exm-complex-number"/>
     <w:p>
       <w:pPr>
         <w:pStyle w:val="BodyText"/>
@@ -68875,7 +69607,7 @@
           <w:b/>
           <w:bCs/>
         </w:rPr>
-        <w:t xml:space="preserve">Example 51 (Real and imaginary parts)</w:t>
+        <w:t xml:space="preserve">Example 52 (Real and imaginary parts)</w:t>
       </w:r>
       <w:r>
         <w:t xml:space="preserve"> </w:t>
@@ -69213,8 +69945,8 @@
         <w:t xml:space="preserve">.</w:t>
       </w:r>
     </w:p>
-    <w:bookmarkEnd w:id="229"/>
-    <w:bookmarkStart w:id="230" w:name="thm-complex-arithmetic"/>
+    <w:bookmarkEnd w:id="232"/>
+    <w:bookmarkStart w:id="233" w:name="thm-reals-in-complex"/>
     <w:p>
       <w:pPr>
         <w:pStyle w:val="BodyText"/>
@@ -69224,7 +69956,1138 @@
           <w:b/>
           <w:bCs/>
         </w:rPr>
-        <w:t xml:space="preserve">Theorem 30 (Adding and multiplying complex numbers)</w:t>
+        <w:t xml:space="preserve">Theorem 31 (Every real number is a complex number)</w:t>
+      </w:r>
+      <w:r>
+        <w:t xml:space="preserve"> </w:t>
+      </w:r>
+      <w:r>
+        <w:t xml:space="preserve">A complex number</w:t>
+      </w:r>
+      <w:r>
+        <w:t xml:space="preserve"> </w:t>
+      </w:r>
+      <m:oMath>
+        <m:r>
+          <m:t>z</m:t>
+        </m:r>
+      </m:oMath>
+      <w:r>
+        <w:t xml:space="preserve"> </w:t>
+      </w:r>
+      <w:r>
+        <w:t xml:space="preserve">is a real number exactly when</w:t>
+      </w:r>
+      <w:r>
+        <w:t xml:space="preserve"> </w:t>
+      </w:r>
+      <m:oMath>
+        <m:r>
+          <m:rPr>
+            <m:sty m:val="p"/>
+          </m:rPr>
+          <m:t>Im</m:t>
+        </m:r>
+        <m:r>
+          <m:t>z</m:t>
+        </m:r>
+        <m:r>
+          <m:rPr>
+            <m:sty m:val="p"/>
+          </m:rPr>
+          <m:t>=</m:t>
+        </m:r>
+        <m:r>
+          <m:t>0</m:t>
+        </m:r>
+      </m:oMath>
+      <w:r>
+        <w:t xml:space="preserve">.</w:t>
+      </w:r>
+      <w:r>
+        <w:t xml:space="preserve"> </w:t>
+      </w:r>
+      <w:r>
+        <w:t xml:space="preserve">In particular, every real number</w:t>
+      </w:r>
+      <w:r>
+        <w:t xml:space="preserve"> </w:t>
+      </w:r>
+      <m:oMath>
+        <m:r>
+          <m:t>a</m:t>
+        </m:r>
+      </m:oMath>
+      <w:r>
+        <w:t xml:space="preserve"> </w:t>
+      </w:r>
+      <w:r>
+        <w:t xml:space="preserve">is the complex number</w:t>
+      </w:r>
+      <w:r>
+        <w:t xml:space="preserve"> </w:t>
+      </w:r>
+      <m:oMath>
+        <m:r>
+          <m:t>a</m:t>
+        </m:r>
+        <m:r>
+          <m:rPr>
+            <m:sty m:val="p"/>
+          </m:rPr>
+          <m:t>+</m:t>
+        </m:r>
+        <m:r>
+          <m:t>0</m:t>
+        </m:r>
+        <m:r>
+          <m:t> </m:t>
+        </m:r>
+        <m:r>
+          <m:t>i</m:t>
+        </m:r>
+      </m:oMath>
+      <w:r>
+        <w:t xml:space="preserve">,</w:t>
+      </w:r>
+      <w:r>
+        <w:t xml:space="preserve"> </w:t>
+      </w:r>
+      <w:r>
+        <w:t xml:space="preserve">with</w:t>
+      </w:r>
+      <w:r>
+        <w:t xml:space="preserve"> </w:t>
+      </w:r>
+      <m:oMath>
+        <m:r>
+          <m:rPr>
+            <m:sty m:val="p"/>
+          </m:rPr>
+          <m:t>Re</m:t>
+        </m:r>
+        <m:r>
+          <m:t>a</m:t>
+        </m:r>
+        <m:r>
+          <m:rPr>
+            <m:sty m:val="p"/>
+          </m:rPr>
+          <m:t>=</m:t>
+        </m:r>
+        <m:r>
+          <m:t>a</m:t>
+        </m:r>
+      </m:oMath>
+      <w:r>
+        <w:t xml:space="preserve"> </w:t>
+      </w:r>
+      <w:r>
+        <w:t xml:space="preserve">and</w:t>
+      </w:r>
+      <w:r>
+        <w:t xml:space="preserve"> </w:t>
+      </w:r>
+      <m:oMath>
+        <m:r>
+          <m:rPr>
+            <m:sty m:val="p"/>
+          </m:rPr>
+          <m:t>Im</m:t>
+        </m:r>
+        <m:r>
+          <m:t>a</m:t>
+        </m:r>
+        <m:r>
+          <m:rPr>
+            <m:sty m:val="p"/>
+          </m:rPr>
+          <m:t>=</m:t>
+        </m:r>
+        <m:r>
+          <m:t>0</m:t>
+        </m:r>
+      </m:oMath>
+      <w:r>
+        <w:t xml:space="preserve">,</w:t>
+      </w:r>
+      <w:r>
+        <w:t xml:space="preserve"> </w:t>
+      </w:r>
+      <w:r>
+        <w:t xml:space="preserve">so</w:t>
+      </w:r>
+      <w:r>
+        <w:t xml:space="preserve"> </w:t>
+      </w:r>
+      <m:oMath>
+        <m:r>
+          <m:rPr>
+            <m:scr m:val="double-struck"/>
+            <m:sty m:val="p"/>
+          </m:rPr>
+          <m:t>R</m:t>
+        </m:r>
+      </m:oMath>
+      <w:r>
+        <w:t xml:space="preserve"> </w:t>
+      </w:r>
+      <w:r>
+        <w:t xml:space="preserve">is a subset of</w:t>
+      </w:r>
+      <w:r>
+        <w:t xml:space="preserve"> </w:t>
+      </w:r>
+      <m:oMath>
+        <m:r>
+          <m:rPr>
+            <m:scr m:val="double-struck"/>
+            <m:sty m:val="p"/>
+          </m:rPr>
+          <m:t>C</m:t>
+        </m:r>
+      </m:oMath>
+      <w:r>
+        <w:t xml:space="preserve">.</w:t>
+      </w:r>
+    </w:p>
+    <w:bookmarkEnd w:id="233"/>
+    <w:p>
+      <w:pPr>
+        <w:pStyle w:val="BodyText"/>
+      </w:pPr>
+      <w:r>
+        <w:rPr>
+          <w:i/>
+          <w:iCs/>
+        </w:rPr>
+        <w:t xml:space="preserve">Proof</w:t>
+      </w:r>
+      <w:r>
+        <w:t xml:space="preserve">. </w:t>
+      </w:r>
+      <w:r>
+        <w:t xml:space="preserve">Let</w:t>
+      </w:r>
+      <w:r>
+        <w:t xml:space="preserve"> </w:t>
+      </w:r>
+      <m:oMath>
+        <m:r>
+          <m:t>a</m:t>
+        </m:r>
+      </m:oMath>
+      <w:r>
+        <w:t xml:space="preserve"> </w:t>
+      </w:r>
+      <w:r>
+        <w:t xml:space="preserve">be a real number.</w:t>
+      </w:r>
+      <w:r>
+        <w:t xml:space="preserve"> </w:t>
+      </w:r>
+      <w:r>
+        <w:t xml:space="preserve">Since</w:t>
+      </w:r>
+      <w:r>
+        <w:t xml:space="preserve"> </w:t>
+      </w:r>
+      <m:oMath>
+        <m:r>
+          <m:t>0</m:t>
+        </m:r>
+        <m:r>
+          <m:t> </m:t>
+        </m:r>
+        <m:r>
+          <m:t>i</m:t>
+        </m:r>
+        <m:r>
+          <m:rPr>
+            <m:sty m:val="p"/>
+          </m:rPr>
+          <m:t>=</m:t>
+        </m:r>
+        <m:r>
+          <m:t>0</m:t>
+        </m:r>
+      </m:oMath>
+      <w:r>
+        <w:t xml:space="preserve">,</w:t>
+      </w:r>
+    </w:p>
+    <w:p>
+      <w:pPr>
+        <w:pStyle w:val="BodyText"/>
+      </w:pPr>
+      <m:oMathPara>
+        <m:oMathParaPr>
+          <m:jc m:val="center"/>
+        </m:oMathParaPr>
+        <m:oMath>
+          <m:eqArr>
+            <m:e>
+              <m:r>
+                <m:t>a</m:t>
+              </m:r>
+              <m:r>
+                <m:rPr>
+                  <m:sty m:val="p"/>
+                </m:rPr>
+                <m:t>+</m:t>
+              </m:r>
+              <m:r>
+                <m:t>0</m:t>
+              </m:r>
+              <m:r>
+                <m:t> </m:t>
+              </m:r>
+              <m:r>
+                <m:t>i</m:t>
+              </m:r>
+              <m:r>
+                <m:t>&amp;</m:t>
+              </m:r>
+              <m:r>
+                <m:rPr>
+                  <m:sty m:val="p"/>
+                </m:rPr>
+                <m:t>=</m:t>
+              </m:r>
+              <m:r>
+                <m:t>a</m:t>
+              </m:r>
+              <m:r>
+                <m:rPr>
+                  <m:sty m:val="p"/>
+                </m:rPr>
+                <m:t>+</m:t>
+              </m:r>
+              <m:r>
+                <m:t>0</m:t>
+              </m:r>
+              <m:r>
+                <m:t>&amp;</m:t>
+              </m:r>
+              <m:r>
+                <m:t>&amp;</m:t>
+              </m:r>
+              <m:r>
+                <m:rPr>
+                  <m:nor/>
+                  <m:sty m:val="p"/>
+                </m:rPr>
+                <m:t>(</m:t>
+              </m:r>
+              <m:r>
+                <m:t>0</m:t>
+              </m:r>
+              <m:r>
+                <m:t> </m:t>
+              </m:r>
+              <m:r>
+                <m:t>i</m:t>
+              </m:r>
+              <m:r>
+                <m:rPr>
+                  <m:sty m:val="p"/>
+                </m:rPr>
+                <m:t>=</m:t>
+              </m:r>
+              <m:r>
+                <m:t>0</m:t>
+              </m:r>
+              <m:r>
+                <m:rPr>
+                  <m:nor/>
+                  <m:sty m:val="p"/>
+                </m:rPr>
+                <m:t>)</m:t>
+              </m:r>
+            </m:e>
+            <m:e>
+              <m:r>
+                <m:t>&amp;</m:t>
+              </m:r>
+              <m:r>
+                <m:rPr>
+                  <m:sty m:val="p"/>
+                </m:rPr>
+                <m:t>=</m:t>
+              </m:r>
+              <m:r>
+                <m:t>a</m:t>
+              </m:r>
+              <m:r>
+                <m:t>&amp;</m:t>
+              </m:r>
+              <m:r>
+                <m:t>&amp;</m:t>
+              </m:r>
+              <m:r>
+                <m:rPr>
+                  <m:nor/>
+                  <m:sty m:val="p"/>
+                </m:rPr>
+                <m:t>(</m:t>
+              </m:r>
+              <m:r>
+                <m:rPr>
+                  <m:nor/>
+                  <m:sty m:val="p"/>
+                </m:rPr>
+                <m:t>Theorem 10</m:t>
+              </m:r>
+              <m:r>
+                <m:rPr>
+                  <m:nor/>
+                  <m:sty m:val="p"/>
+                </m:rPr>
+                <m:t>)</m:t>
+              </m:r>
+            </m:e>
+          </m:eqArr>
+        </m:oMath>
+      </m:oMathPara>
+    </w:p>
+    <w:p>
+      <w:pPr>
+        <w:pStyle w:val="FirstParagraph"/>
+      </w:pPr>
+      <w:r>
+        <w:t xml:space="preserve">so</w:t>
+      </w:r>
+      <w:r>
+        <w:t xml:space="preserve"> </w:t>
+      </w:r>
+      <m:oMath>
+        <m:r>
+          <m:t>a</m:t>
+        </m:r>
+      </m:oMath>
+      <w:r>
+        <w:t xml:space="preserve"> </w:t>
+      </w:r>
+      <w:r>
+        <w:t xml:space="preserve">is the complex number</w:t>
+      </w:r>
+      <w:r>
+        <w:t xml:space="preserve"> </w:t>
+      </w:r>
+      <m:oMath>
+        <m:r>
+          <m:t>a</m:t>
+        </m:r>
+        <m:r>
+          <m:rPr>
+            <m:sty m:val="p"/>
+          </m:rPr>
+          <m:t>+</m:t>
+        </m:r>
+        <m:r>
+          <m:t>0</m:t>
+        </m:r>
+        <m:r>
+          <m:t> </m:t>
+        </m:r>
+        <m:r>
+          <m:t>i</m:t>
+        </m:r>
+      </m:oMath>
+      <w:r>
+        <w:t xml:space="preserve">, whose imaginary part is</w:t>
+      </w:r>
+      <w:r>
+        <w:t xml:space="preserve"> </w:t>
+      </w:r>
+      <m:oMath>
+        <m:r>
+          <m:t>0</m:t>
+        </m:r>
+      </m:oMath>
+      <w:r>
+        <w:t xml:space="preserve">.</w:t>
+      </w:r>
+      <w:r>
+        <w:t xml:space="preserve"> </w:t>
+      </w:r>
+      <w:r>
+        <w:t xml:space="preserve">The real part of</w:t>
+      </w:r>
+      <w:r>
+        <w:t xml:space="preserve"> </w:t>
+      </w:r>
+      <m:oMath>
+        <m:r>
+          <m:t>a</m:t>
+        </m:r>
+        <m:r>
+          <m:rPr>
+            <m:sty m:val="p"/>
+          </m:rPr>
+          <m:t>+</m:t>
+        </m:r>
+        <m:r>
+          <m:t>0</m:t>
+        </m:r>
+        <m:r>
+          <m:t> </m:t>
+        </m:r>
+        <m:r>
+          <m:t>i</m:t>
+        </m:r>
+      </m:oMath>
+      <w:r>
+        <w:t xml:space="preserve"> </w:t>
+      </w:r>
+      <w:r>
+        <w:t xml:space="preserve">is</w:t>
+      </w:r>
+      <w:r>
+        <w:t xml:space="preserve"> </w:t>
+      </w:r>
+      <m:oMath>
+        <m:r>
+          <m:t>a</m:t>
+        </m:r>
+      </m:oMath>
+      <w:r>
+        <w:t xml:space="preserve">, and by the equality rule in</w:t>
+      </w:r>
+      <w:r>
+        <w:t xml:space="preserve"> </w:t>
+      </w:r>
+      <w:hyperlink w:anchor="def-complex-number">
+        <w:r>
+          <w:rPr>
+            <w:rStyle w:val="Hyperlink"/>
+          </w:rPr>
+          <w:t xml:space="preserve">Definition 51</w:t>
+        </w:r>
+      </w:hyperlink>
+      <w:r>
+        <w:t xml:space="preserve"> </w:t>
+      </w:r>
+      <w:r>
+        <w:t xml:space="preserve">no other pair of real and imaginary parts gives the same number.</w:t>
+      </w:r>
+    </w:p>
+    <w:p>
+      <w:pPr>
+        <w:pStyle w:val="BodyText"/>
+      </w:pPr>
+      <w:r>
+        <w:t xml:space="preserve">Conversely, if</w:t>
+      </w:r>
+      <w:r>
+        <w:t xml:space="preserve"> </w:t>
+      </w:r>
+      <m:oMath>
+        <m:r>
+          <m:t>z</m:t>
+        </m:r>
+        <m:r>
+          <m:rPr>
+            <m:sty m:val="p"/>
+          </m:rPr>
+          <m:t>=</m:t>
+        </m:r>
+        <m:r>
+          <m:t>a</m:t>
+        </m:r>
+        <m:r>
+          <m:rPr>
+            <m:sty m:val="p"/>
+          </m:rPr>
+          <m:t>+</m:t>
+        </m:r>
+        <m:r>
+          <m:t>b</m:t>
+        </m:r>
+        <m:r>
+          <m:t> </m:t>
+        </m:r>
+        <m:r>
+          <m:t>i</m:t>
+        </m:r>
+      </m:oMath>
+      <w:r>
+        <w:t xml:space="preserve"> </w:t>
+      </w:r>
+      <w:r>
+        <w:t xml:space="preserve">has</w:t>
+      </w:r>
+      <w:r>
+        <w:t xml:space="preserve"> </w:t>
+      </w:r>
+      <m:oMath>
+        <m:r>
+          <m:t>b</m:t>
+        </m:r>
+        <m:r>
+          <m:rPr>
+            <m:sty m:val="p"/>
+          </m:rPr>
+          <m:t>=</m:t>
+        </m:r>
+        <m:r>
+          <m:rPr>
+            <m:sty m:val="p"/>
+          </m:rPr>
+          <m:t>Im</m:t>
+        </m:r>
+        <m:r>
+          <m:t>z</m:t>
+        </m:r>
+        <m:r>
+          <m:rPr>
+            <m:sty m:val="p"/>
+          </m:rPr>
+          <m:t>=</m:t>
+        </m:r>
+        <m:r>
+          <m:t>0</m:t>
+        </m:r>
+      </m:oMath>
+      <w:r>
+        <w:t xml:space="preserve">, then</w:t>
+      </w:r>
+      <w:r>
+        <w:t xml:space="preserve"> </w:t>
+      </w:r>
+      <m:oMath>
+        <m:r>
+          <m:t>z</m:t>
+        </m:r>
+        <m:r>
+          <m:rPr>
+            <m:sty m:val="p"/>
+          </m:rPr>
+          <m:t>=</m:t>
+        </m:r>
+        <m:r>
+          <m:t>a</m:t>
+        </m:r>
+        <m:r>
+          <m:rPr>
+            <m:sty m:val="p"/>
+          </m:rPr>
+          <m:t>+</m:t>
+        </m:r>
+        <m:r>
+          <m:t>0</m:t>
+        </m:r>
+        <m:r>
+          <m:t> </m:t>
+        </m:r>
+        <m:r>
+          <m:t>i</m:t>
+        </m:r>
+        <m:r>
+          <m:rPr>
+            <m:sty m:val="p"/>
+          </m:rPr>
+          <m:t>=</m:t>
+        </m:r>
+        <m:r>
+          <m:t>a</m:t>
+        </m:r>
+      </m:oMath>
+      <w:r>
+        <w:t xml:space="preserve"> </w:t>
+      </w:r>
+      <w:r>
+        <w:t xml:space="preserve">by the same calculation, so</w:t>
+      </w:r>
+      <w:r>
+        <w:t xml:space="preserve"> </w:t>
+      </w:r>
+      <m:oMath>
+        <m:r>
+          <m:t>z</m:t>
+        </m:r>
+      </m:oMath>
+      <w:r>
+        <w:t xml:space="preserve"> </w:t>
+      </w:r>
+      <w:r>
+        <w:t xml:space="preserve">is real.</w:t>
+      </w:r>
+    </w:p>
+    <w:bookmarkStart w:id="234" w:name="exm-reals-in-complex"/>
+    <w:p>
+      <w:pPr>
+        <w:pStyle w:val="BodyText"/>
+      </w:pPr>
+      <w:r>
+        <w:rPr>
+          <w:b/>
+          <w:bCs/>
+        </w:rPr>
+        <w:t xml:space="preserve">Example 53 (Which complex numbers are real)</w:t>
+      </w:r>
+      <w:r>
+        <w:t xml:space="preserve"> </w:t>
+      </w:r>
+      <w:r>
+        <w:t xml:space="preserve">R stores complex numbers as a real part and an imaginary part.</w:t>
+      </w:r>
+      <w:r>
+        <w:t xml:space="preserve"> </w:t>
+      </w:r>
+      <w:r>
+        <w:t xml:space="preserve">The code below converts the real number</w:t>
+      </w:r>
+      <w:r>
+        <w:t xml:space="preserve"> </w:t>
+      </w:r>
+      <m:oMath>
+        <m:r>
+          <m:t>7</m:t>
+        </m:r>
+      </m:oMath>
+      <w:r>
+        <w:t xml:space="preserve"> </w:t>
+      </w:r>
+      <w:r>
+        <w:t xml:space="preserve">to a complex number</w:t>
+      </w:r>
+      <w:r>
+        <w:t xml:space="preserve"> </w:t>
+      </w:r>
+      <w:r>
+        <w:t xml:space="preserve">and reads the parts of three complex numbers.</w:t>
+      </w:r>
+    </w:p>
+    <w:p>
+      <w:pPr>
+        <w:pStyle w:val="SourceCode"/>
+      </w:pPr>
+      <w:r>
+        <w:rPr>
+          <w:rStyle w:val="NormalTok"/>
+        </w:rPr>
+        <w:t xml:space="preserve">z </w:t>
+      </w:r>
+      <w:r>
+        <w:rPr>
+          <w:rStyle w:val="OtherTok"/>
+        </w:rPr>
+        <w:t xml:space="preserve">&lt;-</w:t>
+      </w:r>
+      <w:r>
+        <w:rPr>
+          <w:rStyle w:val="NormalTok"/>
+        </w:rPr>
+        <w:t xml:space="preserve"> </w:t>
+      </w:r>
+      <w:r>
+        <w:rPr>
+          <w:rStyle w:val="FunctionTok"/>
+        </w:rPr>
+        <w:t xml:space="preserve">c</w:t>
+      </w:r>
+      <w:r>
+        <w:rPr>
+          <w:rStyle w:val="NormalTok"/>
+        </w:rPr>
+        <w:t xml:space="preserve">(</w:t>
+      </w:r>
+      <w:r>
+        <w:rPr>
+          <w:rStyle w:val="FunctionTok"/>
+        </w:rPr>
+        <w:t xml:space="preserve">as.complex</w:t>
+      </w:r>
+      <w:r>
+        <w:rPr>
+          <w:rStyle w:val="NormalTok"/>
+        </w:rPr>
+        <w:t xml:space="preserve">(</w:t>
+      </w:r>
+      <w:r>
+        <w:rPr>
+          <w:rStyle w:val="DecValTok"/>
+        </w:rPr>
+        <w:t xml:space="preserve">7</w:t>
+      </w:r>
+      <w:r>
+        <w:rPr>
+          <w:rStyle w:val="NormalTok"/>
+        </w:rPr>
+        <w:t xml:space="preserve">), </w:t>
+      </w:r>
+      <w:r>
+        <w:rPr>
+          <w:rStyle w:val="DecValTok"/>
+        </w:rPr>
+        <w:t xml:space="preserve">2</w:t>
+      </w:r>
+      <w:r>
+        <w:rPr>
+          <w:rStyle w:val="NormalTok"/>
+        </w:rPr>
+        <w:t xml:space="preserve"> </w:t>
+      </w:r>
+      <w:r>
+        <w:rPr>
+          <w:rStyle w:val="SpecialCharTok"/>
+        </w:rPr>
+        <w:t xml:space="preserve">-</w:t>
+      </w:r>
+      <w:r>
+        <w:rPr>
+          <w:rStyle w:val="NormalTok"/>
+        </w:rPr>
+        <w:t xml:space="preserve"> </w:t>
+      </w:r>
+      <w:r>
+        <w:rPr>
+          <w:rStyle w:val="DecValTok"/>
+        </w:rPr>
+        <w:t xml:space="preserve">5</w:t>
+      </w:r>
+      <w:r>
+        <w:rPr>
+          <w:rStyle w:val="NormalTok"/>
+        </w:rPr>
+        <w:t xml:space="preserve">i, </w:t>
+      </w:r>
+      <w:r>
+        <w:rPr>
+          <w:rStyle w:val="DecValTok"/>
+        </w:rPr>
+        <w:t xml:space="preserve">3</w:t>
+      </w:r>
+      <w:r>
+        <w:rPr>
+          <w:rStyle w:val="NormalTok"/>
+        </w:rPr>
+        <w:t xml:space="preserve"> </w:t>
+      </w:r>
+      <w:r>
+        <w:rPr>
+          <w:rStyle w:val="SpecialCharTok"/>
+        </w:rPr>
+        <w:t xml:space="preserve">+</w:t>
+      </w:r>
+      <w:r>
+        <w:rPr>
+          <w:rStyle w:val="NormalTok"/>
+        </w:rPr>
+        <w:t xml:space="preserve"> </w:t>
+      </w:r>
+      <w:r>
+        <w:rPr>
+          <w:rStyle w:val="DecValTok"/>
+        </w:rPr>
+        <w:t xml:space="preserve">0</w:t>
+      </w:r>
+      <w:r>
+        <w:rPr>
+          <w:rStyle w:val="NormalTok"/>
+        </w:rPr>
+        <w:t xml:space="preserve">i)</w:t>
+      </w:r>
+      <w:r>
+        <w:br/>
+      </w:r>
+      <w:r>
+        <w:rPr>
+          <w:rStyle w:val="FunctionTok"/>
+        </w:rPr>
+        <w:t xml:space="preserve">data.frame</w:t>
+      </w:r>
+      <w:r>
+        <w:rPr>
+          <w:rStyle w:val="NormalTok"/>
+        </w:rPr>
+        <w:t xml:space="preserve">(</w:t>
+      </w:r>
+      <w:r>
+        <w:rPr>
+          <w:rStyle w:val="AttributeTok"/>
+        </w:rPr>
+        <w:t xml:space="preserve">z =</w:t>
+      </w:r>
+      <w:r>
+        <w:rPr>
+          <w:rStyle w:val="NormalTok"/>
+        </w:rPr>
+        <w:t xml:space="preserve"> z, </w:t>
+      </w:r>
+      <w:r>
+        <w:rPr>
+          <w:rStyle w:val="AttributeTok"/>
+        </w:rPr>
+        <w:t xml:space="preserve">re =</w:t>
+      </w:r>
+      <w:r>
+        <w:rPr>
+          <w:rStyle w:val="NormalTok"/>
+        </w:rPr>
+        <w:t xml:space="preserve"> </w:t>
+      </w:r>
+      <w:r>
+        <w:rPr>
+          <w:rStyle w:val="FunctionTok"/>
+        </w:rPr>
+        <w:t xml:space="preserve">Re</w:t>
+      </w:r>
+      <w:r>
+        <w:rPr>
+          <w:rStyle w:val="NormalTok"/>
+        </w:rPr>
+        <w:t xml:space="preserve">(z), </w:t>
+      </w:r>
+      <w:r>
+        <w:rPr>
+          <w:rStyle w:val="AttributeTok"/>
+        </w:rPr>
+        <w:t xml:space="preserve">im =</w:t>
+      </w:r>
+      <w:r>
+        <w:rPr>
+          <w:rStyle w:val="NormalTok"/>
+        </w:rPr>
+        <w:t xml:space="preserve"> </w:t>
+      </w:r>
+      <w:r>
+        <w:rPr>
+          <w:rStyle w:val="FunctionTok"/>
+        </w:rPr>
+        <w:t xml:space="preserve">Im</w:t>
+      </w:r>
+      <w:r>
+        <w:rPr>
+          <w:rStyle w:val="NormalTok"/>
+        </w:rPr>
+        <w:t xml:space="preserve">(z), </w:t>
+      </w:r>
+      <w:r>
+        <w:rPr>
+          <w:rStyle w:val="AttributeTok"/>
+        </w:rPr>
+        <w:t xml:space="preserve">is_real =</w:t>
+      </w:r>
+      <w:r>
+        <w:rPr>
+          <w:rStyle w:val="NormalTok"/>
+        </w:rPr>
+        <w:t xml:space="preserve"> </w:t>
+      </w:r>
+      <w:r>
+        <w:rPr>
+          <w:rStyle w:val="FunctionTok"/>
+        </w:rPr>
+        <w:t xml:space="preserve">Im</w:t>
+      </w:r>
+      <w:r>
+        <w:rPr>
+          <w:rStyle w:val="NormalTok"/>
+        </w:rPr>
+        <w:t xml:space="preserve">(z) </w:t>
+      </w:r>
+      <w:r>
+        <w:rPr>
+          <w:rStyle w:val="SpecialCharTok"/>
+        </w:rPr>
+        <w:t xml:space="preserve">==</w:t>
+      </w:r>
+      <w:r>
+        <w:rPr>
+          <w:rStyle w:val="NormalTok"/>
+        </w:rPr>
+        <w:t xml:space="preserve"> </w:t>
+      </w:r>
+      <w:r>
+        <w:rPr>
+          <w:rStyle w:val="DecValTok"/>
+        </w:rPr>
+        <w:t xml:space="preserve">0</w:t>
+      </w:r>
+      <w:r>
+        <w:rPr>
+          <w:rStyle w:val="NormalTok"/>
+        </w:rPr>
+        <w:t xml:space="preserve">)</w:t>
+      </w:r>
+      <w:r>
+        <w:br/>
+      </w:r>
+      <w:r>
+        <w:rPr>
+          <w:rStyle w:val="CommentTok"/>
+        </w:rPr>
+        <w:t xml:space="preserve">#&gt; # A tibble: 3 × 4</w:t>
+      </w:r>
+      <w:r>
+        <w:br/>
+      </w:r>
+      <w:r>
+        <w:rPr>
+          <w:rStyle w:val="CommentTok"/>
+        </w:rPr>
+        <w:t xml:space="preserve">#&gt;   z        re    im is_real</w:t>
+      </w:r>
+      <w:r>
+        <w:br/>
+      </w:r>
+      <w:r>
+        <w:rPr>
+          <w:rStyle w:val="CommentTok"/>
+        </w:rPr>
+        <w:t xml:space="preserve">#&gt;   &lt;cpl&gt; &lt;dbl&gt; &lt;dbl&gt; &lt;lgl&gt;  </w:t>
+      </w:r>
+      <w:r>
+        <w:br/>
+      </w:r>
+      <w:r>
+        <w:rPr>
+          <w:rStyle w:val="CommentTok"/>
+        </w:rPr>
+        <w:t xml:space="preserve">#&gt; 1 7+0i      7     0 TRUE   </w:t>
+      </w:r>
+      <w:r>
+        <w:br/>
+      </w:r>
+      <w:r>
+        <w:rPr>
+          <w:rStyle w:val="CommentTok"/>
+        </w:rPr>
+        <w:t xml:space="preserve">#&gt; 2 2-5i      2    -5 FALSE  </w:t>
+      </w:r>
+      <w:r>
+        <w:br/>
+      </w:r>
+      <w:r>
+        <w:rPr>
+          <w:rStyle w:val="CommentTok"/>
+        </w:rPr>
+        <w:t xml:space="preserve">#&gt; 3 3+0i      3     0 TRUE</w:t>
+      </w:r>
+    </w:p>
+    <w:p>
+      <w:pPr>
+        <w:pStyle w:val="FirstParagraph"/>
+      </w:pPr>
+      <w:r>
+        <w:t xml:space="preserve">The real number</w:t>
+      </w:r>
+      <w:r>
+        <w:t xml:space="preserve"> </w:t>
+      </w:r>
+      <m:oMath>
+        <m:r>
+          <m:t>7</m:t>
+        </m:r>
+      </m:oMath>
+      <w:r>
+        <w:t xml:space="preserve"> </w:t>
+      </w:r>
+      <w:r>
+        <w:t xml:space="preserve">becomes the complex number 7+0i,</w:t>
+      </w:r>
+      <w:r>
+        <w:t xml:space="preserve"> </w:t>
+      </w:r>
+      <w:r>
+        <w:t xml:space="preserve">with imaginary part 0.</w:t>
+      </w:r>
+      <w:r>
+        <w:t xml:space="preserve"> </w:t>
+      </w:r>
+      <w:r>
+        <w:t xml:space="preserve">Of the 3 numbers,</w:t>
+      </w:r>
+      <w:r>
+        <w:t xml:space="preserve"> </w:t>
+      </w:r>
+      <w:r>
+        <w:t xml:space="preserve">2 have imaginary part</w:t>
+      </w:r>
+      <w:r>
+        <w:t xml:space="preserve"> </w:t>
+      </w:r>
+      <m:oMath>
+        <m:r>
+          <m:t>0</m:t>
+        </m:r>
+      </m:oMath>
+      <w:r>
+        <w:t xml:space="preserve">,</w:t>
+      </w:r>
+      <w:r>
+        <w:t xml:space="preserve"> </w:t>
+      </w:r>
+      <w:r>
+        <w:t xml:space="preserve">and by</w:t>
+      </w:r>
+      <w:r>
+        <w:t xml:space="preserve"> </w:t>
+      </w:r>
+      <w:hyperlink w:anchor="thm-reals-in-complex">
+        <w:r>
+          <w:rPr>
+            <w:rStyle w:val="Hyperlink"/>
+          </w:rPr>
+          <w:t xml:space="preserve">Theorem 31</w:t>
+        </w:r>
+      </w:hyperlink>
+      <w:r>
+        <w:t xml:space="preserve"> </w:t>
+      </w:r>
+      <w:r>
+        <w:t xml:space="preserve">these are the real ones.</w:t>
+      </w:r>
+      <w:r>
+        <w:t xml:space="preserve"> </w:t>
+      </w:r>
+      <w:r>
+        <w:t xml:space="preserve">The number</w:t>
+      </w:r>
+      <w:r>
+        <w:t xml:space="preserve"> </w:t>
+      </w:r>
+      <m:oMath>
+        <m:r>
+          <m:t>2</m:t>
+        </m:r>
+        <m:r>
+          <m:rPr>
+            <m:sty m:val="p"/>
+          </m:rPr>
+          <m:t>−</m:t>
+        </m:r>
+        <m:r>
+          <m:t>5</m:t>
+        </m:r>
+        <m:r>
+          <m:t> </m:t>
+        </m:r>
+        <m:r>
+          <m:t>i</m:t>
+        </m:r>
+      </m:oMath>
+      <w:r>
+        <w:t xml:space="preserve"> </w:t>
+      </w:r>
+      <w:r>
+        <w:t xml:space="preserve">is not real, because its imaginary part is -5.</w:t>
+      </w:r>
+    </w:p>
+    <w:bookmarkEnd w:id="234"/>
+    <w:bookmarkStart w:id="235" w:name="thm-complex-arithmetic"/>
+    <w:p>
+      <w:pPr>
+        <w:pStyle w:val="BodyText"/>
+      </w:pPr>
+      <w:r>
+        <w:rPr>
+          <w:b/>
+          <w:bCs/>
+        </w:rPr>
+        <w:t xml:space="preserve">Theorem 32 (Adding and multiplying complex numbers)</w:t>
       </w:r>
       <w:r>
         <w:t xml:space="preserve"> </w:t>
@@ -69579,7 +71442,7 @@
         </m:oMath>
       </m:oMathPara>
     </w:p>
-    <w:bookmarkEnd w:id="230"/>
+    <w:bookmarkEnd w:id="235"/>
     <w:p>
       <w:pPr>
         <w:pStyle w:val="FirstParagraph"/>
@@ -70233,7 +72096,7 @@
         <w:t xml:space="preserve">takes these two formulas as the definitions of addition and multiplication.</w:t>
       </w:r>
     </w:p>
-    <w:bookmarkStart w:id="231" w:name="exm-complex-arithmetic"/>
+    <w:bookmarkStart w:id="236" w:name="exm-complex-arithmetic"/>
     <w:p>
       <w:pPr>
         <w:pStyle w:val="BodyText"/>
@@ -70243,7 +72106,7 @@
           <w:b/>
           <w:bCs/>
         </w:rPr>
-        <w:t xml:space="preserve">Example 52 (Adding and multiplying two complex numbers)</w:t>
+        <w:t xml:space="preserve">Example 54 (Adding and multiplying two complex numbers)</w:t>
       </w:r>
       <w:r>
         <w:t xml:space="preserve"> </w:t>
@@ -70453,7 +72316,7 @@
                   <m:nor/>
                   <m:sty m:val="p"/>
                 </m:rPr>
-                <m:t>Theorem 30</m:t>
+                <m:t>Theorem 32</m:t>
               </m:r>
               <m:r>
                 <m:rPr>
@@ -70975,7 +72838,7 @@
           <w:rPr>
             <w:rStyle w:val="Hyperlink"/>
           </w:rPr>
-          <w:t xml:space="preserve">Theorem 30</w:t>
+          <w:t xml:space="preserve">Theorem 32</w:t>
         </w:r>
       </w:hyperlink>
       <w:r>
@@ -71256,8 +73119,8 @@
         </m:oMath>
       </m:oMathPara>
     </w:p>
-    <w:bookmarkEnd w:id="231"/>
-    <w:bookmarkStart w:id="232" w:name="def-complex-conjugate"/>
+    <w:bookmarkEnd w:id="236"/>
+    <w:bookmarkStart w:id="237" w:name="def-complex-conjugate"/>
     <w:p>
       <w:pPr>
         <w:pStyle w:val="FirstParagraph"/>
@@ -71406,7 +73269,7 @@
         </m:oMath>
       </m:oMathPara>
     </w:p>
-    <w:bookmarkEnd w:id="232"/>
+    <w:bookmarkEnd w:id="237"/>
     <w:p>
       <w:pPr>
         <w:pStyle w:val="FirstParagraph"/>
@@ -71487,7 +73350,7 @@
         <w:t xml:space="preserve">.</w:t>
       </w:r>
     </w:p>
-    <w:bookmarkStart w:id="233" w:name="exm-complex-conjugate"/>
+    <w:bookmarkStart w:id="238" w:name="exm-complex-conjugate"/>
     <w:p>
       <w:pPr>
         <w:pStyle w:val="BodyText"/>
@@ -71497,7 +73360,7 @@
           <w:b/>
           <w:bCs/>
         </w:rPr>
-        <w:t xml:space="preserve">Example 53 (Complex conjugates)</w:t>
+        <w:t xml:space="preserve">Example 55 (Complex conjugates)</w:t>
       </w:r>
       <w:r>
         <w:t xml:space="preserve"> </w:t>
@@ -71883,8 +73746,8 @@
         <w:t xml:space="preserve">, is not.</w:t>
       </w:r>
     </w:p>
-    <w:bookmarkEnd w:id="233"/>
-    <w:bookmarkStart w:id="234" w:name="def-complex-modulus"/>
+    <w:bookmarkEnd w:id="238"/>
+    <w:bookmarkStart w:id="239" w:name="def-complex-modulus"/>
     <w:p>
       <w:pPr>
         <w:pStyle w:val="FirstParagraph"/>
@@ -72072,7 +73935,7 @@
         </m:oMath>
       </m:oMathPara>
     </w:p>
-    <w:bookmarkEnd w:id="234"/>
+    <w:bookmarkEnd w:id="239"/>
     <w:p>
       <w:pPr>
         <w:pStyle w:val="FirstParagraph"/>
@@ -72087,7 +73950,7 @@
         <w:t xml:space="preserve">gives the same definition.</w:t>
       </w:r>
     </w:p>
-    <w:bookmarkStart w:id="235" w:name="exm-complex-modulus"/>
+    <w:bookmarkStart w:id="240" w:name="exm-complex-modulus"/>
     <w:p>
       <w:pPr>
         <w:pStyle w:val="BodyText"/>
@@ -72097,7 +73960,7 @@
           <w:b/>
           <w:bCs/>
         </w:rPr>
-        <w:t xml:space="preserve">Example 54 (Absolute values of complex numbers)</w:t>
+        <w:t xml:space="preserve">Example 56 (Absolute values of complex numbers)</w:t>
       </w:r>
       <w:r>
         <w:t xml:space="preserve"> </w:t>
@@ -72673,8 +74536,8 @@
         </m:oMath>
       </m:oMathPara>
     </w:p>
-    <w:bookmarkEnd w:id="235"/>
-    <w:bookmarkStart w:id="236" w:name="thm-conj-product"/>
+    <w:bookmarkEnd w:id="240"/>
+    <w:bookmarkStart w:id="241" w:name="thm-conj-product"/>
     <w:p>
       <w:pPr>
         <w:pStyle w:val="FirstParagraph"/>
@@ -72684,7 +74547,7 @@
           <w:b/>
           <w:bCs/>
         </w:rPr>
-        <w:t xml:space="preserve">Theorem 31 (A complex number times its conjugate)</w:t>
+        <w:t xml:space="preserve">Theorem 33 (A complex number times its conjugate)</w:t>
       </w:r>
       <w:r>
         <w:t xml:space="preserve"> </w:t>
@@ -72807,7 +74670,7 @@
         <w:t xml:space="preserve">is a nonnegative real number.</w:t>
       </w:r>
     </w:p>
-    <w:bookmarkEnd w:id="236"/>
+    <w:bookmarkEnd w:id="241"/>
     <w:p>
       <w:pPr>
         <w:pStyle w:val="BodyText"/>
@@ -73356,7 +75219,7 @@
         <w:t xml:space="preserve">lists this identity among the properties of complex numbers.</w:t>
       </w:r>
     </w:p>
-    <w:bookmarkStart w:id="237" w:name="exm-conj-product"/>
+    <w:bookmarkStart w:id="242" w:name="exm-conj-product"/>
     <w:p>
       <w:pPr>
         <w:pStyle w:val="BodyText"/>
@@ -73366,7 +75229,7 @@
           <w:b/>
           <w:bCs/>
         </w:rPr>
-        <w:t xml:space="preserve">Example 55 (Multiplying</w:t>
+        <w:t xml:space="preserve">Example 57 (Multiplying</w:t>
       </w:r>
       <w:r>
         <w:rPr>
@@ -73801,7 +75664,7 @@
           <w:rPr>
             <w:rStyle w:val="Hyperlink"/>
           </w:rPr>
-          <w:t xml:space="preserve">Example 54</w:t>
+          <w:t xml:space="preserve">Example 56</w:t>
         </w:r>
       </w:hyperlink>
       <w:r>
@@ -73815,7 +75678,7 @@
           <w:rPr>
             <w:rStyle w:val="Hyperlink"/>
           </w:rPr>
-          <w:t xml:space="preserve">Theorem 31</w:t>
+          <w:t xml:space="preserve">Theorem 33</w:t>
         </w:r>
       </w:hyperlink>
       <w:r>
@@ -73825,9 +75688,9 @@
         <w:t xml:space="preserve">says.</w:t>
       </w:r>
     </w:p>
-    <w:bookmarkEnd w:id="237"/>
-    <w:bookmarkEnd w:id="238"/>
-    <w:bookmarkStart w:id="239" w:name="sec-further-reading"/>
+    <w:bookmarkEnd w:id="242"/>
+    <w:bookmarkEnd w:id="243"/>
+    <w:bookmarkStart w:id="244" w:name="sec-further-reading"/>
     <w:p>
       <w:pPr>
         <w:pStyle w:val="Heading2"/>
@@ -73896,8 +75759,8 @@
         <w:t xml:space="preserve">behind the infimum and supremum.</w:t>
       </w:r>
     </w:p>
-    <w:bookmarkEnd w:id="239"/>
-    <w:bookmarkStart w:id="246" w:name="references"/>
+    <w:bookmarkEnd w:id="244"/>
+    <w:bookmarkStart w:id="251" w:name="references"/>
     <w:p>
       <w:pPr>
         <w:pStyle w:val="Heading2"/>
@@ -73906,8 +75769,8 @@
         <w:t xml:space="preserve">References</w:t>
       </w:r>
     </w:p>
-    <w:bookmarkStart w:id="245" w:name="refs"/>
-    <w:bookmarkStart w:id="241" w:name="ref-abramson2021algebra"/>
+    <w:bookmarkStart w:id="250" w:name="refs"/>
+    <w:bookmarkStart w:id="246" w:name="ref-abramson2021algebra"/>
     <w:p>
       <w:pPr>
         <w:pStyle w:val="Bibliography"/>
@@ -73934,7 +75797,7 @@
       <w:r>
         <w:t xml:space="preserve"> </w:t>
       </w:r>
-      <w:hyperlink r:id="rId240">
+      <w:hyperlink r:id="rId245">
         <w:r>
           <w:rPr>
             <w:rStyle w:val="Hyperlink"/>
@@ -73946,8 +75809,8 @@
         <w:t xml:space="preserve">.</w:t>
       </w:r>
     </w:p>
-    <w:bookmarkEnd w:id="241"/>
-    <w:bookmarkStart w:id="243" w:name="ref-axler2024linear"/>
+    <w:bookmarkEnd w:id="246"/>
+    <w:bookmarkStart w:id="248" w:name="ref-axler2024linear"/>
     <w:p>
       <w:pPr>
         <w:pStyle w:val="Bibliography"/>
@@ -73971,7 +75834,7 @@
       <w:r>
         <w:t xml:space="preserve"> </w:t>
       </w:r>
-      <w:hyperlink r:id="rId242">
+      <w:hyperlink r:id="rId247">
         <w:r>
           <w:rPr>
             <w:rStyle w:val="Hyperlink"/>
@@ -73983,8 +75846,8 @@
         <w:t xml:space="preserve">.</w:t>
       </w:r>
     </w:p>
-    <w:bookmarkEnd w:id="243"/>
-    <w:bookmarkStart w:id="244" w:name="ref-rudin1976principles"/>
+    <w:bookmarkEnd w:id="248"/>
+    <w:bookmarkStart w:id="249" w:name="ref-rudin1976principles"/>
     <w:p>
       <w:pPr>
         <w:pStyle w:val="Bibliography"/>
@@ -74006,9 +75869,9 @@
         <w:t xml:space="preserve">. 3rd ed. International Series in Pure and Applied Mathematics. McGraw-Hill.</w:t>
       </w:r>
     </w:p>
-    <w:bookmarkEnd w:id="244"/>
-    <w:bookmarkEnd w:id="245"/>
-    <w:bookmarkEnd w:id="246"/>
+    <w:bookmarkEnd w:id="249"/>
+    <w:bookmarkEnd w:id="250"/>
+    <w:bookmarkEnd w:id="251"/>
     <w:sectPr>
       <w:footnotePr>
         <w:numRestart w:val="eachSect"/>

</xml_diff>

<commit_message>
Deploying to gh-pages from @ Morrison-Lab/mds@eac1fc803f75f151c1feb1c10c187b9a9081f7d7 🚀
</commit_message>
<xml_diff>
--- a/algebra.docx
+++ b/algebra.docx
@@ -15,7 +15,7 @@
         <w:pStyle w:val="Date"/>
       </w:pPr>
       <w:r>
-        <w:t xml:space="preserve">Last modified: 2026-10-10 18:57:52 (PDT)</w:t>
+        <w:t xml:space="preserve">Last modified: 2026-10-10 19:44:14 (PDT)</w:t>
       </w:r>
     </w:p>
     <w:bookmarkStart w:id="18" w:name="equalities"/>
@@ -75732,7 +75732,7 @@
         <w:t xml:space="preserve"> </w:t>
       </w:r>
       <w:r>
-        <w:t xml:space="preserve">which overlap with the algebra on this page.</w:t>
+        <w:t xml:space="preserve">which overlap with the algebra in these notes.</w:t>
       </w:r>
     </w:p>
     <w:p>

</xml_diff>